<commit_message>
Introduccion acortada a 3 carillas (catedra) y objetivos de maxima revisados (C21); 'y aguda' en amarillo como lo marco Sol
Co-Authored-By: Claude Opus 5.5 <noreply@anthropic.com>
</commit_message>
<xml_diff>
--- a/entregas/tesina 20261024B.docx
+++ b/entregas/tesina 20261024B.docx
@@ -47,7 +47,7 @@
           <w:noProof/>
         </w:rPr>
         <w:drawing>
-          <wp:inline distT="0" distB="0" distL="0" distR="0" wp14:anchorId="2B80CC71" wp14:editId="072FE1AC">
+          <wp:inline distT="0" distB="0" distL="0" distR="0" wp14:anchorId="7BBF4912" wp14:editId="74633C29">
             <wp:extent cx="2879999" cy="1722810"/>
             <wp:effectExtent l="0" t="0" r="0" b="0"/>
             <wp:docPr id="1" name="Picture" descr="image"/>
@@ -145,7 +145,7 @@
         <w:pStyle w:val="Ttulo1"/>
       </w:pPr>
       <w:bookmarkStart w:id="0" w:name="resumen"/>
-      <w:bookmarkStart w:id="1" w:name="_Toc243732523"/>
+      <w:bookmarkStart w:id="1" w:name="_Toc243733489"/>
       <w:r>
         <w:lastRenderedPageBreak/>
         <w:t>Resumen</w:t>
@@ -273,7 +273,7 @@
         <w:pStyle w:val="Ttulo1"/>
       </w:pPr>
       <w:bookmarkStart w:id="2" w:name="glosario-de-abreviaturas"/>
-      <w:bookmarkStart w:id="3" w:name="_Toc243732524"/>
+      <w:bookmarkStart w:id="3" w:name="_Toc243733490"/>
       <w:bookmarkEnd w:id="0"/>
       <w:r>
         <w:lastRenderedPageBreak/>
@@ -1327,7 +1327,7 @@
       <w:r>
         <w:fldChar w:fldCharType="separate"/>
       </w:r>
-      <w:hyperlink w:anchor="_Toc243732523" w:history="1">
+      <w:hyperlink w:anchor="_Toc243733489" w:history="1">
         <w:r>
           <w:rPr>
             <w:rStyle w:val="Hipervnculo"/>
@@ -1354,7 +1354,7 @@
             <w:noProof/>
             <w:webHidden/>
           </w:rPr>
-          <w:instrText xml:space="preserve"> PAGEREF _Toc243732523 \h </w:instrText>
+          <w:instrText xml:space="preserve"> PAGEREF _Toc243733489 \h </w:instrText>
         </w:r>
         <w:r>
           <w:rPr>
@@ -1399,7 +1399,7 @@
           <w14:ligatures w14:val="standardContextual"/>
         </w:rPr>
       </w:pPr>
-      <w:hyperlink w:anchor="_Toc243732524" w:history="1">
+      <w:hyperlink w:anchor="_Toc243733490" w:history="1">
         <w:r>
           <w:rPr>
             <w:rStyle w:val="Hipervnculo"/>
@@ -1426,7 +1426,7 @@
             <w:noProof/>
             <w:webHidden/>
           </w:rPr>
-          <w:instrText xml:space="preserve"> PAGEREF _Toc243732524 \h </w:instrText>
+          <w:instrText xml:space="preserve"> PAGEREF _Toc243733490 \h </w:instrText>
         </w:r>
         <w:r>
           <w:rPr>
@@ -1471,7 +1471,7 @@
           <w14:ligatures w14:val="standardContextual"/>
         </w:rPr>
       </w:pPr>
-      <w:hyperlink w:anchor="_Toc243732525" w:history="1">
+      <w:hyperlink w:anchor="_Toc243733491" w:history="1">
         <w:r>
           <w:rPr>
             <w:rStyle w:val="Hipervnculo"/>
@@ -1498,7 +1498,7 @@
             <w:noProof/>
             <w:webHidden/>
           </w:rPr>
-          <w:instrText xml:space="preserve"> PAGEREF _Toc243732525 \h </w:instrText>
+          <w:instrText xml:space="preserve"> PAGEREF _Toc243733491 \h </w:instrText>
         </w:r>
         <w:r>
           <w:rPr>
@@ -1543,7 +1543,7 @@
           <w14:ligatures w14:val="standardContextual"/>
         </w:rPr>
       </w:pPr>
-      <w:hyperlink w:anchor="_Toc243732526" w:history="1">
+      <w:hyperlink w:anchor="_Toc243733492" w:history="1">
         <w:r>
           <w:rPr>
             <w:rStyle w:val="Hipervnculo"/>
@@ -1570,7 +1570,7 @@
             <w:noProof/>
             <w:webHidden/>
           </w:rPr>
-          <w:instrText xml:space="preserve"> PAGEREF _Toc243732526 \h </w:instrText>
+          <w:instrText xml:space="preserve"> PAGEREF _Toc243733492 \h </w:instrText>
         </w:r>
         <w:r>
           <w:rPr>
@@ -1615,7 +1615,7 @@
           <w14:ligatures w14:val="standardContextual"/>
         </w:rPr>
       </w:pPr>
-      <w:hyperlink w:anchor="_Toc243732527" w:history="1">
+      <w:hyperlink w:anchor="_Toc243733493" w:history="1">
         <w:r>
           <w:rPr>
             <w:rStyle w:val="Hipervnculo"/>
@@ -1642,7 +1642,7 @@
             <w:noProof/>
             <w:webHidden/>
           </w:rPr>
-          <w:instrText xml:space="preserve"> PAGEREF _Toc243732527 \h </w:instrText>
+          <w:instrText xml:space="preserve"> PAGEREF _Toc243733493 \h </w:instrText>
         </w:r>
         <w:r>
           <w:rPr>
@@ -1687,7 +1687,7 @@
           <w14:ligatures w14:val="standardContextual"/>
         </w:rPr>
       </w:pPr>
-      <w:hyperlink w:anchor="_Toc243732528" w:history="1">
+      <w:hyperlink w:anchor="_Toc243733494" w:history="1">
         <w:r>
           <w:rPr>
             <w:rStyle w:val="Hipervnculo"/>
@@ -1714,7 +1714,7 @@
             <w:noProof/>
             <w:webHidden/>
           </w:rPr>
-          <w:instrText xml:space="preserve"> PAGEREF _Toc243732528 \h </w:instrText>
+          <w:instrText xml:space="preserve"> PAGEREF _Toc243733494 \h </w:instrText>
         </w:r>
         <w:r>
           <w:rPr>
@@ -1734,7 +1734,7 @@
             <w:noProof/>
             <w:webHidden/>
           </w:rPr>
-          <w:t>3</w:t>
+          <w:t>2</w:t>
         </w:r>
         <w:r>
           <w:rPr>
@@ -1759,7 +1759,7 @@
           <w14:ligatures w14:val="standardContextual"/>
         </w:rPr>
       </w:pPr>
-      <w:hyperlink w:anchor="_Toc243732529" w:history="1">
+      <w:hyperlink w:anchor="_Toc243733495" w:history="1">
         <w:r>
           <w:rPr>
             <w:rStyle w:val="Hipervnculo"/>
@@ -1786,7 +1786,7 @@
             <w:noProof/>
             <w:webHidden/>
           </w:rPr>
-          <w:instrText xml:space="preserve"> PAGEREF _Toc243732529 \h </w:instrText>
+          <w:instrText xml:space="preserve"> PAGEREF _Toc243733495 \h </w:instrText>
         </w:r>
         <w:r>
           <w:rPr>
@@ -1806,7 +1806,7 @@
             <w:noProof/>
             <w:webHidden/>
           </w:rPr>
-          <w:t>3</w:t>
+          <w:t>2</w:t>
         </w:r>
         <w:r>
           <w:rPr>
@@ -1831,7 +1831,7 @@
           <w14:ligatures w14:val="standardContextual"/>
         </w:rPr>
       </w:pPr>
-      <w:hyperlink w:anchor="_Toc243732530" w:history="1">
+      <w:hyperlink w:anchor="_Toc243733496" w:history="1">
         <w:r>
           <w:rPr>
             <w:rStyle w:val="Hipervnculo"/>
@@ -1858,7 +1858,7 @@
             <w:noProof/>
             <w:webHidden/>
           </w:rPr>
-          <w:instrText xml:space="preserve"> PAGEREF _Toc243732530 \h </w:instrText>
+          <w:instrText xml:space="preserve"> PAGEREF _Toc243733496 \h </w:instrText>
         </w:r>
         <w:r>
           <w:rPr>
@@ -1878,7 +1878,7 @@
             <w:noProof/>
             <w:webHidden/>
           </w:rPr>
-          <w:t>3</w:t>
+          <w:t>2</w:t>
         </w:r>
         <w:r>
           <w:rPr>
@@ -1903,7 +1903,7 @@
           <w14:ligatures w14:val="standardContextual"/>
         </w:rPr>
       </w:pPr>
-      <w:hyperlink w:anchor="_Toc243732531" w:history="1">
+      <w:hyperlink w:anchor="_Toc243733497" w:history="1">
         <w:r>
           <w:rPr>
             <w:rStyle w:val="Hipervnculo"/>
@@ -1930,7 +1930,7 @@
             <w:noProof/>
             <w:webHidden/>
           </w:rPr>
-          <w:instrText xml:space="preserve"> PAGEREF _Toc243732531 \h </w:instrText>
+          <w:instrText xml:space="preserve"> PAGEREF _Toc243733497 \h </w:instrText>
         </w:r>
         <w:r>
           <w:rPr>
@@ -1950,7 +1950,7 @@
             <w:noProof/>
             <w:webHidden/>
           </w:rPr>
-          <w:t>3</w:t>
+          <w:t>2</w:t>
         </w:r>
         <w:r>
           <w:rPr>
@@ -1975,7 +1975,7 @@
           <w14:ligatures w14:val="standardContextual"/>
         </w:rPr>
       </w:pPr>
-      <w:hyperlink w:anchor="_Toc243732532" w:history="1">
+      <w:hyperlink w:anchor="_Toc243733498" w:history="1">
         <w:r>
           <w:rPr>
             <w:rStyle w:val="Hipervnculo"/>
@@ -2002,7 +2002,7 @@
             <w:noProof/>
             <w:webHidden/>
           </w:rPr>
-          <w:instrText xml:space="preserve"> PAGEREF _Toc243732532 \h </w:instrText>
+          <w:instrText xml:space="preserve"> PAGEREF _Toc243733498 \h </w:instrText>
         </w:r>
         <w:r>
           <w:rPr>
@@ -2047,7 +2047,7 @@
           <w14:ligatures w14:val="standardContextual"/>
         </w:rPr>
       </w:pPr>
-      <w:hyperlink w:anchor="_Toc243732533" w:history="1">
+      <w:hyperlink w:anchor="_Toc243733499" w:history="1">
         <w:r>
           <w:rPr>
             <w:rStyle w:val="Hipervnculo"/>
@@ -2074,7 +2074,7 @@
             <w:noProof/>
             <w:webHidden/>
           </w:rPr>
-          <w:instrText xml:space="preserve"> PAGEREF _Toc243732533 \h </w:instrText>
+          <w:instrText xml:space="preserve"> PAGEREF _Toc243733499 \h </w:instrText>
         </w:r>
         <w:r>
           <w:rPr>
@@ -2094,7 +2094,7 @@
             <w:noProof/>
             <w:webHidden/>
           </w:rPr>
-          <w:t>5</w:t>
+          <w:t>4</w:t>
         </w:r>
         <w:r>
           <w:rPr>
@@ -2119,7 +2119,7 @@
           <w14:ligatures w14:val="standardContextual"/>
         </w:rPr>
       </w:pPr>
-      <w:hyperlink w:anchor="_Toc243732534" w:history="1">
+      <w:hyperlink w:anchor="_Toc243733500" w:history="1">
         <w:r>
           <w:rPr>
             <w:rStyle w:val="Hipervnculo"/>
@@ -2155,7 +2155,7 @@
             <w:noProof/>
             <w:webHidden/>
           </w:rPr>
-          <w:instrText xml:space="preserve"> PAGEREF _Toc243732534 \h </w:instrText>
+          <w:instrText xml:space="preserve"> PAGEREF _Toc243733500 \h </w:instrText>
         </w:r>
         <w:r>
           <w:rPr>
@@ -2175,7 +2175,7 @@
             <w:noProof/>
             <w:webHidden/>
           </w:rPr>
-          <w:t>5</w:t>
+          <w:t>4</w:t>
         </w:r>
         <w:r>
           <w:rPr>
@@ -2200,7 +2200,7 @@
           <w14:ligatures w14:val="standardContextual"/>
         </w:rPr>
       </w:pPr>
-      <w:hyperlink w:anchor="_Toc243732535" w:history="1">
+      <w:hyperlink w:anchor="_Toc243733501" w:history="1">
         <w:r>
           <w:rPr>
             <w:rStyle w:val="Hipervnculo"/>
@@ -2227,7 +2227,7 @@
             <w:noProof/>
             <w:webHidden/>
           </w:rPr>
-          <w:instrText xml:space="preserve"> PAGEREF _Toc243732535 \h </w:instrText>
+          <w:instrText xml:space="preserve"> PAGEREF _Toc243733501 \h </w:instrText>
         </w:r>
         <w:r>
           <w:rPr>
@@ -2247,7 +2247,7 @@
             <w:noProof/>
             <w:webHidden/>
           </w:rPr>
-          <w:t>5</w:t>
+          <w:t>4</w:t>
         </w:r>
         <w:r>
           <w:rPr>
@@ -2272,7 +2272,7 @@
           <w14:ligatures w14:val="standardContextual"/>
         </w:rPr>
       </w:pPr>
-      <w:hyperlink w:anchor="_Toc243732536" w:history="1">
+      <w:hyperlink w:anchor="_Toc243733502" w:history="1">
         <w:r>
           <w:rPr>
             <w:rStyle w:val="Hipervnculo"/>
@@ -2307,7 +2307,7 @@
             <w:noProof/>
             <w:webHidden/>
           </w:rPr>
-          <w:instrText xml:space="preserve"> PAGEREF _Toc243732536 \h </w:instrText>
+          <w:instrText xml:space="preserve"> PAGEREF _Toc243733502 \h </w:instrText>
         </w:r>
         <w:r>
           <w:rPr>
@@ -2327,7 +2327,7 @@
             <w:noProof/>
             <w:webHidden/>
           </w:rPr>
-          <w:t>5</w:t>
+          <w:t>4</w:t>
         </w:r>
         <w:r>
           <w:rPr>
@@ -2352,7 +2352,7 @@
           <w14:ligatures w14:val="standardContextual"/>
         </w:rPr>
       </w:pPr>
-      <w:hyperlink w:anchor="_Toc243732537" w:history="1">
+      <w:hyperlink w:anchor="_Toc243733503" w:history="1">
         <w:r>
           <w:rPr>
             <w:rStyle w:val="Hipervnculo"/>
@@ -2379,7 +2379,7 @@
             <w:noProof/>
             <w:webHidden/>
           </w:rPr>
-          <w:instrText xml:space="preserve"> PAGEREF _Toc243732537 \h </w:instrText>
+          <w:instrText xml:space="preserve"> PAGEREF _Toc243733503 \h </w:instrText>
         </w:r>
         <w:r>
           <w:rPr>
@@ -2399,7 +2399,7 @@
             <w:noProof/>
             <w:webHidden/>
           </w:rPr>
-          <w:t>7</w:t>
+          <w:t>6</w:t>
         </w:r>
         <w:r>
           <w:rPr>
@@ -2424,7 +2424,7 @@
           <w14:ligatures w14:val="standardContextual"/>
         </w:rPr>
       </w:pPr>
-      <w:hyperlink w:anchor="_Toc243732538" w:history="1">
+      <w:hyperlink w:anchor="_Toc243733504" w:history="1">
         <w:r>
           <w:rPr>
             <w:rStyle w:val="Hipervnculo"/>
@@ -2451,7 +2451,7 @@
             <w:noProof/>
             <w:webHidden/>
           </w:rPr>
-          <w:instrText xml:space="preserve"> PAGEREF _Toc243732538 \h </w:instrText>
+          <w:instrText xml:space="preserve"> PAGEREF _Toc243733504 \h </w:instrText>
         </w:r>
         <w:r>
           <w:rPr>
@@ -2471,7 +2471,7 @@
             <w:noProof/>
             <w:webHidden/>
           </w:rPr>
-          <w:t>7</w:t>
+          <w:t>6</w:t>
         </w:r>
         <w:r>
           <w:rPr>
@@ -2496,7 +2496,7 @@
           <w14:ligatures w14:val="standardContextual"/>
         </w:rPr>
       </w:pPr>
-      <w:hyperlink w:anchor="_Toc243732539" w:history="1">
+      <w:hyperlink w:anchor="_Toc243733505" w:history="1">
         <w:r>
           <w:rPr>
             <w:rStyle w:val="Hipervnculo"/>
@@ -2523,7 +2523,7 @@
             <w:noProof/>
             <w:webHidden/>
           </w:rPr>
-          <w:instrText xml:space="preserve"> PAGEREF _Toc243732539 \h </w:instrText>
+          <w:instrText xml:space="preserve"> PAGEREF _Toc243733505 \h </w:instrText>
         </w:r>
         <w:r>
           <w:rPr>
@@ -2543,7 +2543,7 @@
             <w:noProof/>
             <w:webHidden/>
           </w:rPr>
-          <w:t>7</w:t>
+          <w:t>6</w:t>
         </w:r>
         <w:r>
           <w:rPr>
@@ -2568,7 +2568,7 @@
           <w14:ligatures w14:val="standardContextual"/>
         </w:rPr>
       </w:pPr>
-      <w:hyperlink w:anchor="_Toc243732540" w:history="1">
+      <w:hyperlink w:anchor="_Toc243733506" w:history="1">
         <w:r>
           <w:rPr>
             <w:rStyle w:val="Hipervnculo"/>
@@ -2603,7 +2603,7 @@
             <w:noProof/>
             <w:webHidden/>
           </w:rPr>
-          <w:instrText xml:space="preserve"> PAGEREF _Toc243732540 \h </w:instrText>
+          <w:instrText xml:space="preserve"> PAGEREF _Toc243733506 \h </w:instrText>
         </w:r>
         <w:r>
           <w:rPr>
@@ -2623,7 +2623,7 @@
             <w:noProof/>
             <w:webHidden/>
           </w:rPr>
-          <w:t>8</w:t>
+          <w:t>7</w:t>
         </w:r>
         <w:r>
           <w:rPr>
@@ -2648,7 +2648,7 @@
           <w14:ligatures w14:val="standardContextual"/>
         </w:rPr>
       </w:pPr>
-      <w:hyperlink w:anchor="_Toc243732541" w:history="1">
+      <w:hyperlink w:anchor="_Toc243733507" w:history="1">
         <w:r>
           <w:rPr>
             <w:rStyle w:val="Hipervnculo"/>
@@ -2675,7 +2675,7 @@
             <w:noProof/>
             <w:webHidden/>
           </w:rPr>
-          <w:instrText xml:space="preserve"> PAGEREF _Toc243732541 \h </w:instrText>
+          <w:instrText xml:space="preserve"> PAGEREF _Toc243733507 \h </w:instrText>
         </w:r>
         <w:r>
           <w:rPr>
@@ -2695,7 +2695,7 @@
             <w:noProof/>
             <w:webHidden/>
           </w:rPr>
-          <w:t>8</w:t>
+          <w:t>7</w:t>
         </w:r>
         <w:r>
           <w:rPr>
@@ -2720,7 +2720,7 @@
           <w14:ligatures w14:val="standardContextual"/>
         </w:rPr>
       </w:pPr>
-      <w:hyperlink w:anchor="_Toc243732542" w:history="1">
+      <w:hyperlink w:anchor="_Toc243733508" w:history="1">
         <w:r>
           <w:rPr>
             <w:rStyle w:val="Hipervnculo"/>
@@ -2747,7 +2747,7 @@
             <w:noProof/>
             <w:webHidden/>
           </w:rPr>
-          <w:instrText xml:space="preserve"> PAGEREF _Toc243732542 \h </w:instrText>
+          <w:instrText xml:space="preserve"> PAGEREF _Toc243733508 \h </w:instrText>
         </w:r>
         <w:r>
           <w:rPr>
@@ -2767,7 +2767,7 @@
             <w:noProof/>
             <w:webHidden/>
           </w:rPr>
-          <w:t>10</w:t>
+          <w:t>9</w:t>
         </w:r>
         <w:r>
           <w:rPr>
@@ -2792,7 +2792,7 @@
           <w14:ligatures w14:val="standardContextual"/>
         </w:rPr>
       </w:pPr>
-      <w:hyperlink w:anchor="_Toc243732543" w:history="1">
+      <w:hyperlink w:anchor="_Toc243733509" w:history="1">
         <w:r>
           <w:rPr>
             <w:rStyle w:val="Hipervnculo"/>
@@ -2819,7 +2819,7 @@
             <w:noProof/>
             <w:webHidden/>
           </w:rPr>
-          <w:instrText xml:space="preserve"> PAGEREF _Toc243732543 \h </w:instrText>
+          <w:instrText xml:space="preserve"> PAGEREF _Toc243733509 \h </w:instrText>
         </w:r>
         <w:r>
           <w:rPr>
@@ -2839,7 +2839,7 @@
             <w:noProof/>
             <w:webHidden/>
           </w:rPr>
-          <w:t>10</w:t>
+          <w:t>9</w:t>
         </w:r>
         <w:r>
           <w:rPr>
@@ -2864,7 +2864,7 @@
           <w14:ligatures w14:val="standardContextual"/>
         </w:rPr>
       </w:pPr>
-      <w:hyperlink w:anchor="_Toc243732544" w:history="1">
+      <w:hyperlink w:anchor="_Toc243733510" w:history="1">
         <w:r>
           <w:rPr>
             <w:rStyle w:val="Hipervnculo"/>
@@ -2891,7 +2891,7 @@
             <w:noProof/>
             <w:webHidden/>
           </w:rPr>
-          <w:instrText xml:space="preserve"> PAGEREF _Toc243732544 \h </w:instrText>
+          <w:instrText xml:space="preserve"> PAGEREF _Toc243733510 \h </w:instrText>
         </w:r>
         <w:r>
           <w:rPr>
@@ -2911,7 +2911,7 @@
             <w:noProof/>
             <w:webHidden/>
           </w:rPr>
-          <w:t>11</w:t>
+          <w:t>10</w:t>
         </w:r>
         <w:r>
           <w:rPr>
@@ -2936,7 +2936,7 @@
           <w14:ligatures w14:val="standardContextual"/>
         </w:rPr>
       </w:pPr>
-      <w:hyperlink w:anchor="_Toc243732545" w:history="1">
+      <w:hyperlink w:anchor="_Toc243733511" w:history="1">
         <w:r>
           <w:rPr>
             <w:rStyle w:val="Hipervnculo"/>
@@ -2963,7 +2963,7 @@
             <w:noProof/>
             <w:webHidden/>
           </w:rPr>
-          <w:instrText xml:space="preserve"> PAGEREF _Toc243732545 \h </w:instrText>
+          <w:instrText xml:space="preserve"> PAGEREF _Toc243733511 \h </w:instrText>
         </w:r>
         <w:r>
           <w:rPr>
@@ -2983,7 +2983,7 @@
             <w:noProof/>
             <w:webHidden/>
           </w:rPr>
-          <w:t>11</w:t>
+          <w:t>10</w:t>
         </w:r>
         <w:r>
           <w:rPr>
@@ -3008,7 +3008,7 @@
           <w14:ligatures w14:val="standardContextual"/>
         </w:rPr>
       </w:pPr>
-      <w:hyperlink w:anchor="_Toc243732546" w:history="1">
+      <w:hyperlink w:anchor="_Toc243733512" w:history="1">
         <w:r>
           <w:rPr>
             <w:rStyle w:val="Hipervnculo"/>
@@ -3051,7 +3051,7 @@
             <w:noProof/>
             <w:webHidden/>
           </w:rPr>
-          <w:instrText xml:space="preserve"> PAGEREF _Toc243732546 \h </w:instrText>
+          <w:instrText xml:space="preserve"> PAGEREF _Toc243733512 \h </w:instrText>
         </w:r>
         <w:r>
           <w:rPr>
@@ -3071,7 +3071,7 @@
             <w:noProof/>
             <w:webHidden/>
           </w:rPr>
-          <w:t>11</w:t>
+          <w:t>10</w:t>
         </w:r>
         <w:r>
           <w:rPr>
@@ -3096,7 +3096,7 @@
           <w14:ligatures w14:val="standardContextual"/>
         </w:rPr>
       </w:pPr>
-      <w:hyperlink w:anchor="_Toc243732547" w:history="1">
+      <w:hyperlink w:anchor="_Toc243733513" w:history="1">
         <w:r>
           <w:rPr>
             <w:rStyle w:val="Hipervnculo"/>
@@ -3123,7 +3123,7 @@
             <w:noProof/>
             <w:webHidden/>
           </w:rPr>
-          <w:instrText xml:space="preserve"> PAGEREF _Toc243732547 \h </w:instrText>
+          <w:instrText xml:space="preserve"> PAGEREF _Toc243733513 \h </w:instrText>
         </w:r>
         <w:r>
           <w:rPr>
@@ -3143,7 +3143,7 @@
             <w:noProof/>
             <w:webHidden/>
           </w:rPr>
-          <w:t>12</w:t>
+          <w:t>11</w:t>
         </w:r>
         <w:r>
           <w:rPr>
@@ -3168,7 +3168,7 @@
           <w14:ligatures w14:val="standardContextual"/>
         </w:rPr>
       </w:pPr>
-      <w:hyperlink w:anchor="_Toc243732548" w:history="1">
+      <w:hyperlink w:anchor="_Toc243733514" w:history="1">
         <w:r>
           <w:rPr>
             <w:rStyle w:val="Hipervnculo"/>
@@ -3195,7 +3195,7 @@
             <w:noProof/>
             <w:webHidden/>
           </w:rPr>
-          <w:instrText xml:space="preserve"> PAGEREF _Toc243732548 \h </w:instrText>
+          <w:instrText xml:space="preserve"> PAGEREF _Toc243733514 \h </w:instrText>
         </w:r>
         <w:r>
           <w:rPr>
@@ -3215,7 +3215,7 @@
             <w:noProof/>
             <w:webHidden/>
           </w:rPr>
-          <w:t>13</w:t>
+          <w:t>12</w:t>
         </w:r>
         <w:r>
           <w:rPr>
@@ -3240,7 +3240,7 @@
           <w14:ligatures w14:val="standardContextual"/>
         </w:rPr>
       </w:pPr>
-      <w:hyperlink w:anchor="_Toc243732549" w:history="1">
+      <w:hyperlink w:anchor="_Toc243733515" w:history="1">
         <w:r>
           <w:rPr>
             <w:rStyle w:val="Hipervnculo"/>
@@ -3267,7 +3267,7 @@
             <w:noProof/>
             <w:webHidden/>
           </w:rPr>
-          <w:instrText xml:space="preserve"> PAGEREF _Toc243732549 \h </w:instrText>
+          <w:instrText xml:space="preserve"> PAGEREF _Toc243733515 \h </w:instrText>
         </w:r>
         <w:r>
           <w:rPr>
@@ -3287,7 +3287,7 @@
             <w:noProof/>
             <w:webHidden/>
           </w:rPr>
-          <w:t>15</w:t>
+          <w:t>14</w:t>
         </w:r>
         <w:r>
           <w:rPr>
@@ -3312,7 +3312,7 @@
           <w14:ligatures w14:val="standardContextual"/>
         </w:rPr>
       </w:pPr>
-      <w:hyperlink w:anchor="_Toc243732550" w:history="1">
+      <w:hyperlink w:anchor="_Toc243733516" w:history="1">
         <w:r>
           <w:rPr>
             <w:rStyle w:val="Hipervnculo"/>
@@ -3339,7 +3339,7 @@
             <w:noProof/>
             <w:webHidden/>
           </w:rPr>
-          <w:instrText xml:space="preserve"> PAGEREF _Toc243732550 \h </w:instrText>
+          <w:instrText xml:space="preserve"> PAGEREF _Toc243733516 \h </w:instrText>
         </w:r>
         <w:r>
           <w:rPr>
@@ -3359,7 +3359,7 @@
             <w:noProof/>
             <w:webHidden/>
           </w:rPr>
-          <w:t>16</w:t>
+          <w:t>15</w:t>
         </w:r>
         <w:r>
           <w:rPr>
@@ -3384,7 +3384,7 @@
           <w14:ligatures w14:val="standardContextual"/>
         </w:rPr>
       </w:pPr>
-      <w:hyperlink w:anchor="_Toc243732551" w:history="1">
+      <w:hyperlink w:anchor="_Toc243733517" w:history="1">
         <w:r>
           <w:rPr>
             <w:rStyle w:val="Hipervnculo"/>
@@ -3411,7 +3411,7 @@
             <w:noProof/>
             <w:webHidden/>
           </w:rPr>
-          <w:instrText xml:space="preserve"> PAGEREF _Toc243732551 \h </w:instrText>
+          <w:instrText xml:space="preserve"> PAGEREF _Toc243733517 \h </w:instrText>
         </w:r>
         <w:r>
           <w:rPr>
@@ -3431,7 +3431,7 @@
             <w:noProof/>
             <w:webHidden/>
           </w:rPr>
-          <w:t>16</w:t>
+          <w:t>15</w:t>
         </w:r>
         <w:r>
           <w:rPr>
@@ -3456,7 +3456,7 @@
           <w14:ligatures w14:val="standardContextual"/>
         </w:rPr>
       </w:pPr>
-      <w:hyperlink w:anchor="_Toc243732552" w:history="1">
+      <w:hyperlink w:anchor="_Toc243733518" w:history="1">
         <w:r>
           <w:rPr>
             <w:rStyle w:val="Hipervnculo"/>
@@ -3483,7 +3483,7 @@
             <w:noProof/>
             <w:webHidden/>
           </w:rPr>
-          <w:instrText xml:space="preserve"> PAGEREF _Toc243732552 \h </w:instrText>
+          <w:instrText xml:space="preserve"> PAGEREF _Toc243733518 \h </w:instrText>
         </w:r>
         <w:r>
           <w:rPr>
@@ -3503,7 +3503,7 @@
             <w:noProof/>
             <w:webHidden/>
           </w:rPr>
-          <w:t>16</w:t>
+          <w:t>15</w:t>
         </w:r>
         <w:r>
           <w:rPr>
@@ -3528,7 +3528,7 @@
           <w14:ligatures w14:val="standardContextual"/>
         </w:rPr>
       </w:pPr>
-      <w:hyperlink w:anchor="_Toc243732553" w:history="1">
+      <w:hyperlink w:anchor="_Toc243733519" w:history="1">
         <w:r>
           <w:rPr>
             <w:rStyle w:val="Hipervnculo"/>
@@ -3555,7 +3555,7 @@
             <w:noProof/>
             <w:webHidden/>
           </w:rPr>
-          <w:instrText xml:space="preserve"> PAGEREF _Toc243732553 \h </w:instrText>
+          <w:instrText xml:space="preserve"> PAGEREF _Toc243733519 \h </w:instrText>
         </w:r>
         <w:r>
           <w:rPr>
@@ -3575,7 +3575,7 @@
             <w:noProof/>
             <w:webHidden/>
           </w:rPr>
-          <w:t>17</w:t>
+          <w:t>16</w:t>
         </w:r>
         <w:r>
           <w:rPr>
@@ -3600,7 +3600,7 @@
           <w14:ligatures w14:val="standardContextual"/>
         </w:rPr>
       </w:pPr>
-      <w:hyperlink w:anchor="_Toc243732554" w:history="1">
+      <w:hyperlink w:anchor="_Toc243733520" w:history="1">
         <w:r>
           <w:rPr>
             <w:rStyle w:val="Hipervnculo"/>
@@ -3627,7 +3627,7 @@
             <w:noProof/>
             <w:webHidden/>
           </w:rPr>
-          <w:instrText xml:space="preserve"> PAGEREF _Toc243732554 \h </w:instrText>
+          <w:instrText xml:space="preserve"> PAGEREF _Toc243733520 \h </w:instrText>
         </w:r>
         <w:r>
           <w:rPr>
@@ -3647,7 +3647,7 @@
             <w:noProof/>
             <w:webHidden/>
           </w:rPr>
-          <w:t>19</w:t>
+          <w:t>18</w:t>
         </w:r>
         <w:r>
           <w:rPr>
@@ -3672,7 +3672,7 @@
           <w14:ligatures w14:val="standardContextual"/>
         </w:rPr>
       </w:pPr>
-      <w:hyperlink w:anchor="_Toc243732555" w:history="1">
+      <w:hyperlink w:anchor="_Toc243733521" w:history="1">
         <w:r>
           <w:rPr>
             <w:rStyle w:val="Hipervnculo"/>
@@ -3699,7 +3699,7 @@
             <w:noProof/>
             <w:webHidden/>
           </w:rPr>
-          <w:instrText xml:space="preserve"> PAGEREF _Toc243732555 \h </w:instrText>
+          <w:instrText xml:space="preserve"> PAGEREF _Toc243733521 \h </w:instrText>
         </w:r>
         <w:r>
           <w:rPr>
@@ -3719,7 +3719,7 @@
             <w:noProof/>
             <w:webHidden/>
           </w:rPr>
-          <w:t>19</w:t>
+          <w:t>18</w:t>
         </w:r>
         <w:r>
           <w:rPr>
@@ -3744,7 +3744,7 @@
           <w14:ligatures w14:val="standardContextual"/>
         </w:rPr>
       </w:pPr>
-      <w:hyperlink w:anchor="_Toc243732556" w:history="1">
+      <w:hyperlink w:anchor="_Toc243733522" w:history="1">
         <w:r>
           <w:rPr>
             <w:rStyle w:val="Hipervnculo"/>
@@ -3771,7 +3771,7 @@
             <w:noProof/>
             <w:webHidden/>
           </w:rPr>
-          <w:instrText xml:space="preserve"> PAGEREF _Toc243732556 \h </w:instrText>
+          <w:instrText xml:space="preserve"> PAGEREF _Toc243733522 \h </w:instrText>
         </w:r>
         <w:r>
           <w:rPr>
@@ -3791,7 +3791,7 @@
             <w:noProof/>
             <w:webHidden/>
           </w:rPr>
-          <w:t>19</w:t>
+          <w:t>18</w:t>
         </w:r>
         <w:r>
           <w:rPr>
@@ -3816,7 +3816,7 @@
           <w14:ligatures w14:val="standardContextual"/>
         </w:rPr>
       </w:pPr>
-      <w:hyperlink w:anchor="_Toc243732557" w:history="1">
+      <w:hyperlink w:anchor="_Toc243733523" w:history="1">
         <w:r>
           <w:rPr>
             <w:rStyle w:val="Hipervnculo"/>
@@ -3843,7 +3843,7 @@
             <w:noProof/>
             <w:webHidden/>
           </w:rPr>
-          <w:instrText xml:space="preserve"> PAGEREF _Toc243732557 \h </w:instrText>
+          <w:instrText xml:space="preserve"> PAGEREF _Toc243733523 \h </w:instrText>
         </w:r>
         <w:r>
           <w:rPr>
@@ -3863,7 +3863,7 @@
             <w:noProof/>
             <w:webHidden/>
           </w:rPr>
-          <w:t>20</w:t>
+          <w:t>19</w:t>
         </w:r>
         <w:r>
           <w:rPr>
@@ -3888,7 +3888,7 @@
           <w14:ligatures w14:val="standardContextual"/>
         </w:rPr>
       </w:pPr>
-      <w:hyperlink w:anchor="_Toc243732558" w:history="1">
+      <w:hyperlink w:anchor="_Toc243733524" w:history="1">
         <w:r>
           <w:rPr>
             <w:rStyle w:val="Hipervnculo"/>
@@ -3915,7 +3915,7 @@
             <w:noProof/>
             <w:webHidden/>
           </w:rPr>
-          <w:instrText xml:space="preserve"> PAGEREF _Toc243732558 \h </w:instrText>
+          <w:instrText xml:space="preserve"> PAGEREF _Toc243733524 \h </w:instrText>
         </w:r>
         <w:r>
           <w:rPr>
@@ -3935,7 +3935,7 @@
             <w:noProof/>
             <w:webHidden/>
           </w:rPr>
-          <w:t>21</w:t>
+          <w:t>20</w:t>
         </w:r>
         <w:r>
           <w:rPr>
@@ -3960,7 +3960,7 @@
           <w14:ligatures w14:val="standardContextual"/>
         </w:rPr>
       </w:pPr>
-      <w:hyperlink w:anchor="_Toc243732559" w:history="1">
+      <w:hyperlink w:anchor="_Toc243733525" w:history="1">
         <w:r>
           <w:rPr>
             <w:rStyle w:val="Hipervnculo"/>
@@ -3987,7 +3987,7 @@
             <w:noProof/>
             <w:webHidden/>
           </w:rPr>
-          <w:instrText xml:space="preserve"> PAGEREF _Toc243732559 \h </w:instrText>
+          <w:instrText xml:space="preserve"> PAGEREF _Toc243733525 \h </w:instrText>
         </w:r>
         <w:r>
           <w:rPr>
@@ -4007,7 +4007,7 @@
             <w:noProof/>
             <w:webHidden/>
           </w:rPr>
-          <w:t>24</w:t>
+          <w:t>23</w:t>
         </w:r>
         <w:r>
           <w:rPr>
@@ -4032,7 +4032,7 @@
           <w14:ligatures w14:val="standardContextual"/>
         </w:rPr>
       </w:pPr>
-      <w:hyperlink w:anchor="_Toc243732560" w:history="1">
+      <w:hyperlink w:anchor="_Toc243733526" w:history="1">
         <w:r>
           <w:rPr>
             <w:rStyle w:val="Hipervnculo"/>
@@ -4059,7 +4059,7 @@
             <w:noProof/>
             <w:webHidden/>
           </w:rPr>
-          <w:instrText xml:space="preserve"> PAGEREF _Toc243732560 \h </w:instrText>
+          <w:instrText xml:space="preserve"> PAGEREF _Toc243733526 \h </w:instrText>
         </w:r>
         <w:r>
           <w:rPr>
@@ -4079,7 +4079,7 @@
             <w:noProof/>
             <w:webHidden/>
           </w:rPr>
-          <w:t>27</w:t>
+          <w:t>26</w:t>
         </w:r>
         <w:r>
           <w:rPr>
@@ -4104,7 +4104,7 @@
           <w14:ligatures w14:val="standardContextual"/>
         </w:rPr>
       </w:pPr>
-      <w:hyperlink w:anchor="_Toc243732561" w:history="1">
+      <w:hyperlink w:anchor="_Toc243733527" w:history="1">
         <w:r>
           <w:rPr>
             <w:rStyle w:val="Hipervnculo"/>
@@ -4131,7 +4131,7 @@
             <w:noProof/>
             <w:webHidden/>
           </w:rPr>
-          <w:instrText xml:space="preserve"> PAGEREF _Toc243732561 \h </w:instrText>
+          <w:instrText xml:space="preserve"> PAGEREF _Toc243733527 \h </w:instrText>
         </w:r>
         <w:r>
           <w:rPr>
@@ -4151,7 +4151,7 @@
             <w:noProof/>
             <w:webHidden/>
           </w:rPr>
-          <w:t>31</w:t>
+          <w:t>30</w:t>
         </w:r>
         <w:r>
           <w:rPr>
@@ -4176,7 +4176,7 @@
           <w14:ligatures w14:val="standardContextual"/>
         </w:rPr>
       </w:pPr>
-      <w:hyperlink w:anchor="_Toc243732562" w:history="1">
+      <w:hyperlink w:anchor="_Toc243733528" w:history="1">
         <w:r>
           <w:rPr>
             <w:rStyle w:val="Hipervnculo"/>
@@ -4203,7 +4203,7 @@
             <w:noProof/>
             <w:webHidden/>
           </w:rPr>
-          <w:instrText xml:space="preserve"> PAGEREF _Toc243732562 \h </w:instrText>
+          <w:instrText xml:space="preserve"> PAGEREF _Toc243733528 \h </w:instrText>
         </w:r>
         <w:r>
           <w:rPr>
@@ -4223,7 +4223,7 @@
             <w:noProof/>
             <w:webHidden/>
           </w:rPr>
-          <w:t>33</w:t>
+          <w:t>32</w:t>
         </w:r>
         <w:r>
           <w:rPr>
@@ -4248,7 +4248,7 @@
           <w14:ligatures w14:val="standardContextual"/>
         </w:rPr>
       </w:pPr>
-      <w:hyperlink w:anchor="_Toc243732563" w:history="1">
+      <w:hyperlink w:anchor="_Toc243733529" w:history="1">
         <w:r>
           <w:rPr>
             <w:rStyle w:val="Hipervnculo"/>
@@ -4275,7 +4275,7 @@
             <w:noProof/>
             <w:webHidden/>
           </w:rPr>
-          <w:instrText xml:space="preserve"> PAGEREF _Toc243732563 \h </w:instrText>
+          <w:instrText xml:space="preserve"> PAGEREF _Toc243733529 \h </w:instrText>
         </w:r>
         <w:r>
           <w:rPr>
@@ -4295,7 +4295,7 @@
             <w:noProof/>
             <w:webHidden/>
           </w:rPr>
-          <w:t>37</w:t>
+          <w:t>36</w:t>
         </w:r>
         <w:r>
           <w:rPr>
@@ -4320,7 +4320,7 @@
           <w14:ligatures w14:val="standardContextual"/>
         </w:rPr>
       </w:pPr>
-      <w:hyperlink w:anchor="_Toc243732564" w:history="1">
+      <w:hyperlink w:anchor="_Toc243733530" w:history="1">
         <w:r>
           <w:rPr>
             <w:rStyle w:val="Hipervnculo"/>
@@ -4347,7 +4347,7 @@
             <w:noProof/>
             <w:webHidden/>
           </w:rPr>
-          <w:instrText xml:space="preserve"> PAGEREF _Toc243732564 \h </w:instrText>
+          <w:instrText xml:space="preserve"> PAGEREF _Toc243733530 \h </w:instrText>
         </w:r>
         <w:r>
           <w:rPr>
@@ -4367,7 +4367,7 @@
             <w:noProof/>
             <w:webHidden/>
           </w:rPr>
-          <w:t>37</w:t>
+          <w:t>36</w:t>
         </w:r>
         <w:r>
           <w:rPr>
@@ -4392,7 +4392,7 @@
           <w14:ligatures w14:val="standardContextual"/>
         </w:rPr>
       </w:pPr>
-      <w:hyperlink w:anchor="_Toc243732565" w:history="1">
+      <w:hyperlink w:anchor="_Toc243733531" w:history="1">
         <w:r>
           <w:rPr>
             <w:rStyle w:val="Hipervnculo"/>
@@ -4419,7 +4419,7 @@
             <w:noProof/>
             <w:webHidden/>
           </w:rPr>
-          <w:instrText xml:space="preserve"> PAGEREF _Toc243732565 \h </w:instrText>
+          <w:instrText xml:space="preserve"> PAGEREF _Toc243733531 \h </w:instrText>
         </w:r>
         <w:r>
           <w:rPr>
@@ -4439,7 +4439,7 @@
             <w:noProof/>
             <w:webHidden/>
           </w:rPr>
-          <w:t>37</w:t>
+          <w:t>36</w:t>
         </w:r>
         <w:r>
           <w:rPr>
@@ -4464,7 +4464,7 @@
           <w14:ligatures w14:val="standardContextual"/>
         </w:rPr>
       </w:pPr>
-      <w:hyperlink w:anchor="_Toc243732566" w:history="1">
+      <w:hyperlink w:anchor="_Toc243733532" w:history="1">
         <w:r>
           <w:rPr>
             <w:rStyle w:val="Hipervnculo"/>
@@ -4500,7 +4500,7 @@
             <w:noProof/>
             <w:webHidden/>
           </w:rPr>
-          <w:instrText xml:space="preserve"> PAGEREF _Toc243732566 \h </w:instrText>
+          <w:instrText xml:space="preserve"> PAGEREF _Toc243733532 \h </w:instrText>
         </w:r>
         <w:r>
           <w:rPr>
@@ -4520,7 +4520,7 @@
             <w:noProof/>
             <w:webHidden/>
           </w:rPr>
-          <w:t>38</w:t>
+          <w:t>37</w:t>
         </w:r>
         <w:r>
           <w:rPr>
@@ -4545,7 +4545,7 @@
           <w14:ligatures w14:val="standardContextual"/>
         </w:rPr>
       </w:pPr>
-      <w:hyperlink w:anchor="_Toc243732567" w:history="1">
+      <w:hyperlink w:anchor="_Toc243733533" w:history="1">
         <w:r>
           <w:rPr>
             <w:rStyle w:val="Hipervnculo"/>
@@ -4572,7 +4572,7 @@
             <w:noProof/>
             <w:webHidden/>
           </w:rPr>
-          <w:instrText xml:space="preserve"> PAGEREF _Toc243732567 \h </w:instrText>
+          <w:instrText xml:space="preserve"> PAGEREF _Toc243733533 \h </w:instrText>
         </w:r>
         <w:r>
           <w:rPr>
@@ -4592,7 +4592,7 @@
             <w:noProof/>
             <w:webHidden/>
           </w:rPr>
-          <w:t>39</w:t>
+          <w:t>38</w:t>
         </w:r>
         <w:r>
           <w:rPr>
@@ -4617,7 +4617,7 @@
           <w14:ligatures w14:val="standardContextual"/>
         </w:rPr>
       </w:pPr>
-      <w:hyperlink w:anchor="_Toc243732568" w:history="1">
+      <w:hyperlink w:anchor="_Toc243733534" w:history="1">
         <w:r>
           <w:rPr>
             <w:rStyle w:val="Hipervnculo"/>
@@ -4644,7 +4644,7 @@
             <w:noProof/>
             <w:webHidden/>
           </w:rPr>
-          <w:instrText xml:space="preserve"> PAGEREF _Toc243732568 \h </w:instrText>
+          <w:instrText xml:space="preserve"> PAGEREF _Toc243733534 \h </w:instrText>
         </w:r>
         <w:r>
           <w:rPr>
@@ -4664,7 +4664,7 @@
             <w:noProof/>
             <w:webHidden/>
           </w:rPr>
-          <w:t>40</w:t>
+          <w:t>39</w:t>
         </w:r>
         <w:r>
           <w:rPr>
@@ -4689,7 +4689,7 @@
           <w14:ligatures w14:val="standardContextual"/>
         </w:rPr>
       </w:pPr>
-      <w:hyperlink w:anchor="_Toc243732569" w:history="1">
+      <w:hyperlink w:anchor="_Toc243733535" w:history="1">
         <w:r>
           <w:rPr>
             <w:rStyle w:val="Hipervnculo"/>
@@ -4716,7 +4716,7 @@
             <w:noProof/>
             <w:webHidden/>
           </w:rPr>
-          <w:instrText xml:space="preserve"> PAGEREF _Toc243732569 \h </w:instrText>
+          <w:instrText xml:space="preserve"> PAGEREF _Toc243733535 \h </w:instrText>
         </w:r>
         <w:r>
           <w:rPr>
@@ -4736,7 +4736,7 @@
             <w:noProof/>
             <w:webHidden/>
           </w:rPr>
-          <w:t>41</w:t>
+          <w:t>40</w:t>
         </w:r>
         <w:r>
           <w:rPr>
@@ -4761,7 +4761,7 @@
           <w14:ligatures w14:val="standardContextual"/>
         </w:rPr>
       </w:pPr>
-      <w:hyperlink w:anchor="_Toc243732570" w:history="1">
+      <w:hyperlink w:anchor="_Toc243733536" w:history="1">
         <w:r>
           <w:rPr>
             <w:rStyle w:val="Hipervnculo"/>
@@ -4788,7 +4788,7 @@
             <w:noProof/>
             <w:webHidden/>
           </w:rPr>
-          <w:instrText xml:space="preserve"> PAGEREF _Toc243732570 \h </w:instrText>
+          <w:instrText xml:space="preserve"> PAGEREF _Toc243733536 \h </w:instrText>
         </w:r>
         <w:r>
           <w:rPr>
@@ -4808,7 +4808,7 @@
             <w:noProof/>
             <w:webHidden/>
           </w:rPr>
-          <w:t>41</w:t>
+          <w:t>40</w:t>
         </w:r>
         <w:r>
           <w:rPr>
@@ -4833,7 +4833,7 @@
           <w14:ligatures w14:val="standardContextual"/>
         </w:rPr>
       </w:pPr>
-      <w:hyperlink w:anchor="_Toc243732571" w:history="1">
+      <w:hyperlink w:anchor="_Toc243733537" w:history="1">
         <w:r>
           <w:rPr>
             <w:rStyle w:val="Hipervnculo"/>
@@ -4860,7 +4860,7 @@
             <w:noProof/>
             <w:webHidden/>
           </w:rPr>
-          <w:instrText xml:space="preserve"> PAGEREF _Toc243732571 \h </w:instrText>
+          <w:instrText xml:space="preserve"> PAGEREF _Toc243733537 \h </w:instrText>
         </w:r>
         <w:r>
           <w:rPr>
@@ -4880,7 +4880,7 @@
             <w:noProof/>
             <w:webHidden/>
           </w:rPr>
-          <w:t>42</w:t>
+          <w:t>41</w:t>
         </w:r>
         <w:r>
           <w:rPr>
@@ -4905,7 +4905,7 @@
           <w14:ligatures w14:val="standardContextual"/>
         </w:rPr>
       </w:pPr>
-      <w:hyperlink w:anchor="_Toc243732572" w:history="1">
+      <w:hyperlink w:anchor="_Toc243733538" w:history="1">
         <w:r>
           <w:rPr>
             <w:rStyle w:val="Hipervnculo"/>
@@ -4932,7 +4932,7 @@
             <w:noProof/>
             <w:webHidden/>
           </w:rPr>
-          <w:instrText xml:space="preserve"> PAGEREF _Toc243732572 \h </w:instrText>
+          <w:instrText xml:space="preserve"> PAGEREF _Toc243733538 \h </w:instrText>
         </w:r>
         <w:r>
           <w:rPr>
@@ -4952,7 +4952,7 @@
             <w:noProof/>
             <w:webHidden/>
           </w:rPr>
-          <w:t>43</w:t>
+          <w:t>42</w:t>
         </w:r>
         <w:r>
           <w:rPr>
@@ -4977,7 +4977,7 @@
           <w14:ligatures w14:val="standardContextual"/>
         </w:rPr>
       </w:pPr>
-      <w:hyperlink w:anchor="_Toc243732573" w:history="1">
+      <w:hyperlink w:anchor="_Toc243733539" w:history="1">
         <w:r>
           <w:rPr>
             <w:rStyle w:val="Hipervnculo"/>
@@ -5004,7 +5004,7 @@
             <w:noProof/>
             <w:webHidden/>
           </w:rPr>
-          <w:instrText xml:space="preserve"> PAGEREF _Toc243732573 \h </w:instrText>
+          <w:instrText xml:space="preserve"> PAGEREF _Toc243733539 \h </w:instrText>
         </w:r>
         <w:r>
           <w:rPr>
@@ -5024,7 +5024,7 @@
             <w:noProof/>
             <w:webHidden/>
           </w:rPr>
-          <w:t>44</w:t>
+          <w:t>43</w:t>
         </w:r>
         <w:r>
           <w:rPr>
@@ -5049,7 +5049,7 @@
           <w14:ligatures w14:val="standardContextual"/>
         </w:rPr>
       </w:pPr>
-      <w:hyperlink w:anchor="_Toc243732574" w:history="1">
+      <w:hyperlink w:anchor="_Toc243733540" w:history="1">
         <w:r>
           <w:rPr>
             <w:rStyle w:val="Hipervnculo"/>
@@ -5076,7 +5076,7 @@
             <w:noProof/>
             <w:webHidden/>
           </w:rPr>
-          <w:instrText xml:space="preserve"> PAGEREF _Toc243732574 \h </w:instrText>
+          <w:instrText xml:space="preserve"> PAGEREF _Toc243733540 \h </w:instrText>
         </w:r>
         <w:r>
           <w:rPr>
@@ -5096,7 +5096,7 @@
             <w:noProof/>
             <w:webHidden/>
           </w:rPr>
-          <w:t>44</w:t>
+          <w:t>43</w:t>
         </w:r>
         <w:r>
           <w:rPr>
@@ -5121,7 +5121,7 @@
           <w14:ligatures w14:val="standardContextual"/>
         </w:rPr>
       </w:pPr>
-      <w:hyperlink w:anchor="_Toc243732575" w:history="1">
+      <w:hyperlink w:anchor="_Toc243733541" w:history="1">
         <w:r>
           <w:rPr>
             <w:rStyle w:val="Hipervnculo"/>
@@ -5148,7 +5148,7 @@
             <w:noProof/>
             <w:webHidden/>
           </w:rPr>
-          <w:instrText xml:space="preserve"> PAGEREF _Toc243732575 \h </w:instrText>
+          <w:instrText xml:space="preserve"> PAGEREF _Toc243733541 \h </w:instrText>
         </w:r>
         <w:r>
           <w:rPr>
@@ -5168,7 +5168,7 @@
             <w:noProof/>
             <w:webHidden/>
           </w:rPr>
-          <w:t>44</w:t>
+          <w:t>43</w:t>
         </w:r>
         <w:r>
           <w:rPr>
@@ -5193,7 +5193,7 @@
           <w14:ligatures w14:val="standardContextual"/>
         </w:rPr>
       </w:pPr>
-      <w:hyperlink w:anchor="_Toc243732576" w:history="1">
+      <w:hyperlink w:anchor="_Toc243733542" w:history="1">
         <w:r>
           <w:rPr>
             <w:rStyle w:val="Hipervnculo"/>
@@ -5220,7 +5220,7 @@
             <w:noProof/>
             <w:webHidden/>
           </w:rPr>
-          <w:instrText xml:space="preserve"> PAGEREF _Toc243732576 \h </w:instrText>
+          <w:instrText xml:space="preserve"> PAGEREF _Toc243733542 \h </w:instrText>
         </w:r>
         <w:r>
           <w:rPr>
@@ -5240,7 +5240,7 @@
             <w:noProof/>
             <w:webHidden/>
           </w:rPr>
-          <w:t>46</w:t>
+          <w:t>45</w:t>
         </w:r>
         <w:r>
           <w:rPr>
@@ -5291,7 +5291,7 @@
       <w:r>
         <w:fldChar w:fldCharType="separate"/>
       </w:r>
-      <w:hyperlink w:anchor="_Toc243732577" w:history="1">
+      <w:hyperlink w:anchor="_Toc243733543" w:history="1">
         <w:r>
           <w:rPr>
             <w:rStyle w:val="Hipervnculo"/>
@@ -5318,7 +5318,7 @@
             <w:noProof/>
             <w:webHidden/>
           </w:rPr>
-          <w:instrText xml:space="preserve"> PAGEREF _Toc243732577 \h </w:instrText>
+          <w:instrText xml:space="preserve"> PAGEREF _Toc243733543 \h </w:instrText>
         </w:r>
         <w:r>
           <w:rPr>
@@ -5338,7 +5338,7 @@
             <w:noProof/>
             <w:webHidden/>
           </w:rPr>
-          <w:t>8</w:t>
+          <w:t>7</w:t>
         </w:r>
         <w:r>
           <w:rPr>
@@ -5363,7 +5363,7 @@
           <w14:ligatures w14:val="standardContextual"/>
         </w:rPr>
       </w:pPr>
-      <w:hyperlink w:anchor="_Toc243732578" w:history="1">
+      <w:hyperlink w:anchor="_Toc243733544" w:history="1">
         <w:r>
           <w:rPr>
             <w:rStyle w:val="Hipervnculo"/>
@@ -5390,7 +5390,7 @@
             <w:noProof/>
             <w:webHidden/>
           </w:rPr>
-          <w:instrText xml:space="preserve"> PAGEREF _Toc243732578 \h </w:instrText>
+          <w:instrText xml:space="preserve"> PAGEREF _Toc243733544 \h </w:instrText>
         </w:r>
         <w:r>
           <w:rPr>
@@ -5410,7 +5410,7 @@
             <w:noProof/>
             <w:webHidden/>
           </w:rPr>
-          <w:t>10</w:t>
+          <w:t>9</w:t>
         </w:r>
         <w:r>
           <w:rPr>
@@ -5435,7 +5435,7 @@
           <w14:ligatures w14:val="standardContextual"/>
         </w:rPr>
       </w:pPr>
-      <w:hyperlink w:anchor="_Toc243732579" w:history="1">
+      <w:hyperlink w:anchor="_Toc243733545" w:history="1">
         <w:r>
           <w:rPr>
             <w:rStyle w:val="Hipervnculo"/>
@@ -5462,7 +5462,7 @@
             <w:noProof/>
             <w:webHidden/>
           </w:rPr>
-          <w:instrText xml:space="preserve"> PAGEREF _Toc243732579 \h </w:instrText>
+          <w:instrText xml:space="preserve"> PAGEREF _Toc243733545 \h </w:instrText>
         </w:r>
         <w:r>
           <w:rPr>
@@ -5482,7 +5482,7 @@
             <w:noProof/>
             <w:webHidden/>
           </w:rPr>
-          <w:t>12</w:t>
+          <w:t>11</w:t>
         </w:r>
         <w:r>
           <w:rPr>
@@ -5507,7 +5507,7 @@
           <w14:ligatures w14:val="standardContextual"/>
         </w:rPr>
       </w:pPr>
-      <w:hyperlink w:anchor="_Toc243732580" w:history="1">
+      <w:hyperlink w:anchor="_Toc243733546" w:history="1">
         <w:r>
           <w:rPr>
             <w:rStyle w:val="Hipervnculo"/>
@@ -5534,7 +5534,7 @@
             <w:noProof/>
             <w:webHidden/>
           </w:rPr>
-          <w:instrText xml:space="preserve"> PAGEREF _Toc243732580 \h </w:instrText>
+          <w:instrText xml:space="preserve"> PAGEREF _Toc243733546 \h </w:instrText>
         </w:r>
         <w:r>
           <w:rPr>
@@ -5554,7 +5554,7 @@
             <w:noProof/>
             <w:webHidden/>
           </w:rPr>
-          <w:t>13</w:t>
+          <w:t>12</w:t>
         </w:r>
         <w:r>
           <w:rPr>
@@ -5579,7 +5579,7 @@
           <w14:ligatures w14:val="standardContextual"/>
         </w:rPr>
       </w:pPr>
-      <w:hyperlink w:anchor="_Toc243732581" w:history="1">
+      <w:hyperlink w:anchor="_Toc243733547" w:history="1">
         <w:r>
           <w:rPr>
             <w:rStyle w:val="Hipervnculo"/>
@@ -5606,7 +5606,7 @@
             <w:noProof/>
             <w:webHidden/>
           </w:rPr>
-          <w:instrText xml:space="preserve"> PAGEREF _Toc243732581 \h </w:instrText>
+          <w:instrText xml:space="preserve"> PAGEREF _Toc243733547 \h </w:instrText>
         </w:r>
         <w:r>
           <w:rPr>
@@ -5626,7 +5626,7 @@
             <w:noProof/>
             <w:webHidden/>
           </w:rPr>
-          <w:t>13</w:t>
+          <w:t>12</w:t>
         </w:r>
         <w:r>
           <w:rPr>
@@ -5651,7 +5651,7 @@
           <w14:ligatures w14:val="standardContextual"/>
         </w:rPr>
       </w:pPr>
-      <w:hyperlink w:anchor="_Toc243732582" w:history="1">
+      <w:hyperlink w:anchor="_Toc243733548" w:history="1">
         <w:r>
           <w:rPr>
             <w:rStyle w:val="Hipervnculo"/>
@@ -5678,7 +5678,7 @@
             <w:noProof/>
             <w:webHidden/>
           </w:rPr>
-          <w:instrText xml:space="preserve"> PAGEREF _Toc243732582 \h </w:instrText>
+          <w:instrText xml:space="preserve"> PAGEREF _Toc243733548 \h </w:instrText>
         </w:r>
         <w:r>
           <w:rPr>
@@ -5698,7 +5698,7 @@
             <w:noProof/>
             <w:webHidden/>
           </w:rPr>
-          <w:t>14</w:t>
+          <w:t>13</w:t>
         </w:r>
         <w:r>
           <w:rPr>
@@ -5723,7 +5723,7 @@
           <w14:ligatures w14:val="standardContextual"/>
         </w:rPr>
       </w:pPr>
-      <w:hyperlink w:anchor="_Toc243732583" w:history="1">
+      <w:hyperlink w:anchor="_Toc243733549" w:history="1">
         <w:r>
           <w:rPr>
             <w:rStyle w:val="Hipervnculo"/>
@@ -5750,7 +5750,7 @@
             <w:noProof/>
             <w:webHidden/>
           </w:rPr>
-          <w:instrText xml:space="preserve"> PAGEREF _Toc243732583 \h </w:instrText>
+          <w:instrText xml:space="preserve"> PAGEREF _Toc243733549 \h </w:instrText>
         </w:r>
         <w:r>
           <w:rPr>
@@ -5770,7 +5770,7 @@
             <w:noProof/>
             <w:webHidden/>
           </w:rPr>
-          <w:t>15</w:t>
+          <w:t>14</w:t>
         </w:r>
         <w:r>
           <w:rPr>
@@ -5795,7 +5795,7 @@
           <w14:ligatures w14:val="standardContextual"/>
         </w:rPr>
       </w:pPr>
-      <w:hyperlink w:anchor="_Toc243732584" w:history="1">
+      <w:hyperlink w:anchor="_Toc243733550" w:history="1">
         <w:r>
           <w:rPr>
             <w:rStyle w:val="Hipervnculo"/>
@@ -5822,7 +5822,7 @@
             <w:noProof/>
             <w:webHidden/>
           </w:rPr>
-          <w:instrText xml:space="preserve"> PAGEREF _Toc243732584 \h </w:instrText>
+          <w:instrText xml:space="preserve"> PAGEREF _Toc243733550 \h </w:instrText>
         </w:r>
         <w:r>
           <w:rPr>
@@ -5842,7 +5842,7 @@
             <w:noProof/>
             <w:webHidden/>
           </w:rPr>
-          <w:t>19</w:t>
+          <w:t>18</w:t>
         </w:r>
         <w:r>
           <w:rPr>
@@ -5867,7 +5867,7 @@
           <w14:ligatures w14:val="standardContextual"/>
         </w:rPr>
       </w:pPr>
-      <w:hyperlink w:anchor="_Toc243732585" w:history="1">
+      <w:hyperlink w:anchor="_Toc243733551" w:history="1">
         <w:r>
           <w:rPr>
             <w:rStyle w:val="Hipervnculo"/>
@@ -5894,7 +5894,7 @@
             <w:noProof/>
             <w:webHidden/>
           </w:rPr>
-          <w:instrText xml:space="preserve"> PAGEREF _Toc243732585 \h </w:instrText>
+          <w:instrText xml:space="preserve"> PAGEREF _Toc243733551 \h </w:instrText>
         </w:r>
         <w:r>
           <w:rPr>
@@ -5914,7 +5914,7 @@
             <w:noProof/>
             <w:webHidden/>
           </w:rPr>
-          <w:t>20</w:t>
+          <w:t>19</w:t>
         </w:r>
         <w:r>
           <w:rPr>
@@ -5939,7 +5939,7 @@
           <w14:ligatures w14:val="standardContextual"/>
         </w:rPr>
       </w:pPr>
-      <w:hyperlink w:anchor="_Toc243732586" w:history="1">
+      <w:hyperlink w:anchor="_Toc243733552" w:history="1">
         <w:r>
           <w:rPr>
             <w:rStyle w:val="Hipervnculo"/>
@@ -5966,7 +5966,7 @@
             <w:noProof/>
             <w:webHidden/>
           </w:rPr>
-          <w:instrText xml:space="preserve"> PAGEREF _Toc243732586 \h </w:instrText>
+          <w:instrText xml:space="preserve"> PAGEREF _Toc243733552 \h </w:instrText>
         </w:r>
         <w:r>
           <w:rPr>
@@ -5986,7 +5986,7 @@
             <w:noProof/>
             <w:webHidden/>
           </w:rPr>
-          <w:t>20</w:t>
+          <w:t>19</w:t>
         </w:r>
         <w:r>
           <w:rPr>
@@ -6011,7 +6011,7 @@
           <w14:ligatures w14:val="standardContextual"/>
         </w:rPr>
       </w:pPr>
-      <w:hyperlink w:anchor="_Toc243732587" w:history="1">
+      <w:hyperlink w:anchor="_Toc243733553" w:history="1">
         <w:r>
           <w:rPr>
             <w:rStyle w:val="Hipervnculo"/>
@@ -6038,7 +6038,7 @@
             <w:noProof/>
             <w:webHidden/>
           </w:rPr>
-          <w:instrText xml:space="preserve"> PAGEREF _Toc243732587 \h </w:instrText>
+          <w:instrText xml:space="preserve"> PAGEREF _Toc243733553 \h </w:instrText>
         </w:r>
         <w:r>
           <w:rPr>
@@ -6058,7 +6058,7 @@
             <w:noProof/>
             <w:webHidden/>
           </w:rPr>
-          <w:t>21</w:t>
+          <w:t>20</w:t>
         </w:r>
         <w:r>
           <w:rPr>
@@ -6083,7 +6083,7 @@
           <w14:ligatures w14:val="standardContextual"/>
         </w:rPr>
       </w:pPr>
-      <w:hyperlink w:anchor="_Toc243732588" w:history="1">
+      <w:hyperlink w:anchor="_Toc243733554" w:history="1">
         <w:r>
           <w:rPr>
             <w:rStyle w:val="Hipervnculo"/>
@@ -6110,7 +6110,7 @@
             <w:noProof/>
             <w:webHidden/>
           </w:rPr>
-          <w:instrText xml:space="preserve"> PAGEREF _Toc243732588 \h </w:instrText>
+          <w:instrText xml:space="preserve"> PAGEREF _Toc243733554 \h </w:instrText>
         </w:r>
         <w:r>
           <w:rPr>
@@ -6130,7 +6130,7 @@
             <w:noProof/>
             <w:webHidden/>
           </w:rPr>
-          <w:t>23</w:t>
+          <w:t>22</w:t>
         </w:r>
         <w:r>
           <w:rPr>
@@ -6155,7 +6155,7 @@
           <w14:ligatures w14:val="standardContextual"/>
         </w:rPr>
       </w:pPr>
-      <w:hyperlink w:anchor="_Toc243732589" w:history="1">
+      <w:hyperlink w:anchor="_Toc243733555" w:history="1">
         <w:r>
           <w:rPr>
             <w:rStyle w:val="Hipervnculo"/>
@@ -6182,7 +6182,7 @@
             <w:noProof/>
             <w:webHidden/>
           </w:rPr>
-          <w:instrText xml:space="preserve"> PAGEREF _Toc243732589 \h </w:instrText>
+          <w:instrText xml:space="preserve"> PAGEREF _Toc243733555 \h </w:instrText>
         </w:r>
         <w:r>
           <w:rPr>
@@ -6202,7 +6202,7 @@
             <w:noProof/>
             <w:webHidden/>
           </w:rPr>
-          <w:t>24</w:t>
+          <w:t>23</w:t>
         </w:r>
         <w:r>
           <w:rPr>
@@ -6227,7 +6227,7 @@
           <w14:ligatures w14:val="standardContextual"/>
         </w:rPr>
       </w:pPr>
-      <w:hyperlink w:anchor="_Toc243732590" w:history="1">
+      <w:hyperlink w:anchor="_Toc243733556" w:history="1">
         <w:r>
           <w:rPr>
             <w:rStyle w:val="Hipervnculo"/>
@@ -6254,7 +6254,7 @@
             <w:noProof/>
             <w:webHidden/>
           </w:rPr>
-          <w:instrText xml:space="preserve"> PAGEREF _Toc243732590 \h </w:instrText>
+          <w:instrText xml:space="preserve"> PAGEREF _Toc243733556 \h </w:instrText>
         </w:r>
         <w:r>
           <w:rPr>
@@ -6274,7 +6274,7 @@
             <w:noProof/>
             <w:webHidden/>
           </w:rPr>
-          <w:t>25</w:t>
+          <w:t>24</w:t>
         </w:r>
         <w:r>
           <w:rPr>
@@ -6299,7 +6299,7 @@
           <w14:ligatures w14:val="standardContextual"/>
         </w:rPr>
       </w:pPr>
-      <w:hyperlink w:anchor="_Toc243732591" w:history="1">
+      <w:hyperlink w:anchor="_Toc243733557" w:history="1">
         <w:r>
           <w:rPr>
             <w:rStyle w:val="Hipervnculo"/>
@@ -6326,7 +6326,7 @@
             <w:noProof/>
             <w:webHidden/>
           </w:rPr>
-          <w:instrText xml:space="preserve"> PAGEREF _Toc243732591 \h </w:instrText>
+          <w:instrText xml:space="preserve"> PAGEREF _Toc243733557 \h </w:instrText>
         </w:r>
         <w:r>
           <w:rPr>
@@ -6346,7 +6346,7 @@
             <w:noProof/>
             <w:webHidden/>
           </w:rPr>
-          <w:t>27</w:t>
+          <w:t>26</w:t>
         </w:r>
         <w:r>
           <w:rPr>
@@ -6371,7 +6371,7 @@
           <w14:ligatures w14:val="standardContextual"/>
         </w:rPr>
       </w:pPr>
-      <w:hyperlink w:anchor="_Toc243732592" w:history="1">
+      <w:hyperlink w:anchor="_Toc243733558" w:history="1">
         <w:r>
           <w:rPr>
             <w:rStyle w:val="Hipervnculo"/>
@@ -6398,7 +6398,7 @@
             <w:noProof/>
             <w:webHidden/>
           </w:rPr>
-          <w:instrText xml:space="preserve"> PAGEREF _Toc243732592 \h </w:instrText>
+          <w:instrText xml:space="preserve"> PAGEREF _Toc243733558 \h </w:instrText>
         </w:r>
         <w:r>
           <w:rPr>
@@ -6418,7 +6418,7 @@
             <w:noProof/>
             <w:webHidden/>
           </w:rPr>
-          <w:t>29</w:t>
+          <w:t>28</w:t>
         </w:r>
         <w:r>
           <w:rPr>
@@ -6443,7 +6443,7 @@
           <w14:ligatures w14:val="standardContextual"/>
         </w:rPr>
       </w:pPr>
-      <w:hyperlink w:anchor="_Toc243732593" w:history="1">
+      <w:hyperlink w:anchor="_Toc243733559" w:history="1">
         <w:r>
           <w:rPr>
             <w:rStyle w:val="Hipervnculo"/>
@@ -6470,7 +6470,7 @@
             <w:noProof/>
             <w:webHidden/>
           </w:rPr>
-          <w:instrText xml:space="preserve"> PAGEREF _Toc243732593 \h </w:instrText>
+          <w:instrText xml:space="preserve"> PAGEREF _Toc243733559 \h </w:instrText>
         </w:r>
         <w:r>
           <w:rPr>
@@ -6490,7 +6490,7 @@
             <w:noProof/>
             <w:webHidden/>
           </w:rPr>
-          <w:t>29</w:t>
+          <w:t>28</w:t>
         </w:r>
         <w:r>
           <w:rPr>
@@ -6515,7 +6515,7 @@
           <w14:ligatures w14:val="standardContextual"/>
         </w:rPr>
       </w:pPr>
-      <w:hyperlink w:anchor="_Toc243732594" w:history="1">
+      <w:hyperlink w:anchor="_Toc243733560" w:history="1">
         <w:r>
           <w:rPr>
             <w:rStyle w:val="Hipervnculo"/>
@@ -6542,7 +6542,7 @@
             <w:noProof/>
             <w:webHidden/>
           </w:rPr>
-          <w:instrText xml:space="preserve"> PAGEREF _Toc243732594 \h </w:instrText>
+          <w:instrText xml:space="preserve"> PAGEREF _Toc243733560 \h </w:instrText>
         </w:r>
         <w:r>
           <w:rPr>
@@ -6562,7 +6562,7 @@
             <w:noProof/>
             <w:webHidden/>
           </w:rPr>
-          <w:t>30</w:t>
+          <w:t>29</w:t>
         </w:r>
         <w:r>
           <w:rPr>
@@ -6587,7 +6587,7 @@
           <w14:ligatures w14:val="standardContextual"/>
         </w:rPr>
       </w:pPr>
-      <w:hyperlink w:anchor="_Toc243732595" w:history="1">
+      <w:hyperlink w:anchor="_Toc243733561" w:history="1">
         <w:r>
           <w:rPr>
             <w:rStyle w:val="Hipervnculo"/>
@@ -6614,7 +6614,7 @@
             <w:noProof/>
             <w:webHidden/>
           </w:rPr>
-          <w:instrText xml:space="preserve"> PAGEREF _Toc243732595 \h </w:instrText>
+          <w:instrText xml:space="preserve"> PAGEREF _Toc243733561 \h </w:instrText>
         </w:r>
         <w:r>
           <w:rPr>
@@ -6634,7 +6634,7 @@
             <w:noProof/>
             <w:webHidden/>
           </w:rPr>
-          <w:t>30</w:t>
+          <w:t>29</w:t>
         </w:r>
         <w:r>
           <w:rPr>
@@ -6659,7 +6659,7 @@
           <w14:ligatures w14:val="standardContextual"/>
         </w:rPr>
       </w:pPr>
-      <w:hyperlink w:anchor="_Toc243732596" w:history="1">
+      <w:hyperlink w:anchor="_Toc243733562" w:history="1">
         <w:r>
           <w:rPr>
             <w:rStyle w:val="Hipervnculo"/>
@@ -6686,7 +6686,7 @@
             <w:noProof/>
             <w:webHidden/>
           </w:rPr>
-          <w:instrText xml:space="preserve"> PAGEREF _Toc243732596 \h </w:instrText>
+          <w:instrText xml:space="preserve"> PAGEREF _Toc243733562 \h </w:instrText>
         </w:r>
         <w:r>
           <w:rPr>
@@ -6706,7 +6706,7 @@
             <w:noProof/>
             <w:webHidden/>
           </w:rPr>
-          <w:t>32</w:t>
+          <w:t>31</w:t>
         </w:r>
         <w:r>
           <w:rPr>
@@ -6731,7 +6731,7 @@
           <w14:ligatures w14:val="standardContextual"/>
         </w:rPr>
       </w:pPr>
-      <w:hyperlink w:anchor="_Toc243732597" w:history="1">
+      <w:hyperlink w:anchor="_Toc243733563" w:history="1">
         <w:r>
           <w:rPr>
             <w:rStyle w:val="Hipervnculo"/>
@@ -6758,7 +6758,7 @@
             <w:noProof/>
             <w:webHidden/>
           </w:rPr>
-          <w:instrText xml:space="preserve"> PAGEREF _Toc243732597 \h </w:instrText>
+          <w:instrText xml:space="preserve"> PAGEREF _Toc243733563 \h </w:instrText>
         </w:r>
         <w:r>
           <w:rPr>
@@ -6778,7 +6778,7 @@
             <w:noProof/>
             <w:webHidden/>
           </w:rPr>
-          <w:t>33</w:t>
+          <w:t>32</w:t>
         </w:r>
         <w:r>
           <w:rPr>
@@ -6803,7 +6803,7 @@
           <w14:ligatures w14:val="standardContextual"/>
         </w:rPr>
       </w:pPr>
-      <w:hyperlink w:anchor="_Toc243732598" w:history="1">
+      <w:hyperlink w:anchor="_Toc243733564" w:history="1">
         <w:r>
           <w:rPr>
             <w:rStyle w:val="Hipervnculo"/>
@@ -6830,7 +6830,7 @@
             <w:noProof/>
             <w:webHidden/>
           </w:rPr>
-          <w:instrText xml:space="preserve"> PAGEREF _Toc243732598 \h </w:instrText>
+          <w:instrText xml:space="preserve"> PAGEREF _Toc243733564 \h </w:instrText>
         </w:r>
         <w:r>
           <w:rPr>
@@ -6850,7 +6850,7 @@
             <w:noProof/>
             <w:webHidden/>
           </w:rPr>
-          <w:t>35</w:t>
+          <w:t>34</w:t>
         </w:r>
         <w:r>
           <w:rPr>
@@ -6875,7 +6875,7 @@
           <w14:ligatures w14:val="standardContextual"/>
         </w:rPr>
       </w:pPr>
-      <w:hyperlink w:anchor="_Toc243732599" w:history="1">
+      <w:hyperlink w:anchor="_Toc243733565" w:history="1">
         <w:r>
           <w:rPr>
             <w:rStyle w:val="Hipervnculo"/>
@@ -6902,7 +6902,7 @@
             <w:noProof/>
             <w:webHidden/>
           </w:rPr>
-          <w:instrText xml:space="preserve"> PAGEREF _Toc243732599 \h </w:instrText>
+          <w:instrText xml:space="preserve"> PAGEREF _Toc243733565 \h </w:instrText>
         </w:r>
         <w:r>
           <w:rPr>
@@ -6922,7 +6922,7 @@
             <w:noProof/>
             <w:webHidden/>
           </w:rPr>
-          <w:t>35</w:t>
+          <w:t>34</w:t>
         </w:r>
         <w:r>
           <w:rPr>
@@ -6973,7 +6973,7 @@
       <w:r>
         <w:fldChar w:fldCharType="separate"/>
       </w:r>
-      <w:hyperlink w:anchor="_Toc243732600" w:history="1">
+      <w:hyperlink w:anchor="_Toc243733566" w:history="1">
         <w:r>
           <w:rPr>
             <w:rStyle w:val="Hipervnculo"/>
@@ -7000,7 +7000,7 @@
             <w:noProof/>
             <w:webHidden/>
           </w:rPr>
-          <w:instrText xml:space="preserve"> PAGEREF _Toc243732600 \h </w:instrText>
+          <w:instrText xml:space="preserve"> PAGEREF _Toc243733566 \h </w:instrText>
         </w:r>
         <w:r>
           <w:rPr>
@@ -7020,7 +7020,7 @@
             <w:noProof/>
             <w:webHidden/>
           </w:rPr>
-          <w:t>11</w:t>
+          <w:t>10</w:t>
         </w:r>
         <w:r>
           <w:rPr>
@@ -7045,7 +7045,7 @@
           <w14:ligatures w14:val="standardContextual"/>
         </w:rPr>
       </w:pPr>
-      <w:hyperlink w:anchor="_Toc243732601" w:history="1">
+      <w:hyperlink w:anchor="_Toc243733567" w:history="1">
         <w:r>
           <w:rPr>
             <w:rStyle w:val="Hipervnculo"/>
@@ -7072,7 +7072,7 @@
             <w:noProof/>
             <w:webHidden/>
           </w:rPr>
-          <w:instrText xml:space="preserve"> PAGEREF _Toc243732601 \h </w:instrText>
+          <w:instrText xml:space="preserve"> PAGEREF _Toc243733567 \h </w:instrText>
         </w:r>
         <w:r>
           <w:rPr>
@@ -7092,7 +7092,7 @@
             <w:noProof/>
             <w:webHidden/>
           </w:rPr>
-          <w:t>24</w:t>
+          <w:t>23</w:t>
         </w:r>
         <w:r>
           <w:rPr>
@@ -7117,7 +7117,7 @@
           <w14:ligatures w14:val="standardContextual"/>
         </w:rPr>
       </w:pPr>
-      <w:hyperlink w:anchor="_Toc243732602" w:history="1">
+      <w:hyperlink w:anchor="_Toc243733568" w:history="1">
         <w:r>
           <w:rPr>
             <w:rStyle w:val="Hipervnculo"/>
@@ -7144,7 +7144,7 @@
             <w:noProof/>
             <w:webHidden/>
           </w:rPr>
-          <w:instrText xml:space="preserve"> PAGEREF _Toc243732602 \h </w:instrText>
+          <w:instrText xml:space="preserve"> PAGEREF _Toc243733568 \h </w:instrText>
         </w:r>
         <w:r>
           <w:rPr>
@@ -7164,7 +7164,7 @@
             <w:noProof/>
             <w:webHidden/>
           </w:rPr>
-          <w:t>27</w:t>
+          <w:t>26</w:t>
         </w:r>
         <w:r>
           <w:rPr>
@@ -7189,7 +7189,7 @@
           <w14:ligatures w14:val="standardContextual"/>
         </w:rPr>
       </w:pPr>
-      <w:hyperlink w:anchor="_Toc243732603" w:history="1">
+      <w:hyperlink w:anchor="_Toc243733569" w:history="1">
         <w:r>
           <w:rPr>
             <w:rStyle w:val="Hipervnculo"/>
@@ -7216,7 +7216,7 @@
             <w:noProof/>
             <w:webHidden/>
           </w:rPr>
-          <w:instrText xml:space="preserve"> PAGEREF _Toc243732603 \h </w:instrText>
+          <w:instrText xml:space="preserve"> PAGEREF _Toc243733569 \h </w:instrText>
         </w:r>
         <w:r>
           <w:rPr>
@@ -7236,7 +7236,7 @@
             <w:noProof/>
             <w:webHidden/>
           </w:rPr>
-          <w:t>31</w:t>
+          <w:t>30</w:t>
         </w:r>
         <w:r>
           <w:rPr>
@@ -7273,7 +7273,7 @@
       <w:pPr>
         <w:pStyle w:val="Ttulo1"/>
       </w:pPr>
-      <w:bookmarkStart w:id="5" w:name="_Toc243732525"/>
+      <w:bookmarkStart w:id="5" w:name="_Toc243733491"/>
       <w:r>
         <w:lastRenderedPageBreak/>
         <w:t>1. Introducción</w:t>
@@ -7356,7 +7356,47 @@
         <w:t xml:space="preserve"> [12]</w:t>
       </w:r>
       <w:r>
-        <w:t>.</w:t>
+        <w:t>. Aunque la sustitución de alimentos y bebidas con alto contenido de azúcar por productos que contienen edulcorantes bajos en calorías se considera una estrategia potencialmente beneficiosa para el control del peso corporal, la evidencia disponible sobre sus efectos en niños y adolescentes es contradictoria</w:t>
+      </w:r>
+      <w:r>
+        <w:rPr>
+          <w:highlight w:val="cyan"/>
+        </w:rPr>
+        <w:t xml:space="preserve"> [14–20]</w:t>
+      </w:r>
+      <w:r>
+        <w:t>. En este contexto, los estudios mecanísticos realizados en modelos de roedores contribuyen a comprender los efectos a largo plazo del consumo habitual de edulcorantes durante distintas etapas de la vida.</w:t>
+      </w:r>
+    </w:p>
+    <w:p>
+      <w:pPr>
+        <w:pStyle w:val="Ttulo2"/>
+      </w:pPr>
+      <w:bookmarkStart w:id="6" w:name="planteamiento-del-problema"/>
+      <w:bookmarkStart w:id="7" w:name="_Toc243733492"/>
+      <w:r>
+        <w:t>1.1 Planteamiento del problema</w:t>
+      </w:r>
+      <w:bookmarkEnd w:id="7"/>
+    </w:p>
+    <w:p>
+      <w:pPr>
+        <w:pStyle w:val="FirstParagraph"/>
+      </w:pPr>
+      <w:r>
+        <w:t>El consumo de azúcar en Argentina constituye un problema de salud pública de primera magnitud: el argentino promedio ingiere el equivalente a 35 cucharaditas de azúcar por día [21], los niños y adolescentes consumen en promedio 127 litros de bebidas azucaradas por año [22], y estas bebidas son responsables de más de 4.400 muertes anuales en el país, ubicándolo en el tercer lugar mundial en nuevos casos de diabetes tipo 2 atribuibles a su consumo [23]. Frente a este panorama, el mercado de stevia crece soste</w:t>
+      </w:r>
+      <w:r>
+        <w:t>nidamente (USD 840 millones en 2024) [24]</w:t>
+      </w:r>
+      <w:r>
+        <w:rPr>
+          <w:highlight w:val="cyan"/>
+        </w:rPr>
+        <w:t>, también en el país</w:t>
+      </w:r>
+      <w:r>
+        <w:t xml:space="preserve"> [25, 26].</w:t>
       </w:r>
     </w:p>
     <w:p>
@@ -7364,16 +7404,16 @@
         <w:pStyle w:val="Textoindependiente"/>
       </w:pPr>
       <w:r>
-        <w:t>Aunque la sustitución de alimentos y bebidas con alto contenido de azúcar por productos que contienen edulcorantes bajos en calorías se considera una estrategia potencialmente beneficiosa para el control del peso corporal, la evidencia disponible sobre sus efectos en niños y adolescentes es contradictoria</w:t>
+        <w:t xml:space="preserve">Sin embargo, la percepción pública de que la stevia es una alternativa inocua al azúcar no está suficientemente respaldada por evidencia científica en etapas críticas del desarrollo. Trabajos del IByME-CONICET demostraron que la exposición temprana a stevia en ratas hembras induce alteraciones persistentes en la fertilidad, la descendencia y el comportamiento [27]. No obstante, </w:t>
       </w:r>
       <w:r>
         <w:rPr>
           <w:highlight w:val="cyan"/>
         </w:rPr>
-        <w:t xml:space="preserve"> [14–20]</w:t>
-      </w:r>
-      <w:r>
-        <w:t>.</w:t>
+        <w:t>sus</w:t>
+      </w:r>
+      <w:r>
+        <w:t xml:space="preserve"> efectos a largo plazo en ratas macho aún no han sido caracterizados.</w:t>
       </w:r>
     </w:p>
     <w:p>
@@ -7381,32 +7421,43 @@
         <w:pStyle w:val="Textoindependiente"/>
       </w:pPr>
       <w:r>
-        <w:t>En este contexto, los estudios mecanísticos realizados en modelos de roedores contribuyen a comprender los efectos a largo plazo del consumo habitual de edulcorantes durante distintas etapas de la vida. El presente trabajo busca evaluar si el consumo de stevia durante períodos críticos del desarrollo produce alteraciones neurobiológicas y conductuales en ratas macho Sprague-Dawley, con el fin de aportar evidencia sobre su seguridad. Asimismo, incorpora, como aporte desde la bioingeniería, un análisis multiv</w:t>
-      </w:r>
-      <w:r>
-        <w:t>ariado de las métricas conductuales mediante técnicas de aprendizaje automático.</w:t>
+        <w:t xml:space="preserve">La pregunta central que guía este trabajo es si el consumo de stevia durante etapas tempranas del desarrollo induce alteraciones conductuales y neurobiológicas que persisten hasta la edad adulta, si estas son comparables con las producidas por el consumo de sacarosa y en qué medida dependen de la etapa del desarrollo en la que ocurre la exposición. </w:t>
+      </w:r>
+      <w:r>
+        <w:rPr>
+          <w:highlight w:val="cyan"/>
+        </w:rPr>
+        <w:t>Para abordarla, se expusieron ratas macho Sprague-Dawley a los endulzantes en una etapa juvenil, entre los días postnatales (PD) 25 y 50, que correspondería a la transición infanto-adolescente en la rata [28], o en la adultez, entre PD75 y PD100, y se evaluaron las conductas de tipo ansioso, la memoria y la expresión del antígeno nuclear de proliferación celular (PCNA) y de doblecortina (DCX) en el giro dentado (GD).</w:t>
       </w:r>
     </w:p>
     <w:p>
       <w:pPr>
         <w:pStyle w:val="Ttulo2"/>
       </w:pPr>
-      <w:bookmarkStart w:id="6" w:name="planteamiento-del-problema"/>
-      <w:bookmarkStart w:id="7" w:name="_Toc243732526"/>
-      <w:r>
-        <w:t>1.1 Planteamiento del problema</w:t>
-      </w:r>
-      <w:bookmarkEnd w:id="7"/>
+      <w:bookmarkStart w:id="8" w:name="justificación"/>
+      <w:bookmarkStart w:id="9" w:name="_Toc243733493"/>
+      <w:bookmarkEnd w:id="6"/>
+      <w:r>
+        <w:lastRenderedPageBreak/>
+        <w:t>1.2 Justificación</w:t>
+      </w:r>
+      <w:bookmarkEnd w:id="9"/>
     </w:p>
     <w:p>
       <w:pPr>
         <w:pStyle w:val="FirstParagraph"/>
       </w:pPr>
       <w:r>
-        <w:t>El consumo de azúcar en Argentina constituye un problema de salud pública de primera magnitud: el argentino promedio ingiere el equivalente a 35 cucharaditas de azúcar por día [21], los niños y adolescentes consumen en promedio 127 litros de bebidas azucaradas por año [22], y estas bebidas son responsables de más de 4.400 muertes anuales en el país, ubicándolo en el tercer lugar mundial en nuevos casos de diabetes tipo 2 atribuibles a su consumo [23]. Frente a este panorama, el mercado de stevia crece soste</w:t>
-      </w:r>
-      <w:r>
-        <w:t>nidamente (USD 840 millones en 2024) [24], y Argentina es uno de sus principales mercados en América Latina [25, 26].</w:t>
+        <w:rPr>
+          <w:highlight w:val="cyan"/>
+        </w:rPr>
+        <w:t xml:space="preserve">La etapa juvenil es un período de intensa maduración y reorganización de los circuitos neuronales, por lo que ciertos componentes de la dieta podrían producir en ella modificaciones neurobiológicas y conductuales persistentes. Por ello, resulta relevante investigar si el consumo de stevia en esta etapa altera la memoria, las conductas de tipo ansioso y la neurogénesis hipocampal de forma distinta que en la adultez, y compararlo con la sacarosa, cuyos efectos adversos ya fueron documentados, para contribuir </w:t>
+      </w:r>
+      <w:r>
+        <w:rPr>
+          <w:highlight w:val="cyan"/>
+        </w:rPr>
+        <w:t>a evaluar su seguridad como alternativa al azúcar.</w:t>
       </w:r>
     </w:p>
     <w:p>
@@ -7414,198 +7465,62 @@
         <w:pStyle w:val="Textoindependiente"/>
       </w:pPr>
       <w:r>
-        <w:t>Sin embargo, la percepción pública de que la stevia es una alternativa inocua al azúcar no está suficientemente respaldada por evidencia científica en etapas críticas del desarrollo. La literatura ha documentado que el consumo temprano de sacarosa induce efectos neurobiológicos persistentes en la adultez: déficits en la memoria dependiente del hipocampo, alteraciones en la neurogénesis del giro dentado</w:t>
-      </w:r>
-      <w:r>
         <w:rPr>
           <w:highlight w:val="cyan"/>
         </w:rPr>
-        <w:t xml:space="preserve"> (GD)</w:t>
-      </w:r>
-      <w:r>
-        <w:t xml:space="preserve"> y cambios conductuales relacionados con la ansiedad [27, 28]. Trabajos del IByME-CONICET demostraron que la exposición temprana a stevia en ratas hembras induce alteraciones persistentes en la fertilidad, la descendencia y el comportamiento [29]. No obstante, los efectos a largo plazo sobre la conducta tipo ansiosa, la memoria de reconocimiento, la separación de patrones espaciales y los marcadores de neurogénesis en ratas macho aún no han sido caracterizados.</w:t>
-      </w:r>
-    </w:p>
-    <w:p>
-      <w:pPr>
-        <w:pStyle w:val="Textoindependiente"/>
-      </w:pPr>
-      <w:r>
-        <w:lastRenderedPageBreak/>
-        <w:t>La pregunta central que guía este trabajo es si el consumo de stevia durante etapas tempranas del desarrollo induce alteraciones conductuales y neurobiológicas que persisten hasta la edad adulta, si estas son comparables con las producidas por el consumo de sacarosa y en qué medida dependen de la etapa del desarrollo en la que ocurre la exposición.</w:t>
-      </w:r>
-    </w:p>
-    <w:p>
-      <w:pPr>
-        <w:pStyle w:val="Textoindependiente"/>
-      </w:pPr>
-      <w:r>
-        <w:t xml:space="preserve">Para abordar estos interrogantes, se utilizaron ratas macho Sprague-Dawley expuestas a los endulzantes durante dos períodos del desarrollo distintos: una etapa juvenil, comprendida entre los días </w:t>
-      </w:r>
-      <w:r>
-        <w:rPr>
-          <w:highlight w:val="cyan"/>
-        </w:rPr>
-        <w:t>postnatales</w:t>
-      </w:r>
-      <w:r>
-        <w:t xml:space="preserve"> (PD) 25 y 50, que correspondería a la transición infanto-</w:t>
-      </w:r>
-      <w:r>
-        <w:rPr>
-          <w:highlight w:val="cyan"/>
-        </w:rPr>
-        <w:t>adolescente</w:t>
-      </w:r>
-      <w:r>
-        <w:t xml:space="preserve"> en la rata</w:t>
-      </w:r>
-      <w:r>
-        <w:rPr>
-          <w:highlight w:val="cyan"/>
-        </w:rPr>
-        <w:t xml:space="preserve"> [30]</w:t>
-      </w:r>
-      <w:r>
-        <w:t xml:space="preserve">, y una etapa adulta, comprendida entre PD75 y </w:t>
-      </w:r>
-      <w:r>
-        <w:rPr>
-          <w:highlight w:val="cyan"/>
-        </w:rPr>
-        <w:t>PD100</w:t>
-      </w:r>
-      <w:r>
-        <w:t xml:space="preserve">. Se evaluaron las conductas de tipo ansioso y el desempeño en pruebas de memoria, así como la expresión del antígeno nuclear de proliferación celular (PCNA) y de doblecortina (DCX), marcadores asociados con distintas etapas del proceso de neurogénesis, en el </w:t>
-      </w:r>
-      <w:r>
-        <w:rPr>
-          <w:highlight w:val="cyan"/>
-        </w:rPr>
-        <w:t>GD</w:t>
-      </w:r>
-      <w:r>
-        <w:t xml:space="preserve"> del hipocampo. Este abordaje permitió comparar los efectos del consumo de stevia y sacarosa en función de la edad de exposición y explorar su posible relación con alteraciones persistentes en la neurogénesis hipocampal.</w:t>
+        <w:t>La pertinencia para la Bioingeniería es doble: el trabajo combina técnicas experimentales de precisión —pruebas conductuales estandarizadas e inmunocitoquímica con microscopía confocal— con herramientas de aprendizaje automático (PCA, clustering jerárquico y Random Forest) aplicadas a datos conductuales.</w:t>
       </w:r>
     </w:p>
     <w:p>
       <w:pPr>
         <w:pStyle w:val="Ttulo2"/>
       </w:pPr>
-      <w:bookmarkStart w:id="8" w:name="justificación"/>
-      <w:bookmarkStart w:id="9" w:name="_Toc243732527"/>
-      <w:bookmarkEnd w:id="6"/>
-      <w:r>
-        <w:t>1.2 Justificación</w:t>
-      </w:r>
-      <w:bookmarkEnd w:id="9"/>
+      <w:bookmarkStart w:id="10" w:name="objetivos"/>
+      <w:bookmarkStart w:id="11" w:name="_Toc243733494"/>
+      <w:bookmarkEnd w:id="8"/>
+      <w:r>
+        <w:t>1.3 Objetivos</w:t>
+      </w:r>
+      <w:bookmarkEnd w:id="11"/>
+    </w:p>
+    <w:p>
+      <w:pPr>
+        <w:pStyle w:val="Ttulo3"/>
+      </w:pPr>
+      <w:bookmarkStart w:id="12" w:name="objetivo-general"/>
+      <w:bookmarkStart w:id="13" w:name="_Toc243733495"/>
+      <w:r>
+        <w:t>1.3.1 Objetivo general</w:t>
+      </w:r>
+      <w:bookmarkEnd w:id="13"/>
     </w:p>
     <w:p>
       <w:pPr>
         <w:pStyle w:val="FirstParagraph"/>
       </w:pPr>
       <w:r>
-        <w:t>El elevado consumo de azúcar durante la infancia y la adolescencia constituye una preocupación para la salud pública, debido a sus efectos adversos sobre la salud metabólica y sus consecuencias sobre el desarrollo cerebral y las funciones cognitivas. En este contexto, los edulcorantes bajos en calorías, como la stevia, han adquirido creciente relevancia como alternativas al azúcar. Sin embargo, aún es necesario profundizar en sus posibles efectos sobre el sistema nervioso central, especialmente durante etap</w:t>
-      </w:r>
-      <w:r>
-        <w:t>as críticas del desarrollo.</w:t>
-      </w:r>
-    </w:p>
-    <w:p>
-      <w:pPr>
-        <w:pStyle w:val="Textoindependiente"/>
-      </w:pPr>
-      <w:r>
-        <w:t>La etapa juvenil constituye un período de especial interés debido a los procesos de maduración y reorganización de los circuitos neuronales que tienen lugar durante esta ventana del desarrollo. En consecuencia, la exposición a determinados componentes de la dieta podría producir modificaciones neurobiológicas y conductuales que persistan hasta la edad adulta.</w:t>
-      </w:r>
-    </w:p>
-    <w:p>
-      <w:pPr>
-        <w:pStyle w:val="Textoindependiente"/>
-      </w:pPr>
-      <w:r>
-        <w:t>En este marco, resulta relevante investigar si el consumo de stevia durante la etapa juvenil produce alteraciones en la memoria, las conductas de tipo ansioso y los procesos de neurogénesis hipocampal, y determinar si estos efectos difieren de los observados cuando la exposición ocurre en la edad adulta. Asimismo, la comparación con la sacarosa, cuyos efectos adversos sobre determinados procesos cognitivos y neurobiológicos han sido documentados previamente, permite contextualizar la magnitud y las caracter</w:t>
-      </w:r>
-      <w:r>
-        <w:t>ísticas de las posibles alteraciones asociadas al consumo de stevia.</w:t>
-      </w:r>
-    </w:p>
-    <w:p>
-      <w:pPr>
-        <w:pStyle w:val="Textoindependiente"/>
-      </w:pPr>
-      <w:r>
-        <w:t>De esta manera, el presente estudio busca aportar evidencia experimental sobre los efectos neurobiológicos y conductuales del consumo de stevia en distintas etapas del desarrollo, contribuyendo a una evaluación más integral de su seguridad como alternativa al azúcar.</w:t>
-      </w:r>
-    </w:p>
-    <w:p>
-      <w:pPr>
-        <w:pStyle w:val="Textoindependiente"/>
-      </w:pPr>
-      <w:r>
-        <w:t xml:space="preserve">La pertinencia en el marco de la carrera de Bioingeniería es doble. Por un lado, el trabajo implica técnicas experimentales —pruebas conductuales estandarizadas, inmunocitoquímica seguida de análisis por </w:t>
-      </w:r>
-      <w:r>
-        <w:rPr>
-          <w:highlight w:val="cyan"/>
-        </w:rPr>
-        <w:t>microscopía</w:t>
-      </w:r>
-      <w:r>
-        <w:t xml:space="preserve"> confocal— que requieren precisión técnica y criterio científico. Por otro, los objetivos de máxima incorporan herramientas de ingeniería de datos y aprendizaje automático —PCA, clustering jerárquico y Random Forest— cuya aplicación sobre datos conductuales constituye un aporte metodológico propio de la formación en ingeniería.</w:t>
-      </w:r>
-    </w:p>
-    <w:p>
-      <w:pPr>
-        <w:pStyle w:val="Ttulo2"/>
-      </w:pPr>
-      <w:bookmarkStart w:id="10" w:name="objetivos"/>
-      <w:bookmarkStart w:id="11" w:name="_Toc243732528"/>
-      <w:bookmarkEnd w:id="8"/>
-      <w:r>
-        <w:lastRenderedPageBreak/>
-        <w:t>1.3 Objetivos</w:t>
-      </w:r>
-      <w:bookmarkEnd w:id="11"/>
+        <w:t xml:space="preserve">Evaluar los efectos neuroconductuales a largo plazo del consumo de </w:t>
+      </w:r>
+      <w:r>
+        <w:rPr>
+          <w:i/>
+          <w:iCs/>
+        </w:rPr>
+        <w:t>Stevia rebaudiana</w:t>
+      </w:r>
+      <w:r>
+        <w:t xml:space="preserve"> </w:t>
+      </w:r>
+      <w:r>
+        <w:t>Bertoni en ratas macho Sprague-Dawley, en comparación con los inducidos por el consumo de sacarosa, y determinar en qué medida estos efectos dependen de la etapa del desarrollo en la que ocurre la exposición (juvenil o adulta).</w:t>
+      </w:r>
     </w:p>
     <w:p>
       <w:pPr>
         <w:pStyle w:val="Ttulo3"/>
       </w:pPr>
-      <w:bookmarkStart w:id="12" w:name="objetivo-general"/>
-      <w:bookmarkStart w:id="13" w:name="_Toc243732529"/>
-      <w:r>
-        <w:t>1.3.1 Objetivo general</w:t>
-      </w:r>
-      <w:bookmarkEnd w:id="13"/>
-    </w:p>
-    <w:p>
-      <w:pPr>
-        <w:pStyle w:val="FirstParagraph"/>
-      </w:pPr>
-      <w:r>
-        <w:t xml:space="preserve">Evaluar los efectos neuroconductuales a largo plazo del consumo de </w:t>
-      </w:r>
-      <w:r>
-        <w:rPr>
-          <w:i/>
-          <w:iCs/>
-        </w:rPr>
-        <w:t>Stevia rebaudiana</w:t>
-      </w:r>
-      <w:r>
-        <w:t xml:space="preserve"> </w:t>
-      </w:r>
-      <w:r>
-        <w:t>Bertoni en ratas macho Sprague-Dawley, en comparación con los inducidos por el consumo de sacarosa, y determinar en qué medida estos efectos dependen de la etapa del desarrollo en la que ocurre la exposición (juvenil o adulta).</w:t>
-      </w:r>
-    </w:p>
-    <w:p>
-      <w:pPr>
-        <w:pStyle w:val="Ttulo3"/>
-      </w:pPr>
       <w:bookmarkStart w:id="14" w:name="objetivos-de-mínima"/>
-      <w:bookmarkStart w:id="15" w:name="_Toc243732530"/>
+      <w:bookmarkStart w:id="15" w:name="_Toc243733496"/>
       <w:bookmarkEnd w:id="12"/>
       <w:r>
         <w:t>1.3.2 Objetivos de mínima</w:t>
@@ -7650,10 +7565,16 @@
         <w:t>open field</w:t>
       </w:r>
       <w:r>
-        <w:t xml:space="preserve"> </w:t>
-      </w:r>
-      <w:r>
-        <w:t>(OF) al finalizar el tratamiento, contrastando los grupos juvenil y adulto y las condiciones stevia, sacarosa y control (6 grupos experimentales, en total).</w:t>
+        <w:t xml:space="preserve"> (OF) al finalizar el tratamiento </w:t>
+      </w:r>
+      <w:r>
+        <w:rPr>
+          <w:highlight w:val="cyan"/>
+        </w:rPr>
+        <w:t>en los 6 grupos experimentales</w:t>
+      </w:r>
+      <w:r>
+        <w:t>.</w:t>
       </w:r>
     </w:p>
     <w:p>
@@ -7675,7 +7596,7 @@
         </w:numPr>
       </w:pPr>
       <w:r>
-        <w:t>Evaluar la separación de patrones espaciales mediante la prueba SLR (configuraciones d-SLR y s-SLR).</w:t>
+        <w:t>Evaluar la separación de patrones espaciales mediante la prueba SLR (d-SLR y s-SLR).</w:t>
       </w:r>
     </w:p>
     <w:p>
@@ -7686,16 +7607,16 @@
         </w:numPr>
       </w:pPr>
       <w:r>
-        <w:t xml:space="preserve">Evaluar si la neurogénesis se encuentra alterada por el tratamiento. Para ello se medirá la expresión de los progenitores neuronales (PCNA) y de neuronas inmaduras (DCX) mediante inmunocitoquímica </w:t>
+        <w:t>Evaluar si la neurogénesis se encuentra alterada por el tratamiento</w:t>
       </w:r>
       <w:r>
         <w:rPr>
           <w:highlight w:val="cyan"/>
         </w:rPr>
-        <w:t>seguida de microscopía</w:t>
-      </w:r>
-      <w:r>
-        <w:t xml:space="preserve"> confocal.</w:t>
+        <w:t>, mediante la expresión de PCNA (progenitores) y DCX (neuronas inmaduras)</w:t>
+      </w:r>
+      <w:r>
+        <w:t>.</w:t>
       </w:r>
     </w:p>
     <w:p>
@@ -7703,7 +7624,7 @@
         <w:pStyle w:val="Ttulo3"/>
       </w:pPr>
       <w:bookmarkStart w:id="16" w:name="objetivos-de-máxima"/>
-      <w:bookmarkStart w:id="17" w:name="_Toc243732531"/>
+      <w:bookmarkStart w:id="17" w:name="_Toc243733497"/>
       <w:bookmarkEnd w:id="14"/>
       <w:r>
         <w:t>1.3.3 Objetivos de máxima</w:t>
@@ -7718,7 +7639,16 @@
         </w:numPr>
       </w:pPr>
       <w:r>
-        <w:t>Aplicar análisis de componentes principales (PCA) y clustering jerárquico sobre el conjunto de métricas conductuales extraídas con AnyMaze© para identificar perfiles conductuales diferenciados entre grupos sin asumir separación a priori.</w:t>
+        <w:t xml:space="preserve">Aplicar análisis de componentes principales (PCA) y clustering jerárquico sobre el conjunto de métricas conductuales </w:t>
+      </w:r>
+      <w:r>
+        <w:rPr>
+          <w:highlight w:val="cyan"/>
+        </w:rPr>
+        <w:t>registradas</w:t>
+      </w:r>
+      <w:r>
+        <w:t xml:space="preserve"> con AnyMaze© para identificar perfiles diferenciados entre grupos sin asumir separación a priori.</w:t>
       </w:r>
     </w:p>
     <w:p>
@@ -7729,7 +7659,10 @@
         </w:numPr>
       </w:pPr>
       <w:r>
-        <w:t>Desarrollar un modelo de clasificación supervisada (Random Forest) entrenado con las variables conductuales de AnyMaze© como predictores, con el objetivo de determinar la capacidad de dichas métricas para predecir el grupo de exposición de cada animal, entre los seis grupos experimentales resultantes del cruce de la ventana etaria (juvenil, adulto) y la condición dietaria (control, sacarosa, stevia), y cuantificar la importancia relativa de cada variable conductual.</w:t>
+        <w:rPr>
+          <w:highlight w:val="cyan"/>
+        </w:rPr>
+        <w:t>Desarrollar un modelo de clasificación supervisada (Random Forest) que, a partir de esas métricas, prediga el grupo de exposición de cada animal entre los seis grupos experimentales (ventana etaria × tratamiento) y cuantifique la importancia relativa de cada variable.</w:t>
       </w:r>
     </w:p>
     <w:p>
@@ -7737,10 +7670,11 @@
         <w:pStyle w:val="Ttulo2"/>
       </w:pPr>
       <w:bookmarkStart w:id="18" w:name="hipótesis"/>
-      <w:bookmarkStart w:id="19" w:name="_Toc243732532"/>
+      <w:bookmarkStart w:id="19" w:name="_Toc243733498"/>
       <w:bookmarkEnd w:id="10"/>
       <w:bookmarkEnd w:id="16"/>
       <w:r>
+        <w:lastRenderedPageBreak/>
         <w:t>1.4 Hipótesis</w:t>
       </w:r>
       <w:bookmarkEnd w:id="19"/>
@@ -7763,14 +7697,10 @@
         <w:t xml:space="preserve"> </w:t>
       </w:r>
       <w:r>
-        <w:t>Bertoni durante etapas tempranas del desarrollo no reproducirá los efectos adversos sobre el comportamiento y la neurogénesis hipocampal documentados para la sacarosa [27, 28]. Por el contrario, en virtud de las propiedades hipoglucemiantes, antiinflamatorias y neuroprotectoras de los glucósidos de esteviol, se espera que la stevia actúe como un compuesto inocuo o eventualmente beneficioso sobre los parámetros conductuales y los marcadores de neurogénesis evaluados [29, 31, 32]. En consecuencia, los animale</w:t>
-      </w:r>
-      <w:r>
-        <w:t xml:space="preserve">s expuestos a stevia —tanto juveniles como adultos— mostrarán un perfil conductual y neurobiológico comparable al de los controles, o incluso más favorable, en contraste con los déficits esperables en los grupos expuestos a sacarosa. El efecto diferencial </w:t>
-      </w:r>
-      <w:r>
-        <w:lastRenderedPageBreak/>
-        <w:t>según la ventana etaria permitirá determinar si las alteraciones halladas dependen de la edad de exposición, como ocurre con el consumo de sacarosa.</w:t>
+        <w:t>Bertoni durante etapas tempranas del desarrollo no reproducirá los efectos adversos sobre el comportamiento y la neurogénesis hipocampal documentados para la sacarosa [29, 30]. Por el contrario, en virtud de las propiedades hipoglucemiantes, antiinflamatorias y neuroprotectoras de los glucósidos de esteviol, se espera que la stevia actúe como un compuesto inocuo o eventualmente beneficioso sobre los parámetros conductuales y los marcadores de neurogénesis evaluados [27, 31, 32]. En consecuencia, los animale</w:t>
+      </w:r>
+      <w:r>
+        <w:t>s expuestos a stevia —tanto juveniles como adultos— mostrarán un perfil conductual y neurobiológico comparable al de los controles, o incluso más favorable, en contraste con los déficits esperables en los grupos expuestos a sacarosa. El efecto diferencial según la ventana etaria permitirá determinar si las alteraciones halladas dependen de la edad de exposición, como ocurre con el consumo de sacarosa.</w:t>
       </w:r>
     </w:p>
     <w:p>
@@ -7778,7 +7708,7 @@
         <w:pStyle w:val="Ttulo1"/>
       </w:pPr>
       <w:bookmarkStart w:id="20" w:name="estado-del-arte"/>
-      <w:bookmarkStart w:id="21" w:name="_Toc243732533"/>
+      <w:bookmarkStart w:id="21" w:name="_Toc243733499"/>
       <w:bookmarkEnd w:id="4"/>
       <w:bookmarkEnd w:id="18"/>
       <w:r>
@@ -7792,7 +7722,7 @@
         <w:pStyle w:val="Ttulo2"/>
       </w:pPr>
       <w:bookmarkStart w:id="22" w:name="Xa20a39c5a34d7f13c187e945fb882fbff1c74ac"/>
-      <w:bookmarkStart w:id="23" w:name="_Toc243732534"/>
+      <w:bookmarkStart w:id="23" w:name="_Toc243733500"/>
       <w:r>
         <w:t xml:space="preserve">2.1 Edulcorantes no calóricos y </w:t>
       </w:r>
@@ -7888,7 +7818,7 @@
         <w:t>reduce</w:t>
       </w:r>
       <w:r>
-        <w:t xml:space="preserve"> su ansiedad [29]. En ratas macho, el consumo temprano del mismo extracto no </w:t>
+        <w:t xml:space="preserve"> su ansiedad [27]. En ratas macho, el consumo temprano del mismo extracto no </w:t>
       </w:r>
       <w:r>
         <w:rPr>
@@ -7914,7 +7844,7 @@
         <w:pStyle w:val="Ttulo2"/>
       </w:pPr>
       <w:bookmarkStart w:id="24" w:name="Xd8a1cfb0b63fd1c82328d12ec348aa53d6afb02"/>
-      <w:bookmarkStart w:id="25" w:name="_Toc243732535"/>
+      <w:bookmarkStart w:id="25" w:name="_Toc243733501"/>
       <w:bookmarkEnd w:id="22"/>
       <w:r>
         <w:t>2.2 Consumo temprano de azúcar, memoria y neurogénesis hipocampal</w:t>
@@ -7953,7 +7883,7 @@
         <w:t>ocurre</w:t>
       </w:r>
       <w:r>
-        <w:t xml:space="preserve"> en animales adultos [28]. Otros trabajos </w:t>
+        <w:t xml:space="preserve"> en animales adultos [30]. Otros trabajos </w:t>
       </w:r>
       <w:r>
         <w:rPr>
@@ -8016,7 +7946,7 @@
         <w:t>GD</w:t>
       </w:r>
       <w:r>
-        <w:t xml:space="preserve"> [27]. Entre los mecanismos propuestos se cuentan la alteración de la microbiota intestinal [6] y la menor expresión de genes hipocampales vinculados a la neurogénesis [44]. Los resultados dependen, no obstante, de la ventana de exposición: el consumo de sacarosa iniciado en la adolescencia tardía no </w:t>
+        <w:t xml:space="preserve"> [29]. Entre los mecanismos propuestos se cuentan la alteración de la microbiota intestinal [6] y la menor expresión de genes hipocampales vinculados a la neurogénesis [44]. Los resultados dependen, no obstante, de la ventana de exposición: el consumo de sacarosa iniciado en la adolescencia tardía no </w:t>
       </w:r>
       <w:r>
         <w:rPr>
@@ -8042,7 +7972,7 @@
         <w:pStyle w:val="Ttulo2"/>
       </w:pPr>
       <w:bookmarkStart w:id="26" w:name="Xc2e42f633b60919927433ba3c6a5c8818707546"/>
-      <w:bookmarkStart w:id="27" w:name="_Toc243732536"/>
+      <w:bookmarkStart w:id="27" w:name="_Toc243733502"/>
       <w:bookmarkEnd w:id="24"/>
       <w:r>
         <w:t xml:space="preserve">2.3 </w:t>
@@ -8090,7 +8020,7 @@
         <w:pStyle w:val="Ttulo1"/>
       </w:pPr>
       <w:bookmarkStart w:id="28" w:name="marco-teórico"/>
-      <w:bookmarkStart w:id="29" w:name="_Toc243732537"/>
+      <w:bookmarkStart w:id="29" w:name="_Toc243733503"/>
       <w:bookmarkEnd w:id="20"/>
       <w:bookmarkEnd w:id="26"/>
       <w:r>
@@ -8104,7 +8034,7 @@
         <w:pStyle w:val="Ttulo2"/>
       </w:pPr>
       <w:bookmarkStart w:id="30" w:name="ventanas-críticas-del-neurodesarrollo"/>
-      <w:bookmarkStart w:id="31" w:name="_Toc243732538"/>
+      <w:bookmarkStart w:id="31" w:name="_Toc243733504"/>
       <w:r>
         <w:t>3.1 Ventanas críticas del neurodesarrollo</w:t>
       </w:r>
@@ -8166,7 +8096,7 @@
         <w:pStyle w:val="Ttulo2"/>
       </w:pPr>
       <w:bookmarkStart w:id="32" w:name="fundamento-del-esquema-de-exposición"/>
-      <w:bookmarkStart w:id="33" w:name="_Toc243732539"/>
+      <w:bookmarkStart w:id="33" w:name="_Toc243733505"/>
       <w:bookmarkEnd w:id="30"/>
       <w:r>
         <w:t>3.2 Fundamento del esquema de exposición</w:t>
@@ -8178,7 +8108,7 @@
         <w:pStyle w:val="FirstParagraph"/>
       </w:pPr>
       <w:r>
-        <w:t xml:space="preserve">La inclusión de tres grupos experimentales responde a una estrategia de comparación que permite contextualizar los efectos de los distintos tratamientos. En particular, la administración de sacarosa al 10 % p/v se utiliza como modelo experimental del consumo de bebidas azucaradas, cuyos efectos adversos sobre la memoria, las conductas de tipo ansioso y la neurogénesis han sido documentados previamente [27, 28, 41]. La sacarosa es </w:t>
+        <w:t xml:space="preserve">La inclusión de tres grupos experimentales responde a una estrategia de comparación que permite contextualizar los efectos de los distintos tratamientos. En particular, la administración de sacarosa al 10 % p/v se utiliza como modelo experimental del consumo de bebidas azucaradas, cuyos efectos adversos sobre la memoria, las conductas de tipo ansioso y la neurogénesis han sido documentados previamente [29, 30, 41]. La sacarosa es </w:t>
       </w:r>
       <w:r>
         <w:rPr>
@@ -8244,7 +8174,7 @@
         <w:pStyle w:val="Ttulo2"/>
       </w:pPr>
       <w:bookmarkStart w:id="34" w:name="X1a121639cb8a479e8dfaf108e2fc37fa6541e2c"/>
-      <w:bookmarkStart w:id="35" w:name="_Toc243732540"/>
+      <w:bookmarkStart w:id="35" w:name="_Toc243733506"/>
       <w:bookmarkEnd w:id="32"/>
       <w:r>
         <w:t xml:space="preserve">3.3 </w:t>
@@ -8318,10 +8248,10 @@
           <w:noProof/>
         </w:rPr>
         <w:drawing>
-          <wp:inline distT="0" distB="0" distL="0" distR="0" wp14:anchorId="52F1360F" wp14:editId="0AB3CE98">
+          <wp:inline distT="0" distB="0" distL="0" distR="0" wp14:anchorId="1E07DE38" wp14:editId="2EE4BE6C">
             <wp:extent cx="4031999" cy="1727999"/>
             <wp:effectExtent l="0" t="0" r="0" b="0"/>
-            <wp:docPr id="104713290" name="Picture" descr="image"/>
+            <wp:docPr id="565015993" name="Picture" descr="image"/>
             <wp:cNvGraphicFramePr/>
             <a:graphic xmlns:a="http://schemas.openxmlformats.org/drawingml/2006/main">
               <a:graphicData uri="http://schemas.openxmlformats.org/drawingml/2006/picture">
@@ -8430,7 +8360,7 @@
       <w:r>
         <w:instrText xml:space="preserve"> TC "</w:instrText>
       </w:r>
-      <w:bookmarkStart w:id="36" w:name="_Toc243732577"/>
+      <w:bookmarkStart w:id="36" w:name="_Toc243733543"/>
       <w:r>
         <w:instrText>3.1. Esquema de la cascada neurogénica del GD</w:instrText>
       </w:r>
@@ -8501,7 +8431,7 @@
         <w:t>pattern separation</w:t>
       </w:r>
       <w:r>
-        <w:t>), un proceso que permite distinguir y codificar patrones similares de actividad neuronal como representaciones diferentes durante la codificación y el almacenamiento de la información [27, 62]. En este sentido, la neurogénesis adulta proporcionaría una funcionalidad adicional al hipocampo, especialmente cuando aumenta la demanda cognitiva [62].</w:t>
+        <w:t>), un proceso que permite distinguir y codificar patrones similares de actividad neuronal como representaciones diferentes durante la codificación y el almacenamiento de la información [29, 62]. En este sentido, la neurogénesis adulta proporcionaría una funcionalidad adicional al hipocampo, especialmente cuando aumenta la demanda cognitiva [62].</w:t>
       </w:r>
     </w:p>
     <w:p>
@@ -8509,7 +8439,7 @@
         <w:pStyle w:val="Ttulo2"/>
       </w:pPr>
       <w:bookmarkStart w:id="37" w:name="fundamento-del-abordaje-multivariado"/>
-      <w:bookmarkStart w:id="38" w:name="_Toc243732541"/>
+      <w:bookmarkStart w:id="38" w:name="_Toc243733507"/>
       <w:bookmarkEnd w:id="34"/>
       <w:r>
         <w:t>3.4 Fundamento del abordaje multivariado</w:t>
@@ -8770,7 +8700,7 @@
         <w:pStyle w:val="Ttulo1"/>
       </w:pPr>
       <w:bookmarkStart w:id="39" w:name="materiales-y-métodos"/>
-      <w:bookmarkStart w:id="40" w:name="_Toc243732542"/>
+      <w:bookmarkStart w:id="40" w:name="_Toc243733508"/>
       <w:bookmarkEnd w:id="28"/>
       <w:bookmarkEnd w:id="37"/>
       <w:r>
@@ -8784,7 +8714,7 @@
         <w:pStyle w:val="Ttulo2"/>
       </w:pPr>
       <w:bookmarkStart w:id="41" w:name="animales-de-experimentación"/>
-      <w:bookmarkStart w:id="42" w:name="_Toc243732543"/>
+      <w:bookmarkStart w:id="42" w:name="_Toc243733509"/>
       <w:r>
         <w:t>4.1 Animales de experimentación</w:t>
       </w:r>
@@ -8866,7 +8796,7 @@
         <w:t>ad libitum</w:t>
       </w:r>
       <w:r>
-        <w:t xml:space="preserve">. Las soluciones se renovaron día por medio. Finalizado este período de 25 días de exposición, se retiraron las botellas con la solución de sacarosa o de stevia y todos los animales bebieron únicamente agua durante otros 25 días (Figura 4.1) [28, 41]. Al finalizar el protocolo, los animales fueron evaluados en las pruebas conductuales: </w:t>
+        <w:t xml:space="preserve">. Las soluciones se renovaron día por medio. Finalizado este período de 25 días de exposición, se retiraron las botellas con la solución de sacarosa o de stevia y todos los animales bebieron únicamente agua durante otros 25 días (Figura 4.1) [30, 41]. Al finalizar el protocolo, los animales fueron evaluados en las pruebas conductuales: </w:t>
       </w:r>
       <w:r>
         <w:rPr>
@@ -8928,10 +8858,10 @@
           <w:noProof/>
         </w:rPr>
         <w:drawing>
-          <wp:inline distT="0" distB="0" distL="0" distR="0" wp14:anchorId="2F095B56" wp14:editId="1501BBF9">
+          <wp:inline distT="0" distB="0" distL="0" distR="0" wp14:anchorId="1869F1EE" wp14:editId="3372EFE2">
             <wp:extent cx="5011199" cy="2100801"/>
             <wp:effectExtent l="0" t="0" r="0" b="0"/>
-            <wp:docPr id="1474669623" name="Picture" descr="image"/>
+            <wp:docPr id="795915211" name="Picture" descr="image"/>
             <wp:cNvGraphicFramePr/>
             <a:graphic xmlns:a="http://schemas.openxmlformats.org/drawingml/2006/main">
               <a:graphicData uri="http://schemas.openxmlformats.org/drawingml/2006/picture">
@@ -9007,7 +8937,7 @@
       <w:r>
         <w:instrText xml:space="preserve"> TC "</w:instrText>
       </w:r>
-      <w:bookmarkStart w:id="43" w:name="_Toc243732578"/>
+      <w:bookmarkStart w:id="43" w:name="_Toc243733544"/>
       <w:r>
         <w:instrText>4.1. Línea temporal de los procedimientos experimentales</w:instrText>
       </w:r>
@@ -9024,7 +8954,7 @@
         <w:pStyle w:val="Ttulo2"/>
       </w:pPr>
       <w:bookmarkStart w:id="44" w:name="Xb5f353fc62361e09f2f036733619f27ae1e46bd"/>
-      <w:bookmarkStart w:id="45" w:name="_Toc243732544"/>
+      <w:bookmarkStart w:id="45" w:name="_Toc243733510"/>
       <w:bookmarkEnd w:id="41"/>
       <w:r>
         <w:lastRenderedPageBreak/>
@@ -9050,10 +8980,10 @@
         <w:t xml:space="preserve"> Bertoni se obtuvieron de Caña Dulce </w:t>
       </w:r>
       <w:r>
-        <w:t>(San Ignacio, Misiones, Argentina), con certificación de Argencert, Argentina (R.P.A.A. N.º MI000348 y R.P.E.A. N.º MI000097). El extracto de stevia se preparó según un método descrito previamente [29], adaptado de Sharma et al. [67], elegido por su alto rendimiento de glucósidos de esteviol [68] y por su similitud con los procedimientos de preparación orientados a la salud. Se hirvieron 20 g de hojas de stevia en 1 L de agua durante 10 min, se dejó reposar 20 min, se filtró y se volvió a hervir durante 45–</w:t>
-      </w:r>
-      <w:r>
-        <w:t>50 min hasta reducir el volumen a 300 mL. El extracto se fraccionó en alícuotas de 40 mL, que se almacenaron a -20 °C; las alícuotas se descongelaron día por medio y se diluyeron a 1 L (4 % v/v). La solución de sacarosa al 10 % (p/v; Ledesma, Argentina) se preparó en agua. Estas concentraciones se eligieron sobre la base de estudios previos y del consumo voluntario de los animales [28, 29, 41, 69].</w:t>
+        <w:t>(San Ignacio, Misiones, Argentina), con certificación de Argencert, Argentina (R.P.A.A. N.º MI000348 y R.P.E.A. N.º MI000097). El extracto de stevia se preparó según un método descrito previamente [27], adaptado de Sharma et al. [67], elegido por su alto rendimiento de glucósidos de esteviol [68] y por su similitud con los procedimientos de preparación orientados a la salud. Se hirvieron 20 g de hojas de stevia en 1 L de agua durante 10 min, se dejó reposar 20 min, se filtró y se volvió a hervir durante 45–</w:t>
+      </w:r>
+      <w:r>
+        <w:t>50 min hasta reducir el volumen a 300 mL. El extracto se fraccionó en alícuotas de 40 mL, que se almacenaron a -20 °C; las alícuotas se descongelaron día por medio y se diluyeron a 1 L (4 % v/v). La solución de sacarosa al 10 % (p/v; Ledesma, Argentina) se preparó en agua. Estas concentraciones se eligieron sobre la base de estudios previos y del consumo voluntario de los animales [27, 30, 41, 69].</w:t>
       </w:r>
     </w:p>
     <w:p>
@@ -9119,7 +9049,7 @@
       <w:r>
         <w:instrText xml:space="preserve"> TC "</w:instrText>
       </w:r>
-      <w:bookmarkStart w:id="46" w:name="_Toc243732600"/>
+      <w:bookmarkStart w:id="46" w:name="_Toc243733566"/>
       <w:r>
         <w:instrText>4.1. Composición química del extracto de stevia</w:instrText>
       </w:r>
@@ -9559,7 +9489,7 @@
         <w:pStyle w:val="Ttulo2"/>
       </w:pPr>
       <w:bookmarkStart w:id="47" w:name="procedimientos-conductuales"/>
-      <w:bookmarkStart w:id="48" w:name="_Toc243732545"/>
+      <w:bookmarkStart w:id="48" w:name="_Toc243733511"/>
       <w:bookmarkEnd w:id="44"/>
       <w:r>
         <w:t>4.3 Procedimientos conductuales</w:t>
@@ -9579,7 +9509,7 @@
         <w:pStyle w:val="Ttulo3"/>
       </w:pPr>
       <w:bookmarkStart w:id="49" w:name="open-field-of"/>
-      <w:bookmarkStart w:id="50" w:name="_Toc243732546"/>
+      <w:bookmarkStart w:id="50" w:name="_Toc243733512"/>
       <w:r>
         <w:t xml:space="preserve">4.3.1 </w:t>
       </w:r>
@@ -9634,10 +9564,10 @@
           <w:noProof/>
         </w:rPr>
         <w:drawing>
-          <wp:inline distT="0" distB="0" distL="0" distR="0" wp14:anchorId="7E950F1A" wp14:editId="37715BDF">
+          <wp:inline distT="0" distB="0" distL="0" distR="0" wp14:anchorId="5B698253" wp14:editId="79B98018">
             <wp:extent cx="2073599" cy="1876965"/>
             <wp:effectExtent l="0" t="0" r="0" b="0"/>
-            <wp:docPr id="513702747" name="Picture" descr="image"/>
+            <wp:docPr id="331095120" name="Picture" descr="image"/>
             <wp:cNvGraphicFramePr/>
             <a:graphic xmlns:a="http://schemas.openxmlformats.org/drawingml/2006/main">
               <a:graphicData uri="http://schemas.openxmlformats.org/drawingml/2006/picture">
@@ -9715,7 +9645,7 @@
       <w:r>
         <w:instrText xml:space="preserve"> TC "</w:instrText>
       </w:r>
-      <w:bookmarkStart w:id="51" w:name="_Toc243732579"/>
+      <w:bookmarkStart w:id="51" w:name="_Toc243733545"/>
       <w:r>
         <w:instrText>4.2. Aparato de open field (OF) y zonas de registro</w:instrText>
       </w:r>
@@ -9732,7 +9662,7 @@
         <w:pStyle w:val="Ttulo3"/>
       </w:pPr>
       <w:bookmarkStart w:id="52" w:name="reconocimiento-de-objeto-novedoso-nor"/>
-      <w:bookmarkStart w:id="53" w:name="_Toc243732547"/>
+      <w:bookmarkStart w:id="53" w:name="_Toc243733513"/>
       <w:bookmarkEnd w:id="49"/>
       <w:r>
         <w:t>4.3.2 Reconocimiento de objeto novedoso (NOR)</w:t>
@@ -9926,10 +9856,10 @@
           <w:noProof/>
         </w:rPr>
         <w:drawing>
-          <wp:inline distT="0" distB="0" distL="0" distR="0" wp14:anchorId="12DE4492" wp14:editId="73F93E3F">
+          <wp:inline distT="0" distB="0" distL="0" distR="0" wp14:anchorId="5C73FFAB" wp14:editId="69243323">
             <wp:extent cx="5183999" cy="1430068"/>
             <wp:effectExtent l="0" t="0" r="0" b="0"/>
-            <wp:docPr id="372327788" name="Picture" descr="image"/>
+            <wp:docPr id="838275685" name="Picture" descr="image"/>
             <wp:cNvGraphicFramePr/>
             <a:graphic xmlns:a="http://schemas.openxmlformats.org/drawingml/2006/main">
               <a:graphicData uri="http://schemas.openxmlformats.org/drawingml/2006/picture">
@@ -9993,7 +9923,7 @@
       <w:r>
         <w:instrText xml:space="preserve"> TC "</w:instrText>
       </w:r>
-      <w:bookmarkStart w:id="54" w:name="_Toc243732580"/>
+      <w:bookmarkStart w:id="54" w:name="_Toc243733546"/>
       <w:r>
         <w:instrText>4.3. Esquema del protocolo de la prueba NOR</w:instrText>
       </w:r>
@@ -10016,10 +9946,10 @@
           <w:noProof/>
         </w:rPr>
         <w:drawing>
-          <wp:inline distT="0" distB="0" distL="0" distR="0" wp14:anchorId="3BD5F358" wp14:editId="19E54592">
+          <wp:inline distT="0" distB="0" distL="0" distR="0" wp14:anchorId="2CCAB4C3" wp14:editId="778557A8">
             <wp:extent cx="5753100" cy="1521984"/>
             <wp:effectExtent l="0" t="0" r="0" b="0"/>
-            <wp:docPr id="770049441" name="Picture" descr="image"/>
+            <wp:docPr id="792494781" name="Picture" descr="image"/>
             <wp:cNvGraphicFramePr/>
             <a:graphic xmlns:a="http://schemas.openxmlformats.org/drawingml/2006/main">
               <a:graphicData uri="http://schemas.openxmlformats.org/drawingml/2006/picture">
@@ -10089,7 +10019,7 @@
       <w:r>
         <w:instrText xml:space="preserve"> TC "</w:instrText>
       </w:r>
-      <w:bookmarkStart w:id="55" w:name="_Toc243732581"/>
+      <w:bookmarkStart w:id="55" w:name="_Toc243733547"/>
       <w:r>
         <w:instrText>4.4. Fases del NOR</w:instrText>
       </w:r>
@@ -10106,7 +10036,7 @@
         <w:pStyle w:val="Ttulo3"/>
       </w:pPr>
       <w:bookmarkStart w:id="56" w:name="Xe97ae87456ffade0f33435ffa16ff2d021c5913"/>
-      <w:bookmarkStart w:id="57" w:name="_Toc243732548"/>
+      <w:bookmarkStart w:id="57" w:name="_Toc243733514"/>
       <w:bookmarkEnd w:id="52"/>
       <w:r>
         <w:t>4.3.3 Reconocimiento espontáneo de posición (SLR)</w:t>
@@ -10118,7 +10048,7 @@
         <w:pStyle w:val="FirstParagraph"/>
       </w:pPr>
       <w:r>
-        <w:t>Este procedimiento se realizó como fue descrito por Reichelt et al. [27, 62]. El aparato consistió en un campo abierto circular de plástico gris y base opaca, de 100 cm de diámetro × 45 cm de alto, sin techo. La arena estuvo rodeada de tres señales espaciales distintivas (pósteres negros y blancos con patrones únicos) de 35 cm de alto × 50 cm de ancho, ubicadas equidistantes alrededor de la arena, y de las señales distales proporcionadas por los muebles de la sala, incluidos los estantes y la puerta.</w:t>
+        <w:t>Este procedimiento se realizó como fue descrito por Reichelt et al. [29, 62]. El aparato consistió en un campo abierto circular de plástico gris y base opaca, de 100 cm de diámetro × 45 cm de alto, sin techo. La arena estuvo rodeada de tres señales espaciales distintivas (pósteres negros y blancos con patrones únicos) de 35 cm de alto × 50 cm de ancho, ubicadas equidistantes alrededor de la arena, y de las señales distales proporcionadas por los muebles de la sala, incluidos los estantes y la puerta.</w:t>
       </w:r>
     </w:p>
     <w:p>
@@ -10165,10 +10095,10 @@
           <w:noProof/>
         </w:rPr>
         <w:drawing>
-          <wp:inline distT="0" distB="0" distL="0" distR="0" wp14:anchorId="0BAABA46" wp14:editId="2FB8C6CE">
+          <wp:inline distT="0" distB="0" distL="0" distR="0" wp14:anchorId="5180B86C" wp14:editId="522FF2C1">
             <wp:extent cx="5183999" cy="4670428"/>
             <wp:effectExtent l="0" t="0" r="0" b="0"/>
-            <wp:docPr id="1364466846" name="Picture" descr="image"/>
+            <wp:docPr id="402681273" name="Picture" descr="image"/>
             <wp:cNvGraphicFramePr/>
             <a:graphic xmlns:a="http://schemas.openxmlformats.org/drawingml/2006/main">
               <a:graphicData uri="http://schemas.openxmlformats.org/drawingml/2006/picture">
@@ -10244,7 +10174,7 @@
       <w:r>
         <w:instrText xml:space="preserve"> TC "</w:instrText>
       </w:r>
-      <w:bookmarkStart w:id="58" w:name="_Toc243732582"/>
+      <w:bookmarkStart w:id="58" w:name="_Toc243733548"/>
       <w:r>
         <w:instrText>4.5. Esquema de la prueba de reconocimiento espontáneo de posición (SLR)</w:instrText>
       </w:r>
@@ -10268,10 +10198,10 @@
         </w:rPr>
         <w:lastRenderedPageBreak/>
         <w:drawing>
-          <wp:inline distT="0" distB="0" distL="0" distR="0" wp14:anchorId="5EAF893A" wp14:editId="0F305F59">
+          <wp:inline distT="0" distB="0" distL="0" distR="0" wp14:anchorId="1480C90E" wp14:editId="2BADE9FD">
             <wp:extent cx="4031999" cy="3016951"/>
             <wp:effectExtent l="0" t="0" r="0" b="0"/>
-            <wp:docPr id="846368067" name="Picture" descr="image"/>
+            <wp:docPr id="2068942775" name="Picture" descr="image"/>
             <wp:cNvGraphicFramePr/>
             <a:graphic xmlns:a="http://schemas.openxmlformats.org/drawingml/2006/main">
               <a:graphicData uri="http://schemas.openxmlformats.org/drawingml/2006/picture">
@@ -10335,7 +10265,7 @@
       <w:r>
         <w:instrText xml:space="preserve"> TC "</w:instrText>
       </w:r>
-      <w:bookmarkStart w:id="59" w:name="_Toc243732583"/>
+      <w:bookmarkStart w:id="59" w:name="_Toc243733549"/>
       <w:r>
         <w:instrText>4.6. Objetos utilizados en la prueba SLR: tazas con dibujos y ranas de juguete</w:instrText>
       </w:r>
@@ -10561,7 +10491,7 @@
         <w:pStyle w:val="Ttulo3"/>
       </w:pPr>
       <w:bookmarkStart w:id="60" w:name="registro-con-anymaze"/>
-      <w:bookmarkStart w:id="61" w:name="_Toc243732549"/>
+      <w:bookmarkStart w:id="61" w:name="_Toc243733515"/>
       <w:bookmarkEnd w:id="56"/>
       <w:r>
         <w:t>4.3.4 Registro con AnyMaze©</w:t>
@@ -10622,7 +10552,7 @@
         <w:pStyle w:val="Ttulo2"/>
       </w:pPr>
       <w:bookmarkStart w:id="62" w:name="Xb71f7db275c89ee5be6e7d9c80109ddbc9394c3"/>
-      <w:bookmarkStart w:id="63" w:name="_Toc243732550"/>
+      <w:bookmarkStart w:id="63" w:name="_Toc243733516"/>
       <w:bookmarkEnd w:id="47"/>
       <w:bookmarkEnd w:id="60"/>
       <w:r>
@@ -10652,7 +10582,7 @@
         <w:pStyle w:val="Ttulo3"/>
       </w:pPr>
       <w:bookmarkStart w:id="64" w:name="recuento-celular"/>
-      <w:bookmarkStart w:id="65" w:name="_Toc243732551"/>
+      <w:bookmarkStart w:id="65" w:name="_Toc243733517"/>
       <w:r>
         <w:t>4.4.1 Recuento celular</w:t>
       </w:r>
@@ -10700,7 +10630,7 @@
         <w:pStyle w:val="Ttulo2"/>
       </w:pPr>
       <w:bookmarkStart w:id="66" w:name="análisis-estadístico"/>
-      <w:bookmarkStart w:id="67" w:name="_Toc243732552"/>
+      <w:bookmarkStart w:id="67" w:name="_Toc243733518"/>
       <w:bookmarkEnd w:id="62"/>
       <w:bookmarkEnd w:id="64"/>
       <w:r>
@@ -10713,7 +10643,7 @@
         <w:pStyle w:val="FirstParagraph"/>
       </w:pPr>
       <w:r>
-        <w:t>El tamaño muestral se estimó sobre la base de estudios previos (95 % de confianza, 10 % de error y 80 % de potencia estadística) [28, 29, 41, 69], siguiendo las recomendaciones estándar [66].</w:t>
+        <w:t>El tamaño muestral se estimó sobre la base de estudios previos (95 % de confianza, 10 % de error y 80 % de potencia estadística) [27, 30, 41, 69], siguiendo las recomendaciones estándar [66].</w:t>
       </w:r>
     </w:p>
     <w:p>
@@ -10842,7 +10772,7 @@
         <w:pStyle w:val="Ttulo2"/>
       </w:pPr>
       <w:bookmarkStart w:id="68" w:name="X430af9d9bfce0b651f903068a5742516bd0d098"/>
-      <w:bookmarkStart w:id="69" w:name="_Toc243732553"/>
+      <w:bookmarkStart w:id="69" w:name="_Toc243733519"/>
       <w:bookmarkEnd w:id="66"/>
       <w:r>
         <w:t>4.6 Análisis multivariado y aprendizaje automático</w:t>
@@ -10932,7 +10862,7 @@
         <w:pStyle w:val="Ttulo1"/>
       </w:pPr>
       <w:bookmarkStart w:id="70" w:name="resultados"/>
-      <w:bookmarkStart w:id="71" w:name="_Toc243732554"/>
+      <w:bookmarkStart w:id="71" w:name="_Toc243733520"/>
       <w:bookmarkEnd w:id="39"/>
       <w:bookmarkEnd w:id="68"/>
       <w:r>
@@ -10946,7 +10876,7 @@
         <w:pStyle w:val="Ttulo2"/>
       </w:pPr>
       <w:bookmarkStart w:id="72" w:name="consumo-de-líquidos"/>
-      <w:bookmarkStart w:id="73" w:name="_Toc243732555"/>
+      <w:bookmarkStart w:id="73" w:name="_Toc243733521"/>
       <w:r>
         <w:t>5.1 Consumo de líquidos</w:t>
       </w:r>
@@ -10957,7 +10887,7 @@
         <w:pStyle w:val="Ttulo3"/>
       </w:pPr>
       <w:bookmarkStart w:id="74" w:name="X22851d61bdb9d2edb8d5b1cf1620057207ed789"/>
-      <w:bookmarkStart w:id="75" w:name="_Toc243732556"/>
+      <w:bookmarkStart w:id="75" w:name="_Toc243733522"/>
       <w:r>
         <w:t>5.1.1 Consumo de líquidos durante el tratamiento</w:t>
       </w:r>
@@ -11229,10 +11159,10 @@
           <w:noProof/>
         </w:rPr>
         <w:drawing>
-          <wp:inline distT="0" distB="0" distL="0" distR="0" wp14:anchorId="4DC694AD" wp14:editId="5642854A">
+          <wp:inline distT="0" distB="0" distL="0" distR="0" wp14:anchorId="49F668D3" wp14:editId="0D203F4C">
             <wp:extent cx="2591999" cy="2356363"/>
             <wp:effectExtent l="0" t="0" r="0" b="0"/>
-            <wp:docPr id="465685478" name="Picture" descr="image"/>
+            <wp:docPr id="645109023" name="Picture" descr="image"/>
             <wp:cNvGraphicFramePr/>
             <a:graphic xmlns:a="http://schemas.openxmlformats.org/drawingml/2006/main">
               <a:graphicData uri="http://schemas.openxmlformats.org/drawingml/2006/picture">
@@ -11343,7 +11273,7 @@
       <w:r>
         <w:instrText xml:space="preserve"> TC "</w:instrText>
       </w:r>
-      <w:bookmarkStart w:id="76" w:name="_Toc243732584"/>
+      <w:bookmarkStart w:id="76" w:name="_Toc243733550"/>
       <w:r>
         <w:instrText>5.1. Índice de preferencia por la solución endulzada</w:instrText>
       </w:r>
@@ -11367,10 +11297,10 @@
         </w:rPr>
         <w:lastRenderedPageBreak/>
         <w:drawing>
-          <wp:inline distT="0" distB="0" distL="0" distR="0" wp14:anchorId="51005CEC" wp14:editId="15F998F0">
+          <wp:inline distT="0" distB="0" distL="0" distR="0" wp14:anchorId="2928F584" wp14:editId="235F978E">
             <wp:extent cx="5753100" cy="2066854"/>
             <wp:effectExtent l="0" t="0" r="0" b="0"/>
-            <wp:docPr id="1077529555" name="Picture" descr="image"/>
+            <wp:docPr id="2134730617" name="Picture" descr="image"/>
             <wp:cNvGraphicFramePr/>
             <a:graphic xmlns:a="http://schemas.openxmlformats.org/drawingml/2006/main">
               <a:graphicData uri="http://schemas.openxmlformats.org/drawingml/2006/picture">
@@ -11454,7 +11384,7 @@
       <w:r>
         <w:instrText xml:space="preserve"> TC "</w:instrText>
       </w:r>
-      <w:bookmarkStart w:id="77" w:name="_Toc243732585"/>
+      <w:bookmarkStart w:id="77" w:name="_Toc243733551"/>
       <w:r>
         <w:instrText>5.2. Curso temporal del consumo de líquidos durante el tratamiento</w:instrText>
       </w:r>
@@ -11477,10 +11407,10 @@
           <w:noProof/>
         </w:rPr>
         <w:drawing>
-          <wp:inline distT="0" distB="0" distL="0" distR="0" wp14:anchorId="236CE271" wp14:editId="2337C5D2">
+          <wp:inline distT="0" distB="0" distL="0" distR="0" wp14:anchorId="2545EAD2" wp14:editId="064E31AA">
             <wp:extent cx="5183999" cy="2530101"/>
             <wp:effectExtent l="0" t="0" r="0" b="0"/>
-            <wp:docPr id="1959582066" name="Picture" descr="image"/>
+            <wp:docPr id="1493666704" name="Picture" descr="image"/>
             <wp:cNvGraphicFramePr/>
             <a:graphic xmlns:a="http://schemas.openxmlformats.org/drawingml/2006/main">
               <a:graphicData uri="http://schemas.openxmlformats.org/drawingml/2006/picture">
@@ -11645,7 +11575,7 @@
       <w:r>
         <w:instrText xml:space="preserve"> TC "</w:instrText>
       </w:r>
-      <w:bookmarkStart w:id="78" w:name="_Toc243732586"/>
+      <w:bookmarkStart w:id="78" w:name="_Toc243733552"/>
       <w:r>
         <w:instrText>5.3. Consumo de líquidos promediado durante el tratamiento</w:instrText>
       </w:r>
@@ -11662,7 +11592,7 @@
         <w:pStyle w:val="Ttulo3"/>
       </w:pPr>
       <w:bookmarkStart w:id="79" w:name="Xbf1431af6e3b62c8a8137aa3e17d8226a064321"/>
-      <w:bookmarkStart w:id="80" w:name="_Toc243732557"/>
+      <w:bookmarkStart w:id="80" w:name="_Toc243733523"/>
       <w:bookmarkEnd w:id="74"/>
       <w:r>
         <w:t>5.1.2 Consumo de agua luego del tratamiento con los endulzantes (período agua)</w:t>
@@ -12123,10 +12053,10 @@
           <w:noProof/>
         </w:rPr>
         <w:drawing>
-          <wp:inline distT="0" distB="0" distL="0" distR="0" wp14:anchorId="2DACC8AE" wp14:editId="589B8850">
+          <wp:inline distT="0" distB="0" distL="0" distR="0" wp14:anchorId="00D40327" wp14:editId="6089B214">
             <wp:extent cx="4607999" cy="2228554"/>
             <wp:effectExtent l="0" t="0" r="0" b="0"/>
-            <wp:docPr id="431660457" name="Picture" descr="image"/>
+            <wp:docPr id="111045040" name="Picture" descr="image"/>
             <wp:cNvGraphicFramePr/>
             <a:graphic xmlns:a="http://schemas.openxmlformats.org/drawingml/2006/main">
               <a:graphicData uri="http://schemas.openxmlformats.org/drawingml/2006/picture">
@@ -12204,7 +12134,7 @@
       <w:r>
         <w:instrText xml:space="preserve"> TC "</w:instrText>
       </w:r>
-      <w:bookmarkStart w:id="81" w:name="_Toc243732587"/>
+      <w:bookmarkStart w:id="81" w:name="_Toc243733553"/>
       <w:r>
         <w:instrText>5.4. Consumo de agua luego del tratamiento con los endulzantes</w:instrText>
       </w:r>
@@ -12221,7 +12151,7 @@
         <w:pStyle w:val="Ttulo2"/>
       </w:pPr>
       <w:bookmarkStart w:id="82" w:name="conducta-tipo-ansiosa-of"/>
-      <w:bookmarkStart w:id="83" w:name="_Toc243732558"/>
+      <w:bookmarkStart w:id="83" w:name="_Toc243733524"/>
       <w:bookmarkEnd w:id="72"/>
       <w:bookmarkEnd w:id="79"/>
       <w:r>
@@ -12901,10 +12831,10 @@
         </w:rPr>
         <w:lastRenderedPageBreak/>
         <w:drawing>
-          <wp:inline distT="0" distB="0" distL="0" distR="0" wp14:anchorId="61C93B61" wp14:editId="7FF7DBAA">
+          <wp:inline distT="0" distB="0" distL="0" distR="0" wp14:anchorId="1D818AFA" wp14:editId="0DBD525E">
             <wp:extent cx="5753100" cy="4508116"/>
             <wp:effectExtent l="0" t="0" r="0" b="0"/>
-            <wp:docPr id="199184082" name="Picture" descr="image"/>
+            <wp:docPr id="370255880" name="Picture" descr="image"/>
             <wp:cNvGraphicFramePr/>
             <a:graphic xmlns:a="http://schemas.openxmlformats.org/drawingml/2006/main">
               <a:graphicData uri="http://schemas.openxmlformats.org/drawingml/2006/picture">
@@ -13123,7 +13053,7 @@
       <w:r>
         <w:instrText xml:space="preserve"> TC "</w:instrText>
       </w:r>
-      <w:bookmarkStart w:id="84" w:name="_Toc243732588"/>
+      <w:bookmarkStart w:id="84" w:name="_Toc243733554"/>
       <w:r>
         <w:instrText>5.5. Actividad locomotora y exploración de la arena en el open field</w:instrText>
       </w:r>
@@ -13433,10 +13363,10 @@
         </w:rPr>
         <w:lastRenderedPageBreak/>
         <w:drawing>
-          <wp:inline distT="0" distB="0" distL="0" distR="0" wp14:anchorId="62B30A62" wp14:editId="09A234BC">
+          <wp:inline distT="0" distB="0" distL="0" distR="0" wp14:anchorId="330DA6CF" wp14:editId="2DC511B1">
             <wp:extent cx="5753100" cy="1945095"/>
             <wp:effectExtent l="0" t="0" r="0" b="0"/>
-            <wp:docPr id="498971780" name="Picture" descr="image"/>
+            <wp:docPr id="503331053" name="Picture" descr="image"/>
             <wp:cNvGraphicFramePr/>
             <a:graphic xmlns:a="http://schemas.openxmlformats.org/drawingml/2006/main">
               <a:graphicData uri="http://schemas.openxmlformats.org/drawingml/2006/picture">
@@ -13650,7 +13580,7 @@
       <w:r>
         <w:instrText xml:space="preserve"> TC "</w:instrText>
       </w:r>
-      <w:bookmarkStart w:id="85" w:name="_Toc243732589"/>
+      <w:bookmarkStart w:id="85" w:name="_Toc243733555"/>
       <w:r>
         <w:instrText>5.6. Conducta de rearing en el open field</w:instrText>
       </w:r>
@@ -13739,7 +13669,7 @@
       <w:r>
         <w:instrText xml:space="preserve"> TC "</w:instrText>
       </w:r>
-      <w:bookmarkStart w:id="86" w:name="_Toc243732601"/>
+      <w:bookmarkStart w:id="86" w:name="_Toc243733567"/>
       <w:r>
         <w:instrText>5.1. Resumen del ANOVA de dos vías para las variables del OF</w:instrText>
       </w:r>
@@ -15777,7 +15707,7 @@
         <w:pStyle w:val="Ttulo2"/>
       </w:pPr>
       <w:bookmarkStart w:id="87" w:name="memoria-de-reconocimiento-de-objetos-nor"/>
-      <w:bookmarkStart w:id="88" w:name="_Toc243732559"/>
+      <w:bookmarkStart w:id="88" w:name="_Toc243733525"/>
       <w:bookmarkEnd w:id="82"/>
       <w:r>
         <w:t>5.3 Memoria de reconocimiento de objetos (NOR)</w:t>
@@ -15984,10 +15914,10 @@
           <w:noProof/>
         </w:rPr>
         <w:drawing>
-          <wp:inline distT="0" distB="0" distL="0" distR="0" wp14:anchorId="2ECDCFB0" wp14:editId="28A5600A">
+          <wp:inline distT="0" distB="0" distL="0" distR="0" wp14:anchorId="7C447981" wp14:editId="69F651A2">
             <wp:extent cx="5753100" cy="3244870"/>
             <wp:effectExtent l="0" t="0" r="0" b="0"/>
-            <wp:docPr id="1387828875" name="Picture" descr="image"/>
+            <wp:docPr id="1580348159" name="Picture" descr="image"/>
             <wp:cNvGraphicFramePr/>
             <a:graphic xmlns:a="http://schemas.openxmlformats.org/drawingml/2006/main">
               <a:graphicData uri="http://schemas.openxmlformats.org/drawingml/2006/picture">
@@ -16111,7 +16041,7 @@
       <w:r>
         <w:instrText xml:space="preserve"> TC "</w:instrText>
       </w:r>
-      <w:bookmarkStart w:id="89" w:name="_Toc243732590"/>
+      <w:bookmarkStart w:id="89" w:name="_Toc243733556"/>
       <w:r>
         <w:instrText>5.7. Exploración de los objetos en la fase de muestreo del NOR</w:instrText>
       </w:r>
@@ -16562,10 +16492,10 @@
           <w:noProof/>
         </w:rPr>
         <w:drawing>
-          <wp:inline distT="0" distB="0" distL="0" distR="0" wp14:anchorId="6B6235F3" wp14:editId="31BC8EB5">
+          <wp:inline distT="0" distB="0" distL="0" distR="0" wp14:anchorId="29A692CA" wp14:editId="765A082D">
             <wp:extent cx="5753100" cy="5555242"/>
             <wp:effectExtent l="0" t="0" r="0" b="0"/>
-            <wp:docPr id="2088028905" name="Picture" descr="image"/>
+            <wp:docPr id="756009414" name="Picture" descr="image"/>
             <wp:cNvGraphicFramePr/>
             <a:graphic xmlns:a="http://schemas.openxmlformats.org/drawingml/2006/main">
               <a:graphicData uri="http://schemas.openxmlformats.org/drawingml/2006/picture">
@@ -16627,7 +16557,7 @@
         <w:rPr>
           <w:sz w:val="19"/>
         </w:rPr>
-        <w:t xml:space="preserve">Tasa de exploración en la prueba NOR. (A) T2 (2 h). (B) T3 (24 h). (C) T4 (7 días). (D) Esquema del protocolo y objetos presentados en cada ensayo [28]. Las barras indican media ± SEM; cada punto representa un animal. Azul: grupo control; rojo: grupo sacarosa; verde: grupo stevia. Se indican los resultados de las </w:t>
+        <w:t xml:space="preserve">Tasa de exploración en la prueba NOR. (A) T2 (2 h). (B) T3 (24 h). (C) T4 (7 días). (D) Esquema del protocolo y objetos presentados en cada ensayo [30]. Las barras indican media ± SEM; cada punto representa un animal. Azul: grupo control; rojo: grupo sacarosa; verde: grupo stevia. Se indican los resultados de las </w:t>
       </w:r>
       <w:r>
         <w:rPr>
@@ -16764,7 +16694,7 @@
       <w:r>
         <w:instrText xml:space="preserve"> TC "</w:instrText>
       </w:r>
-      <w:bookmarkStart w:id="90" w:name="_Toc243732591"/>
+      <w:bookmarkStart w:id="90" w:name="_Toc243733557"/>
       <w:r>
         <w:instrText>5.8. Tasa de exploración en la prueba NOR</w:instrText>
       </w:r>
@@ -16854,7 +16784,7 @@
       <w:r>
         <w:instrText xml:space="preserve"> TC "</w:instrText>
       </w:r>
-      <w:bookmarkStart w:id="91" w:name="_Toc243732602"/>
+      <w:bookmarkStart w:id="91" w:name="_Toc243733568"/>
       <w:r>
         <w:instrText>5.2. Resumen del ANOVA de dos vías para la tasa de exploración en la prueba NOR</w:instrText>
       </w:r>
@@ -17893,7 +17823,7 @@
         <w:pStyle w:val="Ttulo2"/>
       </w:pPr>
       <w:bookmarkStart w:id="92" w:name="separación-de-patrones-espaciales-slr"/>
-      <w:bookmarkStart w:id="93" w:name="_Toc243732560"/>
+      <w:bookmarkStart w:id="93" w:name="_Toc243733526"/>
       <w:bookmarkEnd w:id="87"/>
       <w:r>
         <w:t>5.4 Separación de patrones espaciales (SLR)</w:t>
@@ -18484,10 +18414,10 @@
           <w:noProof/>
         </w:rPr>
         <w:drawing>
-          <wp:inline distT="0" distB="0" distL="0" distR="0" wp14:anchorId="29BB9118" wp14:editId="1BBA094E">
+          <wp:inline distT="0" distB="0" distL="0" distR="0" wp14:anchorId="76F89A69" wp14:editId="3A4895EC">
             <wp:extent cx="5753100" cy="5573505"/>
             <wp:effectExtent l="0" t="0" r="0" b="0"/>
-            <wp:docPr id="172628067" name="Picture" descr="image"/>
+            <wp:docPr id="1866006108" name="Picture" descr="image"/>
             <wp:cNvGraphicFramePr/>
             <a:graphic xmlns:a="http://schemas.openxmlformats.org/drawingml/2006/main">
               <a:graphicData uri="http://schemas.openxmlformats.org/drawingml/2006/picture">
@@ -18652,7 +18582,7 @@
       <w:r>
         <w:instrText xml:space="preserve"> TC "</w:instrText>
       </w:r>
-      <w:bookmarkStart w:id="94" w:name="_Toc243732592"/>
+      <w:bookmarkStart w:id="94" w:name="_Toc243733558"/>
       <w:r>
         <w:instrText>5.9. Exploración de los objetos y distancia recorrida en la fase de muestreo de la SLR</w:instrText>
       </w:r>
@@ -19102,10 +19032,10 @@
           <w:noProof/>
         </w:rPr>
         <w:drawing>
-          <wp:inline distT="0" distB="0" distL="0" distR="0" wp14:anchorId="4B03C908" wp14:editId="6B440D9F">
+          <wp:inline distT="0" distB="0" distL="0" distR="0" wp14:anchorId="0DAC483E" wp14:editId="255C2D45">
             <wp:extent cx="5753100" cy="2161217"/>
             <wp:effectExtent l="0" t="0" r="0" b="0"/>
-            <wp:docPr id="323124632" name="Picture" descr="image"/>
+            <wp:docPr id="983832857" name="Picture" descr="image"/>
             <wp:cNvGraphicFramePr/>
             <a:graphic xmlns:a="http://schemas.openxmlformats.org/drawingml/2006/main">
               <a:graphicData uri="http://schemas.openxmlformats.org/drawingml/2006/picture">
@@ -19237,7 +19167,7 @@
       <w:r>
         <w:instrText xml:space="preserve"> TC "</w:instrText>
       </w:r>
-      <w:bookmarkStart w:id="95" w:name="_Toc243732593"/>
+      <w:bookmarkStart w:id="95" w:name="_Toc243733559"/>
       <w:r>
         <w:instrText>5.10. Índice de discriminación (DI) en la prueba SLR</w:instrText>
       </w:r>
@@ -19261,10 +19191,10 @@
         </w:rPr>
         <w:lastRenderedPageBreak/>
         <w:drawing>
-          <wp:inline distT="0" distB="0" distL="0" distR="0" wp14:anchorId="2CCB852C" wp14:editId="16C0BEEE">
+          <wp:inline distT="0" distB="0" distL="0" distR="0" wp14:anchorId="5C417320" wp14:editId="55EA8244">
             <wp:extent cx="5753100" cy="2072942"/>
             <wp:effectExtent l="0" t="0" r="0" b="0"/>
-            <wp:docPr id="117735003" name="Picture" descr="image"/>
+            <wp:docPr id="933144086" name="Picture" descr="image"/>
             <wp:cNvGraphicFramePr/>
             <a:graphic xmlns:a="http://schemas.openxmlformats.org/drawingml/2006/main">
               <a:graphicData uri="http://schemas.openxmlformats.org/drawingml/2006/picture">
@@ -19402,7 +19332,7 @@
       <w:r>
         <w:instrText xml:space="preserve"> TC "</w:instrText>
       </w:r>
-      <w:bookmarkStart w:id="96" w:name="_Toc243732594"/>
+      <w:bookmarkStart w:id="96" w:name="_Toc243733560"/>
       <w:r>
         <w:instrText>5.11. Tasa de exploración en la prueba SLR</w:instrText>
       </w:r>
@@ -19436,10 +19366,10 @@
           <w:noProof/>
         </w:rPr>
         <w:drawing>
-          <wp:inline distT="0" distB="0" distL="0" distR="0" wp14:anchorId="7B69710C" wp14:editId="1722C93B">
+          <wp:inline distT="0" distB="0" distL="0" distR="0" wp14:anchorId="20945D45" wp14:editId="76CAEF7D">
             <wp:extent cx="5753100" cy="2899166"/>
             <wp:effectExtent l="0" t="0" r="0" b="0"/>
-            <wp:docPr id="1802611797" name="Picture" descr="image"/>
+            <wp:docPr id="282844930" name="Picture" descr="image"/>
             <wp:cNvGraphicFramePr/>
             <a:graphic xmlns:a="http://schemas.openxmlformats.org/drawingml/2006/main">
               <a:graphicData uri="http://schemas.openxmlformats.org/drawingml/2006/picture">
@@ -19517,7 +19447,7 @@
       <w:r>
         <w:instrText xml:space="preserve"> TC "</w:instrText>
       </w:r>
-      <w:bookmarkStart w:id="97" w:name="_Toc243732595"/>
+      <w:bookmarkStart w:id="97" w:name="_Toc243733561"/>
       <w:r>
         <w:instrText>5.12. Diferencias de medias del DI entre grupos (prueba de Tukey)</w:instrText>
       </w:r>
@@ -19581,7 +19511,7 @@
       <w:r>
         <w:instrText xml:space="preserve"> TC "</w:instrText>
       </w:r>
-      <w:bookmarkStart w:id="98" w:name="_Toc243732603"/>
+      <w:bookmarkStart w:id="98" w:name="_Toc243733569"/>
       <w:r>
         <w:instrText>5.3. Resumen del ANOVA de dos vías para el DI en la prueba SLR</w:instrText>
       </w:r>
@@ -20320,7 +20250,7 @@
         <w:pStyle w:val="Ttulo2"/>
       </w:pPr>
       <w:bookmarkStart w:id="99" w:name="neurogénesis-hipocampal-pcna-y-dcx"/>
-      <w:bookmarkStart w:id="100" w:name="_Toc243732561"/>
+      <w:bookmarkStart w:id="100" w:name="_Toc243733527"/>
       <w:bookmarkEnd w:id="92"/>
       <w:r>
         <w:t>5.5 Neurogénesis hipocampal (PCNA y DCX)</w:t>
@@ -20733,10 +20663,10 @@
         </w:rPr>
         <w:lastRenderedPageBreak/>
         <w:drawing>
-          <wp:inline distT="0" distB="0" distL="0" distR="0" wp14:anchorId="2C8E9741" wp14:editId="754D62A4">
+          <wp:inline distT="0" distB="0" distL="0" distR="0" wp14:anchorId="62527CED" wp14:editId="118F8D4E">
             <wp:extent cx="5753100" cy="2669560"/>
             <wp:effectExtent l="0" t="0" r="0" b="0"/>
-            <wp:docPr id="2055082671" name="Picture" descr="image"/>
+            <wp:docPr id="1092592832" name="Picture" descr="image"/>
             <wp:cNvGraphicFramePr/>
             <a:graphic xmlns:a="http://schemas.openxmlformats.org/drawingml/2006/main">
               <a:graphicData uri="http://schemas.openxmlformats.org/drawingml/2006/picture">
@@ -20933,7 +20863,7 @@
       <w:r>
         <w:instrText xml:space="preserve"> TC "</w:instrText>
       </w:r>
-      <w:bookmarkStart w:id="101" w:name="_Toc243732596"/>
+      <w:bookmarkStart w:id="101" w:name="_Toc243733562"/>
       <w:r>
         <w:instrText>5.13. Inmunocitoquímica del GD (PCNA y DCX)</w:instrText>
       </w:r>
@@ -20957,10 +20887,10 @@
         </w:rPr>
         <w:lastRenderedPageBreak/>
         <w:drawing>
-          <wp:inline distT="0" distB="0" distL="0" distR="0" wp14:anchorId="34CE191A" wp14:editId="61A5C718">
+          <wp:inline distT="0" distB="0" distL="0" distR="0" wp14:anchorId="4B2CB0D1" wp14:editId="0C8826B5">
             <wp:extent cx="2879999" cy="5961264"/>
             <wp:effectExtent l="0" t="0" r="0" b="0"/>
-            <wp:docPr id="124917244" name="Picture" descr="image"/>
+            <wp:docPr id="1633056434" name="Picture" descr="image"/>
             <wp:cNvGraphicFramePr/>
             <a:graphic xmlns:a="http://schemas.openxmlformats.org/drawingml/2006/main">
               <a:graphicData uri="http://schemas.openxmlformats.org/drawingml/2006/picture">
@@ -21063,7 +20993,7 @@
       <w:r>
         <w:instrText xml:space="preserve"> TC "</w:instrText>
       </w:r>
-      <w:bookmarkStart w:id="102" w:name="_Toc243732597"/>
+      <w:bookmarkStart w:id="102" w:name="_Toc243733563"/>
       <w:r>
         <w:instrText>5.14. Fotomicrografías representativas del GD (PCNA y DCX)</w:instrText>
       </w:r>
@@ -21151,7 +21081,7 @@
         <w:pStyle w:val="Ttulo2"/>
       </w:pPr>
       <w:bookmarkStart w:id="103" w:name="análisis-multivariado-de-la-prueba-slr"/>
-      <w:bookmarkStart w:id="104" w:name="_Toc243732562"/>
+      <w:bookmarkStart w:id="104" w:name="_Toc243733528"/>
       <w:bookmarkEnd w:id="99"/>
       <w:r>
         <w:t>5.6 Análisis multivariado de la prueba SLR</w:t>
@@ -21474,10 +21404,10 @@
         </w:rPr>
         <w:lastRenderedPageBreak/>
         <w:drawing>
-          <wp:inline distT="0" distB="0" distL="0" distR="0" wp14:anchorId="2FD3DCF4" wp14:editId="6DD0526E">
+          <wp:inline distT="0" distB="0" distL="0" distR="0" wp14:anchorId="5E41ACFE" wp14:editId="189671CE">
             <wp:extent cx="5753100" cy="2649453"/>
             <wp:effectExtent l="0" t="0" r="0" b="0"/>
-            <wp:docPr id="1221222712" name="Picture" descr="image"/>
+            <wp:docPr id="644317791" name="Picture" descr="image"/>
             <wp:cNvGraphicFramePr/>
             <a:graphic xmlns:a="http://schemas.openxmlformats.org/drawingml/2006/main">
               <a:graphicData uri="http://schemas.openxmlformats.org/drawingml/2006/picture">
@@ -21573,7 +21503,7 @@
       <w:r>
         <w:instrText xml:space="preserve"> TC "</w:instrText>
       </w:r>
-      <w:bookmarkStart w:id="105" w:name="_Toc243732598"/>
+      <w:bookmarkStart w:id="105" w:name="_Toc243733564"/>
       <w:r>
         <w:instrText>5.15. Análisis de componentes principales de la prueba SLR</w:instrText>
       </w:r>
@@ -21596,10 +21526,10 @@
           <w:noProof/>
         </w:rPr>
         <w:drawing>
-          <wp:inline distT="0" distB="0" distL="0" distR="0" wp14:anchorId="6BF74556" wp14:editId="082BEC5B">
+          <wp:inline distT="0" distB="0" distL="0" distR="0" wp14:anchorId="5E98A408" wp14:editId="20D9A997">
             <wp:extent cx="5753100" cy="2573755"/>
             <wp:effectExtent l="0" t="0" r="0" b="0"/>
-            <wp:docPr id="886450667" name="Picture" descr="image"/>
+            <wp:docPr id="843201939" name="Picture" descr="image"/>
             <wp:cNvGraphicFramePr/>
             <a:graphic xmlns:a="http://schemas.openxmlformats.org/drawingml/2006/main">
               <a:graphicData uri="http://schemas.openxmlformats.org/drawingml/2006/picture">
@@ -21695,7 +21625,7 @@
       <w:r>
         <w:instrText xml:space="preserve"> TC "</w:instrText>
       </w:r>
-      <w:bookmarkStart w:id="106" w:name="_Toc243732599"/>
+      <w:bookmarkStart w:id="106" w:name="_Toc243733565"/>
       <w:r>
         <w:instrText>5.16. Clasificación de los grupos experimentales con Random Forest</w:instrText>
       </w:r>
@@ -21724,7 +21654,7 @@
         <w:pStyle w:val="Ttulo1"/>
       </w:pPr>
       <w:bookmarkStart w:id="107" w:name="discusión"/>
-      <w:bookmarkStart w:id="108" w:name="_Toc243732563"/>
+      <w:bookmarkStart w:id="108" w:name="_Toc243733529"/>
       <w:bookmarkEnd w:id="70"/>
       <w:bookmarkEnd w:id="103"/>
       <w:r>
@@ -21738,7 +21668,7 @@
         <w:pStyle w:val="Ttulo2"/>
       </w:pPr>
       <w:bookmarkStart w:id="109" w:name="síntesis-de-los-hallazgos"/>
-      <w:bookmarkStart w:id="110" w:name="_Toc243732564"/>
+      <w:bookmarkStart w:id="110" w:name="_Toc243733530"/>
       <w:r>
         <w:t>6.1 Síntesis de los hallazgos</w:t>
       </w:r>
@@ -21749,7 +21679,7 @@
         <w:pStyle w:val="FirstParagraph"/>
       </w:pPr>
       <w:r>
-        <w:t xml:space="preserve">En este trabajo se evaluaron los efectos a largo plazo del consumo de un extracto de stevia durante la etapa juvenil o durante la adultez y se los comparó con los de la sacarosa al 10 %, cuyos efectos persistentes sobre la conducta y la memoria ya fueron descriptos por el laboratorio [28, 41]. Los animales expuestos a stevia exploraron más las zonas centrales del </w:t>
+        <w:t xml:space="preserve">En este trabajo se evaluaron los efectos a largo plazo del consumo de un extracto de stevia durante la etapa juvenil o durante la adultez y se los comparó con los de la sacarosa al 10 %, cuyos efectos persistentes sobre la conducta y la memoria ya fueron descriptos por el laboratorio [30, 41]. Los animales expuestos a stevia exploraron más las zonas centrales del </w:t>
       </w:r>
       <w:r>
         <w:rPr>
@@ -21798,7 +21728,7 @@
         <w:pStyle w:val="Ttulo2"/>
       </w:pPr>
       <w:bookmarkStart w:id="111" w:name="consumo-de-líquidos-1"/>
-      <w:bookmarkStart w:id="112" w:name="_Toc243732565"/>
+      <w:bookmarkStart w:id="112" w:name="_Toc243733531"/>
       <w:bookmarkEnd w:id="109"/>
       <w:r>
         <w:t>6.2 Consumo de líquidos</w:t>
@@ -21869,7 +21799,7 @@
         <w:pStyle w:val="Ttulo2"/>
       </w:pPr>
       <w:bookmarkStart w:id="113" w:name="Xbe6db9f52668e63da41a503be782c14d7927980"/>
-      <w:bookmarkStart w:id="114" w:name="_Toc243732566"/>
+      <w:bookmarkStart w:id="114" w:name="_Toc243733532"/>
       <w:bookmarkEnd w:id="111"/>
       <w:r>
         <w:t xml:space="preserve">6.3 Conducta tipo ansiosa y exploración en el </w:t>
@@ -22025,16 +21955,25 @@
         <w:t>Interesantemente</w:t>
       </w:r>
       <w:r>
-        <w:t xml:space="preserve">, resultados previos del laboratorio demostraron que la exposición temprana y aguda al mismo extracto acuoso en ratas </w:t>
+        <w:t xml:space="preserve">, resultados previos del laboratorio demostraron que la exposición temprana </w:t>
       </w:r>
       <w:r>
         <w:rPr>
           <w:highlight w:val="yellow"/>
         </w:rPr>
+        <w:t>y aguda</w:t>
+      </w:r>
+      <w:r>
+        <w:t xml:space="preserve"> al mismo extracto acuoso en ratas </w:t>
+      </w:r>
+      <w:r>
+        <w:rPr>
+          <w:highlight w:val="yellow"/>
+        </w:rPr>
         <w:t>hembras</w:t>
       </w:r>
       <w:r>
-        <w:t xml:space="preserve"> juveniles disminuye las conductas de tipo ansioso en el laberinto en cruz elevado [29]. Estos hallazgos sugieren la existencia de diferencias sexuales en la respuesta </w:t>
+        <w:t xml:space="preserve"> juveniles disminuye las conductas de tipo ansioso en el laberinto en cruz elevado [27]. Estos hallazgos sugieren la existencia de diferencias sexuales en la respuesta </w:t>
       </w:r>
       <w:r>
         <w:rPr>
@@ -22078,7 +22017,7 @@
         <w:pStyle w:val="Ttulo2"/>
       </w:pPr>
       <w:bookmarkStart w:id="115" w:name="memoria-de-reconocimiento-de-objetos"/>
-      <w:bookmarkStart w:id="116" w:name="_Toc243732567"/>
+      <w:bookmarkStart w:id="116" w:name="_Toc243733533"/>
       <w:bookmarkEnd w:id="113"/>
       <w:r>
         <w:lastRenderedPageBreak/>
@@ -22094,7 +22033,7 @@
         <w:t>En el NOR, los animales expuestos a sacarosa durante la etapa juvenil presentaron una menor exploración del objeto novedoso que sus controles de edad en todos los intervalos de retención evaluados: a las 2 h (memoria a corto plazo), a las 24 h (memoria a largo plazo) y a los 7 días (memoria consolidada). En contraste, los animales expuestos a sacarosa durante la adultez conservaron la capacidad de discriminar entre el objeto familiar y el novedoso en los tres intervalos de retención (§5.3), como fue descrip</w:t>
       </w:r>
       <w:r>
-        <w:t>to previamente [28].</w:t>
+        <w:t>to previamente [30].</w:t>
       </w:r>
     </w:p>
     <w:p>
@@ -22187,7 +22126,7 @@
         <w:pStyle w:val="Ttulo2"/>
       </w:pPr>
       <w:bookmarkStart w:id="117" w:name="Xa69d358d6a5b9d31515259c5445516064b70d4b"/>
-      <w:bookmarkStart w:id="118" w:name="_Toc243732568"/>
+      <w:bookmarkStart w:id="118" w:name="_Toc243733534"/>
       <w:bookmarkEnd w:id="115"/>
       <w:r>
         <w:t>6.5 Separación de patrones espaciales y neurogénesis</w:t>
@@ -22199,7 +22138,7 @@
         <w:pStyle w:val="FirstParagraph"/>
       </w:pPr>
       <w:r>
-        <w:t>En la SLR, los animales expuestos a sacarosa durante la etapa juvenil discriminaron peor la posición novedosa en ambas configuraciones, mientras que los expuestos durante la adultez lo hicieron solo en la s-SLR, la configuración de mayor demanda de separación de patrones (§5.4). Este patrón concuerda con el de Reichelt et al., quienes encontraron que las ratas con acceso diario a sacarosa discriminaron la nueva ubicación de un objeto cuando la separación espacial era grande, pero no cuando era pequeña [27].</w:t>
+        <w:t>En la SLR, los animales expuestos a sacarosa durante la etapa juvenil discriminaron peor la posición novedosa en ambas configuraciones, mientras que los expuestos durante la adultez lo hicieron solo en la s-SLR, la configuración de mayor demanda de separación de patrones (§5.4). Este patrón concuerda con el de Reichelt et al., quienes encontraron que las ratas con acceso diario a sacarosa discriminaron la nueva ubicación de un objeto cuando la separación espacial era grande, pero no cuando era pequeña [29].</w:t>
       </w:r>
       <w:r>
         <w:t xml:space="preserve"> También concuerda con la alteración selectiva de la memoria de lugar descripta tras una exposición breve a azúcar [84, 85] y con el deterioro de la separación de patrones asociado a una menor neurogénesis tras una alteración nutricional temprana [72]. Que en los adultos el déficit apareciera solo en la configuración más exigente sugiere que la exposición adulta a sacarosa compromete específicamente la separación de patrones, mientras que la exposición juvenil produce una alteración más amplia de la memoria</w:t>
@@ -22311,7 +22250,7 @@
         <w:t>+</w:t>
       </w:r>
       <w:r>
-        <w:t xml:space="preserve"> [27]. En este trabajo, en cambio, el número total de células DCX</w:t>
+        <w:t xml:space="preserve"> [29]. En este trabajo, en cambio, el número total de células DCX</w:t>
       </w:r>
       <w:r>
         <w:rPr>
@@ -22361,7 +22300,7 @@
           <w:highlight w:val="yellow"/>
         </w:rPr>
         <w:lastRenderedPageBreak/>
-        <w:t xml:space="preserve">representaciones neuronales diferenciadas durante la formación de la memoria [27]. En particular, se ha propuesto que la neurogénesis adulta en el </w:t>
+        <w:t xml:space="preserve">representaciones neuronales diferenciadas durante la formación de la memoria [29]. En particular, se ha propuesto que la neurogénesis adulta en el </w:t>
       </w:r>
       <w:r>
         <w:rPr>
@@ -22416,7 +22355,7 @@
         <w:pStyle w:val="Ttulo2"/>
       </w:pPr>
       <w:bookmarkStart w:id="119" w:name="análisis-multivariado"/>
-      <w:bookmarkStart w:id="120" w:name="_Toc243732569"/>
+      <w:bookmarkStart w:id="120" w:name="_Toc243733535"/>
       <w:bookmarkEnd w:id="117"/>
       <w:r>
         <w:t>6.6 Análisis multivariado</w:t>
@@ -22452,7 +22391,7 @@
         <w:pStyle w:val="Ttulo2"/>
       </w:pPr>
       <w:bookmarkStart w:id="121" w:name="ventana-etaria"/>
-      <w:bookmarkStart w:id="122" w:name="_Toc243732570"/>
+      <w:bookmarkStart w:id="122" w:name="_Toc243733536"/>
       <w:bookmarkEnd w:id="119"/>
       <w:r>
         <w:t>6.7 Ventana etaria</w:t>
@@ -22497,7 +22436,7 @@
         <w:pStyle w:val="Ttulo2"/>
       </w:pPr>
       <w:bookmarkStart w:id="123" w:name="en-resumen"/>
-      <w:bookmarkStart w:id="124" w:name="_Toc243732571"/>
+      <w:bookmarkStart w:id="124" w:name="_Toc243733537"/>
       <w:bookmarkEnd w:id="121"/>
       <w:r>
         <w:t>6.8 En resumen</w:t>
@@ -22529,7 +22468,7 @@
         <w:t>En conclusión, los resultados obtenidos, junto con la evidencia aportada por estudios previos, sugieren que el consumo crónico de bebidas azucaradas durante etapas tempranas de la vida puede afectar negativamente el desarrollo y la maduración del sistema nervioso central, con consecuencias que podrían persistir hasta la edad adulta. Por su parte, el consumo de stevia se asoció con un perfil de efectos diferente, caracterizado por conductas de tipo ansiolítico y alteraciones más moderadas de la memoria de re</w:t>
       </w:r>
       <w:r>
-        <w:t>conocimiento, observadas tanto en animales juveniles como adultos. Si bien estos efectos fueron de menor magnitud que los asociados al consumo de sacarosa, su presencia en ambas etapas de la vida, sumada a los efectos sobre la fertilidad descriptos en ratas hembra [29], pone de manifiesto que la stevia no está exenta de efectos. En este sentido, resulta fundamental continuar investigando sus posibles consecuencias neurobiológicas y cognitivas a largo plazo, así como profundizar en la evaluación de la seguri</w:t>
+        <w:t>conocimiento, observadas tanto en animales juveniles como adultos. Si bien estos efectos fueron de menor magnitud que los asociados al consumo de sacarosa, su presencia en ambas etapas de la vida, sumada a los efectos sobre la fertilidad descriptos en ratas hembra [27], pone de manifiesto que la stevia no está exenta de efectos. En este sentido, resulta fundamental continuar investigando sus posibles consecuencias neurobiológicas y cognitivas a largo plazo, así como profundizar en la evaluación de la seguri</w:t>
       </w:r>
       <w:r>
         <w:t>dad de su consumo en las distintas etapas de la vida.</w:t>
@@ -22540,7 +22479,7 @@
         <w:pStyle w:val="Ttulo1"/>
       </w:pPr>
       <w:bookmarkStart w:id="125" w:name="perspectivas-futuras"/>
-      <w:bookmarkStart w:id="126" w:name="_Toc243732572"/>
+      <w:bookmarkStart w:id="126" w:name="_Toc243733538"/>
       <w:bookmarkEnd w:id="107"/>
       <w:bookmarkEnd w:id="123"/>
       <w:r>
@@ -22711,7 +22650,7 @@
         <w:pStyle w:val="Ttulo1"/>
       </w:pPr>
       <w:bookmarkStart w:id="127" w:name="conclusiones"/>
-      <w:bookmarkStart w:id="128" w:name="_Toc243732573"/>
+      <w:bookmarkStart w:id="128" w:name="_Toc243733539"/>
       <w:bookmarkEnd w:id="125"/>
       <w:r>
         <w:lastRenderedPageBreak/>
@@ -22856,7 +22795,7 @@
         <w:pStyle w:val="Ttulo2"/>
       </w:pPr>
       <w:bookmarkStart w:id="129" w:name="cumplimiento-de-los-objetivos"/>
-      <w:bookmarkStart w:id="130" w:name="_Toc243732574"/>
+      <w:bookmarkStart w:id="130" w:name="_Toc243733540"/>
       <w:r>
         <w:t>Cumplimiento de los objetivos</w:t>
       </w:r>
@@ -22884,7 +22823,7 @@
         <w:pStyle w:val="Ttulo2"/>
       </w:pPr>
       <w:bookmarkStart w:id="131" w:name="hipótesis-1"/>
-      <w:bookmarkStart w:id="132" w:name="_Toc243732575"/>
+      <w:bookmarkStart w:id="132" w:name="_Toc243733541"/>
       <w:bookmarkEnd w:id="129"/>
       <w:r>
         <w:t>Hipótesis</w:t>
@@ -22916,7 +22855,7 @@
         <w:pStyle w:val="Ttulo1"/>
       </w:pPr>
       <w:bookmarkStart w:id="133" w:name="referencias-bibliográficas"/>
-      <w:bookmarkStart w:id="134" w:name="_Toc243732576"/>
+      <w:bookmarkStart w:id="134" w:name="_Toc243733542"/>
       <w:bookmarkEnd w:id="127"/>
       <w:bookmarkEnd w:id="131"/>
       <w:r>
@@ -23328,7 +23267,7 @@
         <w:rPr>
           <w:sz w:val="19"/>
         </w:rPr>
-        <w:t>[27] A. C. Reichelt, M. J. Morris, and R. F. Westbrook, “Daily access to sucrose impairs aspects of spatial memory tasks reliant on pattern separation and neural proliferation in rats,” Learn. Mem., vol. 23, no. 7, pp. 386–390, Jul. 2016. doi: 10.1101/lm.042416.116 [Online]. Available: http://www.ncbi.nlm.nih.gov/pubmed/27317199</w:t>
+        <w:t>[27] M. S. Kruse, H. Coirini, and M. Rey, “Early Consumption of Stevia rebaudiana Bertoni on Rat Females: Actions on Their Fertility, Progeny, and Behavior,” J. Nutr., vol. 155, no. 6, pp. 1839–1850, Jun. 2025. doi: 10.1016/j.tjnut.2025.04.023 [Online]. Available: https://www.sciencedirect.com/science/article/abs/pii/S0022316625002688</w:t>
       </w:r>
     </w:p>
     <w:p>
@@ -23341,13 +23280,13 @@
         <w:rPr>
           <w:sz w:val="19"/>
         </w:rPr>
-        <w:t>[28] H. Coirini et al., “</w:t>
-      </w:r>
-      <w:r>
-        <w:rPr>
-          <w:sz w:val="19"/>
-        </w:rPr>
-        <w:t>Long-Term Memory Function Impairments following Sucrose Exposure in Juvenile versus Adult Rats,” Biomedicines, vol. 10, no. 11, Nov. 2022, Art. no. 2723. doi: 10.3390/biomedicines10112723 [Online]. Available: https://www.mdpi.com/2227-9059/10/11/2723</w:t>
+        <w:t>[28] L. P. Spear, “</w:t>
+      </w:r>
+      <w:r>
+        <w:rPr>
+          <w:sz w:val="19"/>
+        </w:rPr>
+        <w:t>The adolescent brain and age-related behavioral manifestations,” Neurosci. Biobehav. Rev., vol. 24, no. 4, pp. 417–463, 2000. doi: 10.1016/S0149-7634(00)00014-2</w:t>
       </w:r>
     </w:p>
     <w:p>
@@ -23360,13 +23299,7 @@
         <w:rPr>
           <w:sz w:val="19"/>
         </w:rPr>
-        <w:t xml:space="preserve">[29] M. S. Kruse, H. Coirini, and M. Rey, “Early Consumption of Stevia rebaudiana Bertoni on Rat Females: Actions on Their Fertility, Progeny, and Behavior,” </w:t>
-      </w:r>
-      <w:r>
-        <w:rPr>
-          <w:sz w:val="19"/>
-        </w:rPr>
-        <w:t>J. Nutr., vol. 155, no. 6, pp. 1839–1850, Jun. 2025. doi: 10.1016/j.tjnut.2025.04.023 [Online]. Available: https://www.sciencedirect.com/science/article/abs/pii/S0022316625002688</w:t>
+        <w:t>[29] A. C. Reichelt, M. J. Morris, and R. F. Westbrook, “Daily access to sucrose impairs aspects of spatial memory tasks reliant on pattern separation and neural proliferation in rats,” Learn. Mem., vol. 23, no. 7, pp. 386–390, Jul. 2016. doi: 10.1101/lm.042416.116 [Online]. Available: http://www.ncbi.nlm.nih.gov/pubmed/27317199</w:t>
       </w:r>
     </w:p>
     <w:p>
@@ -23379,7 +23312,7 @@
         <w:rPr>
           <w:sz w:val="19"/>
         </w:rPr>
-        <w:t>[30] L. P. Spear, “The adolescent brain and age-related behavioral manifestations,” Neurosci. Biobehav. Rev., vol. 24, no. 4, pp. 417–463, 2000. doi: 10.1016/S0149-7634(00)00014-2</w:t>
+        <w:t>[30] H. Coirini et al., “Long-Term Memory Function Impairments following Sucrose Exposure in Juvenile versus Adult Rats,” Biomedicines, vol. 10, no. 11, Nov. 2022, Art. no. 2723. doi: 10.3390/biomedicines10112723 [Online]. Available: https://www.mdpi.com/2227-9059/10/11/2723</w:t>
       </w:r>
     </w:p>
     <w:p>
@@ -23392,13 +23325,13 @@
         <w:rPr>
           <w:sz w:val="19"/>
         </w:rPr>
-        <w:t>[31] Y. Pozdnyakova and A. Murzatayeva, “</w:t>
-      </w:r>
-      <w:r>
-        <w:rPr>
-          <w:sz w:val="19"/>
-        </w:rPr>
-        <w:t>Neuroprotective potential of Stevia rebaudiana and Stachys sieboldii: Effects on oxidative stress and locomotor activity in male rats fed a high-fat, high-sucrose diet,” Biology (Basel), vol. 14, no. 4, Mar. 2025, Art. no. 359. doi: 10.3390/biology14040359 [Online]. Available: https://www.mdpi.com/2079-7737/14/4/359</w:t>
+        <w:t xml:space="preserve">[31] Y. Pozdnyakova and A. Murzatayeva, “Neuroprotective potential of Stevia rebaudiana and Stachys sieboldii: Effects on oxidative stress and locomotor activity in male rats fed a high-fat, high-sucrose diet,” </w:t>
+      </w:r>
+      <w:r>
+        <w:rPr>
+          <w:sz w:val="19"/>
+        </w:rPr>
+        <w:t>Biology (Basel), vol. 14, no. 4, Mar. 2025, Art. no. 359. doi: 10.3390/biology14040359 [Online]. Available: https://www.mdpi.com/2079-7737/14/4/359</w:t>
       </w:r>
     </w:p>
     <w:p>
@@ -23412,13 +23345,7 @@
           <w:sz w:val="19"/>
         </w:rPr>
         <w:lastRenderedPageBreak/>
-        <w:t xml:space="preserve">[32] C. Prata et al., “Glycosides from Stevia rebaudiana Bertoni possess insulin-mimetic and antioxidant activities in rat cardiac fibroblasts,” </w:t>
-      </w:r>
-      <w:r>
-        <w:rPr>
-          <w:sz w:val="19"/>
-        </w:rPr>
-        <w:t>Oxid. Med. Cell. Longev., vol. 2017, Aug. 2017, Art. no. 3724545. doi: 10.1155/2017/3724545 [Online]. Available: https://www.ncbi.nlm.nih.gov/pmc/articles/PMC5602648/</w:t>
+        <w:t>[32] C. Prata et al., “Glycosides from Stevia rebaudiana Bertoni possess insulin-mimetic and antioxidant activities in rat cardiac fibroblasts,” Oxid. Med. Cell. Longev., vol. 2017, Aug. 2017, Art. no. 3724545. doi: 10.1155/2017/3724545 [Online]. Available: https://www.ncbi.nlm.nih.gov/pmc/articles/PMC5602648/</w:t>
       </w:r>
     </w:p>
     <w:p>
@@ -23431,7 +23358,13 @@
         <w:rPr>
           <w:sz w:val="19"/>
         </w:rPr>
-        <w:t>[33] A. G. Yunker, R. Patel, and K. A. Page, “Effects of non-nutritive sweeteners on sweet taste processing and neuroendocrine regulation of eating behavior,” Curr. Nutr. Rep., vol. 9, no. 3, pp. 278–289, Sep. 2020. doi: 10.1007/s13668-020-00323-3 [Online]. Available: https://pubmed.ncbi.nlm.nih.gov/32588329/</w:t>
+        <w:t>[33] A. G. Yunker, R. Patel, and K. A. Page, “</w:t>
+      </w:r>
+      <w:r>
+        <w:rPr>
+          <w:sz w:val="19"/>
+        </w:rPr>
+        <w:t>Effects of non-nutritive sweeteners on sweet taste processing and neuroendocrine regulation of eating behavior,” Curr. Nutr. Rep., vol. 9, no. 3, pp. 278–289, Sep. 2020. doi: 10.1007/s13668-020-00323-3 [Online]. Available: https://pubmed.ncbi.nlm.nih.gov/32588329/</w:t>
       </w:r>
     </w:p>
     <w:p>
@@ -23444,13 +23377,13 @@
         <w:rPr>
           <w:sz w:val="19"/>
         </w:rPr>
-        <w:t>[34] L. Tsan et al., “</w:t>
-      </w:r>
-      <w:r>
-        <w:rPr>
-          <w:sz w:val="19"/>
-        </w:rPr>
-        <w:t>Early-life low-calorie sweetener consumption disrupts glucose regulation, sugar-motivated behavior, and memory function in rats,” JCI Insight, vol. 7, no. 20, Oct. 2022, Art. no. e157714. doi: 10.1172/jci.insight.157714 [Online]. Available: https://www.ncbi.nlm.nih.gov/pmc/articles/PMC9714783/</w:t>
+        <w:t xml:space="preserve">[34] L. Tsan et al., “Early-life low-calorie sweetener consumption disrupts glucose regulation, sugar-motivated behavior, and memory function in rats,” </w:t>
+      </w:r>
+      <w:r>
+        <w:rPr>
+          <w:sz w:val="19"/>
+        </w:rPr>
+        <w:t>JCI Insight, vol. 7, no. 20, Oct. 2022, Art. no. e157714. doi: 10.1172/jci.insight.157714 [Online]. Available: https://www.ncbi.nlm.nih.gov/pmc/articles/PMC9714783/</w:t>
       </w:r>
     </w:p>
     <w:p>
@@ -23476,7 +23409,13 @@
         <w:rPr>
           <w:sz w:val="19"/>
         </w:rPr>
-        <w:t>[36] V. A. Chavushyan et al., “Effects of stevia on synaptic plasticity and NADPH oxidase level of CNS in conditions of metabolic disorders caused by fructose,” BMC Complement. Altern. Med., vol. 17, Dec. 2017, Art. no. 540. doi: 10.1186/s12906-017-2049-9</w:t>
+        <w:t>[36] V. A. Chavushyan et al., “</w:t>
+      </w:r>
+      <w:r>
+        <w:rPr>
+          <w:sz w:val="19"/>
+        </w:rPr>
+        <w:t>Effects of stevia on synaptic plasticity and NADPH oxidase level of CNS in conditions of metabolic disorders caused by fructose,” BMC Complement. Altern. Med., vol. 17, Dec. 2017, Art. no. 540. doi: 10.1186/s12906-017-2049-9</w:t>
       </w:r>
     </w:p>
     <w:p>
@@ -23489,13 +23428,13 @@
         <w:rPr>
           <w:sz w:val="19"/>
         </w:rPr>
-        <w:t>[37] F. Khakpai, M. Naseroleslami, M. Moheb-Alian, E. Ghanimati, F. Abdollah-pour, and N. Mousavi-Niri, “</w:t>
-      </w:r>
-      <w:r>
-        <w:rPr>
-          <w:sz w:val="19"/>
-        </w:rPr>
-        <w:t>Intra-gastrically administration of Stevia and particularly Nano-Stevia reversed the hyperglycemia, anxiety, and memory impairment in streptozotocin-induced diabetic rats,” Physiol. Behav., vol. 263, 2023, Art. no. 114100. doi: 10.1016/j.physbeh.2023.114100</w:t>
+        <w:t xml:space="preserve">[37] F. Khakpai, M. Naseroleslami, M. Moheb-Alian, E. Ghanimati, F. Abdollah-pour, and N. Mousavi-Niri, “Intra-gastrically administration of Stevia and particularly Nano-Stevia reversed the hyperglycemia, anxiety, and memory impairment in streptozotocin-induced diabetic rats,” </w:t>
+      </w:r>
+      <w:r>
+        <w:rPr>
+          <w:sz w:val="19"/>
+        </w:rPr>
+        <w:t>Physiol. Behav., vol. 263, 2023, Art. no. 114100. doi: 10.1016/j.physbeh.2023.114100</w:t>
       </w:r>
     </w:p>
     <w:p>
@@ -23508,13 +23447,7 @@
         <w:rPr>
           <w:sz w:val="19"/>
         </w:rPr>
-        <w:t xml:space="preserve">[38] I. D. Salinas-Velarde et al., “Lower ΔFosB expression in the dopaminergic system after stevia consumption in rats housed under environmental enrichment conditions,” </w:t>
-      </w:r>
-      <w:r>
-        <w:rPr>
-          <w:sz w:val="19"/>
-        </w:rPr>
-        <w:t>Brain Res. Bull., vol. 177, pp. 172–180, 2021. doi: 10.1016/j.brainresbull.2021.10.001</w:t>
+        <w:t>[38] I. D. Salinas-Velarde et al., “Lower ΔFosB expression in the dopaminergic system after stevia consumption in rats housed under environmental enrichment conditions,” Brain Res. Bull., vol. 177, pp. 172–180, 2021. doi: 10.1016/j.brainresbull.2021.10.001</w:t>
       </w:r>
     </w:p>
     <w:p>
@@ -23527,7 +23460,13 @@
         <w:rPr>
           <w:sz w:val="19"/>
         </w:rPr>
-        <w:t>[39] H. Coirini, M. Rey, A. Marchena, P. Lence, and M. S. Kruse, “Stevia vs. sucrose consumption: influence on the behavior of juvenile rats,” Medicina (B. Aires), vol. 83, no. Supl. V, p. 148, 2023, Resumen 182, Reunión Conjunta SAIC SAB AAFE AACYTAL 2023, Mar del Plata, Argentina.</w:t>
+        <w:t xml:space="preserve">[39] H. Coirini, M. Rey, A. Marchena, P. Lence, and M. S. Kruse, “Stevia vs. sucrose consumption: influence on the behavior of juvenile rats,” </w:t>
+      </w:r>
+      <w:r>
+        <w:rPr>
+          <w:sz w:val="19"/>
+        </w:rPr>
+        <w:t>Medicina (B. Aires), vol. 83, no. Supl. V, p. 148, 2023, Resumen 182, Reunión Conjunta SAIC SAB AAFE AACYTAL 2023, Mar del Plata, Argentina.</w:t>
       </w:r>
     </w:p>
     <w:p>
@@ -23540,13 +23479,7 @@
         <w:rPr>
           <w:sz w:val="19"/>
         </w:rPr>
-        <w:t>[40] A. Marchena, M. Rey, M. C. González Deniselle, H. Coirini, and M. S. Kruse, “</w:t>
-      </w:r>
-      <w:r>
-        <w:rPr>
-          <w:sz w:val="19"/>
-        </w:rPr>
-        <w:t>Stevia vs. sucrose consumption: influence on the behavior of juvenile rats,” En revisión en J. Nutr. (JN-2025-2424_R2), 2025.</w:t>
+        <w:t>[40] A. Marchena, M. Rey, M. C. González Deniselle, H. Coirini, and M. S. Kruse, “Stevia vs. sucrose consumption: influence on the behavior of juvenile rats,” En revisión en J. Nutr. (JN-2025-2424_R2), 2025.</w:t>
       </w:r>
     </w:p>
     <w:p>
@@ -23559,7 +23492,13 @@
         <w:rPr>
           <w:sz w:val="19"/>
         </w:rPr>
-        <w:t>[41] M. S. Kruse et al., “Sucrose exposure in juvenile rats produces long-term changes in fear memory and anxiety-like behavior,” Psychoneuroendocrinology, vol. 104, pp. 300–307, Jun. 2019. doi: 10.1016/j.psyneuen.2019.03.005</w:t>
+        <w:t xml:space="preserve">[41] M. S. Kruse et al., “Sucrose exposure in juvenile rats produces long-term changes in fear memory and anxiety-like behavior,” </w:t>
+      </w:r>
+      <w:r>
+        <w:rPr>
+          <w:sz w:val="19"/>
+        </w:rPr>
+        <w:t>Psychoneuroendocrinology, vol. 104, pp. 300–307, Jun. 2019. doi: 10.1016/j.psyneuen.2019.03.005</w:t>
       </w:r>
     </w:p>
     <w:p>
@@ -23572,13 +23511,7 @@
         <w:rPr>
           <w:sz w:val="19"/>
         </w:rPr>
-        <w:t>[42] T. J. Xu and A. C. Reichelt, “</w:t>
-      </w:r>
-      <w:r>
-        <w:rPr>
-          <w:sz w:val="19"/>
-        </w:rPr>
-        <w:t>Sucrose or sucrose and caffeine differentially impact memory and anxiety-like behaviours, and alter hippocampal parvalbumin and doublecortin,” Neuropharmacology, vol. 137, pp. 24–32, 2018. doi: 10.1016/j.neuropharm.2018.04.012</w:t>
+        <w:t>[42] T. J. Xu and A. C. Reichelt, “Sucrose or sucrose and caffeine differentially impact memory and anxiety-like behaviours, and alter hippocampal parvalbumin and doublecortin,” Neuropharmacology, vol. 137, pp. 24–32, 2018. doi: 10.1016/j.neuropharm.2018.04.012</w:t>
       </w:r>
     </w:p>
     <w:p>
@@ -23591,7 +23524,13 @@
         <w:rPr>
           <w:sz w:val="19"/>
         </w:rPr>
-        <w:t>[43] A. C. Reichelt, S. Killcross, L. D. Hambly, M. J. Morris, and R. F. Westbrook, “Impact of adolescent sucrose access on cognitive control, recognition memory, and parvalbumin immunoreactivity,” Learn. Mem., vol. 22, no. 4, pp. 215–224, 2015. doi: 10.1101/lm.038000.114</w:t>
+        <w:t>[43] A. C. Reichelt, S. Killcross, L. D. Hambly, M. J. Morris, and R. F. Westbrook, “</w:t>
+      </w:r>
+      <w:r>
+        <w:rPr>
+          <w:sz w:val="19"/>
+        </w:rPr>
+        <w:t>Impact of adolescent sucrose access on cognitive control, recognition memory, and parvalbumin immunoreactivity,” Learn. Mem., vol. 22, no. 4, pp. 215–224, 2015. doi: 10.1101/lm.038000.114</w:t>
       </w:r>
     </w:p>
     <w:p>
@@ -23604,7 +23543,13 @@
         <w:rPr>
           <w:sz w:val="19"/>
         </w:rPr>
-        <w:t>[44] J. Maniam, C. P. Antoniadis, N. A. Youngson, J. K. Sinha, and M. J. Morris, “Sugar consumption produces effects similar to early life stress exposure on hippocampal markers of neurogenesis and stress response,” Front. Mol. Neurosci., vol. 8, Jan. 2016, Art. no. 86. doi: 10.3389/fnmol.2015.00086 [Online]. Available: https://www.ncbi.nlm.nih.gov/pmc/articles/PMC4717325/</w:t>
+        <w:t xml:space="preserve">[44] J. Maniam, C. P. Antoniadis, N. A. Youngson, J. K. Sinha, and M. J. Morris, “Sugar consumption produces effects similar to early life stress exposure on hippocampal markers of neurogenesis and stress response,” </w:t>
+      </w:r>
+      <w:r>
+        <w:rPr>
+          <w:sz w:val="19"/>
+        </w:rPr>
+        <w:t>Front. Mol. Neurosci., vol. 8, Jan. 2016, Art. no. 86. doi: 10.3389/fnmol.2015.00086 [Online]. Available: https://www.ncbi.nlm.nih.gov/pmc/articles/PMC4717325/</w:t>
       </w:r>
     </w:p>
     <w:p>
@@ -23617,13 +23562,7 @@
         <w:rPr>
           <w:sz w:val="19"/>
         </w:rPr>
-        <w:t>[45] K. Sánchez-Huerta et al., “</w:t>
-      </w:r>
-      <w:r>
-        <w:rPr>
-          <w:sz w:val="19"/>
-        </w:rPr>
-        <w:t>Sucrose consumption during late adolescence impairs adult neurogenesis of the ventral dentate gyrus without inducing an anxiety-like behavior,” Int. J. Mol. Sci., vol. 23, no. 22, Nov. 2022, Art. no. 14176. doi: 10.3390/ijms232214176 [Online].Available: https://www.ncbi.nlm.nih.gov/pmc/articles/PMC9695980/</w:t>
+        <w:t>[45] K. Sánchez-Huerta et al., “Sucrose consumption during late adolescence impairs adult neurogenesis of the ventral dentate gyrus without inducing an anxiety-like behavior,” Int. J. Mol. Sci., vol. 23, no. 22, Nov. 2022, Art. no. 14176. doi: 10.3390/ijms232214176 [Online].Available: https://www.ncbi.nlm.nih.gov/pmc/articles/PMC9695980/</w:t>
       </w:r>
     </w:p>
     <w:p>
@@ -23637,13 +23576,7 @@
           <w:sz w:val="19"/>
         </w:rPr>
         <w:lastRenderedPageBreak/>
-        <w:t xml:space="preserve">[46] A. Gerós, A. Magalhães, and P. Aguiar, “Improved 3D tracking and automated classification of rodents’ behavioral activity using depth-sensing cameras,” </w:t>
-      </w:r>
-      <w:r>
-        <w:rPr>
-          <w:sz w:val="19"/>
-        </w:rPr>
-        <w:t>Behav. Res. Methods, vol. 52, no. 5, pp. 2156–2167, Oct. 2020. doi: 10.3758/s13428-020-01381-9 [Online]. Available: https://link.springer.com/article/10.3758/s13428-020-01381-9</w:t>
+        <w:t>[46] A. Gerós, A. Magalhães, and P. Aguiar, “Improved 3D tracking and automated classification of rodents’ behavioral activity using depth-sensing cameras,” Behav. Res. Methods, vol. 52, no. 5, pp. 2156–2167, Oct. 2020. doi: 10.3758/s13428-020-01381-9 [Online]. Available: https://link.springer.com/article/10.3758/s13428-020-01381-9</w:t>
       </w:r>
     </w:p>
     <w:p>
@@ -23656,7 +23589,13 @@
         <w:rPr>
           <w:sz w:val="19"/>
         </w:rPr>
-        <w:t>[47] D. A. Lukovikov et al., “Automated phenotyping of rodent behavior in the Cylinder Exploration Test using machine learning,” Neuroscience, vol. 601, pp. 169–178, May 2026. doi: 10.1016/j.neuroscience.2026.02.048 [Online]. Available: https://pubmed.ncbi.nlm.nih.gov/41780714/</w:t>
+        <w:t xml:space="preserve">[47] D. A. Lukovikov et al., “Automated phenotyping of rodent behavior in the Cylinder Exploration Test using machine learning,” </w:t>
+      </w:r>
+      <w:r>
+        <w:rPr>
+          <w:sz w:val="19"/>
+        </w:rPr>
+        <w:t>Neuroscience, vol. 601, pp. 169–178, May 2026. doi: 10.1016/j.neuroscience.2026.02.048 [Online]. Available: https://pubmed.ncbi.nlm.nih.gov/41780714/</w:t>
       </w:r>
     </w:p>
     <w:p>
@@ -23669,13 +23608,7 @@
         <w:rPr>
           <w:sz w:val="19"/>
         </w:rPr>
-        <w:t>[48] J. F. Guthrie and J. F. Morton, “</w:t>
-      </w:r>
-      <w:r>
-        <w:rPr>
-          <w:sz w:val="19"/>
-        </w:rPr>
-        <w:t>Food sources of added sweeteners in the diets of Americans,” J. Am. Diet. Assoc., vol. 100, no. 1, pp. 43–51, 2000. doi: 10.1016/S0002-8223(00)00018-3</w:t>
+        <w:t>[48] J. F. Guthrie and J. F. Morton, “Food sources of added sweeteners in the diets of Americans,” J. Am. Diet. Assoc., vol. 100, no. 1, pp. 43–51, 2000. doi: 10.1016/S0002-8223(00)00018-3</w:t>
       </w:r>
     </w:p>
     <w:p>
@@ -23688,7 +23621,13 @@
         <w:rPr>
           <w:sz w:val="19"/>
         </w:rPr>
-        <w:t>[49] C. D. Frary, R. K. Johnson, and M. Q. Wang, “Children and adolescents’ choices of foods and beverages high in added sugars are associated with intakes of key nutrients and food groups,” J. Adolesc. Health, vol. 34, no. 1, pp. 56–63, 2004. doi: 10.1016/S1054-139X(03)00248-9</w:t>
+        <w:t>[49] C. D. Frary, R. K. Johnson, and M. Q. Wang, “</w:t>
+      </w:r>
+      <w:r>
+        <w:rPr>
+          <w:sz w:val="19"/>
+        </w:rPr>
+        <w:t>Children and adolescents’ choices of foods and beverages high in added sugars are associated with intakes of key nutrients and food groups,” J. Adolesc. Health, vol. 34, no. 1, pp. 56–63, 2004. doi: 10.1016/S1054-139X(03)00248-9</w:t>
       </w:r>
     </w:p>
     <w:p>
@@ -23701,13 +23640,7 @@
         <w:rPr>
           <w:sz w:val="19"/>
         </w:rPr>
-        <w:t>[50] I. Guelinckx et al., “</w:t>
-      </w:r>
-      <w:r>
-        <w:rPr>
-          <w:sz w:val="19"/>
-        </w:rPr>
-        <w:t>Intake of water and beverages of children and adolescents in 13 countries,” Eur. J. Nutr., vol. 54, no. Suppl. 2, pp. 69–79, 2015. doi: 10.1007/s00394-015-0955-5</w:t>
+        <w:t>[50] I. Guelinckx et al., “Intake of water and beverages of children and adolescents in 13 countries,” Eur. J. Nutr., vol. 54, no. Suppl. 2, pp. 69–79, 2015. doi: 10.1007/s00394-015-0955-5</w:t>
       </w:r>
     </w:p>
     <w:p>
@@ -23720,7 +23653,13 @@
         <w:rPr>
           <w:sz w:val="19"/>
         </w:rPr>
-        <w:t>[51] C. L. Sisk and D. L. Foster, “The neural basis of puberty and adolescence,” Nat. Neurosci., vol. 7, no. 10, pp. 1040–1047, 2004. doi: 10.1038/nn1326</w:t>
+        <w:t xml:space="preserve">[51] C. L. Sisk and D. L. Foster, “The neural basis of puberty and adolescence,” </w:t>
+      </w:r>
+      <w:r>
+        <w:rPr>
+          <w:sz w:val="19"/>
+        </w:rPr>
+        <w:t>Nat. Neurosci., vol. 7, no. 10, pp. 1040–1047, 2004. doi: 10.1038/nn1326</w:t>
       </w:r>
     </w:p>
     <w:p>
@@ -23733,13 +23672,7 @@
         <w:rPr>
           <w:sz w:val="19"/>
         </w:rPr>
-        <w:t xml:space="preserve">[52] S. D. Anton et al., “Effects of stevia, aspartame, and sucrose on food intake, satiety, and postprandial glucose and insulin levels,” </w:t>
-      </w:r>
-      <w:r>
-        <w:rPr>
-          <w:sz w:val="19"/>
-        </w:rPr>
-        <w:t>Appetite, vol. 55, no. 1, pp. 37–43, 2010. doi: 10.1016/j.appet.2010.03.009</w:t>
+        <w:t>[52] S. D. Anton et al., “Effects of stevia, aspartame, and sucrose on food intake, satiety, and postprandial glucose and insulin levels,” Appetite, vol. 55, no. 1, pp. 37–43, 2010. doi: 10.1016/j.appet.2010.03.009</w:t>
       </w:r>
     </w:p>
     <w:p>
@@ -23791,7 +23724,13 @@
         <w:rPr>
           <w:sz w:val="19"/>
         </w:rPr>
-        <w:t>[56] A. J. Eisch and C. D. Mandyam, “Adult neurogenesis: can analysis of cell cycle proteins move us “Beyond BrdU”?,” Curr. Pharm. Biotechnol., vol. 8, no. 3, pp. 147–165, 2007. doi: 10.2174/138920107780906540</w:t>
+        <w:t>[56] A. J. Eisch and C. D. Mandyam, “Adult neurogenesis: can analysis of cell cycle proteins move us “</w:t>
+      </w:r>
+      <w:r>
+        <w:rPr>
+          <w:sz w:val="19"/>
+        </w:rPr>
+        <w:t>Beyond BrdU”?,” Curr. Pharm. Biotechnol., vol. 8, no. 3, pp. 147–165, 2007. doi: 10.2174/138920107780906540</w:t>
       </w:r>
     </w:p>
     <w:p>
@@ -23804,13 +23743,7 @@
         <w:rPr>
           <w:sz w:val="19"/>
         </w:rPr>
-        <w:t>[57] C. D. Mandyam, G. C. Harburg, and A. J. Eisch, “</w:t>
-      </w:r>
-      <w:r>
-        <w:rPr>
-          <w:sz w:val="19"/>
-        </w:rPr>
-        <w:t>Determination of key aspects of precursor cell proliferation, cell cycle length and kinetics in the adult mouse subgranular zone,” Neuroscience, vol. 146, no. 1, pp. 108–122, 2007. doi: 10.1016/j.neuroscience.2006.12.064</w:t>
+        <w:t>[57] C. D. Mandyam, G. C. Harburg, and A. J. Eisch, “Determination of key aspects of precursor cell proliferation, cell cycle length and kinetics in the adult mouse subgranular zone,” Neuroscience, vol. 146, no. 1, pp. 108–122, 2007. doi: 10.1016/j.neuroscience.2006.12.064</w:t>
       </w:r>
     </w:p>
     <w:p>
@@ -23823,7 +23756,13 @@
         <w:rPr>
           <w:sz w:val="19"/>
         </w:rPr>
-        <w:t>[58] J. G. Gleeson, P. T. Lin, L. A. Flanagan, and C. A. Walsh, “Doublecortin is a microtubule-associated protein and is expressed widely by migrating neurons,” Neuron, vol. 23, no. 2, pp. 257–271, 1999. doi: 10.1016/S0896-6273(00)80778-3</w:t>
+        <w:t>[58] J. G. Gleeson, P. T. Lin, L. A. Flanagan, and C. A. Walsh, “</w:t>
+      </w:r>
+      <w:r>
+        <w:rPr>
+          <w:sz w:val="19"/>
+        </w:rPr>
+        <w:t>Doublecortin is a microtubule-associated protein and is expressed widely by migrating neurons,” Neuron, vol. 23, no. 2, pp. 257–271, 1999. doi: 10.1016/S0896-6273(00)80778-3</w:t>
       </w:r>
     </w:p>
     <w:p>
@@ -23836,13 +23775,7 @@
         <w:rPr>
           <w:sz w:val="19"/>
         </w:rPr>
-        <w:t>[59] F. Francis et al., “</w:t>
-      </w:r>
-      <w:r>
-        <w:rPr>
-          <w:sz w:val="19"/>
-        </w:rPr>
-        <w:t>Doublecortin is a developmentally regulated, microtubule-associated protein expressed in migrating and differentiating neurons,” Neuron, vol. 23, no. 2, pp. 247–256, 1999. doi: 10.1016/S0896-6273(00)80777-1</w:t>
+        <w:t>[59] F. Francis et al., “Doublecortin is a developmentally regulated, microtubule-associated protein expressed in migrating and differentiating neurons,” Neuron, vol. 23, no. 2, pp. 247–256, 1999. doi: 10.1016/S0896-6273(00)80777-1</w:t>
       </w:r>
     </w:p>
     <w:p>
@@ -23855,7 +23788,13 @@
         <w:rPr>
           <w:sz w:val="19"/>
         </w:rPr>
-        <w:t>[60] J. P. Brown, S. Couillard-Després, C. M. Cooper-Kuhn, J. Winkler, L. Aigner, and H. G. Kuhn, “Transient expression of doublecortin during adult neurogenesis,” J. Comp. Neurol., vol. 467, no. 1, pp. 1–10, 2003. doi: 10.1002/cne.10874</w:t>
+        <w:t>[60] J. P. Brown, S. Couillard-Després, C. M. Cooper-Kuhn, J. Winkler, L. Aigner, and H. G. Kuhn, “</w:t>
+      </w:r>
+      <w:r>
+        <w:rPr>
+          <w:sz w:val="19"/>
+        </w:rPr>
+        <w:t>Transient expression of doublecortin during adult neurogenesis,” J. Comp. Neurol., vol. 467, no. 1, pp. 1–10, 2003. doi: 10.1002/cne.10874</w:t>
       </w:r>
     </w:p>
     <w:p>
@@ -23868,13 +23807,7 @@
         <w:rPr>
           <w:sz w:val="19"/>
         </w:rPr>
-        <w:t>[61] S. Couillard-Despres et al., “</w:t>
-      </w:r>
-      <w:r>
-        <w:rPr>
-          <w:sz w:val="19"/>
-        </w:rPr>
-        <w:t>Doublecortin expression levels in adult brain reflect neurogenesis,” Eur. J. Neurosci., vol. 21, no. 1, pp. 1–14, 2005. doi: 10.1111/j.1460-9568.2004.03813.x</w:t>
+        <w:t>[61] S. Couillard-Despres et al., “Doublecortin expression levels in adult brain reflect neurogenesis,” Eur. J. Neurosci., vol. 21, no. 1, pp. 1–14, 2005. doi: 10.1111/j.1460-9568.2004.03813.x</w:t>
       </w:r>
     </w:p>
     <w:p>
@@ -23887,7 +23820,13 @@
         <w:rPr>
           <w:sz w:val="19"/>
         </w:rPr>
-        <w:t>[62] A. C. Reichelt et al., “The spontaneous location recognition task for assessing spatial pattern separation and memory across a delay in rats and mice,” Nat. Protoc., vol. 16, no. 12, pp. 5616–5633, Dec. 2021. doi: 10.1038/s41596-021-00627-w [Online]. Available: https://www.nature.com/articles/s41596-021-00627-w</w:t>
+        <w:t xml:space="preserve">[62] A. C. Reichelt et al., “The spontaneous location recognition task for assessing spatial pattern separation and memory across a delay in rats and mice,” </w:t>
+      </w:r>
+      <w:r>
+        <w:rPr>
+          <w:sz w:val="19"/>
+        </w:rPr>
+        <w:t>Nat. Protoc., vol. 16, no. 12, pp. 5616–5633, Dec. 2021. doi: 10.1038/s41596-021-00627-w [Online]. Available: https://www.nature.com/articles/s41596-021-00627-w</w:t>
       </w:r>
     </w:p>
     <w:p>
@@ -23901,13 +23840,7 @@
           <w:sz w:val="19"/>
         </w:rPr>
         <w:lastRenderedPageBreak/>
-        <w:t>[63] I. T. Jolliffe and J. Cadima, “</w:t>
-      </w:r>
-      <w:r>
-        <w:rPr>
-          <w:sz w:val="19"/>
-        </w:rPr>
-        <w:t>Principal component analysis: a review and recent developments,” Philos. Trans. R. Soc. A, vol. 374, no. 2065, Apr. 2016, Art. no. 20150202. doi: 10.1098/rsta.2015.0202 [Online]. Available: https://royalsocietypublishing.org/doi/10.1098/rsta.2015.0202</w:t>
+        <w:t>[63] I. T. Jolliffe and J. Cadima, “Principal component analysis: a review and recent developments,” Philos. Trans. R. Soc. A, vol. 374, no. 2065, Apr. 2016, Art. no. 20150202. doi: 10.1098/rsta.2015.0202 [Online]. Available: https://royalsocietypublishing.org/doi/10.1098/rsta.2015.0202</w:t>
       </w:r>
     </w:p>
     <w:p>
@@ -23920,13 +23853,13 @@
         <w:rPr>
           <w:sz w:val="19"/>
         </w:rPr>
-        <w:t xml:space="preserve">[64] J. H. Ward Jr., “Hierarchical grouping to optimize an objective function,” </w:t>
-      </w:r>
-      <w:r>
-        <w:rPr>
-          <w:sz w:val="19"/>
-        </w:rPr>
-        <w:t>J. Amer. Statist. Assoc., vol. 58, no. 301, pp. 236–244, Mar. 1963. doi: 10.1080/01621459.1963.10500845 [Online]. Available: https://www.tandfonline.com/doi/abs/10.1080/01621459.1963.10500845</w:t>
+        <w:t>[64] J. H. Ward Jr., “</w:t>
+      </w:r>
+      <w:r>
+        <w:rPr>
+          <w:sz w:val="19"/>
+        </w:rPr>
+        <w:t>Hierarchical grouping to optimize an objective function,” J. Amer. Statist. Assoc., vol. 58, no. 301, pp. 236–244, Mar. 1963. doi: 10.1080/01621459.1963.10500845 [Online]. Available: https://www.tandfonline.com/doi/abs/10.1080/01621459.1963.10500845</w:t>
       </w:r>
     </w:p>
     <w:p>
@@ -23952,13 +23885,13 @@
         <w:rPr>
           <w:sz w:val="19"/>
         </w:rPr>
-        <w:t xml:space="preserve">[66] J. Charan and N. D. Kantharia, “How to calculate sample size in animal studies?,” </w:t>
-      </w:r>
-      <w:r>
-        <w:rPr>
-          <w:sz w:val="19"/>
-        </w:rPr>
-        <w:t>J. Pharmacol. Pharmacother., vol. 4, no. 4, pp. 303–306, Oct. 2013. doi: 10.4103/0976-500X.119726 [Online]. Available: http://www.ncbi.nlm.nih.gov/pubmed/24250214</w:t>
+        <w:t>[66] J. Charan and N. D. Kantharia, “</w:t>
+      </w:r>
+      <w:r>
+        <w:rPr>
+          <w:sz w:val="19"/>
+        </w:rPr>
+        <w:t>How to calculate sample size in animal studies?,” J. Pharmacol. Pharmacother., vol. 4, no. 4, pp. 303–306, Oct. 2013. doi: 10.4103/0976-500X.119726 [Online]. Available: http://www.ncbi.nlm.nih.gov/pubmed/24250214</w:t>
       </w:r>
     </w:p>
     <w:p>
@@ -24366,7 +24299,7 @@
   <w:abstractNum w:abstractNumId="0" w15:restartNumberingAfterBreak="0">
     <w:nsid w:val="EA454B4C"/>
     <w:multiLevelType w:val="multilevel"/>
-    <w:tmpl w:val="4C804A28"/>
+    <w:tmpl w:val="86500E5C"/>
     <w:lvl w:ilvl="0">
       <w:start w:val="1"/>
       <w:numFmt w:val="decimal"/>
@@ -24452,7 +24385,7 @@
   <w:abstractNum w:abstractNumId="1" w15:restartNumberingAfterBreak="0">
     <w:nsid w:val="2C1AE401"/>
     <w:multiLevelType w:val="multilevel"/>
-    <w:tmpl w:val="1FCC5266"/>
+    <w:tmpl w:val="1ABE4D8E"/>
     <w:lvl w:ilvl="0">
       <w:numFmt w:val="bullet"/>
       <w:lvlText w:val=" "/>
@@ -24529,7 +24462,7 @@
   <w:abstractNum w:abstractNumId="2" w15:restartNumberingAfterBreak="0">
     <w:nsid w:val="71315DCA"/>
     <w:multiLevelType w:val="multilevel"/>
-    <w:tmpl w:val="9686383E"/>
+    <w:tmpl w:val="4C721F9E"/>
     <w:lvl w:ilvl="0">
       <w:numFmt w:val="bullet"/>
       <w:lvlText w:val="•"/>
@@ -24603,10 +24536,10 @@
       </w:pPr>
     </w:lvl>
   </w:abstractNum>
-  <w:num w:numId="1" w16cid:durableId="1767459258">
+  <w:num w:numId="1" w16cid:durableId="1542396818">
     <w:abstractNumId w:val="1"/>
   </w:num>
-  <w:num w:numId="2" w16cid:durableId="1215577004">
+  <w:num w:numId="2" w16cid:durableId="1770849910">
     <w:abstractNumId w:val="0"/>
     <w:lvlOverride w:ilvl="0">
       <w:startOverride w:val="1"/>
@@ -24636,7 +24569,7 @@
       <w:startOverride w:val="1"/>
     </w:lvlOverride>
   </w:num>
-  <w:num w:numId="3" w16cid:durableId="960569966">
+  <w:num w:numId="3" w16cid:durableId="1726102517">
     <w:abstractNumId w:val="0"/>
     <w:lvlOverride w:ilvl="0">
       <w:startOverride w:val="1"/>
@@ -24666,7 +24599,7 @@
       <w:startOverride w:val="1"/>
     </w:lvlOverride>
   </w:num>
-  <w:num w:numId="4" w16cid:durableId="175309705">
+  <w:num w:numId="4" w16cid:durableId="1830751855">
     <w:abstractNumId w:val="2"/>
   </w:num>
 </w:numbering>
@@ -25730,7 +25663,7 @@
     <w:next w:val="Normal"/>
     <w:autoRedefine/>
     <w:uiPriority w:val="39"/>
-    <w:rsid w:val="00C54AEC"/>
+    <w:rsid w:val="00883B92"/>
     <w:pPr>
       <w:spacing w:after="100"/>
     </w:pPr>
@@ -25741,7 +25674,7 @@
     <w:next w:val="Normal"/>
     <w:autoRedefine/>
     <w:uiPriority w:val="39"/>
-    <w:rsid w:val="00C54AEC"/>
+    <w:rsid w:val="00883B92"/>
     <w:pPr>
       <w:spacing w:after="100"/>
       <w:ind w:left="240"/>
@@ -25753,7 +25686,7 @@
     <w:next w:val="Normal"/>
     <w:autoRedefine/>
     <w:uiPriority w:val="39"/>
-    <w:rsid w:val="00C54AEC"/>
+    <w:rsid w:val="00883B92"/>
     <w:pPr>
       <w:spacing w:after="100"/>
       <w:ind w:left="480"/>

</xml_diff>

<commit_message>
Revision completa de citas: texto contra fuente y numeracion; objetivo 5 con inmunocitoquimica y microscopia confocal
Co-Authored-By: Claude Opus 5.5 <noreply@anthropic.com>
</commit_message>
<xml_diff>
--- a/entregas/tesina 20261024B.docx
+++ b/entregas/tesina 20261024B.docx
@@ -47,7 +47,7 @@
           <w:noProof/>
         </w:rPr>
         <w:drawing>
-          <wp:inline distT="0" distB="0" distL="0" distR="0" wp14:anchorId="7BBF4912" wp14:editId="74633C29">
+          <wp:inline distT="0" distB="0" distL="0" distR="0" wp14:anchorId="4DE6D0CF" wp14:editId="2AE56839">
             <wp:extent cx="2879999" cy="1722810"/>
             <wp:effectExtent l="0" t="0" r="0" b="0"/>
             <wp:docPr id="1" name="Picture" descr="image"/>
@@ -145,7 +145,7 @@
         <w:pStyle w:val="Ttulo1"/>
       </w:pPr>
       <w:bookmarkStart w:id="0" w:name="resumen"/>
-      <w:bookmarkStart w:id="1" w:name="_Toc243733489"/>
+      <w:bookmarkStart w:id="1" w:name="_Toc243735219"/>
       <w:r>
         <w:lastRenderedPageBreak/>
         <w:t>Resumen</w:t>
@@ -273,7 +273,7 @@
         <w:pStyle w:val="Ttulo1"/>
       </w:pPr>
       <w:bookmarkStart w:id="2" w:name="glosario-de-abreviaturas"/>
-      <w:bookmarkStart w:id="3" w:name="_Toc243733490"/>
+      <w:bookmarkStart w:id="3" w:name="_Toc243735220"/>
       <w:bookmarkEnd w:id="0"/>
       <w:r>
         <w:lastRenderedPageBreak/>
@@ -1327,7 +1327,7 @@
       <w:r>
         <w:fldChar w:fldCharType="separate"/>
       </w:r>
-      <w:hyperlink w:anchor="_Toc243733489" w:history="1">
+      <w:hyperlink w:anchor="_Toc243735219" w:history="1">
         <w:r>
           <w:rPr>
             <w:rStyle w:val="Hipervnculo"/>
@@ -1354,7 +1354,7 @@
             <w:noProof/>
             <w:webHidden/>
           </w:rPr>
-          <w:instrText xml:space="preserve"> PAGEREF _Toc243733489 \h </w:instrText>
+          <w:instrText xml:space="preserve"> PAGEREF _Toc243735219 \h </w:instrText>
         </w:r>
         <w:r>
           <w:rPr>
@@ -1399,7 +1399,7 @@
           <w14:ligatures w14:val="standardContextual"/>
         </w:rPr>
       </w:pPr>
-      <w:hyperlink w:anchor="_Toc243733490" w:history="1">
+      <w:hyperlink w:anchor="_Toc243735220" w:history="1">
         <w:r>
           <w:rPr>
             <w:rStyle w:val="Hipervnculo"/>
@@ -1426,7 +1426,7 @@
             <w:noProof/>
             <w:webHidden/>
           </w:rPr>
-          <w:instrText xml:space="preserve"> PAGEREF _Toc243733490 \h </w:instrText>
+          <w:instrText xml:space="preserve"> PAGEREF _Toc243735220 \h </w:instrText>
         </w:r>
         <w:r>
           <w:rPr>
@@ -1471,7 +1471,7 @@
           <w14:ligatures w14:val="standardContextual"/>
         </w:rPr>
       </w:pPr>
-      <w:hyperlink w:anchor="_Toc243733491" w:history="1">
+      <w:hyperlink w:anchor="_Toc243735221" w:history="1">
         <w:r>
           <w:rPr>
             <w:rStyle w:val="Hipervnculo"/>
@@ -1498,7 +1498,7 @@
             <w:noProof/>
             <w:webHidden/>
           </w:rPr>
-          <w:instrText xml:space="preserve"> PAGEREF _Toc243733491 \h </w:instrText>
+          <w:instrText xml:space="preserve"> PAGEREF _Toc243735221 \h </w:instrText>
         </w:r>
         <w:r>
           <w:rPr>
@@ -1543,7 +1543,7 @@
           <w14:ligatures w14:val="standardContextual"/>
         </w:rPr>
       </w:pPr>
-      <w:hyperlink w:anchor="_Toc243733492" w:history="1">
+      <w:hyperlink w:anchor="_Toc243735222" w:history="1">
         <w:r>
           <w:rPr>
             <w:rStyle w:val="Hipervnculo"/>
@@ -1570,7 +1570,7 @@
             <w:noProof/>
             <w:webHidden/>
           </w:rPr>
-          <w:instrText xml:space="preserve"> PAGEREF _Toc243733492 \h </w:instrText>
+          <w:instrText xml:space="preserve"> PAGEREF _Toc243735222 \h </w:instrText>
         </w:r>
         <w:r>
           <w:rPr>
@@ -1615,7 +1615,7 @@
           <w14:ligatures w14:val="standardContextual"/>
         </w:rPr>
       </w:pPr>
-      <w:hyperlink w:anchor="_Toc243733493" w:history="1">
+      <w:hyperlink w:anchor="_Toc243735223" w:history="1">
         <w:r>
           <w:rPr>
             <w:rStyle w:val="Hipervnculo"/>
@@ -1642,7 +1642,7 @@
             <w:noProof/>
             <w:webHidden/>
           </w:rPr>
-          <w:instrText xml:space="preserve"> PAGEREF _Toc243733493 \h </w:instrText>
+          <w:instrText xml:space="preserve"> PAGEREF _Toc243735223 \h </w:instrText>
         </w:r>
         <w:r>
           <w:rPr>
@@ -1687,7 +1687,7 @@
           <w14:ligatures w14:val="standardContextual"/>
         </w:rPr>
       </w:pPr>
-      <w:hyperlink w:anchor="_Toc243733494" w:history="1">
+      <w:hyperlink w:anchor="_Toc243735224" w:history="1">
         <w:r>
           <w:rPr>
             <w:rStyle w:val="Hipervnculo"/>
@@ -1714,7 +1714,7 @@
             <w:noProof/>
             <w:webHidden/>
           </w:rPr>
-          <w:instrText xml:space="preserve"> PAGEREF _Toc243733494 \h </w:instrText>
+          <w:instrText xml:space="preserve"> PAGEREF _Toc243735224 \h </w:instrText>
         </w:r>
         <w:r>
           <w:rPr>
@@ -1759,7 +1759,7 @@
           <w14:ligatures w14:val="standardContextual"/>
         </w:rPr>
       </w:pPr>
-      <w:hyperlink w:anchor="_Toc243733495" w:history="1">
+      <w:hyperlink w:anchor="_Toc243735225" w:history="1">
         <w:r>
           <w:rPr>
             <w:rStyle w:val="Hipervnculo"/>
@@ -1786,7 +1786,7 @@
             <w:noProof/>
             <w:webHidden/>
           </w:rPr>
-          <w:instrText xml:space="preserve"> PAGEREF _Toc243733495 \h </w:instrText>
+          <w:instrText xml:space="preserve"> PAGEREF _Toc243735225 \h </w:instrText>
         </w:r>
         <w:r>
           <w:rPr>
@@ -1831,7 +1831,7 @@
           <w14:ligatures w14:val="standardContextual"/>
         </w:rPr>
       </w:pPr>
-      <w:hyperlink w:anchor="_Toc243733496" w:history="1">
+      <w:hyperlink w:anchor="_Toc243735226" w:history="1">
         <w:r>
           <w:rPr>
             <w:rStyle w:val="Hipervnculo"/>
@@ -1858,7 +1858,7 @@
             <w:noProof/>
             <w:webHidden/>
           </w:rPr>
-          <w:instrText xml:space="preserve"> PAGEREF _Toc243733496 \h </w:instrText>
+          <w:instrText xml:space="preserve"> PAGEREF _Toc243735226 \h </w:instrText>
         </w:r>
         <w:r>
           <w:rPr>
@@ -1903,7 +1903,7 @@
           <w14:ligatures w14:val="standardContextual"/>
         </w:rPr>
       </w:pPr>
-      <w:hyperlink w:anchor="_Toc243733497" w:history="1">
+      <w:hyperlink w:anchor="_Toc243735227" w:history="1">
         <w:r>
           <w:rPr>
             <w:rStyle w:val="Hipervnculo"/>
@@ -1930,7 +1930,7 @@
             <w:noProof/>
             <w:webHidden/>
           </w:rPr>
-          <w:instrText xml:space="preserve"> PAGEREF _Toc243733497 \h </w:instrText>
+          <w:instrText xml:space="preserve"> PAGEREF _Toc243735227 \h </w:instrText>
         </w:r>
         <w:r>
           <w:rPr>
@@ -1975,7 +1975,7 @@
           <w14:ligatures w14:val="standardContextual"/>
         </w:rPr>
       </w:pPr>
-      <w:hyperlink w:anchor="_Toc243733498" w:history="1">
+      <w:hyperlink w:anchor="_Toc243735228" w:history="1">
         <w:r>
           <w:rPr>
             <w:rStyle w:val="Hipervnculo"/>
@@ -2002,7 +2002,7 @@
             <w:noProof/>
             <w:webHidden/>
           </w:rPr>
-          <w:instrText xml:space="preserve"> PAGEREF _Toc243733498 \h </w:instrText>
+          <w:instrText xml:space="preserve"> PAGEREF _Toc243735228 \h </w:instrText>
         </w:r>
         <w:r>
           <w:rPr>
@@ -2047,7 +2047,7 @@
           <w14:ligatures w14:val="standardContextual"/>
         </w:rPr>
       </w:pPr>
-      <w:hyperlink w:anchor="_Toc243733499" w:history="1">
+      <w:hyperlink w:anchor="_Toc243735229" w:history="1">
         <w:r>
           <w:rPr>
             <w:rStyle w:val="Hipervnculo"/>
@@ -2074,7 +2074,7 @@
             <w:noProof/>
             <w:webHidden/>
           </w:rPr>
-          <w:instrText xml:space="preserve"> PAGEREF _Toc243733499 \h </w:instrText>
+          <w:instrText xml:space="preserve"> PAGEREF _Toc243735229 \h </w:instrText>
         </w:r>
         <w:r>
           <w:rPr>
@@ -2119,7 +2119,7 @@
           <w14:ligatures w14:val="standardContextual"/>
         </w:rPr>
       </w:pPr>
-      <w:hyperlink w:anchor="_Toc243733500" w:history="1">
+      <w:hyperlink w:anchor="_Toc243735230" w:history="1">
         <w:r>
           <w:rPr>
             <w:rStyle w:val="Hipervnculo"/>
@@ -2155,7 +2155,7 @@
             <w:noProof/>
             <w:webHidden/>
           </w:rPr>
-          <w:instrText xml:space="preserve"> PAGEREF _Toc243733500 \h </w:instrText>
+          <w:instrText xml:space="preserve"> PAGEREF _Toc243735230 \h </w:instrText>
         </w:r>
         <w:r>
           <w:rPr>
@@ -2200,7 +2200,7 @@
           <w14:ligatures w14:val="standardContextual"/>
         </w:rPr>
       </w:pPr>
-      <w:hyperlink w:anchor="_Toc243733501" w:history="1">
+      <w:hyperlink w:anchor="_Toc243735231" w:history="1">
         <w:r>
           <w:rPr>
             <w:rStyle w:val="Hipervnculo"/>
@@ -2227,7 +2227,7 @@
             <w:noProof/>
             <w:webHidden/>
           </w:rPr>
-          <w:instrText xml:space="preserve"> PAGEREF _Toc243733501 \h </w:instrText>
+          <w:instrText xml:space="preserve"> PAGEREF _Toc243735231 \h </w:instrText>
         </w:r>
         <w:r>
           <w:rPr>
@@ -2272,7 +2272,7 @@
           <w14:ligatures w14:val="standardContextual"/>
         </w:rPr>
       </w:pPr>
-      <w:hyperlink w:anchor="_Toc243733502" w:history="1">
+      <w:hyperlink w:anchor="_Toc243735232" w:history="1">
         <w:r>
           <w:rPr>
             <w:rStyle w:val="Hipervnculo"/>
@@ -2307,7 +2307,7 @@
             <w:noProof/>
             <w:webHidden/>
           </w:rPr>
-          <w:instrText xml:space="preserve"> PAGEREF _Toc243733502 \h </w:instrText>
+          <w:instrText xml:space="preserve"> PAGEREF _Toc243735232 \h </w:instrText>
         </w:r>
         <w:r>
           <w:rPr>
@@ -2352,7 +2352,7 @@
           <w14:ligatures w14:val="standardContextual"/>
         </w:rPr>
       </w:pPr>
-      <w:hyperlink w:anchor="_Toc243733503" w:history="1">
+      <w:hyperlink w:anchor="_Toc243735233" w:history="1">
         <w:r>
           <w:rPr>
             <w:rStyle w:val="Hipervnculo"/>
@@ -2379,7 +2379,7 @@
             <w:noProof/>
             <w:webHidden/>
           </w:rPr>
-          <w:instrText xml:space="preserve"> PAGEREF _Toc243733503 \h </w:instrText>
+          <w:instrText xml:space="preserve"> PAGEREF _Toc243735233 \h </w:instrText>
         </w:r>
         <w:r>
           <w:rPr>
@@ -2424,7 +2424,7 @@
           <w14:ligatures w14:val="standardContextual"/>
         </w:rPr>
       </w:pPr>
-      <w:hyperlink w:anchor="_Toc243733504" w:history="1">
+      <w:hyperlink w:anchor="_Toc243735234" w:history="1">
         <w:r>
           <w:rPr>
             <w:rStyle w:val="Hipervnculo"/>
@@ -2451,7 +2451,7 @@
             <w:noProof/>
             <w:webHidden/>
           </w:rPr>
-          <w:instrText xml:space="preserve"> PAGEREF _Toc243733504 \h </w:instrText>
+          <w:instrText xml:space="preserve"> PAGEREF _Toc243735234 \h </w:instrText>
         </w:r>
         <w:r>
           <w:rPr>
@@ -2496,7 +2496,7 @@
           <w14:ligatures w14:val="standardContextual"/>
         </w:rPr>
       </w:pPr>
-      <w:hyperlink w:anchor="_Toc243733505" w:history="1">
+      <w:hyperlink w:anchor="_Toc243735235" w:history="1">
         <w:r>
           <w:rPr>
             <w:rStyle w:val="Hipervnculo"/>
@@ -2523,7 +2523,7 @@
             <w:noProof/>
             <w:webHidden/>
           </w:rPr>
-          <w:instrText xml:space="preserve"> PAGEREF _Toc243733505 \h </w:instrText>
+          <w:instrText xml:space="preserve"> PAGEREF _Toc243735235 \h </w:instrText>
         </w:r>
         <w:r>
           <w:rPr>
@@ -2568,7 +2568,7 @@
           <w14:ligatures w14:val="standardContextual"/>
         </w:rPr>
       </w:pPr>
-      <w:hyperlink w:anchor="_Toc243733506" w:history="1">
+      <w:hyperlink w:anchor="_Toc243735236" w:history="1">
         <w:r>
           <w:rPr>
             <w:rStyle w:val="Hipervnculo"/>
@@ -2603,7 +2603,7 @@
             <w:noProof/>
             <w:webHidden/>
           </w:rPr>
-          <w:instrText xml:space="preserve"> PAGEREF _Toc243733506 \h </w:instrText>
+          <w:instrText xml:space="preserve"> PAGEREF _Toc243735236 \h </w:instrText>
         </w:r>
         <w:r>
           <w:rPr>
@@ -2648,7 +2648,7 @@
           <w14:ligatures w14:val="standardContextual"/>
         </w:rPr>
       </w:pPr>
-      <w:hyperlink w:anchor="_Toc243733507" w:history="1">
+      <w:hyperlink w:anchor="_Toc243735237" w:history="1">
         <w:r>
           <w:rPr>
             <w:rStyle w:val="Hipervnculo"/>
@@ -2675,7 +2675,7 @@
             <w:noProof/>
             <w:webHidden/>
           </w:rPr>
-          <w:instrText xml:space="preserve"> PAGEREF _Toc243733507 \h </w:instrText>
+          <w:instrText xml:space="preserve"> PAGEREF _Toc243735237 \h </w:instrText>
         </w:r>
         <w:r>
           <w:rPr>
@@ -2720,7 +2720,7 @@
           <w14:ligatures w14:val="standardContextual"/>
         </w:rPr>
       </w:pPr>
-      <w:hyperlink w:anchor="_Toc243733508" w:history="1">
+      <w:hyperlink w:anchor="_Toc243735238" w:history="1">
         <w:r>
           <w:rPr>
             <w:rStyle w:val="Hipervnculo"/>
@@ -2747,7 +2747,7 @@
             <w:noProof/>
             <w:webHidden/>
           </w:rPr>
-          <w:instrText xml:space="preserve"> PAGEREF _Toc243733508 \h </w:instrText>
+          <w:instrText xml:space="preserve"> PAGEREF _Toc243735238 \h </w:instrText>
         </w:r>
         <w:r>
           <w:rPr>
@@ -2792,7 +2792,7 @@
           <w14:ligatures w14:val="standardContextual"/>
         </w:rPr>
       </w:pPr>
-      <w:hyperlink w:anchor="_Toc243733509" w:history="1">
+      <w:hyperlink w:anchor="_Toc243735239" w:history="1">
         <w:r>
           <w:rPr>
             <w:rStyle w:val="Hipervnculo"/>
@@ -2819,7 +2819,7 @@
             <w:noProof/>
             <w:webHidden/>
           </w:rPr>
-          <w:instrText xml:space="preserve"> PAGEREF _Toc243733509 \h </w:instrText>
+          <w:instrText xml:space="preserve"> PAGEREF _Toc243735239 \h </w:instrText>
         </w:r>
         <w:r>
           <w:rPr>
@@ -2864,7 +2864,7 @@
           <w14:ligatures w14:val="standardContextual"/>
         </w:rPr>
       </w:pPr>
-      <w:hyperlink w:anchor="_Toc243733510" w:history="1">
+      <w:hyperlink w:anchor="_Toc243735240" w:history="1">
         <w:r>
           <w:rPr>
             <w:rStyle w:val="Hipervnculo"/>
@@ -2891,7 +2891,7 @@
             <w:noProof/>
             <w:webHidden/>
           </w:rPr>
-          <w:instrText xml:space="preserve"> PAGEREF _Toc243733510 \h </w:instrText>
+          <w:instrText xml:space="preserve"> PAGEREF _Toc243735240 \h </w:instrText>
         </w:r>
         <w:r>
           <w:rPr>
@@ -2936,7 +2936,7 @@
           <w14:ligatures w14:val="standardContextual"/>
         </w:rPr>
       </w:pPr>
-      <w:hyperlink w:anchor="_Toc243733511" w:history="1">
+      <w:hyperlink w:anchor="_Toc243735241" w:history="1">
         <w:r>
           <w:rPr>
             <w:rStyle w:val="Hipervnculo"/>
@@ -2963,7 +2963,7 @@
             <w:noProof/>
             <w:webHidden/>
           </w:rPr>
-          <w:instrText xml:space="preserve"> PAGEREF _Toc243733511 \h </w:instrText>
+          <w:instrText xml:space="preserve"> PAGEREF _Toc243735241 \h </w:instrText>
         </w:r>
         <w:r>
           <w:rPr>
@@ -3008,7 +3008,7 @@
           <w14:ligatures w14:val="standardContextual"/>
         </w:rPr>
       </w:pPr>
-      <w:hyperlink w:anchor="_Toc243733512" w:history="1">
+      <w:hyperlink w:anchor="_Toc243735242" w:history="1">
         <w:r>
           <w:rPr>
             <w:rStyle w:val="Hipervnculo"/>
@@ -3051,7 +3051,7 @@
             <w:noProof/>
             <w:webHidden/>
           </w:rPr>
-          <w:instrText xml:space="preserve"> PAGEREF _Toc243733512 \h </w:instrText>
+          <w:instrText xml:space="preserve"> PAGEREF _Toc243735242 \h </w:instrText>
         </w:r>
         <w:r>
           <w:rPr>
@@ -3096,7 +3096,7 @@
           <w14:ligatures w14:val="standardContextual"/>
         </w:rPr>
       </w:pPr>
-      <w:hyperlink w:anchor="_Toc243733513" w:history="1">
+      <w:hyperlink w:anchor="_Toc243735243" w:history="1">
         <w:r>
           <w:rPr>
             <w:rStyle w:val="Hipervnculo"/>
@@ -3123,7 +3123,7 @@
             <w:noProof/>
             <w:webHidden/>
           </w:rPr>
-          <w:instrText xml:space="preserve"> PAGEREF _Toc243733513 \h </w:instrText>
+          <w:instrText xml:space="preserve"> PAGEREF _Toc243735243 \h </w:instrText>
         </w:r>
         <w:r>
           <w:rPr>
@@ -3168,7 +3168,7 @@
           <w14:ligatures w14:val="standardContextual"/>
         </w:rPr>
       </w:pPr>
-      <w:hyperlink w:anchor="_Toc243733514" w:history="1">
+      <w:hyperlink w:anchor="_Toc243735244" w:history="1">
         <w:r>
           <w:rPr>
             <w:rStyle w:val="Hipervnculo"/>
@@ -3195,7 +3195,7 @@
             <w:noProof/>
             <w:webHidden/>
           </w:rPr>
-          <w:instrText xml:space="preserve"> PAGEREF _Toc243733514 \h </w:instrText>
+          <w:instrText xml:space="preserve"> PAGEREF _Toc243735244 \h </w:instrText>
         </w:r>
         <w:r>
           <w:rPr>
@@ -3240,7 +3240,7 @@
           <w14:ligatures w14:val="standardContextual"/>
         </w:rPr>
       </w:pPr>
-      <w:hyperlink w:anchor="_Toc243733515" w:history="1">
+      <w:hyperlink w:anchor="_Toc243735245" w:history="1">
         <w:r>
           <w:rPr>
             <w:rStyle w:val="Hipervnculo"/>
@@ -3267,7 +3267,7 @@
             <w:noProof/>
             <w:webHidden/>
           </w:rPr>
-          <w:instrText xml:space="preserve"> PAGEREF _Toc243733515 \h </w:instrText>
+          <w:instrText xml:space="preserve"> PAGEREF _Toc243735245 \h </w:instrText>
         </w:r>
         <w:r>
           <w:rPr>
@@ -3312,7 +3312,7 @@
           <w14:ligatures w14:val="standardContextual"/>
         </w:rPr>
       </w:pPr>
-      <w:hyperlink w:anchor="_Toc243733516" w:history="1">
+      <w:hyperlink w:anchor="_Toc243735246" w:history="1">
         <w:r>
           <w:rPr>
             <w:rStyle w:val="Hipervnculo"/>
@@ -3339,7 +3339,7 @@
             <w:noProof/>
             <w:webHidden/>
           </w:rPr>
-          <w:instrText xml:space="preserve"> PAGEREF _Toc243733516 \h </w:instrText>
+          <w:instrText xml:space="preserve"> PAGEREF _Toc243735246 \h </w:instrText>
         </w:r>
         <w:r>
           <w:rPr>
@@ -3384,7 +3384,7 @@
           <w14:ligatures w14:val="standardContextual"/>
         </w:rPr>
       </w:pPr>
-      <w:hyperlink w:anchor="_Toc243733517" w:history="1">
+      <w:hyperlink w:anchor="_Toc243735247" w:history="1">
         <w:r>
           <w:rPr>
             <w:rStyle w:val="Hipervnculo"/>
@@ -3411,7 +3411,7 @@
             <w:noProof/>
             <w:webHidden/>
           </w:rPr>
-          <w:instrText xml:space="preserve"> PAGEREF _Toc243733517 \h </w:instrText>
+          <w:instrText xml:space="preserve"> PAGEREF _Toc243735247 \h </w:instrText>
         </w:r>
         <w:r>
           <w:rPr>
@@ -3456,7 +3456,7 @@
           <w14:ligatures w14:val="standardContextual"/>
         </w:rPr>
       </w:pPr>
-      <w:hyperlink w:anchor="_Toc243733518" w:history="1">
+      <w:hyperlink w:anchor="_Toc243735248" w:history="1">
         <w:r>
           <w:rPr>
             <w:rStyle w:val="Hipervnculo"/>
@@ -3483,7 +3483,7 @@
             <w:noProof/>
             <w:webHidden/>
           </w:rPr>
-          <w:instrText xml:space="preserve"> PAGEREF _Toc243733518 \h </w:instrText>
+          <w:instrText xml:space="preserve"> PAGEREF _Toc243735248 \h </w:instrText>
         </w:r>
         <w:r>
           <w:rPr>
@@ -3528,7 +3528,7 @@
           <w14:ligatures w14:val="standardContextual"/>
         </w:rPr>
       </w:pPr>
-      <w:hyperlink w:anchor="_Toc243733519" w:history="1">
+      <w:hyperlink w:anchor="_Toc243735249" w:history="1">
         <w:r>
           <w:rPr>
             <w:rStyle w:val="Hipervnculo"/>
@@ -3555,7 +3555,7 @@
             <w:noProof/>
             <w:webHidden/>
           </w:rPr>
-          <w:instrText xml:space="preserve"> PAGEREF _Toc243733519 \h </w:instrText>
+          <w:instrText xml:space="preserve"> PAGEREF _Toc243735249 \h </w:instrText>
         </w:r>
         <w:r>
           <w:rPr>
@@ -3600,7 +3600,7 @@
           <w14:ligatures w14:val="standardContextual"/>
         </w:rPr>
       </w:pPr>
-      <w:hyperlink w:anchor="_Toc243733520" w:history="1">
+      <w:hyperlink w:anchor="_Toc243735250" w:history="1">
         <w:r>
           <w:rPr>
             <w:rStyle w:val="Hipervnculo"/>
@@ -3627,7 +3627,7 @@
             <w:noProof/>
             <w:webHidden/>
           </w:rPr>
-          <w:instrText xml:space="preserve"> PAGEREF _Toc243733520 \h </w:instrText>
+          <w:instrText xml:space="preserve"> PAGEREF _Toc243735250 \h </w:instrText>
         </w:r>
         <w:r>
           <w:rPr>
@@ -3672,7 +3672,7 @@
           <w14:ligatures w14:val="standardContextual"/>
         </w:rPr>
       </w:pPr>
-      <w:hyperlink w:anchor="_Toc243733521" w:history="1">
+      <w:hyperlink w:anchor="_Toc243735251" w:history="1">
         <w:r>
           <w:rPr>
             <w:rStyle w:val="Hipervnculo"/>
@@ -3699,7 +3699,7 @@
             <w:noProof/>
             <w:webHidden/>
           </w:rPr>
-          <w:instrText xml:space="preserve"> PAGEREF _Toc243733521 \h </w:instrText>
+          <w:instrText xml:space="preserve"> PAGEREF _Toc243735251 \h </w:instrText>
         </w:r>
         <w:r>
           <w:rPr>
@@ -3744,7 +3744,7 @@
           <w14:ligatures w14:val="standardContextual"/>
         </w:rPr>
       </w:pPr>
-      <w:hyperlink w:anchor="_Toc243733522" w:history="1">
+      <w:hyperlink w:anchor="_Toc243735252" w:history="1">
         <w:r>
           <w:rPr>
             <w:rStyle w:val="Hipervnculo"/>
@@ -3771,7 +3771,7 @@
             <w:noProof/>
             <w:webHidden/>
           </w:rPr>
-          <w:instrText xml:space="preserve"> PAGEREF _Toc243733522 \h </w:instrText>
+          <w:instrText xml:space="preserve"> PAGEREF _Toc243735252 \h </w:instrText>
         </w:r>
         <w:r>
           <w:rPr>
@@ -3816,7 +3816,7 @@
           <w14:ligatures w14:val="standardContextual"/>
         </w:rPr>
       </w:pPr>
-      <w:hyperlink w:anchor="_Toc243733523" w:history="1">
+      <w:hyperlink w:anchor="_Toc243735253" w:history="1">
         <w:r>
           <w:rPr>
             <w:rStyle w:val="Hipervnculo"/>
@@ -3843,7 +3843,7 @@
             <w:noProof/>
             <w:webHidden/>
           </w:rPr>
-          <w:instrText xml:space="preserve"> PAGEREF _Toc243733523 \h </w:instrText>
+          <w:instrText xml:space="preserve"> PAGEREF _Toc243735253 \h </w:instrText>
         </w:r>
         <w:r>
           <w:rPr>
@@ -3888,7 +3888,7 @@
           <w14:ligatures w14:val="standardContextual"/>
         </w:rPr>
       </w:pPr>
-      <w:hyperlink w:anchor="_Toc243733524" w:history="1">
+      <w:hyperlink w:anchor="_Toc243735254" w:history="1">
         <w:r>
           <w:rPr>
             <w:rStyle w:val="Hipervnculo"/>
@@ -3915,7 +3915,7 @@
             <w:noProof/>
             <w:webHidden/>
           </w:rPr>
-          <w:instrText xml:space="preserve"> PAGEREF _Toc243733524 \h </w:instrText>
+          <w:instrText xml:space="preserve"> PAGEREF _Toc243735254 \h </w:instrText>
         </w:r>
         <w:r>
           <w:rPr>
@@ -3960,7 +3960,7 @@
           <w14:ligatures w14:val="standardContextual"/>
         </w:rPr>
       </w:pPr>
-      <w:hyperlink w:anchor="_Toc243733525" w:history="1">
+      <w:hyperlink w:anchor="_Toc243735255" w:history="1">
         <w:r>
           <w:rPr>
             <w:rStyle w:val="Hipervnculo"/>
@@ -3987,7 +3987,7 @@
             <w:noProof/>
             <w:webHidden/>
           </w:rPr>
-          <w:instrText xml:space="preserve"> PAGEREF _Toc243733525 \h </w:instrText>
+          <w:instrText xml:space="preserve"> PAGEREF _Toc243735255 \h </w:instrText>
         </w:r>
         <w:r>
           <w:rPr>
@@ -4032,7 +4032,7 @@
           <w14:ligatures w14:val="standardContextual"/>
         </w:rPr>
       </w:pPr>
-      <w:hyperlink w:anchor="_Toc243733526" w:history="1">
+      <w:hyperlink w:anchor="_Toc243735256" w:history="1">
         <w:r>
           <w:rPr>
             <w:rStyle w:val="Hipervnculo"/>
@@ -4059,7 +4059,7 @@
             <w:noProof/>
             <w:webHidden/>
           </w:rPr>
-          <w:instrText xml:space="preserve"> PAGEREF _Toc243733526 \h </w:instrText>
+          <w:instrText xml:space="preserve"> PAGEREF _Toc243735256 \h </w:instrText>
         </w:r>
         <w:r>
           <w:rPr>
@@ -4104,7 +4104,7 @@
           <w14:ligatures w14:val="standardContextual"/>
         </w:rPr>
       </w:pPr>
-      <w:hyperlink w:anchor="_Toc243733527" w:history="1">
+      <w:hyperlink w:anchor="_Toc243735257" w:history="1">
         <w:r>
           <w:rPr>
             <w:rStyle w:val="Hipervnculo"/>
@@ -4131,7 +4131,7 @@
             <w:noProof/>
             <w:webHidden/>
           </w:rPr>
-          <w:instrText xml:space="preserve"> PAGEREF _Toc243733527 \h </w:instrText>
+          <w:instrText xml:space="preserve"> PAGEREF _Toc243735257 \h </w:instrText>
         </w:r>
         <w:r>
           <w:rPr>
@@ -4176,7 +4176,7 @@
           <w14:ligatures w14:val="standardContextual"/>
         </w:rPr>
       </w:pPr>
-      <w:hyperlink w:anchor="_Toc243733528" w:history="1">
+      <w:hyperlink w:anchor="_Toc243735258" w:history="1">
         <w:r>
           <w:rPr>
             <w:rStyle w:val="Hipervnculo"/>
@@ -4203,7 +4203,7 @@
             <w:noProof/>
             <w:webHidden/>
           </w:rPr>
-          <w:instrText xml:space="preserve"> PAGEREF _Toc243733528 \h </w:instrText>
+          <w:instrText xml:space="preserve"> PAGEREF _Toc243735258 \h </w:instrText>
         </w:r>
         <w:r>
           <w:rPr>
@@ -4248,7 +4248,7 @@
           <w14:ligatures w14:val="standardContextual"/>
         </w:rPr>
       </w:pPr>
-      <w:hyperlink w:anchor="_Toc243733529" w:history="1">
+      <w:hyperlink w:anchor="_Toc243735259" w:history="1">
         <w:r>
           <w:rPr>
             <w:rStyle w:val="Hipervnculo"/>
@@ -4275,7 +4275,7 @@
             <w:noProof/>
             <w:webHidden/>
           </w:rPr>
-          <w:instrText xml:space="preserve"> PAGEREF _Toc243733529 \h </w:instrText>
+          <w:instrText xml:space="preserve"> PAGEREF _Toc243735259 \h </w:instrText>
         </w:r>
         <w:r>
           <w:rPr>
@@ -4320,7 +4320,7 @@
           <w14:ligatures w14:val="standardContextual"/>
         </w:rPr>
       </w:pPr>
-      <w:hyperlink w:anchor="_Toc243733530" w:history="1">
+      <w:hyperlink w:anchor="_Toc243735260" w:history="1">
         <w:r>
           <w:rPr>
             <w:rStyle w:val="Hipervnculo"/>
@@ -4347,7 +4347,7 @@
             <w:noProof/>
             <w:webHidden/>
           </w:rPr>
-          <w:instrText xml:space="preserve"> PAGEREF _Toc243733530 \h </w:instrText>
+          <w:instrText xml:space="preserve"> PAGEREF _Toc243735260 \h </w:instrText>
         </w:r>
         <w:r>
           <w:rPr>
@@ -4392,7 +4392,7 @@
           <w14:ligatures w14:val="standardContextual"/>
         </w:rPr>
       </w:pPr>
-      <w:hyperlink w:anchor="_Toc243733531" w:history="1">
+      <w:hyperlink w:anchor="_Toc243735261" w:history="1">
         <w:r>
           <w:rPr>
             <w:rStyle w:val="Hipervnculo"/>
@@ -4419,7 +4419,7 @@
             <w:noProof/>
             <w:webHidden/>
           </w:rPr>
-          <w:instrText xml:space="preserve"> PAGEREF _Toc243733531 \h </w:instrText>
+          <w:instrText xml:space="preserve"> PAGEREF _Toc243735261 \h </w:instrText>
         </w:r>
         <w:r>
           <w:rPr>
@@ -4464,7 +4464,7 @@
           <w14:ligatures w14:val="standardContextual"/>
         </w:rPr>
       </w:pPr>
-      <w:hyperlink w:anchor="_Toc243733532" w:history="1">
+      <w:hyperlink w:anchor="_Toc243735262" w:history="1">
         <w:r>
           <w:rPr>
             <w:rStyle w:val="Hipervnculo"/>
@@ -4500,7 +4500,7 @@
             <w:noProof/>
             <w:webHidden/>
           </w:rPr>
-          <w:instrText xml:space="preserve"> PAGEREF _Toc243733532 \h </w:instrText>
+          <w:instrText xml:space="preserve"> PAGEREF _Toc243735262 \h </w:instrText>
         </w:r>
         <w:r>
           <w:rPr>
@@ -4545,7 +4545,7 @@
           <w14:ligatures w14:val="standardContextual"/>
         </w:rPr>
       </w:pPr>
-      <w:hyperlink w:anchor="_Toc243733533" w:history="1">
+      <w:hyperlink w:anchor="_Toc243735263" w:history="1">
         <w:r>
           <w:rPr>
             <w:rStyle w:val="Hipervnculo"/>
@@ -4572,7 +4572,7 @@
             <w:noProof/>
             <w:webHidden/>
           </w:rPr>
-          <w:instrText xml:space="preserve"> PAGEREF _Toc243733533 \h </w:instrText>
+          <w:instrText xml:space="preserve"> PAGEREF _Toc243735263 \h </w:instrText>
         </w:r>
         <w:r>
           <w:rPr>
@@ -4617,7 +4617,7 @@
           <w14:ligatures w14:val="standardContextual"/>
         </w:rPr>
       </w:pPr>
-      <w:hyperlink w:anchor="_Toc243733534" w:history="1">
+      <w:hyperlink w:anchor="_Toc243735264" w:history="1">
         <w:r>
           <w:rPr>
             <w:rStyle w:val="Hipervnculo"/>
@@ -4644,7 +4644,7 @@
             <w:noProof/>
             <w:webHidden/>
           </w:rPr>
-          <w:instrText xml:space="preserve"> PAGEREF _Toc243733534 \h </w:instrText>
+          <w:instrText xml:space="preserve"> PAGEREF _Toc243735264 \h </w:instrText>
         </w:r>
         <w:r>
           <w:rPr>
@@ -4689,7 +4689,7 @@
           <w14:ligatures w14:val="standardContextual"/>
         </w:rPr>
       </w:pPr>
-      <w:hyperlink w:anchor="_Toc243733535" w:history="1">
+      <w:hyperlink w:anchor="_Toc243735265" w:history="1">
         <w:r>
           <w:rPr>
             <w:rStyle w:val="Hipervnculo"/>
@@ -4716,7 +4716,7 @@
             <w:noProof/>
             <w:webHidden/>
           </w:rPr>
-          <w:instrText xml:space="preserve"> PAGEREF _Toc243733535 \h </w:instrText>
+          <w:instrText xml:space="preserve"> PAGEREF _Toc243735265 \h </w:instrText>
         </w:r>
         <w:r>
           <w:rPr>
@@ -4761,7 +4761,7 @@
           <w14:ligatures w14:val="standardContextual"/>
         </w:rPr>
       </w:pPr>
-      <w:hyperlink w:anchor="_Toc243733536" w:history="1">
+      <w:hyperlink w:anchor="_Toc243735266" w:history="1">
         <w:r>
           <w:rPr>
             <w:rStyle w:val="Hipervnculo"/>
@@ -4788,7 +4788,7 @@
             <w:noProof/>
             <w:webHidden/>
           </w:rPr>
-          <w:instrText xml:space="preserve"> PAGEREF _Toc243733536 \h </w:instrText>
+          <w:instrText xml:space="preserve"> PAGEREF _Toc243735266 \h </w:instrText>
         </w:r>
         <w:r>
           <w:rPr>
@@ -4833,7 +4833,7 @@
           <w14:ligatures w14:val="standardContextual"/>
         </w:rPr>
       </w:pPr>
-      <w:hyperlink w:anchor="_Toc243733537" w:history="1">
+      <w:hyperlink w:anchor="_Toc243735267" w:history="1">
         <w:r>
           <w:rPr>
             <w:rStyle w:val="Hipervnculo"/>
@@ -4860,7 +4860,7 @@
             <w:noProof/>
             <w:webHidden/>
           </w:rPr>
-          <w:instrText xml:space="preserve"> PAGEREF _Toc243733537 \h </w:instrText>
+          <w:instrText xml:space="preserve"> PAGEREF _Toc243735267 \h </w:instrText>
         </w:r>
         <w:r>
           <w:rPr>
@@ -4905,7 +4905,7 @@
           <w14:ligatures w14:val="standardContextual"/>
         </w:rPr>
       </w:pPr>
-      <w:hyperlink w:anchor="_Toc243733538" w:history="1">
+      <w:hyperlink w:anchor="_Toc243735268" w:history="1">
         <w:r>
           <w:rPr>
             <w:rStyle w:val="Hipervnculo"/>
@@ -4932,7 +4932,7 @@
             <w:noProof/>
             <w:webHidden/>
           </w:rPr>
-          <w:instrText xml:space="preserve"> PAGEREF _Toc243733538 \h </w:instrText>
+          <w:instrText xml:space="preserve"> PAGEREF _Toc243735268 \h </w:instrText>
         </w:r>
         <w:r>
           <w:rPr>
@@ -4977,7 +4977,7 @@
           <w14:ligatures w14:val="standardContextual"/>
         </w:rPr>
       </w:pPr>
-      <w:hyperlink w:anchor="_Toc243733539" w:history="1">
+      <w:hyperlink w:anchor="_Toc243735269" w:history="1">
         <w:r>
           <w:rPr>
             <w:rStyle w:val="Hipervnculo"/>
@@ -5004,7 +5004,7 @@
             <w:noProof/>
             <w:webHidden/>
           </w:rPr>
-          <w:instrText xml:space="preserve"> PAGEREF _Toc243733539 \h </w:instrText>
+          <w:instrText xml:space="preserve"> PAGEREF _Toc243735269 \h </w:instrText>
         </w:r>
         <w:r>
           <w:rPr>
@@ -5049,7 +5049,7 @@
           <w14:ligatures w14:val="standardContextual"/>
         </w:rPr>
       </w:pPr>
-      <w:hyperlink w:anchor="_Toc243733540" w:history="1">
+      <w:hyperlink w:anchor="_Toc243735270" w:history="1">
         <w:r>
           <w:rPr>
             <w:rStyle w:val="Hipervnculo"/>
@@ -5076,7 +5076,7 @@
             <w:noProof/>
             <w:webHidden/>
           </w:rPr>
-          <w:instrText xml:space="preserve"> PAGEREF _Toc243733540 \h </w:instrText>
+          <w:instrText xml:space="preserve"> PAGEREF _Toc243735270 \h </w:instrText>
         </w:r>
         <w:r>
           <w:rPr>
@@ -5121,7 +5121,7 @@
           <w14:ligatures w14:val="standardContextual"/>
         </w:rPr>
       </w:pPr>
-      <w:hyperlink w:anchor="_Toc243733541" w:history="1">
+      <w:hyperlink w:anchor="_Toc243735271" w:history="1">
         <w:r>
           <w:rPr>
             <w:rStyle w:val="Hipervnculo"/>
@@ -5148,7 +5148,7 @@
             <w:noProof/>
             <w:webHidden/>
           </w:rPr>
-          <w:instrText xml:space="preserve"> PAGEREF _Toc243733541 \h </w:instrText>
+          <w:instrText xml:space="preserve"> PAGEREF _Toc243735271 \h </w:instrText>
         </w:r>
         <w:r>
           <w:rPr>
@@ -5193,7 +5193,7 @@
           <w14:ligatures w14:val="standardContextual"/>
         </w:rPr>
       </w:pPr>
-      <w:hyperlink w:anchor="_Toc243733542" w:history="1">
+      <w:hyperlink w:anchor="_Toc243735272" w:history="1">
         <w:r>
           <w:rPr>
             <w:rStyle w:val="Hipervnculo"/>
@@ -5220,7 +5220,7 @@
             <w:noProof/>
             <w:webHidden/>
           </w:rPr>
-          <w:instrText xml:space="preserve"> PAGEREF _Toc243733542 \h </w:instrText>
+          <w:instrText xml:space="preserve"> PAGEREF _Toc243735272 \h </w:instrText>
         </w:r>
         <w:r>
           <w:rPr>
@@ -5291,7 +5291,7 @@
       <w:r>
         <w:fldChar w:fldCharType="separate"/>
       </w:r>
-      <w:hyperlink w:anchor="_Toc243733543" w:history="1">
+      <w:hyperlink w:anchor="_Toc243735273" w:history="1">
         <w:r>
           <w:rPr>
             <w:rStyle w:val="Hipervnculo"/>
@@ -5318,7 +5318,7 @@
             <w:noProof/>
             <w:webHidden/>
           </w:rPr>
-          <w:instrText xml:space="preserve"> PAGEREF _Toc243733543 \h </w:instrText>
+          <w:instrText xml:space="preserve"> PAGEREF _Toc243735273 \h </w:instrText>
         </w:r>
         <w:r>
           <w:rPr>
@@ -5363,7 +5363,7 @@
           <w14:ligatures w14:val="standardContextual"/>
         </w:rPr>
       </w:pPr>
-      <w:hyperlink w:anchor="_Toc243733544" w:history="1">
+      <w:hyperlink w:anchor="_Toc243735274" w:history="1">
         <w:r>
           <w:rPr>
             <w:rStyle w:val="Hipervnculo"/>
@@ -5390,7 +5390,7 @@
             <w:noProof/>
             <w:webHidden/>
           </w:rPr>
-          <w:instrText xml:space="preserve"> PAGEREF _Toc243733544 \h </w:instrText>
+          <w:instrText xml:space="preserve"> PAGEREF _Toc243735274 \h </w:instrText>
         </w:r>
         <w:r>
           <w:rPr>
@@ -5435,7 +5435,7 @@
           <w14:ligatures w14:val="standardContextual"/>
         </w:rPr>
       </w:pPr>
-      <w:hyperlink w:anchor="_Toc243733545" w:history="1">
+      <w:hyperlink w:anchor="_Toc243735275" w:history="1">
         <w:r>
           <w:rPr>
             <w:rStyle w:val="Hipervnculo"/>
@@ -5462,7 +5462,7 @@
             <w:noProof/>
             <w:webHidden/>
           </w:rPr>
-          <w:instrText xml:space="preserve"> PAGEREF _Toc243733545 \h </w:instrText>
+          <w:instrText xml:space="preserve"> PAGEREF _Toc243735275 \h </w:instrText>
         </w:r>
         <w:r>
           <w:rPr>
@@ -5507,7 +5507,7 @@
           <w14:ligatures w14:val="standardContextual"/>
         </w:rPr>
       </w:pPr>
-      <w:hyperlink w:anchor="_Toc243733546" w:history="1">
+      <w:hyperlink w:anchor="_Toc243735276" w:history="1">
         <w:r>
           <w:rPr>
             <w:rStyle w:val="Hipervnculo"/>
@@ -5534,7 +5534,7 @@
             <w:noProof/>
             <w:webHidden/>
           </w:rPr>
-          <w:instrText xml:space="preserve"> PAGEREF _Toc243733546 \h </w:instrText>
+          <w:instrText xml:space="preserve"> PAGEREF _Toc243735276 \h </w:instrText>
         </w:r>
         <w:r>
           <w:rPr>
@@ -5579,7 +5579,7 @@
           <w14:ligatures w14:val="standardContextual"/>
         </w:rPr>
       </w:pPr>
-      <w:hyperlink w:anchor="_Toc243733547" w:history="1">
+      <w:hyperlink w:anchor="_Toc243735277" w:history="1">
         <w:r>
           <w:rPr>
             <w:rStyle w:val="Hipervnculo"/>
@@ -5606,7 +5606,7 @@
             <w:noProof/>
             <w:webHidden/>
           </w:rPr>
-          <w:instrText xml:space="preserve"> PAGEREF _Toc243733547 \h </w:instrText>
+          <w:instrText xml:space="preserve"> PAGEREF _Toc243735277 \h </w:instrText>
         </w:r>
         <w:r>
           <w:rPr>
@@ -5651,7 +5651,7 @@
           <w14:ligatures w14:val="standardContextual"/>
         </w:rPr>
       </w:pPr>
-      <w:hyperlink w:anchor="_Toc243733548" w:history="1">
+      <w:hyperlink w:anchor="_Toc243735278" w:history="1">
         <w:r>
           <w:rPr>
             <w:rStyle w:val="Hipervnculo"/>
@@ -5678,7 +5678,7 @@
             <w:noProof/>
             <w:webHidden/>
           </w:rPr>
-          <w:instrText xml:space="preserve"> PAGEREF _Toc243733548 \h </w:instrText>
+          <w:instrText xml:space="preserve"> PAGEREF _Toc243735278 \h </w:instrText>
         </w:r>
         <w:r>
           <w:rPr>
@@ -5723,7 +5723,7 @@
           <w14:ligatures w14:val="standardContextual"/>
         </w:rPr>
       </w:pPr>
-      <w:hyperlink w:anchor="_Toc243733549" w:history="1">
+      <w:hyperlink w:anchor="_Toc243735279" w:history="1">
         <w:r>
           <w:rPr>
             <w:rStyle w:val="Hipervnculo"/>
@@ -5750,7 +5750,7 @@
             <w:noProof/>
             <w:webHidden/>
           </w:rPr>
-          <w:instrText xml:space="preserve"> PAGEREF _Toc243733549 \h </w:instrText>
+          <w:instrText xml:space="preserve"> PAGEREF _Toc243735279 \h </w:instrText>
         </w:r>
         <w:r>
           <w:rPr>
@@ -5795,7 +5795,7 @@
           <w14:ligatures w14:val="standardContextual"/>
         </w:rPr>
       </w:pPr>
-      <w:hyperlink w:anchor="_Toc243733550" w:history="1">
+      <w:hyperlink w:anchor="_Toc243735280" w:history="1">
         <w:r>
           <w:rPr>
             <w:rStyle w:val="Hipervnculo"/>
@@ -5822,7 +5822,7 @@
             <w:noProof/>
             <w:webHidden/>
           </w:rPr>
-          <w:instrText xml:space="preserve"> PAGEREF _Toc243733550 \h </w:instrText>
+          <w:instrText xml:space="preserve"> PAGEREF _Toc243735280 \h </w:instrText>
         </w:r>
         <w:r>
           <w:rPr>
@@ -5867,7 +5867,7 @@
           <w14:ligatures w14:val="standardContextual"/>
         </w:rPr>
       </w:pPr>
-      <w:hyperlink w:anchor="_Toc243733551" w:history="1">
+      <w:hyperlink w:anchor="_Toc243735281" w:history="1">
         <w:r>
           <w:rPr>
             <w:rStyle w:val="Hipervnculo"/>
@@ -5894,7 +5894,7 @@
             <w:noProof/>
             <w:webHidden/>
           </w:rPr>
-          <w:instrText xml:space="preserve"> PAGEREF _Toc243733551 \h </w:instrText>
+          <w:instrText xml:space="preserve"> PAGEREF _Toc243735281 \h </w:instrText>
         </w:r>
         <w:r>
           <w:rPr>
@@ -5939,7 +5939,7 @@
           <w14:ligatures w14:val="standardContextual"/>
         </w:rPr>
       </w:pPr>
-      <w:hyperlink w:anchor="_Toc243733552" w:history="1">
+      <w:hyperlink w:anchor="_Toc243735282" w:history="1">
         <w:r>
           <w:rPr>
             <w:rStyle w:val="Hipervnculo"/>
@@ -5966,7 +5966,7 @@
             <w:noProof/>
             <w:webHidden/>
           </w:rPr>
-          <w:instrText xml:space="preserve"> PAGEREF _Toc243733552 \h </w:instrText>
+          <w:instrText xml:space="preserve"> PAGEREF _Toc243735282 \h </w:instrText>
         </w:r>
         <w:r>
           <w:rPr>
@@ -6011,7 +6011,7 @@
           <w14:ligatures w14:val="standardContextual"/>
         </w:rPr>
       </w:pPr>
-      <w:hyperlink w:anchor="_Toc243733553" w:history="1">
+      <w:hyperlink w:anchor="_Toc243735283" w:history="1">
         <w:r>
           <w:rPr>
             <w:rStyle w:val="Hipervnculo"/>
@@ -6038,7 +6038,7 @@
             <w:noProof/>
             <w:webHidden/>
           </w:rPr>
-          <w:instrText xml:space="preserve"> PAGEREF _Toc243733553 \h </w:instrText>
+          <w:instrText xml:space="preserve"> PAGEREF _Toc243735283 \h </w:instrText>
         </w:r>
         <w:r>
           <w:rPr>
@@ -6083,7 +6083,7 @@
           <w14:ligatures w14:val="standardContextual"/>
         </w:rPr>
       </w:pPr>
-      <w:hyperlink w:anchor="_Toc243733554" w:history="1">
+      <w:hyperlink w:anchor="_Toc243735284" w:history="1">
         <w:r>
           <w:rPr>
             <w:rStyle w:val="Hipervnculo"/>
@@ -6110,7 +6110,7 @@
             <w:noProof/>
             <w:webHidden/>
           </w:rPr>
-          <w:instrText xml:space="preserve"> PAGEREF _Toc243733554 \h </w:instrText>
+          <w:instrText xml:space="preserve"> PAGEREF _Toc243735284 \h </w:instrText>
         </w:r>
         <w:r>
           <w:rPr>
@@ -6155,7 +6155,7 @@
           <w14:ligatures w14:val="standardContextual"/>
         </w:rPr>
       </w:pPr>
-      <w:hyperlink w:anchor="_Toc243733555" w:history="1">
+      <w:hyperlink w:anchor="_Toc243735285" w:history="1">
         <w:r>
           <w:rPr>
             <w:rStyle w:val="Hipervnculo"/>
@@ -6182,7 +6182,7 @@
             <w:noProof/>
             <w:webHidden/>
           </w:rPr>
-          <w:instrText xml:space="preserve"> PAGEREF _Toc243733555 \h </w:instrText>
+          <w:instrText xml:space="preserve"> PAGEREF _Toc243735285 \h </w:instrText>
         </w:r>
         <w:r>
           <w:rPr>
@@ -6227,7 +6227,7 @@
           <w14:ligatures w14:val="standardContextual"/>
         </w:rPr>
       </w:pPr>
-      <w:hyperlink w:anchor="_Toc243733556" w:history="1">
+      <w:hyperlink w:anchor="_Toc243735286" w:history="1">
         <w:r>
           <w:rPr>
             <w:rStyle w:val="Hipervnculo"/>
@@ -6254,7 +6254,7 @@
             <w:noProof/>
             <w:webHidden/>
           </w:rPr>
-          <w:instrText xml:space="preserve"> PAGEREF _Toc243733556 \h </w:instrText>
+          <w:instrText xml:space="preserve"> PAGEREF _Toc243735286 \h </w:instrText>
         </w:r>
         <w:r>
           <w:rPr>
@@ -6299,7 +6299,7 @@
           <w14:ligatures w14:val="standardContextual"/>
         </w:rPr>
       </w:pPr>
-      <w:hyperlink w:anchor="_Toc243733557" w:history="1">
+      <w:hyperlink w:anchor="_Toc243735287" w:history="1">
         <w:r>
           <w:rPr>
             <w:rStyle w:val="Hipervnculo"/>
@@ -6326,7 +6326,7 @@
             <w:noProof/>
             <w:webHidden/>
           </w:rPr>
-          <w:instrText xml:space="preserve"> PAGEREF _Toc243733557 \h </w:instrText>
+          <w:instrText xml:space="preserve"> PAGEREF _Toc243735287 \h </w:instrText>
         </w:r>
         <w:r>
           <w:rPr>
@@ -6371,7 +6371,7 @@
           <w14:ligatures w14:val="standardContextual"/>
         </w:rPr>
       </w:pPr>
-      <w:hyperlink w:anchor="_Toc243733558" w:history="1">
+      <w:hyperlink w:anchor="_Toc243735288" w:history="1">
         <w:r>
           <w:rPr>
             <w:rStyle w:val="Hipervnculo"/>
@@ -6398,7 +6398,7 @@
             <w:noProof/>
             <w:webHidden/>
           </w:rPr>
-          <w:instrText xml:space="preserve"> PAGEREF _Toc243733558 \h </w:instrText>
+          <w:instrText xml:space="preserve"> PAGEREF _Toc243735288 \h </w:instrText>
         </w:r>
         <w:r>
           <w:rPr>
@@ -6443,7 +6443,7 @@
           <w14:ligatures w14:val="standardContextual"/>
         </w:rPr>
       </w:pPr>
-      <w:hyperlink w:anchor="_Toc243733559" w:history="1">
+      <w:hyperlink w:anchor="_Toc243735289" w:history="1">
         <w:r>
           <w:rPr>
             <w:rStyle w:val="Hipervnculo"/>
@@ -6470,7 +6470,7 @@
             <w:noProof/>
             <w:webHidden/>
           </w:rPr>
-          <w:instrText xml:space="preserve"> PAGEREF _Toc243733559 \h </w:instrText>
+          <w:instrText xml:space="preserve"> PAGEREF _Toc243735289 \h </w:instrText>
         </w:r>
         <w:r>
           <w:rPr>
@@ -6515,7 +6515,7 @@
           <w14:ligatures w14:val="standardContextual"/>
         </w:rPr>
       </w:pPr>
-      <w:hyperlink w:anchor="_Toc243733560" w:history="1">
+      <w:hyperlink w:anchor="_Toc243735290" w:history="1">
         <w:r>
           <w:rPr>
             <w:rStyle w:val="Hipervnculo"/>
@@ -6542,7 +6542,7 @@
             <w:noProof/>
             <w:webHidden/>
           </w:rPr>
-          <w:instrText xml:space="preserve"> PAGEREF _Toc243733560 \h </w:instrText>
+          <w:instrText xml:space="preserve"> PAGEREF _Toc243735290 \h </w:instrText>
         </w:r>
         <w:r>
           <w:rPr>
@@ -6587,7 +6587,7 @@
           <w14:ligatures w14:val="standardContextual"/>
         </w:rPr>
       </w:pPr>
-      <w:hyperlink w:anchor="_Toc243733561" w:history="1">
+      <w:hyperlink w:anchor="_Toc243735291" w:history="1">
         <w:r>
           <w:rPr>
             <w:rStyle w:val="Hipervnculo"/>
@@ -6614,7 +6614,7 @@
             <w:noProof/>
             <w:webHidden/>
           </w:rPr>
-          <w:instrText xml:space="preserve"> PAGEREF _Toc243733561 \h </w:instrText>
+          <w:instrText xml:space="preserve"> PAGEREF _Toc243735291 \h </w:instrText>
         </w:r>
         <w:r>
           <w:rPr>
@@ -6659,7 +6659,7 @@
           <w14:ligatures w14:val="standardContextual"/>
         </w:rPr>
       </w:pPr>
-      <w:hyperlink w:anchor="_Toc243733562" w:history="1">
+      <w:hyperlink w:anchor="_Toc243735292" w:history="1">
         <w:r>
           <w:rPr>
             <w:rStyle w:val="Hipervnculo"/>
@@ -6686,7 +6686,7 @@
             <w:noProof/>
             <w:webHidden/>
           </w:rPr>
-          <w:instrText xml:space="preserve"> PAGEREF _Toc243733562 \h </w:instrText>
+          <w:instrText xml:space="preserve"> PAGEREF _Toc243735292 \h </w:instrText>
         </w:r>
         <w:r>
           <w:rPr>
@@ -6731,7 +6731,7 @@
           <w14:ligatures w14:val="standardContextual"/>
         </w:rPr>
       </w:pPr>
-      <w:hyperlink w:anchor="_Toc243733563" w:history="1">
+      <w:hyperlink w:anchor="_Toc243735293" w:history="1">
         <w:r>
           <w:rPr>
             <w:rStyle w:val="Hipervnculo"/>
@@ -6758,7 +6758,7 @@
             <w:noProof/>
             <w:webHidden/>
           </w:rPr>
-          <w:instrText xml:space="preserve"> PAGEREF _Toc243733563 \h </w:instrText>
+          <w:instrText xml:space="preserve"> PAGEREF _Toc243735293 \h </w:instrText>
         </w:r>
         <w:r>
           <w:rPr>
@@ -6803,7 +6803,7 @@
           <w14:ligatures w14:val="standardContextual"/>
         </w:rPr>
       </w:pPr>
-      <w:hyperlink w:anchor="_Toc243733564" w:history="1">
+      <w:hyperlink w:anchor="_Toc243735294" w:history="1">
         <w:r>
           <w:rPr>
             <w:rStyle w:val="Hipervnculo"/>
@@ -6830,7 +6830,7 @@
             <w:noProof/>
             <w:webHidden/>
           </w:rPr>
-          <w:instrText xml:space="preserve"> PAGEREF _Toc243733564 \h </w:instrText>
+          <w:instrText xml:space="preserve"> PAGEREF _Toc243735294 \h </w:instrText>
         </w:r>
         <w:r>
           <w:rPr>
@@ -6875,7 +6875,7 @@
           <w14:ligatures w14:val="standardContextual"/>
         </w:rPr>
       </w:pPr>
-      <w:hyperlink w:anchor="_Toc243733565" w:history="1">
+      <w:hyperlink w:anchor="_Toc243735295" w:history="1">
         <w:r>
           <w:rPr>
             <w:rStyle w:val="Hipervnculo"/>
@@ -6902,7 +6902,7 @@
             <w:noProof/>
             <w:webHidden/>
           </w:rPr>
-          <w:instrText xml:space="preserve"> PAGEREF _Toc243733565 \h </w:instrText>
+          <w:instrText xml:space="preserve"> PAGEREF _Toc243735295 \h </w:instrText>
         </w:r>
         <w:r>
           <w:rPr>
@@ -6973,7 +6973,7 @@
       <w:r>
         <w:fldChar w:fldCharType="separate"/>
       </w:r>
-      <w:hyperlink w:anchor="_Toc243733566" w:history="1">
+      <w:hyperlink w:anchor="_Toc243735296" w:history="1">
         <w:r>
           <w:rPr>
             <w:rStyle w:val="Hipervnculo"/>
@@ -7000,7 +7000,7 @@
             <w:noProof/>
             <w:webHidden/>
           </w:rPr>
-          <w:instrText xml:space="preserve"> PAGEREF _Toc243733566 \h </w:instrText>
+          <w:instrText xml:space="preserve"> PAGEREF _Toc243735296 \h </w:instrText>
         </w:r>
         <w:r>
           <w:rPr>
@@ -7045,7 +7045,7 @@
           <w14:ligatures w14:val="standardContextual"/>
         </w:rPr>
       </w:pPr>
-      <w:hyperlink w:anchor="_Toc243733567" w:history="1">
+      <w:hyperlink w:anchor="_Toc243735297" w:history="1">
         <w:r>
           <w:rPr>
             <w:rStyle w:val="Hipervnculo"/>
@@ -7072,7 +7072,7 @@
             <w:noProof/>
             <w:webHidden/>
           </w:rPr>
-          <w:instrText xml:space="preserve"> PAGEREF _Toc243733567 \h </w:instrText>
+          <w:instrText xml:space="preserve"> PAGEREF _Toc243735297 \h </w:instrText>
         </w:r>
         <w:r>
           <w:rPr>
@@ -7117,7 +7117,7 @@
           <w14:ligatures w14:val="standardContextual"/>
         </w:rPr>
       </w:pPr>
-      <w:hyperlink w:anchor="_Toc243733568" w:history="1">
+      <w:hyperlink w:anchor="_Toc243735298" w:history="1">
         <w:r>
           <w:rPr>
             <w:rStyle w:val="Hipervnculo"/>
@@ -7144,7 +7144,7 @@
             <w:noProof/>
             <w:webHidden/>
           </w:rPr>
-          <w:instrText xml:space="preserve"> PAGEREF _Toc243733568 \h </w:instrText>
+          <w:instrText xml:space="preserve"> PAGEREF _Toc243735298 \h </w:instrText>
         </w:r>
         <w:r>
           <w:rPr>
@@ -7189,7 +7189,7 @@
           <w14:ligatures w14:val="standardContextual"/>
         </w:rPr>
       </w:pPr>
-      <w:hyperlink w:anchor="_Toc243733569" w:history="1">
+      <w:hyperlink w:anchor="_Toc243735299" w:history="1">
         <w:r>
           <w:rPr>
             <w:rStyle w:val="Hipervnculo"/>
@@ -7216,7 +7216,7 @@
             <w:noProof/>
             <w:webHidden/>
           </w:rPr>
-          <w:instrText xml:space="preserve"> PAGEREF _Toc243733569 \h </w:instrText>
+          <w:instrText xml:space="preserve"> PAGEREF _Toc243735299 \h </w:instrText>
         </w:r>
         <w:r>
           <w:rPr>
@@ -7273,7 +7273,7 @@
       <w:pPr>
         <w:pStyle w:val="Ttulo1"/>
       </w:pPr>
-      <w:bookmarkStart w:id="5" w:name="_Toc243733491"/>
+      <w:bookmarkStart w:id="5" w:name="_Toc243735221"/>
       <w:r>
         <w:lastRenderedPageBreak/>
         <w:t>1. Introducción</w:t>
@@ -7285,22 +7285,31 @@
         <w:pStyle w:val="FirstParagraph"/>
       </w:pPr>
       <w:r>
-        <w:t>Los niños constituyen el grupo etario con mayor consumo de azúcar, ya que aproximadamente el 16 % de su ingesta calórica total proviene de azúcares añadidos, de los cuales casi el 40 % corresponde a bebidas azucaradas</w:t>
+        <w:t xml:space="preserve">Los niños constituyen el grupo etario con mayor consumo de azúcar, ya que aproximadamente el 16 % de su ingesta calórica total proviene de azúcares añadidos, de los cuales </w:t>
       </w:r>
       <w:r>
         <w:rPr>
           <w:highlight w:val="cyan"/>
         </w:rPr>
+        <w:t>alrededor del</w:t>
+      </w:r>
+      <w:r>
+        <w:t xml:space="preserve"> 40 % corresponde a bebidas azucaradas</w:t>
+      </w:r>
+      <w:r>
+        <w:rPr>
+          <w:highlight w:val="cyan"/>
+        </w:rPr>
         <w:t xml:space="preserve"> [1]</w:t>
       </w:r>
       <w:r>
-        <w:t>. Estudios realizados tanto en humanos como en modelos de roedores han demostrado que el consumo excesivo de azúcar durante las etapas tempranas de la vida afecta negativamente el metabolismo de la glucosa</w:t>
+        <w:t xml:space="preserve">. Estudios realizados tanto en humanos como en modelos de roedores han demostrado que el consumo excesivo de azúcar durante las etapas tempranas de la vida afecta negativamente </w:t>
       </w:r>
       <w:r>
         <w:rPr>
           <w:highlight w:val="cyan"/>
         </w:rPr>
-        <w:t xml:space="preserve"> [2, 3]</w:t>
+        <w:t>la salud metabólica [2, 3]</w:t>
       </w:r>
       <w:r>
         <w:t>, el procesamiento sensorial y de la recompensa</w:t>
@@ -7373,7 +7382,7 @@
         <w:pStyle w:val="Ttulo2"/>
       </w:pPr>
       <w:bookmarkStart w:id="6" w:name="planteamiento-del-problema"/>
-      <w:bookmarkStart w:id="7" w:name="_Toc243733492"/>
+      <w:bookmarkStart w:id="7" w:name="_Toc243735222"/>
       <w:r>
         <w:t>1.1 Planteamiento del problema</w:t>
       </w:r>
@@ -7384,19 +7393,31 @@
         <w:pStyle w:val="FirstParagraph"/>
       </w:pPr>
       <w:r>
-        <w:t>El consumo de azúcar en Argentina constituye un problema de salud pública de primera magnitud: el argentino promedio ingiere el equivalente a 35 cucharaditas de azúcar por día [21], los niños y adolescentes consumen en promedio 127 litros de bebidas azucaradas por año [22], y estas bebidas son responsables de más de 4.400 muertes anuales en el país, ubicándolo en el tercer lugar mundial en nuevos casos de diabetes tipo 2 atribuibles a su consumo [23]. Frente a este panorama, el mercado de stevia crece soste</w:t>
-      </w:r>
-      <w:r>
-        <w:t>nidamente (USD 840 millones en 2024) [24]</w:t>
+        <w:t xml:space="preserve">El consumo de azúcar en Argentina constituye un problema de salud pública de primera magnitud: el argentino promedio ingiere el equivalente a 35 cucharaditas de azúcar por día [21], los niños y adolescentes consumen en promedio 127 litros de bebidas azucaradas por año [22], y estas bebidas son responsables de más de 4.400 muertes anuales en el país </w:t>
       </w:r>
       <w:r>
         <w:rPr>
           <w:highlight w:val="cyan"/>
         </w:rPr>
-        <w:t>, también en el país</w:t>
-      </w:r>
-      <w:r>
-        <w:t xml:space="preserve"> [25, 26].</w:t>
+        <w:t>[23]</w:t>
+      </w:r>
+      <w:r>
+        <w:rPr>
+          <w:highlight w:val="cyan"/>
+        </w:rPr>
+        <w:t>, que es, además, el tercero entre los 30 países más poblados del mundo con mayor aumento de casos nuevos de diabetes tipo 2 atribuibles a su consumo entre 1990 y 2020</w:t>
+      </w:r>
+      <w:r>
+        <w:t xml:space="preserve"> [24]. Frente a este panorama, el mercado de stevia crece sostenidamente (</w:t>
+      </w:r>
+      <w:r>
+        <w:rPr>
+          <w:highlight w:val="cyan"/>
+        </w:rPr>
+        <w:t>USD 930 millones en 2025</w:t>
+      </w:r>
+      <w:r>
+        <w:t>) [25], y Argentina es uno de sus principales mercados en América Latina [26, 27].</w:t>
       </w:r>
     </w:p>
     <w:p>
@@ -7404,7 +7425,7 @@
         <w:pStyle w:val="Textoindependiente"/>
       </w:pPr>
       <w:r>
-        <w:t xml:space="preserve">Sin embargo, la percepción pública de que la stevia es una alternativa inocua al azúcar no está suficientemente respaldada por evidencia científica en etapas críticas del desarrollo. Trabajos del IByME-CONICET demostraron que la exposición temprana a stevia en ratas hembras induce alteraciones persistentes en la fertilidad, la descendencia y el comportamiento [27]. No obstante, </w:t>
+        <w:t xml:space="preserve">Sin embargo, la percepción pública de que la stevia es una alternativa inocua al azúcar no está suficientemente respaldada por evidencia científica en etapas críticas del desarrollo. Trabajos del IByME-CONICET demostraron que la exposición temprana a stevia en ratas hembras induce alteraciones persistentes en la fertilidad, la descendencia y el comportamiento [28]. No obstante, </w:t>
       </w:r>
       <w:r>
         <w:rPr>
@@ -7427,7 +7448,7 @@
         <w:rPr>
           <w:highlight w:val="cyan"/>
         </w:rPr>
-        <w:t>Para abordarla, se expusieron ratas macho Sprague-Dawley a los endulzantes en una etapa juvenil, entre los días postnatales (PD) 25 y 50, que correspondería a la transición infanto-adolescente en la rata [28], o en la adultez, entre PD75 y PD100, y se evaluaron las conductas de tipo ansioso, la memoria y la expresión del antígeno nuclear de proliferación celular (PCNA) y de doblecortina (DCX) en el giro dentado (GD).</w:t>
+        <w:t>Para abordarla, se expusieron ratas macho Sprague-Dawley a los endulzantes en una etapa juvenil, entre los días postnatales (PD) 25 y 50, que correspondería a la transición infanto-adolescente en la rata [29], o en la adultez, entre PD75 y PD100, y se evaluaron las conductas de tipo ansioso, la memoria y la expresión del antígeno nuclear de proliferación celular (PCNA) y de doblecortina (DCX) en el giro dentado (GD).</w:t>
       </w:r>
     </w:p>
     <w:p>
@@ -7435,7 +7456,7 @@
         <w:pStyle w:val="Ttulo2"/>
       </w:pPr>
       <w:bookmarkStart w:id="8" w:name="justificación"/>
-      <w:bookmarkStart w:id="9" w:name="_Toc243733493"/>
+      <w:bookmarkStart w:id="9" w:name="_Toc243735223"/>
       <w:bookmarkEnd w:id="6"/>
       <w:r>
         <w:lastRenderedPageBreak/>
@@ -7476,7 +7497,7 @@
         <w:pStyle w:val="Ttulo2"/>
       </w:pPr>
       <w:bookmarkStart w:id="10" w:name="objetivos"/>
-      <w:bookmarkStart w:id="11" w:name="_Toc243733494"/>
+      <w:bookmarkStart w:id="11" w:name="_Toc243735224"/>
       <w:bookmarkEnd w:id="8"/>
       <w:r>
         <w:t>1.3 Objetivos</w:t>
@@ -7488,7 +7509,7 @@
         <w:pStyle w:val="Ttulo3"/>
       </w:pPr>
       <w:bookmarkStart w:id="12" w:name="objetivo-general"/>
-      <w:bookmarkStart w:id="13" w:name="_Toc243733495"/>
+      <w:bookmarkStart w:id="13" w:name="_Toc243735225"/>
       <w:r>
         <w:t>1.3.1 Objetivo general</w:t>
       </w:r>
@@ -7520,7 +7541,7 @@
         <w:pStyle w:val="Ttulo3"/>
       </w:pPr>
       <w:bookmarkStart w:id="14" w:name="objetivos-de-mínima"/>
-      <w:bookmarkStart w:id="15" w:name="_Toc243733496"/>
+      <w:bookmarkStart w:id="15" w:name="_Toc243735226"/>
       <w:bookmarkEnd w:id="12"/>
       <w:r>
         <w:t>1.3.2 Objetivos de mínima</w:t>
@@ -7613,7 +7634,7 @@
         <w:rPr>
           <w:highlight w:val="cyan"/>
         </w:rPr>
-        <w:t>, mediante la expresión de PCNA (progenitores) y DCX (neuronas inmaduras)</w:t>
+        <w:t>. Para ello se medirá la expresión de los progenitores neuronales (PCNA) y de las neuronas inmaduras (DCX) mediante inmunocitoquímica seguida de microscopía confocal</w:t>
       </w:r>
       <w:r>
         <w:t>.</w:t>
@@ -7624,7 +7645,7 @@
         <w:pStyle w:val="Ttulo3"/>
       </w:pPr>
       <w:bookmarkStart w:id="16" w:name="objetivos-de-máxima"/>
-      <w:bookmarkStart w:id="17" w:name="_Toc243733497"/>
+      <w:bookmarkStart w:id="17" w:name="_Toc243735227"/>
       <w:bookmarkEnd w:id="14"/>
       <w:r>
         <w:t>1.3.3 Objetivos de máxima</w:t>
@@ -7670,7 +7691,7 @@
         <w:pStyle w:val="Ttulo2"/>
       </w:pPr>
       <w:bookmarkStart w:id="18" w:name="hipótesis"/>
-      <w:bookmarkStart w:id="19" w:name="_Toc243733498"/>
+      <w:bookmarkStart w:id="19" w:name="_Toc243735228"/>
       <w:bookmarkEnd w:id="10"/>
       <w:bookmarkEnd w:id="16"/>
       <w:r>
@@ -7697,10 +7718,16 @@
         <w:t xml:space="preserve"> </w:t>
       </w:r>
       <w:r>
-        <w:t>Bertoni durante etapas tempranas del desarrollo no reproducirá los efectos adversos sobre el comportamiento y la neurogénesis hipocampal documentados para la sacarosa [29, 30]. Por el contrario, en virtud de las propiedades hipoglucemiantes, antiinflamatorias y neuroprotectoras de los glucósidos de esteviol, se espera que la stevia actúe como un compuesto inocuo o eventualmente beneficioso sobre los parámetros conductuales y los marcadores de neurogénesis evaluados [27, 31, 32]. En consecuencia, los animale</w:t>
-      </w:r>
-      <w:r>
-        <w:t>s expuestos a stevia —tanto juveniles como adultos— mostrarán un perfil conductual y neurobiológico comparable al de los controles, o incluso más favorable, en contraste con los déficits esperables en los grupos expuestos a sacarosa. El efecto diferencial según la ventana etaria permitirá determinar si las alteraciones halladas dependen de la edad de exposición, como ocurre con el consumo de sacarosa.</w:t>
+        <w:t xml:space="preserve">Bertoni durante etapas tempranas del desarrollo no reproducirá los efectos adversos sobre el comportamiento y la neurogénesis hipocampal documentados para la sacarosa [30, 31]. Por el contrario, en virtud de las propiedades hipoglucemiantes, antiinflamatorias y neuroprotectoras de los glucósidos de esteviol, se espera que la stevia actúe como un compuesto inocuo o eventualmente beneficioso sobre los parámetros conductuales y los marcadores de neurogénesis evaluados </w:t>
+      </w:r>
+      <w:r>
+        <w:rPr>
+          <w:highlight w:val="cyan"/>
+        </w:rPr>
+        <w:t>[32–34]</w:t>
+      </w:r>
+      <w:r>
+        <w:t>. En consecuencia, los animales expuestos a stevia —tanto juveniles como adultos— mostrarán un perfil conductual y neurobiológico comparable al de los controles, o incluso más favorable, en contraste con los déficits esperables en los grupos expuestos a sacarosa. El efecto diferencial según la ventana etaria permitirá determinar si las alteraciones halladas dependen de la edad de exposición, como ocurre con el consumo de sacarosa.</w:t>
       </w:r>
     </w:p>
     <w:p>
@@ -7708,7 +7735,7 @@
         <w:pStyle w:val="Ttulo1"/>
       </w:pPr>
       <w:bookmarkStart w:id="20" w:name="estado-del-arte"/>
-      <w:bookmarkStart w:id="21" w:name="_Toc243733499"/>
+      <w:bookmarkStart w:id="21" w:name="_Toc243735229"/>
       <w:bookmarkEnd w:id="4"/>
       <w:bookmarkEnd w:id="18"/>
       <w:r>
@@ -7722,7 +7749,7 @@
         <w:pStyle w:val="Ttulo2"/>
       </w:pPr>
       <w:bookmarkStart w:id="22" w:name="Xa20a39c5a34d7f13c187e945fb882fbff1c74ac"/>
-      <w:bookmarkStart w:id="23" w:name="_Toc243733500"/>
+      <w:bookmarkStart w:id="23" w:name="_Toc243735230"/>
       <w:r>
         <w:t xml:space="preserve">2.1 Edulcorantes no calóricos y </w:t>
       </w:r>
@@ -7743,10 +7770,10 @@
         <w:rPr>
           <w:highlight w:val="cyan"/>
         </w:rPr>
-        <w:t>Los edulcorantes no calóricos no son metabólicamente inertes: modifican la respuesta de las regiones cerebrales vinculadas a la recompensa y al procesamiento del sabor dulce</w:t>
-      </w:r>
-      <w:r>
-        <w:t xml:space="preserve"> [33]</w:t>
+        <w:t>Los edulcorantes no calóricos no son neutros para el sistema nervioso: modifican la respuesta de las regiones cerebrales vinculadas a la recompensa y al procesamiento del sabor dulce</w:t>
+      </w:r>
+      <w:r>
+        <w:t xml:space="preserve"> [35]</w:t>
       </w:r>
       <w:r>
         <w:rPr>
@@ -7755,7 +7782,7 @@
         <w:t>. En ratas, el consumo diario de edulcorantes bajos en calorías (acesulfamo de potasio, sacarina o stevia) desde la etapa juvenil altera la conducta motivada por el azúcar y la memoria dependiente del hipocampo; sin embargo, la memoria se evaluó mientras los animales todavía consumían los edulcorantes, y el deterioro se observó al analizar los tres edulcorantes en conjunto, no la stevia por separado</w:t>
       </w:r>
       <w:r>
-        <w:t xml:space="preserve"> [34]. La stevia, en particular, ocupa una posición ambigua. Por un lado, se le atribuyen propiedades neuroprotectoras: reduce la peroxidación lipídica cerebral en ratas alimentadas con una dieta alta en grasas y sacarosa [31], sus glucósidos presentan actividad antioxidante e insulino-mimética [32], el esteviósido </w:t>
+        <w:t xml:space="preserve"> [36]. La stevia, en particular, ocupa una posición ambigua. Por un lado, se le atribuyen propiedades neuroprotectoras: reduce la peroxidación lipídica cerebral en ratas alimentadas con una dieta alta en grasas y sacarosa [33], sus glucósidos presentan actividad antioxidante e insulino-mimética [34], el esteviósido </w:t>
       </w:r>
       <w:r>
         <w:rPr>
@@ -7764,7 +7791,7 @@
         <w:t>tiene</w:t>
       </w:r>
       <w:r>
-        <w:t xml:space="preserve"> un efecto antiamnésico en ratas tratadas con escopolamina [35], y la stevia </w:t>
+        <w:t xml:space="preserve"> un efecto antiamnésico en ratas tratadas con escopolamina [37], y la stevia </w:t>
       </w:r>
       <w:r>
         <w:rPr>
@@ -7773,7 +7800,7 @@
         <w:t>modula</w:t>
       </w:r>
       <w:r>
-        <w:t xml:space="preserve"> la plasticidad sináptica en un modelo de desorden metabólico [36] y </w:t>
+        <w:t xml:space="preserve"> la plasticidad sináptica en un modelo de desorden metabólico [38] y </w:t>
       </w:r>
       <w:r>
         <w:rPr>
@@ -7782,7 +7809,7 @@
         <w:t>revierte</w:t>
       </w:r>
       <w:r>
-        <w:t xml:space="preserve"> la ansiedad y el deterioro de la memoria en ratas diabéticas [37]. Por otro lado, su consumo </w:t>
+        <w:t xml:space="preserve"> la ansiedad y el deterioro de la memoria en ratas diabéticas [39]. Por otro lado, su consumo </w:t>
       </w:r>
       <w:r>
         <w:rPr>
@@ -7791,7 +7818,7 @@
         <w:t>activa</w:t>
       </w:r>
       <w:r>
-        <w:t xml:space="preserve"> el sistema de recompensa [38], y </w:t>
+        <w:t xml:space="preserve"> el sistema de recompensa [40], y </w:t>
       </w:r>
       <w:r>
         <w:rPr>
@@ -7818,7 +7845,7 @@
         <w:t>reduce</w:t>
       </w:r>
       <w:r>
-        <w:t xml:space="preserve"> su ansiedad [27]. En ratas macho, el consumo temprano del mismo extracto no </w:t>
+        <w:t xml:space="preserve"> su ansiedad [28]. En ratas macho, el consumo temprano del mismo extracto no </w:t>
       </w:r>
       <w:r>
         <w:rPr>
@@ -7836,7 +7863,7 @@
         <w:t>evalúa mientras dura el consumo</w:t>
       </w:r>
       <w:r>
-        <w:t xml:space="preserve"> [39, 40]; no se dispone, sin embargo, de estudios que evalúen sus efectos a largo plazo, tras el retiro del edulcorante, con una batería conductual e histológica en las ventanas etarias juvenil y adulta, vacío que este proyecto aborda.</w:t>
+        <w:t xml:space="preserve"> [41, 42]; no se dispone, sin embargo, de estudios que evalúen sus efectos a largo plazo, tras el retiro del edulcorante, con una batería conductual e histológica en las ventanas etarias juvenil y adulta, vacío que este proyecto aborda.</w:t>
       </w:r>
     </w:p>
     <w:p>
@@ -7844,7 +7871,7 @@
         <w:pStyle w:val="Ttulo2"/>
       </w:pPr>
       <w:bookmarkStart w:id="24" w:name="Xd8a1cfb0b63fd1c82328d12ec348aa53d6afb02"/>
-      <w:bookmarkStart w:id="25" w:name="_Toc243733501"/>
+      <w:bookmarkStart w:id="25" w:name="_Toc243735231"/>
       <w:bookmarkEnd w:id="22"/>
       <w:r>
         <w:t>2.2 Consumo temprano de azúcar, memoria y neurogénesis hipocampal</w:t>
@@ -7874,7 +7901,7 @@
         <w:t>aumenta</w:t>
       </w:r>
       <w:r>
-        <w:t xml:space="preserve"> la conducta tipo ansiosa [41] y altera la memoria de reconocimiento de objetos en la adultez, sin efectos cuando la exposición </w:t>
+        <w:t xml:space="preserve"> la conducta tipo ansiosa [43] y altera la memoria de reconocimiento de objetos en la adultez, sin efectos cuando la exposición </w:t>
       </w:r>
       <w:r>
         <w:rPr>
@@ -7883,7 +7910,7 @@
         <w:t>ocurre</w:t>
       </w:r>
       <w:r>
-        <w:t xml:space="preserve"> en animales adultos [30]. Otros trabajos </w:t>
+        <w:t xml:space="preserve"> en animales adultos [31]. Otros trabajos </w:t>
       </w:r>
       <w:r>
         <w:rPr>
@@ -7892,7 +7919,7 @@
         <w:t>describen</w:t>
       </w:r>
       <w:r>
-        <w:t xml:space="preserve"> deterioros de la memoria dependiente del hipocampo tras el consumo de azúcar [9, 42], que </w:t>
+        <w:t xml:space="preserve"> deterioros de la memoria dependiente del hipocampo tras el consumo de azúcar [9, 44], que </w:t>
       </w:r>
       <w:r>
         <w:rPr>
@@ -7910,7 +7937,7 @@
         <w:t>restringe</w:t>
       </w:r>
       <w:r>
-        <w:t xml:space="preserve"> a la adolescencia [10, 43], y el acceso diario a sacarosa </w:t>
+        <w:t xml:space="preserve"> a la adolescencia [10, 45], y el acceso diario a sacarosa </w:t>
       </w:r>
       <w:r>
         <w:rPr>
@@ -7946,7 +7973,7 @@
         <w:t>GD</w:t>
       </w:r>
       <w:r>
-        <w:t xml:space="preserve"> [29]. Entre los mecanismos propuestos se cuentan la alteración de la microbiota intestinal [6] y la menor expresión de genes hipocampales vinculados a la neurogénesis [44]. Los resultados dependen, no obstante, de la ventana de exposición: el consumo de sacarosa iniciado en la adolescencia tardía no </w:t>
+        <w:t xml:space="preserve"> [30]. Entre los mecanismos propuestos se cuentan la alteración de la microbiota intestinal [6] y la menor expresión de genes hipocampales vinculados a la neurogénesis [46]. Los resultados dependen, no obstante, de la ventana de exposición: el consumo de sacarosa iniciado en la adolescencia tardía no </w:t>
       </w:r>
       <w:r>
         <w:rPr>
@@ -7964,7 +7991,7 @@
         <w:t>aumenta</w:t>
       </w:r>
       <w:r>
-        <w:t xml:space="preserve"> la proliferación en la zona subgranular [45], lo que respalda la elección de dos ventanas etarias contrastantes (PD25 y PD75).</w:t>
+        <w:t xml:space="preserve"> la proliferación en la zona subgranular [47], lo que respalda la elección de dos ventanas etarias contrastantes (PD25 y PD75).</w:t>
       </w:r>
     </w:p>
     <w:p>
@@ -7972,7 +7999,7 @@
         <w:pStyle w:val="Ttulo2"/>
       </w:pPr>
       <w:bookmarkStart w:id="26" w:name="Xc2e42f633b60919927433ba3c6a5c8818707546"/>
-      <w:bookmarkStart w:id="27" w:name="_Toc243733502"/>
+      <w:bookmarkStart w:id="27" w:name="_Toc243735232"/>
       <w:bookmarkEnd w:id="24"/>
       <w:r>
         <w:t xml:space="preserve">2.3 </w:t>
@@ -7990,11 +8017,17 @@
         <w:pStyle w:val="FirstParagraph"/>
       </w:pPr>
       <w:r>
-        <w:t xml:space="preserve">El análisis conductual tradicional se apoya en medidas univariadas que, examinadas de forma aislada, omiten la estructura conjunta del comportamiento [46]. El aprendizaje automático se ha aplicado a las métricas que los sistemas de seguimiento registran en cada animal: modelos de Random Forest discriminan fenotipos asociados a disfunción dopaminérgica o serotoninérgica e </w:t>
+        <w:rPr>
+          <w:highlight w:val="cyan"/>
+        </w:rPr>
+        <w:t>El análisis conductual tradicional se apoya en gran medida en la puntuación manual de medidas aisladas, con problemas de reproducibilidad</w:t>
+      </w:r>
+      <w:r>
+        <w:t xml:space="preserve"> [48]. El aprendizaje automático se ha aplicado a las métricas que los sistemas de seguimiento registran en cada animal: modelos de Random Forest discriminan fenotipos asociados a disfunción dopaminérgica o serotoninérgica e identifican las </w:t>
       </w:r>
       <w:r>
         <w:lastRenderedPageBreak/>
-        <w:t xml:space="preserve">identifican las variables de mayor peso [47], y otros clasificadores </w:t>
+        <w:t xml:space="preserve">variables de mayor peso [49], y otros clasificadores </w:t>
       </w:r>
       <w:r>
         <w:rPr>
@@ -8003,16 +8036,16 @@
         <w:t>diferencian</w:t>
       </w:r>
       <w:r>
-        <w:t xml:space="preserve"> cepas de ratas a partir de sus perfiles conductuales [46]. En ambos casos, los grupos </w:t>
+        <w:t xml:space="preserve"> cepas de ratas a partir de sus perfiles conductuales [48]. En ambos casos, los grupos </w:t>
       </w:r>
       <w:r>
         <w:rPr>
           <w:highlight w:val="cyan"/>
         </w:rPr>
-        <w:t>difieren</w:t>
-      </w:r>
-      <w:r>
-        <w:t xml:space="preserve"> por manipulaciones farmacológicas o genéticas de gran efecto; su aplicación a intervenciones nutricionales, de efectos más sutiles, permanece escasamente explorada.</w:t>
+        <w:t>difieren genéticamente (líneas knockout o cepas distintas), con efectos de gran magnitud</w:t>
+      </w:r>
+      <w:r>
+        <w:t>; su aplicación a intervenciones nutricionales, de efectos más sutiles, permanece escasamente explorada.</w:t>
       </w:r>
     </w:p>
     <w:p>
@@ -8020,7 +8053,7 @@
         <w:pStyle w:val="Ttulo1"/>
       </w:pPr>
       <w:bookmarkStart w:id="28" w:name="marco-teórico"/>
-      <w:bookmarkStart w:id="29" w:name="_Toc243733503"/>
+      <w:bookmarkStart w:id="29" w:name="_Toc243735233"/>
       <w:bookmarkEnd w:id="20"/>
       <w:bookmarkEnd w:id="26"/>
       <w:r>
@@ -8034,7 +8067,7 @@
         <w:pStyle w:val="Ttulo2"/>
       </w:pPr>
       <w:bookmarkStart w:id="30" w:name="ventanas-críticas-del-neurodesarrollo"/>
-      <w:bookmarkStart w:id="31" w:name="_Toc243733504"/>
+      <w:bookmarkStart w:id="31" w:name="_Toc243735234"/>
       <w:r>
         <w:t>3.1 Ventanas críticas del neurodesarrollo</w:t>
       </w:r>
@@ -8051,7 +8084,7 @@
         <w:rPr>
           <w:highlight w:val="cyan"/>
         </w:rPr>
-        <w:t xml:space="preserve"> [48–50]</w:t>
+        <w:t xml:space="preserve"> [50–53]</w:t>
       </w:r>
       <w:r>
         <w:t>. Esta etapa del desarrollo se caracteriza por una intensa maduración y reorganización del sistema nervioso central, acompañada de una elevada plasticidad neuronal y de la adquisición de nuevos conocimientos y habilidades</w:t>
@@ -8060,7 +8093,7 @@
         <w:rPr>
           <w:highlight w:val="cyan"/>
         </w:rPr>
-        <w:t xml:space="preserve"> [51]</w:t>
+        <w:t xml:space="preserve"> [29, 54]</w:t>
       </w:r>
       <w:r>
         <w:t>. Durante este período tienen lugar procesos fundamentales, como la maduración de los circuitos neuronales, el refinamiento de las conexiones sinápticas y el desarrollo progresivo de las funciones cognitivas y emocionales. En consecuencia, la exposición a determinados factores ambientales y nutricionales durante estas ventanas de especial vulnerabilidad podría interferir con dichos procesos y producir alteraciones neurobiológicas y conductuales que persistan hasta la edad adulta.</w:t>
@@ -8096,7 +8129,7 @@
         <w:pStyle w:val="Ttulo2"/>
       </w:pPr>
       <w:bookmarkStart w:id="32" w:name="fundamento-del-esquema-de-exposición"/>
-      <w:bookmarkStart w:id="33" w:name="_Toc243733505"/>
+      <w:bookmarkStart w:id="33" w:name="_Toc243735235"/>
       <w:bookmarkEnd w:id="30"/>
       <w:r>
         <w:t>3.2 Fundamento del esquema de exposición</w:t>
@@ -8108,7 +8141,7 @@
         <w:pStyle w:val="FirstParagraph"/>
       </w:pPr>
       <w:r>
-        <w:t xml:space="preserve">La inclusión de tres grupos experimentales responde a una estrategia de comparación que permite contextualizar los efectos de los distintos tratamientos. En particular, la administración de sacarosa al 10 % p/v se utiliza como modelo experimental del consumo de bebidas azucaradas, cuyos efectos adversos sobre la memoria, las conductas de tipo ansioso y la neurogénesis han sido documentados previamente [29, 30, 41]. La sacarosa es </w:t>
+        <w:t xml:space="preserve">La inclusión de tres grupos experimentales responde a una estrategia de comparación que permite contextualizar los efectos de los distintos tratamientos. En particular, la administración de sacarosa al 10 % p/v se utiliza como modelo experimental del consumo de bebidas azucaradas, cuyos efectos adversos sobre la memoria, las conductas de tipo ansioso y la neurogénesis han sido documentados previamente [30, 31, 43]. La sacarosa es </w:t>
       </w:r>
       <w:r>
         <w:rPr>
@@ -8132,7 +8165,7 @@
         <w:rPr>
           <w:highlight w:val="cyan"/>
         </w:rPr>
-        <w:t xml:space="preserve"> [2, 9, 52]</w:t>
+        <w:t xml:space="preserve"> [2, 9, 55]</w:t>
       </w:r>
       <w:r>
         <w:t xml:space="preserve">. El grupo control corresponde a los animales que consumen solamente agua durante todo el </w:t>
@@ -8150,7 +8183,7 @@
         <w:rPr>
           <w:highlight w:val="cyan"/>
         </w:rPr>
-        <w:t>prácticamente sin aportar calorías [53]</w:t>
+        <w:t>prácticamente sin aportar calorías [32]</w:t>
       </w:r>
       <w:r>
         <w:t xml:space="preserve">. A </w:t>
@@ -8163,7 +8196,7 @@
         <w:rPr>
           <w:highlight w:val="cyan"/>
         </w:rPr>
-        <w:t xml:space="preserve"> [52–54]</w:t>
+        <w:t xml:space="preserve"> [32, 34, 55, 56]</w:t>
       </w:r>
       <w:r>
         <w:t>. Ambas soluciones se ofrecen junto a una botella de agua, de modo que el índice de preferencia indica cuánto se eligió la solución dulce frente al agua.</w:t>
@@ -8174,7 +8207,7 @@
         <w:pStyle w:val="Ttulo2"/>
       </w:pPr>
       <w:bookmarkStart w:id="34" w:name="X1a121639cb8a479e8dfaf108e2fc37fa6541e2c"/>
-      <w:bookmarkStart w:id="35" w:name="_Toc243733506"/>
+      <w:bookmarkStart w:id="35" w:name="_Toc243735236"/>
       <w:bookmarkEnd w:id="32"/>
       <w:r>
         <w:t xml:space="preserve">3.3 </w:t>
@@ -8234,7 +8267,7 @@
         <w:t>+</w:t>
       </w:r>
       <w:r>
-        <w:t>; Figura 3.1) [55].</w:t>
+        <w:t>; Figura 3.1) [57].</w:t>
       </w:r>
     </w:p>
     <w:p>
@@ -8248,10 +8281,10 @@
           <w:noProof/>
         </w:rPr>
         <w:drawing>
-          <wp:inline distT="0" distB="0" distL="0" distR="0" wp14:anchorId="1E07DE38" wp14:editId="2EE4BE6C">
+          <wp:inline distT="0" distB="0" distL="0" distR="0" wp14:anchorId="3DDC1013" wp14:editId="3E6179AD">
             <wp:extent cx="4031999" cy="1727999"/>
             <wp:effectExtent l="0" t="0" r="0" b="0"/>
-            <wp:docPr id="565015993" name="Picture" descr="image"/>
+            <wp:docPr id="836584399" name="Picture" descr="image"/>
             <wp:cNvGraphicFramePr/>
             <a:graphic xmlns:a="http://schemas.openxmlformats.org/drawingml/2006/main">
               <a:graphicData uri="http://schemas.openxmlformats.org/drawingml/2006/picture">
@@ -8352,7 +8385,7 @@
         <w:rPr>
           <w:sz w:val="19"/>
         </w:rPr>
-        <w:t>(neuronas granulares maduras). Elaboración propia, generada con asistencia de inteligencia artificial, a partir de Kempermann et al. [55].</w:t>
+        <w:t>(neuronas granulares maduras). Elaboración propia, generada con asistencia de inteligencia artificial, a partir de Kempermann et al. [57].</w:t>
       </w:r>
       <w:r>
         <w:fldChar w:fldCharType="begin"/>
@@ -8360,7 +8393,7 @@
       <w:r>
         <w:instrText xml:space="preserve"> TC "</w:instrText>
       </w:r>
-      <w:bookmarkStart w:id="36" w:name="_Toc243733543"/>
+      <w:bookmarkStart w:id="36" w:name="_Toc243735273"/>
       <w:r>
         <w:instrText>3.1. Esquema de la cascada neurogénica del GD</w:instrText>
       </w:r>
@@ -8383,7 +8416,7 @@
         <w:rPr>
           <w:highlight w:val="cyan"/>
         </w:rPr>
-        <w:t xml:space="preserve"> [56, 57]</w:t>
+        <w:t xml:space="preserve"> [58, 59]</w:t>
       </w:r>
       <w:r>
         <w:t>, que se expresa durante todas las fases activas del ciclo celular y durante un breve período después de que las células adquieren un estado postmitótico</w:t>
@@ -8392,7 +8425,7 @@
         <w:rPr>
           <w:highlight w:val="cyan"/>
         </w:rPr>
-        <w:t xml:space="preserve"> [57]</w:t>
+        <w:t xml:space="preserve"> [30]</w:t>
       </w:r>
       <w:r>
         <w:t>. Por su parte, DCX es una proteína asociada a los microtúbulos que se expresa en células precursoras neuronales en migración</w:t>
@@ -8401,7 +8434,7 @@
         <w:rPr>
           <w:highlight w:val="cyan"/>
         </w:rPr>
-        <w:t xml:space="preserve"> [58, 59]</w:t>
+        <w:t xml:space="preserve"> [60, 61]</w:t>
       </w:r>
       <w:r>
         <w:t xml:space="preserve"> y se utiliza como marcador de neuronas generadas durante la neurogénesis adulta en el </w:t>
@@ -8410,7 +8443,7 @@
         <w:rPr>
           <w:highlight w:val="cyan"/>
         </w:rPr>
-        <w:t>GD [60, 61]</w:t>
+        <w:t>GD [62, 63]</w:t>
       </w:r>
       <w:r>
         <w:t>.</w:t>
@@ -8431,7 +8464,16 @@
         <w:t>pattern separation</w:t>
       </w:r>
       <w:r>
-        <w:t>), un proceso que permite distinguir y codificar patrones similares de actividad neuronal como representaciones diferentes durante la codificación y el almacenamiento de la información [29, 62]. En este sentido, la neurogénesis adulta proporcionaría una funcionalidad adicional al hipocampo, especialmente cuando aumenta la demanda cognitiva [62].</w:t>
+        <w:t xml:space="preserve">), un proceso que permite distinguir y codificar patrones similares de actividad neuronal como representaciones diferentes durante la codificación y el almacenamiento de la información [30, 64]. En este sentido, la neurogénesis adulta proporcionaría una funcionalidad adicional al hipocampo, especialmente cuando aumenta la demanda cognitiva </w:t>
+      </w:r>
+      <w:r>
+        <w:rPr>
+          <w:highlight w:val="cyan"/>
+        </w:rPr>
+        <w:t>[30, 64]</w:t>
+      </w:r>
+      <w:r>
+        <w:t>.</w:t>
       </w:r>
     </w:p>
     <w:p>
@@ -8439,7 +8481,7 @@
         <w:pStyle w:val="Ttulo2"/>
       </w:pPr>
       <w:bookmarkStart w:id="37" w:name="fundamento-del-abordaje-multivariado"/>
-      <w:bookmarkStart w:id="38" w:name="_Toc243733507"/>
+      <w:bookmarkStart w:id="38" w:name="_Toc243735237"/>
       <w:bookmarkEnd w:id="34"/>
       <w:r>
         <w:t>3.4 Fundamento del abordaje multivariado</w:t>
@@ -8571,7 +8613,7 @@
         <w:pStyle w:val="Textoindependiente"/>
       </w:pPr>
       <w:r>
-        <w:t>El análisis de componentes principales (PCA) resume las variables estandarizadas en combinaciones no correlacionadas mediante la descomposición espectral de su matriz de correlación [63],</w:t>
+        <w:t>El análisis de componentes principales (PCA) resume las variables estandarizadas en combinaciones no correlacionadas mediante la descomposición espectral de su matriz de correlación [65],</w:t>
       </w:r>
     </w:p>
     <w:p>
@@ -8671,7 +8713,7 @@
         <w:t xml:space="preserve"> </w:t>
       </w:r>
       <w:r>
-        <w:t>cuantifican la varianza que explica cada una. Sobre las mismas variables estandarizadas, el clustering jerárquico con el criterio de Ward, que minimiza el aumento de la varianza dentro de los grupos al fusionarlos [64], evalúa si los animales se agrupan espontáneamente según su exposición (objetivo de máxima 1); el coeficiente de silueta indica el número de grupos naturales, y el índice de Rand ajustado (ARI), su coincidencia con los grupos experimentales (0: azar; 1: coincidencia perfecta).</w:t>
+        <w:t>cuantifican la varianza que explica cada una. Sobre las mismas variables estandarizadas, el clustering jerárquico con el criterio de Ward, que minimiza el aumento de la varianza dentro de los grupos al fusionarlos [66], evalúa si los animales se agrupan espontáneamente según su exposición (objetivo de máxima 1); el coeficiente de silueta indica el número de grupos naturales, y el índice de Rand ajustado (ARI), su coincidencia con los grupos experimentales (0: azar; 1: coincidencia perfecta).</w:t>
       </w:r>
     </w:p>
     <w:p>
@@ -8689,7 +8731,7 @@
         <w:t>bootstrap</w:t>
       </w:r>
       <w:r>
-        <w:t>, resulta adecuado por tolerar relaciones no lineales y variables correlacionadas [65]. Con los tamaños muestrales de la experimentación animal [66], su desempeño se estima mediante validación cruzada (el modelo se evalúa con animales que no usó para entrenarse) y se compara con el obtenido al mezclar las etiquetas al azar (prueba de permutación); la importancia de cada variable es la caída del desempeño al permutar sus valores. Como el clasificador aprovecha cualquier diferencia sistemática entre grupos, d</w:t>
+        <w:t>, resulta adecuado por tolerar relaciones no lineales y variables correlacionadas [67]. Con los tamaños muestrales de la experimentación animal [68], su desempeño se estima mediante validación cruzada (el modelo se evalúa con animales que no usó para entrenarse) y se compara con el obtenido al mezclar las etiquetas al azar (prueba de permutación); la importancia de cada variable es la caída del desempeño al permutar sus valores. Como el clasificador aprovecha cualquier diferencia sistemática entre grupos, d</w:t>
       </w:r>
       <w:r>
         <w:t>eben excluirse las variables que identifiquen la cohorte de origen y no el tratamiento.</w:t>
@@ -8700,7 +8742,7 @@
         <w:pStyle w:val="Ttulo1"/>
       </w:pPr>
       <w:bookmarkStart w:id="39" w:name="materiales-y-métodos"/>
-      <w:bookmarkStart w:id="40" w:name="_Toc243733508"/>
+      <w:bookmarkStart w:id="40" w:name="_Toc243735238"/>
       <w:bookmarkEnd w:id="28"/>
       <w:bookmarkEnd w:id="37"/>
       <w:r>
@@ -8714,7 +8756,7 @@
         <w:pStyle w:val="Ttulo2"/>
       </w:pPr>
       <w:bookmarkStart w:id="41" w:name="animales-de-experimentación"/>
-      <w:bookmarkStart w:id="42" w:name="_Toc243733509"/>
+      <w:bookmarkStart w:id="42" w:name="_Toc243735239"/>
       <w:r>
         <w:t>4.1 Animales de experimentación</w:t>
       </w:r>
@@ -8796,7 +8838,7 @@
         <w:t>ad libitum</w:t>
       </w:r>
       <w:r>
-        <w:t xml:space="preserve">. Las soluciones se renovaron día por medio. Finalizado este período de 25 días de exposición, se retiraron las botellas con la solución de sacarosa o de stevia y todos los animales bebieron únicamente agua durante otros 25 días (Figura 4.1) [30, 41]. Al finalizar el protocolo, los animales fueron evaluados en las pruebas conductuales: </w:t>
+        <w:t xml:space="preserve">. Las soluciones se renovaron día por medio. Finalizado este período de 25 días de exposición, se retiraron las botellas con la solución de sacarosa o de stevia y todos los animales bebieron únicamente agua durante otros 25 días (Figura 4.1) [31, 43]. Al finalizar el protocolo, los animales fueron evaluados en las pruebas conductuales: </w:t>
       </w:r>
       <w:r>
         <w:rPr>
@@ -8858,10 +8900,10 @@
           <w:noProof/>
         </w:rPr>
         <w:drawing>
-          <wp:inline distT="0" distB="0" distL="0" distR="0" wp14:anchorId="1869F1EE" wp14:editId="3372EFE2">
+          <wp:inline distT="0" distB="0" distL="0" distR="0" wp14:anchorId="3C85B458" wp14:editId="70646D48">
             <wp:extent cx="5011199" cy="2100801"/>
             <wp:effectExtent l="0" t="0" r="0" b="0"/>
-            <wp:docPr id="795915211" name="Picture" descr="image"/>
+            <wp:docPr id="755449175" name="Picture" descr="image"/>
             <wp:cNvGraphicFramePr/>
             <a:graphic xmlns:a="http://schemas.openxmlformats.org/drawingml/2006/main">
               <a:graphicData uri="http://schemas.openxmlformats.org/drawingml/2006/picture">
@@ -8937,7 +8979,7 @@
       <w:r>
         <w:instrText xml:space="preserve"> TC "</w:instrText>
       </w:r>
-      <w:bookmarkStart w:id="43" w:name="_Toc243733544"/>
+      <w:bookmarkStart w:id="43" w:name="_Toc243735274"/>
       <w:r>
         <w:instrText>4.1. Línea temporal de los procedimientos experimentales</w:instrText>
       </w:r>
@@ -8954,7 +8996,7 @@
         <w:pStyle w:val="Ttulo2"/>
       </w:pPr>
       <w:bookmarkStart w:id="44" w:name="Xb5f353fc62361e09f2f036733619f27ae1e46bd"/>
-      <w:bookmarkStart w:id="45" w:name="_Toc243733510"/>
+      <w:bookmarkStart w:id="45" w:name="_Toc243735240"/>
       <w:bookmarkEnd w:id="41"/>
       <w:r>
         <w:lastRenderedPageBreak/>
@@ -8980,10 +9022,10 @@
         <w:t xml:space="preserve"> Bertoni se obtuvieron de Caña Dulce </w:t>
       </w:r>
       <w:r>
-        <w:t>(San Ignacio, Misiones, Argentina), con certificación de Argencert, Argentina (R.P.A.A. N.º MI000348 y R.P.E.A. N.º MI000097). El extracto de stevia se preparó según un método descrito previamente [27], adaptado de Sharma et al. [67], elegido por su alto rendimiento de glucósidos de esteviol [68] y por su similitud con los procedimientos de preparación orientados a la salud. Se hirvieron 20 g de hojas de stevia en 1 L de agua durante 10 min, se dejó reposar 20 min, se filtró y se volvió a hervir durante 45–</w:t>
-      </w:r>
-      <w:r>
-        <w:t>50 min hasta reducir el volumen a 300 mL. El extracto se fraccionó en alícuotas de 40 mL, que se almacenaron a -20 °C; las alícuotas se descongelaron día por medio y se diluyeron a 1 L (4 % v/v). La solución de sacarosa al 10 % (p/v; Ledesma, Argentina) se preparó en agua. Estas concentraciones se eligieron sobre la base de estudios previos y del consumo voluntario de los animales [27, 30, 41, 69].</w:t>
+        <w:t>(San Ignacio, Misiones, Argentina), con certificación de Argencert, Argentina (R.P.A.A. N.º MI000348 y R.P.E.A. N.º MI000097). El extracto de stevia se preparó según un método descrito previamente [28], adaptado de Sharma et al. [69], elegido por su alto rendimiento de glucósidos de esteviol [70] y por su similitud con los procedimientos de preparación orientados a la salud. Se hirvieron 20 g de hojas de stevia en 1 L de agua durante 10 min, se dejó reposar 20 min, se filtró y se volvió a hervir durante 45–</w:t>
+      </w:r>
+      <w:r>
+        <w:t>50 min hasta reducir el volumen a 300 mL. El extracto se fraccionó en alícuotas de 40 mL, que se almacenaron a -20 °C; las alícuotas se descongelaron día por medio y se diluyeron a 1 L (4 % v/v). La solución de sacarosa al 10 % (p/v; Ledesma, Argentina) se preparó en agua. Estas concentraciones se eligieron sobre la base de estudios previos y del consumo voluntario de los animales [28, 31, 43, 71].</w:t>
       </w:r>
     </w:p>
     <w:p>
@@ -8991,7 +9033,7 @@
         <w:pStyle w:val="Textoindependiente"/>
       </w:pPr>
       <w:r>
-        <w:t>La caracterización química del extracto de stevia fue realizada por el Laboratorio Central de la Facultad de Ciencias Exactas, Químicas y Naturales (FCEQyN) de la Universidad Nacional de Misiones (Argentina), siguiendo protocolos establecidos [68, 70]. El contenido de glucósidos de esteviol se determinó por cromatografía líquida de alta eficacia (HPLC). Los compuestos fenólicos totales y los taninos se cuantificaron con un espectrofotocolorímetro y la actividad antioxidante se evaluó mediante el ensayo de c</w:t>
+        <w:t>La caracterización química del extracto de stevia fue realizada por el Laboratorio Central de la Facultad de Ciencias Exactas, Químicas y Naturales (FCEQyN) de la Universidad Nacional de Misiones (Argentina), siguiendo protocolos establecidos [70, 72]. El contenido de glucósidos de esteviol se determinó por cromatografía líquida de alta eficacia (HPLC). Los compuestos fenólicos totales y los taninos se cuantificaron con un espectrofotocolorímetro y la actividad antioxidante se evaluó mediante el ensayo de c</w:t>
       </w:r>
       <w:r>
         <w:t>aptación del radical 2,2-difenil-1-picrilhidrazilo (DPPH). La composición del extracto se resume en la Tabla 4.1.</w:t>
@@ -9049,7 +9091,7 @@
       <w:r>
         <w:instrText xml:space="preserve"> TC "</w:instrText>
       </w:r>
-      <w:bookmarkStart w:id="46" w:name="_Toc243733566"/>
+      <w:bookmarkStart w:id="46" w:name="_Toc243735296"/>
       <w:r>
         <w:instrText>4.1. Composición química del extracto de stevia</w:instrText>
       </w:r>
@@ -9489,7 +9531,7 @@
         <w:pStyle w:val="Ttulo2"/>
       </w:pPr>
       <w:bookmarkStart w:id="47" w:name="procedimientos-conductuales"/>
-      <w:bookmarkStart w:id="48" w:name="_Toc243733511"/>
+      <w:bookmarkStart w:id="48" w:name="_Toc243735241"/>
       <w:bookmarkEnd w:id="44"/>
       <w:r>
         <w:t>4.3 Procedimientos conductuales</w:t>
@@ -9509,7 +9551,7 @@
         <w:pStyle w:val="Ttulo3"/>
       </w:pPr>
       <w:bookmarkStart w:id="49" w:name="open-field-of"/>
-      <w:bookmarkStart w:id="50" w:name="_Toc243733512"/>
+      <w:bookmarkStart w:id="50" w:name="_Toc243735242"/>
       <w:r>
         <w:t xml:space="preserve">4.3.1 </w:t>
       </w:r>
@@ -9534,7 +9576,7 @@
       </w:r>
       <w:r>
         <w:lastRenderedPageBreak/>
-        <w:t>periférica (zonas 1 a 3; Figura 4.2). El piso de la arena está dividido en una cuadrícula de 5 × 5 cuadrados de 15 cm de lado: la zona 1 corresponde al cuadrado central (15 × 15 cm); la zona 2, al anillo de ocho cuadrados que lo rodea (límite externo de 45 × 45 cm); y la zona 3, a la franja de 15 cm de ancho adyacente a las paredes. Se registraron la distancia total recorrida, el número de zonas visitadas y las entradas, las distancias recorridas y el tiempo de permanencia en cada zona [41]. Se registró ade</w:t>
+        <w:t>periférica (zonas 1 a 3; Figura 4.2). El piso de la arena está dividido en una cuadrícula de 5 × 5 cuadrados de 15 cm de lado: la zona 1 corresponde al cuadrado central (15 × 15 cm); la zona 2, al anillo de ocho cuadrados que lo rodea (límite externo de 45 × 45 cm); y la zona 3, a la franja de 15 cm de ancho adyacente a las paredes. Se registraron la distancia total recorrida, el número de zonas visitadas y las entradas, las distancias recorridas y el tiempo de permanencia en cada zona [43]. Se registró ade</w:t>
       </w:r>
       <w:r>
         <w:t>más el</w:t>
@@ -9550,7 +9592,7 @@
         <w:t>rearing</w:t>
       </w:r>
       <w:r>
-        <w:t>, una conducta de exploración vertical en la que el animal se incorpora sobre las patas traseras [71], como número de eventos y tiempo total.</w:t>
+        <w:t>, una conducta de exploración vertical en la que el animal se incorpora sobre las patas traseras [73], como número de eventos y tiempo total.</w:t>
       </w:r>
     </w:p>
     <w:p>
@@ -9564,10 +9606,10 @@
           <w:noProof/>
         </w:rPr>
         <w:drawing>
-          <wp:inline distT="0" distB="0" distL="0" distR="0" wp14:anchorId="5B698253" wp14:editId="79B98018">
+          <wp:inline distT="0" distB="0" distL="0" distR="0" wp14:anchorId="57C150C6" wp14:editId="2E44B23E">
             <wp:extent cx="2073599" cy="1876965"/>
             <wp:effectExtent l="0" t="0" r="0" b="0"/>
-            <wp:docPr id="331095120" name="Picture" descr="image"/>
+            <wp:docPr id="794491055" name="Picture" descr="image"/>
             <wp:cNvGraphicFramePr/>
             <a:graphic xmlns:a="http://schemas.openxmlformats.org/drawingml/2006/main">
               <a:graphicData uri="http://schemas.openxmlformats.org/drawingml/2006/picture">
@@ -9645,7 +9687,7 @@
       <w:r>
         <w:instrText xml:space="preserve"> TC "</w:instrText>
       </w:r>
-      <w:bookmarkStart w:id="51" w:name="_Toc243733545"/>
+      <w:bookmarkStart w:id="51" w:name="_Toc243735275"/>
       <w:r>
         <w:instrText>4.2. Aparato de open field (OF) y zonas de registro</w:instrText>
       </w:r>
@@ -9662,7 +9704,7 @@
         <w:pStyle w:val="Ttulo3"/>
       </w:pPr>
       <w:bookmarkStart w:id="52" w:name="reconocimiento-de-objeto-novedoso-nor"/>
-      <w:bookmarkStart w:id="53" w:name="_Toc243733513"/>
+      <w:bookmarkStart w:id="53" w:name="_Toc243735243"/>
       <w:bookmarkEnd w:id="49"/>
       <w:r>
         <w:t>4.3.2 Reconocimiento de objeto novedoso (NOR)</w:t>
@@ -9674,7 +9716,7 @@
         <w:pStyle w:val="FirstParagraph"/>
       </w:pPr>
       <w:r>
-        <w:t>El aparato consistió en una caja abierta de madera oscura (75 cm de largo × 30 cm de alto × 45 cm de ancho). Los objetos a discriminar diferían en forma y textura; eran de vidrio, plástico o cerámica y tenían cuatro formas distintas (frascos de vidrio, una rana de juguete de plástico, cajas de plástico y tazas de cerámica), y no podían ser desplazados por las ratas [72, 73]. Brevemente, durante la semana previa a la prueba las ratas fueron manipuladas una vez al día durante 5 días consecutivos. Tres días an</w:t>
+        <w:t>El aparato consistió en una caja abierta de madera oscura (75 cm de largo × 30 cm de alto × 45 cm de ancho). Los objetos a discriminar diferían en forma y textura; eran de vidrio, plástico o cerámica y tenían cuatro formas distintas (frascos de vidrio, una rana de juguete de plástico, cajas de plástico y tazas de cerámica), y no podían ser desplazados por las ratas [74, 75]. Brevemente, durante la semana previa a la prueba las ratas fueron manipuladas una vez al día durante 5 días consecutivos. Tres días an</w:t>
       </w:r>
       <w:r>
         <w:t>tes de la prueba se permitió que las ratas exploraran el aparato durante 5 min por día. En estas sesiones de habituación no había objetos en la caja. Veinticuatro horas después de la última sesión de habituación, las ratas fueron entrenadas para el reconocimiento de objetos permitiéndoles explorar durante 5 min dos objetos idénticos colocados en la arena de prueba (fase de muestreo). Durante esta fase de muestreo (T1), los objetos (dos frascos de vidrio de 12,5 cm de alto y 5 cm de diámetro) se colocaron al</w:t>
@@ -9856,10 +9898,10 @@
           <w:noProof/>
         </w:rPr>
         <w:drawing>
-          <wp:inline distT="0" distB="0" distL="0" distR="0" wp14:anchorId="5C73FFAB" wp14:editId="69243323">
+          <wp:inline distT="0" distB="0" distL="0" distR="0" wp14:anchorId="1C76C719" wp14:editId="13C0C401">
             <wp:extent cx="5183999" cy="1430068"/>
             <wp:effectExtent l="0" t="0" r="0" b="0"/>
-            <wp:docPr id="838275685" name="Picture" descr="image"/>
+            <wp:docPr id="573862077" name="Picture" descr="image"/>
             <wp:cNvGraphicFramePr/>
             <a:graphic xmlns:a="http://schemas.openxmlformats.org/drawingml/2006/main">
               <a:graphicData uri="http://schemas.openxmlformats.org/drawingml/2006/picture">
@@ -9923,7 +9965,7 @@
       <w:r>
         <w:instrText xml:space="preserve"> TC "</w:instrText>
       </w:r>
-      <w:bookmarkStart w:id="54" w:name="_Toc243733546"/>
+      <w:bookmarkStart w:id="54" w:name="_Toc243735276"/>
       <w:r>
         <w:instrText>4.3. Esquema del protocolo de la prueba NOR</w:instrText>
       </w:r>
@@ -9946,10 +9988,10 @@
           <w:noProof/>
         </w:rPr>
         <w:drawing>
-          <wp:inline distT="0" distB="0" distL="0" distR="0" wp14:anchorId="2CCAB4C3" wp14:editId="778557A8">
+          <wp:inline distT="0" distB="0" distL="0" distR="0" wp14:anchorId="652C1D7F" wp14:editId="687487BF">
             <wp:extent cx="5753100" cy="1521984"/>
             <wp:effectExtent l="0" t="0" r="0" b="0"/>
-            <wp:docPr id="792494781" name="Picture" descr="image"/>
+            <wp:docPr id="1357668117" name="Picture" descr="image"/>
             <wp:cNvGraphicFramePr/>
             <a:graphic xmlns:a="http://schemas.openxmlformats.org/drawingml/2006/main">
               <a:graphicData uri="http://schemas.openxmlformats.org/drawingml/2006/picture">
@@ -10019,7 +10061,7 @@
       <w:r>
         <w:instrText xml:space="preserve"> TC "</w:instrText>
       </w:r>
-      <w:bookmarkStart w:id="55" w:name="_Toc243733547"/>
+      <w:bookmarkStart w:id="55" w:name="_Toc243735277"/>
       <w:r>
         <w:instrText>4.4. Fases del NOR</w:instrText>
       </w:r>
@@ -10036,7 +10078,7 @@
         <w:pStyle w:val="Ttulo3"/>
       </w:pPr>
       <w:bookmarkStart w:id="56" w:name="Xe97ae87456ffade0f33435ffa16ff2d021c5913"/>
-      <w:bookmarkStart w:id="57" w:name="_Toc243733514"/>
+      <w:bookmarkStart w:id="57" w:name="_Toc243735244"/>
       <w:bookmarkEnd w:id="52"/>
       <w:r>
         <w:t>4.3.3 Reconocimiento espontáneo de posición (SLR)</w:t>
@@ -10048,7 +10090,7 @@
         <w:pStyle w:val="FirstParagraph"/>
       </w:pPr>
       <w:r>
-        <w:t>Este procedimiento se realizó como fue descrito por Reichelt et al. [29, 62]. El aparato consistió en un campo abierto circular de plástico gris y base opaca, de 100 cm de diámetro × 45 cm de alto, sin techo. La arena estuvo rodeada de tres señales espaciales distintivas (pósteres negros y blancos con patrones únicos) de 35 cm de alto × 50 cm de ancho, ubicadas equidistantes alrededor de la arena, y de las señales distales proporcionadas por los muebles de la sala, incluidos los estantes y la puerta.</w:t>
+        <w:t>Este procedimiento se realizó como fue descrito por Reichelt et al. [30, 64]. El aparato consistió en un campo abierto circular de plástico gris y base opaca, de 100 cm de diámetro × 45 cm de alto, sin techo. La arena estuvo rodeada de tres señales espaciales distintivas (pósteres negros y blancos con patrones únicos) de 35 cm de alto × 50 cm de ancho, ubicadas equidistantes alrededor de la arena, y de las señales distales proporcionadas por los muebles de la sala, incluidos los estantes y la puerta.</w:t>
       </w:r>
     </w:p>
     <w:p>
@@ -10081,7 +10123,7 @@
         <w:t>= 9–10 por grupo y configuración). Para la d-SLR, los objetos A1, A2 y A3 se colocaron equidistantes, a 120° y a una distancia aproximada de 49 cm entre ellos. Para la s-SLR, los objetos A2 y A3 se colocaron a 50° de distancia, a 20,5 cm entre ellos, mientras que A1 se ubicó a la misma distancia de A2 y de A3. El ensayo se fundamenta en la separación de patrones: la demanda cognitiva es mayor cuanto menor es la distancia entre los objetos, de modo que la s-SLR impone una demanda cognitiva mayor, y es más de</w:t>
       </w:r>
       <w:r>
-        <w:t>pendiente de la neurogénesis, que la d-SLR [62]. Veinticuatro horas después de la fase de muestreo, los animales regresaron a la arena, donde fueron expuestos solo a dos objetos, uno familiar (A1) y otro novedoso (N), durante 5 min (fase de prueba). El objeto N se ubicó en la posición media entre las que ocupaban los objetos A2 y A3 en la fase de muestreo (Figura 4.5).</w:t>
+        <w:t>pendiente de la neurogénesis, que la d-SLR [64]. Veinticuatro horas después de la fase de muestreo, los animales regresaron a la arena, donde fueron expuestos solo a dos objetos, uno familiar (A1) y otro novedoso (N), durante 5 min (fase de prueba). El objeto N se ubicó en la posición media entre las que ocupaban los objetos A2 y A3 en la fase de muestreo (Figura 4.5).</w:t>
       </w:r>
     </w:p>
     <w:p>
@@ -10095,10 +10137,10 @@
           <w:noProof/>
         </w:rPr>
         <w:drawing>
-          <wp:inline distT="0" distB="0" distL="0" distR="0" wp14:anchorId="5180B86C" wp14:editId="522FF2C1">
+          <wp:inline distT="0" distB="0" distL="0" distR="0" wp14:anchorId="598898D4" wp14:editId="685BF32D">
             <wp:extent cx="5183999" cy="4670428"/>
             <wp:effectExtent l="0" t="0" r="0" b="0"/>
-            <wp:docPr id="402681273" name="Picture" descr="image"/>
+            <wp:docPr id="1674496208" name="Picture" descr="image"/>
             <wp:cNvGraphicFramePr/>
             <a:graphic xmlns:a="http://schemas.openxmlformats.org/drawingml/2006/main">
               <a:graphicData uri="http://schemas.openxmlformats.org/drawingml/2006/picture">
@@ -10166,7 +10208,7 @@
         <w:rPr>
           <w:sz w:val="19"/>
         </w:rPr>
-        <w:t>s señales espaciales, y la flecha indica la mayor demanda cognitiva de la configuración s-SLR. Adaptado de [62].</w:t>
+        <w:t>s señales espaciales, y la flecha indica la mayor demanda cognitiva de la configuración s-SLR. Adaptado de [64].</w:t>
       </w:r>
       <w:r>
         <w:fldChar w:fldCharType="begin"/>
@@ -10174,7 +10216,7 @@
       <w:r>
         <w:instrText xml:space="preserve"> TC "</w:instrText>
       </w:r>
-      <w:bookmarkStart w:id="58" w:name="_Toc243733548"/>
+      <w:bookmarkStart w:id="58" w:name="_Toc243735278"/>
       <w:r>
         <w:instrText>4.5. Esquema de la prueba de reconocimiento espontáneo de posición (SLR)</w:instrText>
       </w:r>
@@ -10198,10 +10240,10 @@
         </w:rPr>
         <w:lastRenderedPageBreak/>
         <w:drawing>
-          <wp:inline distT="0" distB="0" distL="0" distR="0" wp14:anchorId="1480C90E" wp14:editId="2BADE9FD">
+          <wp:inline distT="0" distB="0" distL="0" distR="0" wp14:anchorId="2A8CF059" wp14:editId="7BED487E">
             <wp:extent cx="4031999" cy="3016951"/>
             <wp:effectExtent l="0" t="0" r="0" b="0"/>
-            <wp:docPr id="2068942775" name="Picture" descr="image"/>
+            <wp:docPr id="267697238" name="Picture" descr="image"/>
             <wp:cNvGraphicFramePr/>
             <a:graphic xmlns:a="http://schemas.openxmlformats.org/drawingml/2006/main">
               <a:graphicData uri="http://schemas.openxmlformats.org/drawingml/2006/picture">
@@ -10265,7 +10307,7 @@
       <w:r>
         <w:instrText xml:space="preserve"> TC "</w:instrText>
       </w:r>
-      <w:bookmarkStart w:id="59" w:name="_Toc243733549"/>
+      <w:bookmarkStart w:id="59" w:name="_Toc243735279"/>
       <w:r>
         <w:instrText>4.6. Objetos utilizados en la prueba SLR: tazas con dibujos y ranas de juguete</w:instrText>
       </w:r>
@@ -10491,7 +10533,7 @@
         <w:pStyle w:val="Ttulo3"/>
       </w:pPr>
       <w:bookmarkStart w:id="60" w:name="registro-con-anymaze"/>
-      <w:bookmarkStart w:id="61" w:name="_Toc243733515"/>
+      <w:bookmarkStart w:id="61" w:name="_Toc243735245"/>
       <w:bookmarkEnd w:id="56"/>
       <w:r>
         <w:t>4.3.4 Registro con AnyMaze©</w:t>
@@ -10552,7 +10594,7 @@
         <w:pStyle w:val="Ttulo2"/>
       </w:pPr>
       <w:bookmarkStart w:id="62" w:name="Xb71f7db275c89ee5be6e7d9c80109ddbc9394c3"/>
-      <w:bookmarkStart w:id="63" w:name="_Toc243733516"/>
+      <w:bookmarkStart w:id="63" w:name="_Toc243735246"/>
       <w:bookmarkEnd w:id="47"/>
       <w:bookmarkEnd w:id="60"/>
       <w:r>
@@ -10565,10 +10607,10 @@
         <w:pStyle w:val="FirstParagraph"/>
       </w:pPr>
       <w:r>
-        <w:t>Los animales fueron anestesiados profundamente mediante una inyección intraperitoneal de ketamina-xilacina (120 + 12 mg/kg; Holliday/Richmond, Argentina) y fijados por perfusión intracardíaca con 600 mL de paraformaldehído (PFA) al 4 % frío en PBS (pH 7,4) [74]. Los cerebros se extrajeron de inmediato y se dejaron en PFA al 4 % durante toda la noche a 4 °C. Luego se lavaron con PBS y se seccionaron con un vibrátomo. Se obtuvieron cortes coronales de 70 µm de espesor (Bregma -2,8 a -4,2 mm), determinados con</w:t>
-      </w:r>
-      <w:r>
-        <w:t xml:space="preserve"> un atlas del cerebro de rata [75], y se bloquearon en PBS con 0,1 % de Tween 20 y 7 % de suero normal de burro durante 1 h a temperatura ambiente. Las muestras de tejido se incubaron luego con un anticuerpo de ratón anti-PCNA (dilución 1:250; ref. MAB424, Merck) y un anticuerpo de cabra anti-DCX (dilución 1:200; ref. sc-8066, Santa Cruz Biotechnology) en PBS con 2 % de suero de burro y 0,1 % de Tween 20, durante toda la noche a 4 °C. Posteriormente se lavaron en PBS durante 30 min y se incubaron con un ant</w:t>
+        <w:t>Los animales fueron anestesiados profundamente mediante una inyección intraperitoneal de ketamina-xilacina (120 + 12 mg/kg; Holliday/Richmond, Argentina) y fijados por perfusión intracardíaca con 600 mL de paraformaldehído (PFA) al 4 % frío en PBS (pH 7,4) [76]. Los cerebros se extrajeron de inmediato y se dejaron en PFA al 4 % durante toda la noche a 4 °C. Luego se lavaron con PBS y se seccionaron con un vibrátomo. Se obtuvieron cortes coronales de 70 µm de espesor (Bregma -2,8 a -4,2 mm), determinados con</w:t>
+      </w:r>
+      <w:r>
+        <w:t xml:space="preserve"> un atlas del cerebro de rata [77], y se bloquearon en PBS con 0,1 % de Tween 20 y 7 % de suero normal de burro durante 1 h a temperatura ambiente. Las muestras de tejido se incubaron luego con un anticuerpo de ratón anti-PCNA (dilución 1:250; ref. MAB424, Merck) y un anticuerpo de cabra anti-DCX (dilución 1:200; ref. sc-8066, Santa Cruz Biotechnology) en PBS con 2 % de suero de burro y 0,1 % de Tween 20, durante toda la noche a 4 °C. Posteriormente se lavaron en PBS durante 30 min y se incubaron con un ant</w:t>
       </w:r>
       <w:r>
         <w:t>icuerpo de burro anti-ratón Alexa 488 y un anticuerpo de burro anti-cabra Alexa 555 (ref. A21202 y A21432, respectivamente; Thermo Fisher; ambos en dilución 1:1000) durante 2 h a temperatura ambiente. Los núcleos se contratiñeron con DAPI (1 µg/mL). Finalmente, después de los lavados, los cortes se montaron en portaobjetos de vidrio codificados y se examinaron con un microscopio confocal de disco giratorio Olympus IX81-DSU. Todas las imágenes se obtuvieron en las mismas condiciones: el tiempo de exposición,</w:t>
@@ -10582,7 +10624,7 @@
         <w:pStyle w:val="Ttulo3"/>
       </w:pPr>
       <w:bookmarkStart w:id="64" w:name="recuento-celular"/>
-      <w:bookmarkStart w:id="65" w:name="_Toc243733517"/>
+      <w:bookmarkStart w:id="65" w:name="_Toc243735247"/>
       <w:r>
         <w:t>4.4.1 Recuento celular</w:t>
       </w:r>
@@ -10630,7 +10672,7 @@
         <w:pStyle w:val="Ttulo2"/>
       </w:pPr>
       <w:bookmarkStart w:id="66" w:name="análisis-estadístico"/>
-      <w:bookmarkStart w:id="67" w:name="_Toc243733518"/>
+      <w:bookmarkStart w:id="67" w:name="_Toc243735248"/>
       <w:bookmarkEnd w:id="62"/>
       <w:bookmarkEnd w:id="64"/>
       <w:r>
@@ -10643,7 +10685,7 @@
         <w:pStyle w:val="FirstParagraph"/>
       </w:pPr>
       <w:r>
-        <w:t>El tamaño muestral se estimó sobre la base de estudios previos (95 % de confianza, 10 % de error y 80 % de potencia estadística) [27, 30, 41, 69], siguiendo las recomendaciones estándar [66].</w:t>
+        <w:t>El tamaño muestral se estimó sobre la base de estudios previos (95 % de confianza, 10 % de error y 80 % de potencia estadística) [28, 31, 43, 71], siguiendo las recomendaciones estándar [68].</w:t>
       </w:r>
     </w:p>
     <w:p>
@@ -10772,7 +10814,7 @@
         <w:pStyle w:val="Ttulo2"/>
       </w:pPr>
       <w:bookmarkStart w:id="68" w:name="X430af9d9bfce0b651f903068a5742516bd0d098"/>
-      <w:bookmarkStart w:id="69" w:name="_Toc243733519"/>
+      <w:bookmarkStart w:id="69" w:name="_Toc243735249"/>
       <w:bookmarkEnd w:id="66"/>
       <w:r>
         <w:t>4.6 Análisis multivariado y aprendizaje automático</w:t>
@@ -10808,7 +10850,7 @@
         <w:pStyle w:val="Textoindependiente"/>
       </w:pPr>
       <w:r>
-        <w:t xml:space="preserve">Se emplearon tres técnicas complementarias. Las variables se estandarizaron (media 0 y desvío estándar 1, para que ninguna pesara más por su escala) y se sometieron a un análisis de componentes principales (PCA) [63], que resume las cinco métricas en unas pocas combinaciones no correlacionadas (componentes) y muestra qué variables varían juntas. Las puntuaciones de las dos primeras componentes se compararon entre grupos mediante ANOVA de dos vías (edad × tratamiento) y entre cohortes mediante la prueba </w:t>
+        <w:t xml:space="preserve">Se emplearon tres técnicas complementarias. Las variables se estandarizaron (media 0 y desvío estándar 1, para que ninguna pesara más por su escala) y se sometieron a un análisis de componentes principales (PCA) [65], que resume las cinco métricas en unas pocas combinaciones no correlacionadas (componentes) y muestra qué variables varían juntas. Las puntuaciones de las dos primeras componentes se compararon entre grupos mediante ANOVA de dos vías (edad × tratamiento) y entre cohortes mediante la prueba </w:t>
       </w:r>
       <w:r>
         <w:rPr>
@@ -10825,7 +10867,7 @@
       </w:r>
       <w:r>
         <w:lastRenderedPageBreak/>
-        <w:t>si los animales se agrupan espontáneamente según su exposición, sin informar al método a qué grupo pertenece cada uno, se aplicó sobre las mismas variables estandarizadas un clustering jerárquico aglomerativo con el criterio de Ward y distancia euclídea [64]; el número de clusters se eligió por el coeficiente de silueta entre 2 y 6, y la concordancia entre los clusters y los grupos experimentales se cuantificó con el índice de Rand ajustado (ARI), que vale 0 para una asignación al a</w:t>
+        <w:t>si los animales se agrupan espontáneamente según su exposición, sin informar al método a qué grupo pertenece cada uno, se aplicó sobre las mismas variables estandarizadas un clustering jerárquico aglomerativo con el criterio de Ward y distancia euclídea [66]; el número de clusters se eligió por el coeficiente de silueta entre 2 y 6, y la concordancia entre los clusters y los grupos experimentales se cuantificó con el índice de Rand ajustado (ARI), que vale 0 para una asignación al a</w:t>
       </w:r>
       <w:r>
         <w:t>zar y 1 para una coincidencia perfecta.</w:t>
@@ -10836,7 +10878,7 @@
         <w:pStyle w:val="Textoindependiente"/>
       </w:pPr>
       <w:r>
-        <w:t>Por último, para evaluar si las métricas contienen información suficiente para reconocer el grupo de cada animal, se entrenó un clasificador Random Forest [65] (300 árboles, al menos 2 observaciones por hoja y pesos de clase balanceados) para predecir el grupo experimental (seis grupos) y, por separado, el tratamiento y los contrastes control–sacarosa y control–stevia. El desempeño se estimó como exactitud balanceada (promedio de la proporción de aciertos de cada grupo) mediante validación cruzada estratifi</w:t>
+        <w:t>Por último, para evaluar si las métricas contienen información suficiente para reconocer el grupo de cada animal, se entrenó un clasificador Random Forest [67] (300 árboles, al menos 2 observaciones por hoja y pesos de clase balanceados) para predecir el grupo experimental (seis grupos) y, por separado, el tratamiento y los contrastes control–sacarosa y control–stevia. El desempeño se estimó como exactitud balanceada (promedio de la proporción de aciertos de cada grupo) mediante validación cruzada estratifi</w:t>
       </w:r>
       <w:r>
         <w:t>cada de 5 particiones, repetida 10 veces: en cada repetición, el modelo se entrenó con cuatro quintos de los animales y se evaluó con el quinto restante. Su significación se estimó mediante una prueba de permutación (500 permutaciones), en la que el procedimiento se repitió con las etiquetas de grupo mezcladas al azar para obtener el desempeño esperable por azar. La importancia de cada variable se estimó por permutación en los conjuntos de prueba. Estos análisis se realizaron en Python 3.14 con scikit-learn</w:t>
@@ -10862,7 +10904,7 @@
         <w:pStyle w:val="Ttulo1"/>
       </w:pPr>
       <w:bookmarkStart w:id="70" w:name="resultados"/>
-      <w:bookmarkStart w:id="71" w:name="_Toc243733520"/>
+      <w:bookmarkStart w:id="71" w:name="_Toc243735250"/>
       <w:bookmarkEnd w:id="39"/>
       <w:bookmarkEnd w:id="68"/>
       <w:r>
@@ -10876,7 +10918,7 @@
         <w:pStyle w:val="Ttulo2"/>
       </w:pPr>
       <w:bookmarkStart w:id="72" w:name="consumo-de-líquidos"/>
-      <w:bookmarkStart w:id="73" w:name="_Toc243733521"/>
+      <w:bookmarkStart w:id="73" w:name="_Toc243735251"/>
       <w:r>
         <w:t>5.1 Consumo de líquidos</w:t>
       </w:r>
@@ -10887,7 +10929,7 @@
         <w:pStyle w:val="Ttulo3"/>
       </w:pPr>
       <w:bookmarkStart w:id="74" w:name="X22851d61bdb9d2edb8d5b1cf1620057207ed789"/>
-      <w:bookmarkStart w:id="75" w:name="_Toc243733522"/>
+      <w:bookmarkStart w:id="75" w:name="_Toc243735252"/>
       <w:r>
         <w:t>5.1.1 Consumo de líquidos durante el tratamiento</w:t>
       </w:r>
@@ -11159,10 +11201,10 @@
           <w:noProof/>
         </w:rPr>
         <w:drawing>
-          <wp:inline distT="0" distB="0" distL="0" distR="0" wp14:anchorId="49F668D3" wp14:editId="0D203F4C">
+          <wp:inline distT="0" distB="0" distL="0" distR="0" wp14:anchorId="5902F286" wp14:editId="611ED61F">
             <wp:extent cx="2591999" cy="2356363"/>
             <wp:effectExtent l="0" t="0" r="0" b="0"/>
-            <wp:docPr id="645109023" name="Picture" descr="image"/>
+            <wp:docPr id="330741957" name="Picture" descr="image"/>
             <wp:cNvGraphicFramePr/>
             <a:graphic xmlns:a="http://schemas.openxmlformats.org/drawingml/2006/main">
               <a:graphicData uri="http://schemas.openxmlformats.org/drawingml/2006/picture">
@@ -11273,7 +11315,7 @@
       <w:r>
         <w:instrText xml:space="preserve"> TC "</w:instrText>
       </w:r>
-      <w:bookmarkStart w:id="76" w:name="_Toc243733550"/>
+      <w:bookmarkStart w:id="76" w:name="_Toc243735280"/>
       <w:r>
         <w:instrText>5.1. Índice de preferencia por la solución endulzada</w:instrText>
       </w:r>
@@ -11297,10 +11339,10 @@
         </w:rPr>
         <w:lastRenderedPageBreak/>
         <w:drawing>
-          <wp:inline distT="0" distB="0" distL="0" distR="0" wp14:anchorId="2928F584" wp14:editId="235F978E">
+          <wp:inline distT="0" distB="0" distL="0" distR="0" wp14:anchorId="77093C20" wp14:editId="385481CD">
             <wp:extent cx="5753100" cy="2066854"/>
             <wp:effectExtent l="0" t="0" r="0" b="0"/>
-            <wp:docPr id="2134730617" name="Picture" descr="image"/>
+            <wp:docPr id="1636410547" name="Picture" descr="image"/>
             <wp:cNvGraphicFramePr/>
             <a:graphic xmlns:a="http://schemas.openxmlformats.org/drawingml/2006/main">
               <a:graphicData uri="http://schemas.openxmlformats.org/drawingml/2006/picture">
@@ -11384,7 +11426,7 @@
       <w:r>
         <w:instrText xml:space="preserve"> TC "</w:instrText>
       </w:r>
-      <w:bookmarkStart w:id="77" w:name="_Toc243733551"/>
+      <w:bookmarkStart w:id="77" w:name="_Toc243735281"/>
       <w:r>
         <w:instrText>5.2. Curso temporal del consumo de líquidos durante el tratamiento</w:instrText>
       </w:r>
@@ -11407,10 +11449,10 @@
           <w:noProof/>
         </w:rPr>
         <w:drawing>
-          <wp:inline distT="0" distB="0" distL="0" distR="0" wp14:anchorId="2545EAD2" wp14:editId="064E31AA">
+          <wp:inline distT="0" distB="0" distL="0" distR="0" wp14:anchorId="1D0457C9" wp14:editId="4AA88A58">
             <wp:extent cx="5183999" cy="2530101"/>
             <wp:effectExtent l="0" t="0" r="0" b="0"/>
-            <wp:docPr id="1493666704" name="Picture" descr="image"/>
+            <wp:docPr id="109434258" name="Picture" descr="image"/>
             <wp:cNvGraphicFramePr/>
             <a:graphic xmlns:a="http://schemas.openxmlformats.org/drawingml/2006/main">
               <a:graphicData uri="http://schemas.openxmlformats.org/drawingml/2006/picture">
@@ -11575,7 +11617,7 @@
       <w:r>
         <w:instrText xml:space="preserve"> TC "</w:instrText>
       </w:r>
-      <w:bookmarkStart w:id="78" w:name="_Toc243733552"/>
+      <w:bookmarkStart w:id="78" w:name="_Toc243735282"/>
       <w:r>
         <w:instrText>5.3. Consumo de líquidos promediado durante el tratamiento</w:instrText>
       </w:r>
@@ -11592,7 +11634,7 @@
         <w:pStyle w:val="Ttulo3"/>
       </w:pPr>
       <w:bookmarkStart w:id="79" w:name="Xbf1431af6e3b62c8a8137aa3e17d8226a064321"/>
-      <w:bookmarkStart w:id="80" w:name="_Toc243733523"/>
+      <w:bookmarkStart w:id="80" w:name="_Toc243735253"/>
       <w:bookmarkEnd w:id="74"/>
       <w:r>
         <w:t>5.1.2 Consumo de agua luego del tratamiento con los endulzantes (período agua)</w:t>
@@ -12053,10 +12095,10 @@
           <w:noProof/>
         </w:rPr>
         <w:drawing>
-          <wp:inline distT="0" distB="0" distL="0" distR="0" wp14:anchorId="00D40327" wp14:editId="6089B214">
+          <wp:inline distT="0" distB="0" distL="0" distR="0" wp14:anchorId="3ED02105" wp14:editId="518F887E">
             <wp:extent cx="4607999" cy="2228554"/>
             <wp:effectExtent l="0" t="0" r="0" b="0"/>
-            <wp:docPr id="111045040" name="Picture" descr="image"/>
+            <wp:docPr id="1786622887" name="Picture" descr="image"/>
             <wp:cNvGraphicFramePr/>
             <a:graphic xmlns:a="http://schemas.openxmlformats.org/drawingml/2006/main">
               <a:graphicData uri="http://schemas.openxmlformats.org/drawingml/2006/picture">
@@ -12134,7 +12176,7 @@
       <w:r>
         <w:instrText xml:space="preserve"> TC "</w:instrText>
       </w:r>
-      <w:bookmarkStart w:id="81" w:name="_Toc243733553"/>
+      <w:bookmarkStart w:id="81" w:name="_Toc243735283"/>
       <w:r>
         <w:instrText>5.4. Consumo de agua luego del tratamiento con los endulzantes</w:instrText>
       </w:r>
@@ -12151,7 +12193,7 @@
         <w:pStyle w:val="Ttulo2"/>
       </w:pPr>
       <w:bookmarkStart w:id="82" w:name="conducta-tipo-ansiosa-of"/>
-      <w:bookmarkStart w:id="83" w:name="_Toc243733524"/>
+      <w:bookmarkStart w:id="83" w:name="_Toc243735254"/>
       <w:bookmarkEnd w:id="72"/>
       <w:bookmarkEnd w:id="79"/>
       <w:r>
@@ -12831,10 +12873,10 @@
         </w:rPr>
         <w:lastRenderedPageBreak/>
         <w:drawing>
-          <wp:inline distT="0" distB="0" distL="0" distR="0" wp14:anchorId="1D818AFA" wp14:editId="0DBD525E">
+          <wp:inline distT="0" distB="0" distL="0" distR="0" wp14:anchorId="0A743526" wp14:editId="2727B172">
             <wp:extent cx="5753100" cy="4508116"/>
             <wp:effectExtent l="0" t="0" r="0" b="0"/>
-            <wp:docPr id="370255880" name="Picture" descr="image"/>
+            <wp:docPr id="2027758105" name="Picture" descr="image"/>
             <wp:cNvGraphicFramePr/>
             <a:graphic xmlns:a="http://schemas.openxmlformats.org/drawingml/2006/main">
               <a:graphicData uri="http://schemas.openxmlformats.org/drawingml/2006/picture">
@@ -13053,7 +13095,7 @@
       <w:r>
         <w:instrText xml:space="preserve"> TC "</w:instrText>
       </w:r>
-      <w:bookmarkStart w:id="84" w:name="_Toc243733554"/>
+      <w:bookmarkStart w:id="84" w:name="_Toc243735284"/>
       <w:r>
         <w:instrText>5.5. Actividad locomotora y exploración de la arena en el open field</w:instrText>
       </w:r>
@@ -13363,10 +13405,10 @@
         </w:rPr>
         <w:lastRenderedPageBreak/>
         <w:drawing>
-          <wp:inline distT="0" distB="0" distL="0" distR="0" wp14:anchorId="330DA6CF" wp14:editId="2DC511B1">
+          <wp:inline distT="0" distB="0" distL="0" distR="0" wp14:anchorId="38CF368F" wp14:editId="006CE51E">
             <wp:extent cx="5753100" cy="1945095"/>
             <wp:effectExtent l="0" t="0" r="0" b="0"/>
-            <wp:docPr id="503331053" name="Picture" descr="image"/>
+            <wp:docPr id="1209183561" name="Picture" descr="image"/>
             <wp:cNvGraphicFramePr/>
             <a:graphic xmlns:a="http://schemas.openxmlformats.org/drawingml/2006/main">
               <a:graphicData uri="http://schemas.openxmlformats.org/drawingml/2006/picture">
@@ -13580,7 +13622,7 @@
       <w:r>
         <w:instrText xml:space="preserve"> TC "</w:instrText>
       </w:r>
-      <w:bookmarkStart w:id="85" w:name="_Toc243733555"/>
+      <w:bookmarkStart w:id="85" w:name="_Toc243735285"/>
       <w:r>
         <w:instrText>5.6. Conducta de rearing en el open field</w:instrText>
       </w:r>
@@ -13669,7 +13711,7 @@
       <w:r>
         <w:instrText xml:space="preserve"> TC "</w:instrText>
       </w:r>
-      <w:bookmarkStart w:id="86" w:name="_Toc243733567"/>
+      <w:bookmarkStart w:id="86" w:name="_Toc243735297"/>
       <w:r>
         <w:instrText>5.1. Resumen del ANOVA de dos vías para las variables del OF</w:instrText>
       </w:r>
@@ -15707,7 +15749,7 @@
         <w:pStyle w:val="Ttulo2"/>
       </w:pPr>
       <w:bookmarkStart w:id="87" w:name="memoria-de-reconocimiento-de-objetos-nor"/>
-      <w:bookmarkStart w:id="88" w:name="_Toc243733525"/>
+      <w:bookmarkStart w:id="88" w:name="_Toc243735255"/>
       <w:bookmarkEnd w:id="82"/>
       <w:r>
         <w:t>5.3 Memoria de reconocimiento de objetos (NOR)</w:t>
@@ -15914,10 +15956,10 @@
           <w:noProof/>
         </w:rPr>
         <w:drawing>
-          <wp:inline distT="0" distB="0" distL="0" distR="0" wp14:anchorId="7C447981" wp14:editId="69F651A2">
+          <wp:inline distT="0" distB="0" distL="0" distR="0" wp14:anchorId="6C9E6937" wp14:editId="14376177">
             <wp:extent cx="5753100" cy="3244870"/>
             <wp:effectExtent l="0" t="0" r="0" b="0"/>
-            <wp:docPr id="1580348159" name="Picture" descr="image"/>
+            <wp:docPr id="213511787" name="Picture" descr="image"/>
             <wp:cNvGraphicFramePr/>
             <a:graphic xmlns:a="http://schemas.openxmlformats.org/drawingml/2006/main">
               <a:graphicData uri="http://schemas.openxmlformats.org/drawingml/2006/picture">
@@ -16041,7 +16083,7 @@
       <w:r>
         <w:instrText xml:space="preserve"> TC "</w:instrText>
       </w:r>
-      <w:bookmarkStart w:id="89" w:name="_Toc243733556"/>
+      <w:bookmarkStart w:id="89" w:name="_Toc243735286"/>
       <w:r>
         <w:instrText>5.7. Exploración de los objetos en la fase de muestreo del NOR</w:instrText>
       </w:r>
@@ -16492,10 +16534,10 @@
           <w:noProof/>
         </w:rPr>
         <w:drawing>
-          <wp:inline distT="0" distB="0" distL="0" distR="0" wp14:anchorId="29A692CA" wp14:editId="765A082D">
+          <wp:inline distT="0" distB="0" distL="0" distR="0" wp14:anchorId="2BA2C243" wp14:editId="1E034861">
             <wp:extent cx="5753100" cy="5555242"/>
             <wp:effectExtent l="0" t="0" r="0" b="0"/>
-            <wp:docPr id="756009414" name="Picture" descr="image"/>
+            <wp:docPr id="335299921" name="Picture" descr="image"/>
             <wp:cNvGraphicFramePr/>
             <a:graphic xmlns:a="http://schemas.openxmlformats.org/drawingml/2006/main">
               <a:graphicData uri="http://schemas.openxmlformats.org/drawingml/2006/picture">
@@ -16557,7 +16599,7 @@
         <w:rPr>
           <w:sz w:val="19"/>
         </w:rPr>
-        <w:t xml:space="preserve">Tasa de exploración en la prueba NOR. (A) T2 (2 h). (B) T3 (24 h). (C) T4 (7 días). (D) Esquema del protocolo y objetos presentados en cada ensayo [30]. Las barras indican media ± SEM; cada punto representa un animal. Azul: grupo control; rojo: grupo sacarosa; verde: grupo stevia. Se indican los resultados de las </w:t>
+        <w:t xml:space="preserve">Tasa de exploración en la prueba NOR. (A) T2 (2 h). (B) T3 (24 h). (C) T4 (7 días). (D) Esquema del protocolo y objetos presentados en cada ensayo [31]. Las barras indican media ± SEM; cada punto representa un animal. Azul: grupo control; rojo: grupo sacarosa; verde: grupo stevia. Se indican los resultados de las </w:t>
       </w:r>
       <w:r>
         <w:rPr>
@@ -16694,7 +16736,7 @@
       <w:r>
         <w:instrText xml:space="preserve"> TC "</w:instrText>
       </w:r>
-      <w:bookmarkStart w:id="90" w:name="_Toc243733557"/>
+      <w:bookmarkStart w:id="90" w:name="_Toc243735287"/>
       <w:r>
         <w:instrText>5.8. Tasa de exploración en la prueba NOR</w:instrText>
       </w:r>
@@ -16784,7 +16826,7 @@
       <w:r>
         <w:instrText xml:space="preserve"> TC "</w:instrText>
       </w:r>
-      <w:bookmarkStart w:id="91" w:name="_Toc243733568"/>
+      <w:bookmarkStart w:id="91" w:name="_Toc243735298"/>
       <w:r>
         <w:instrText>5.2. Resumen del ANOVA de dos vías para la tasa de exploración en la prueba NOR</w:instrText>
       </w:r>
@@ -17823,7 +17865,7 @@
         <w:pStyle w:val="Ttulo2"/>
       </w:pPr>
       <w:bookmarkStart w:id="92" w:name="separación-de-patrones-espaciales-slr"/>
-      <w:bookmarkStart w:id="93" w:name="_Toc243733526"/>
+      <w:bookmarkStart w:id="93" w:name="_Toc243735256"/>
       <w:bookmarkEnd w:id="87"/>
       <w:r>
         <w:t>5.4 Separación de patrones espaciales (SLR)</w:t>
@@ -18414,10 +18456,10 @@
           <w:noProof/>
         </w:rPr>
         <w:drawing>
-          <wp:inline distT="0" distB="0" distL="0" distR="0" wp14:anchorId="76F89A69" wp14:editId="3A4895EC">
+          <wp:inline distT="0" distB="0" distL="0" distR="0" wp14:anchorId="7EFC6203" wp14:editId="334916CF">
             <wp:extent cx="5753100" cy="5573505"/>
             <wp:effectExtent l="0" t="0" r="0" b="0"/>
-            <wp:docPr id="1866006108" name="Picture" descr="image"/>
+            <wp:docPr id="1996793395" name="Picture" descr="image"/>
             <wp:cNvGraphicFramePr/>
             <a:graphic xmlns:a="http://schemas.openxmlformats.org/drawingml/2006/main">
               <a:graphicData uri="http://schemas.openxmlformats.org/drawingml/2006/picture">
@@ -18582,7 +18624,7 @@
       <w:r>
         <w:instrText xml:space="preserve"> TC "</w:instrText>
       </w:r>
-      <w:bookmarkStart w:id="94" w:name="_Toc243733558"/>
+      <w:bookmarkStart w:id="94" w:name="_Toc243735288"/>
       <w:r>
         <w:instrText>5.9. Exploración de los objetos y distancia recorrida en la fase de muestreo de la SLR</w:instrText>
       </w:r>
@@ -19032,10 +19074,10 @@
           <w:noProof/>
         </w:rPr>
         <w:drawing>
-          <wp:inline distT="0" distB="0" distL="0" distR="0" wp14:anchorId="0DAC483E" wp14:editId="255C2D45">
+          <wp:inline distT="0" distB="0" distL="0" distR="0" wp14:anchorId="15FCD7A5" wp14:editId="1FE9A39E">
             <wp:extent cx="5753100" cy="2161217"/>
             <wp:effectExtent l="0" t="0" r="0" b="0"/>
-            <wp:docPr id="983832857" name="Picture" descr="image"/>
+            <wp:docPr id="97293172" name="Picture" descr="image"/>
             <wp:cNvGraphicFramePr/>
             <a:graphic xmlns:a="http://schemas.openxmlformats.org/drawingml/2006/main">
               <a:graphicData uri="http://schemas.openxmlformats.org/drawingml/2006/picture">
@@ -19167,7 +19209,7 @@
       <w:r>
         <w:instrText xml:space="preserve"> TC "</w:instrText>
       </w:r>
-      <w:bookmarkStart w:id="95" w:name="_Toc243733559"/>
+      <w:bookmarkStart w:id="95" w:name="_Toc243735289"/>
       <w:r>
         <w:instrText>5.10. Índice de discriminación (DI) en la prueba SLR</w:instrText>
       </w:r>
@@ -19191,10 +19233,10 @@
         </w:rPr>
         <w:lastRenderedPageBreak/>
         <w:drawing>
-          <wp:inline distT="0" distB="0" distL="0" distR="0" wp14:anchorId="5C417320" wp14:editId="55EA8244">
+          <wp:inline distT="0" distB="0" distL="0" distR="0" wp14:anchorId="6136B399" wp14:editId="0A94CE33">
             <wp:extent cx="5753100" cy="2072942"/>
             <wp:effectExtent l="0" t="0" r="0" b="0"/>
-            <wp:docPr id="933144086" name="Picture" descr="image"/>
+            <wp:docPr id="1954480916" name="Picture" descr="image"/>
             <wp:cNvGraphicFramePr/>
             <a:graphic xmlns:a="http://schemas.openxmlformats.org/drawingml/2006/main">
               <a:graphicData uri="http://schemas.openxmlformats.org/drawingml/2006/picture">
@@ -19332,7 +19374,7 @@
       <w:r>
         <w:instrText xml:space="preserve"> TC "</w:instrText>
       </w:r>
-      <w:bookmarkStart w:id="96" w:name="_Toc243733560"/>
+      <w:bookmarkStart w:id="96" w:name="_Toc243735290"/>
       <w:r>
         <w:instrText>5.11. Tasa de exploración en la prueba SLR</w:instrText>
       </w:r>
@@ -19366,10 +19408,10 @@
           <w:noProof/>
         </w:rPr>
         <w:drawing>
-          <wp:inline distT="0" distB="0" distL="0" distR="0" wp14:anchorId="20945D45" wp14:editId="76CAEF7D">
+          <wp:inline distT="0" distB="0" distL="0" distR="0" wp14:anchorId="09B7374C" wp14:editId="54D11DFF">
             <wp:extent cx="5753100" cy="2899166"/>
             <wp:effectExtent l="0" t="0" r="0" b="0"/>
-            <wp:docPr id="282844930" name="Picture" descr="image"/>
+            <wp:docPr id="335832907" name="Picture" descr="image"/>
             <wp:cNvGraphicFramePr/>
             <a:graphic xmlns:a="http://schemas.openxmlformats.org/drawingml/2006/main">
               <a:graphicData uri="http://schemas.openxmlformats.org/drawingml/2006/picture">
@@ -19447,7 +19489,7 @@
       <w:r>
         <w:instrText xml:space="preserve"> TC "</w:instrText>
       </w:r>
-      <w:bookmarkStart w:id="97" w:name="_Toc243733561"/>
+      <w:bookmarkStart w:id="97" w:name="_Toc243735291"/>
       <w:r>
         <w:instrText>5.12. Diferencias de medias del DI entre grupos (prueba de Tukey)</w:instrText>
       </w:r>
@@ -19511,7 +19553,7 @@
       <w:r>
         <w:instrText xml:space="preserve"> TC "</w:instrText>
       </w:r>
-      <w:bookmarkStart w:id="98" w:name="_Toc243733569"/>
+      <w:bookmarkStart w:id="98" w:name="_Toc243735299"/>
       <w:r>
         <w:instrText>5.3. Resumen del ANOVA de dos vías para el DI en la prueba SLR</w:instrText>
       </w:r>
@@ -20250,7 +20292,7 @@
         <w:pStyle w:val="Ttulo2"/>
       </w:pPr>
       <w:bookmarkStart w:id="99" w:name="neurogénesis-hipocampal-pcna-y-dcx"/>
-      <w:bookmarkStart w:id="100" w:name="_Toc243733527"/>
+      <w:bookmarkStart w:id="100" w:name="_Toc243735257"/>
       <w:bookmarkEnd w:id="92"/>
       <w:r>
         <w:t>5.5 Neurogénesis hipocampal (PCNA y DCX)</w:t>
@@ -20663,10 +20705,10 @@
         </w:rPr>
         <w:lastRenderedPageBreak/>
         <w:drawing>
-          <wp:inline distT="0" distB="0" distL="0" distR="0" wp14:anchorId="62527CED" wp14:editId="118F8D4E">
+          <wp:inline distT="0" distB="0" distL="0" distR="0" wp14:anchorId="7578B319" wp14:editId="327BC2C4">
             <wp:extent cx="5753100" cy="2669560"/>
             <wp:effectExtent l="0" t="0" r="0" b="0"/>
-            <wp:docPr id="1092592832" name="Picture" descr="image"/>
+            <wp:docPr id="1438725194" name="Picture" descr="image"/>
             <wp:cNvGraphicFramePr/>
             <a:graphic xmlns:a="http://schemas.openxmlformats.org/drawingml/2006/main">
               <a:graphicData uri="http://schemas.openxmlformats.org/drawingml/2006/picture">
@@ -20863,7 +20905,7 @@
       <w:r>
         <w:instrText xml:space="preserve"> TC "</w:instrText>
       </w:r>
-      <w:bookmarkStart w:id="101" w:name="_Toc243733562"/>
+      <w:bookmarkStart w:id="101" w:name="_Toc243735292"/>
       <w:r>
         <w:instrText>5.13. Inmunocitoquímica del GD (PCNA y DCX)</w:instrText>
       </w:r>
@@ -20887,10 +20929,10 @@
         </w:rPr>
         <w:lastRenderedPageBreak/>
         <w:drawing>
-          <wp:inline distT="0" distB="0" distL="0" distR="0" wp14:anchorId="4B2CB0D1" wp14:editId="0C8826B5">
+          <wp:inline distT="0" distB="0" distL="0" distR="0" wp14:anchorId="50EB9645" wp14:editId="78F0B053">
             <wp:extent cx="2879999" cy="5961264"/>
             <wp:effectExtent l="0" t="0" r="0" b="0"/>
-            <wp:docPr id="1633056434" name="Picture" descr="image"/>
+            <wp:docPr id="559039969" name="Picture" descr="image"/>
             <wp:cNvGraphicFramePr/>
             <a:graphic xmlns:a="http://schemas.openxmlformats.org/drawingml/2006/main">
               <a:graphicData uri="http://schemas.openxmlformats.org/drawingml/2006/picture">
@@ -20993,7 +21035,7 @@
       <w:r>
         <w:instrText xml:space="preserve"> TC "</w:instrText>
       </w:r>
-      <w:bookmarkStart w:id="102" w:name="_Toc243733563"/>
+      <w:bookmarkStart w:id="102" w:name="_Toc243735293"/>
       <w:r>
         <w:instrText>5.14. Fotomicrografías representativas del GD (PCNA y DCX)</w:instrText>
       </w:r>
@@ -21081,7 +21123,7 @@
         <w:pStyle w:val="Ttulo2"/>
       </w:pPr>
       <w:bookmarkStart w:id="103" w:name="análisis-multivariado-de-la-prueba-slr"/>
-      <w:bookmarkStart w:id="104" w:name="_Toc243733528"/>
+      <w:bookmarkStart w:id="104" w:name="_Toc243735258"/>
       <w:bookmarkEnd w:id="99"/>
       <w:r>
         <w:t>5.6 Análisis multivariado de la prueba SLR</w:t>
@@ -21404,10 +21446,10 @@
         </w:rPr>
         <w:lastRenderedPageBreak/>
         <w:drawing>
-          <wp:inline distT="0" distB="0" distL="0" distR="0" wp14:anchorId="5E41ACFE" wp14:editId="189671CE">
+          <wp:inline distT="0" distB="0" distL="0" distR="0" wp14:anchorId="44A9697F" wp14:editId="32410507">
             <wp:extent cx="5753100" cy="2649453"/>
             <wp:effectExtent l="0" t="0" r="0" b="0"/>
-            <wp:docPr id="644317791" name="Picture" descr="image"/>
+            <wp:docPr id="1181578834" name="Picture" descr="image"/>
             <wp:cNvGraphicFramePr/>
             <a:graphic xmlns:a="http://schemas.openxmlformats.org/drawingml/2006/main">
               <a:graphicData uri="http://schemas.openxmlformats.org/drawingml/2006/picture">
@@ -21503,7 +21545,7 @@
       <w:r>
         <w:instrText xml:space="preserve"> TC "</w:instrText>
       </w:r>
-      <w:bookmarkStart w:id="105" w:name="_Toc243733564"/>
+      <w:bookmarkStart w:id="105" w:name="_Toc243735294"/>
       <w:r>
         <w:instrText>5.15. Análisis de componentes principales de la prueba SLR</w:instrText>
       </w:r>
@@ -21526,10 +21568,10 @@
           <w:noProof/>
         </w:rPr>
         <w:drawing>
-          <wp:inline distT="0" distB="0" distL="0" distR="0" wp14:anchorId="5E98A408" wp14:editId="20D9A997">
+          <wp:inline distT="0" distB="0" distL="0" distR="0" wp14:anchorId="036AB9DC" wp14:editId="3068D802">
             <wp:extent cx="5753100" cy="2573755"/>
             <wp:effectExtent l="0" t="0" r="0" b="0"/>
-            <wp:docPr id="843201939" name="Picture" descr="image"/>
+            <wp:docPr id="1060085636" name="Picture" descr="image"/>
             <wp:cNvGraphicFramePr/>
             <a:graphic xmlns:a="http://schemas.openxmlformats.org/drawingml/2006/main">
               <a:graphicData uri="http://schemas.openxmlformats.org/drawingml/2006/picture">
@@ -21625,7 +21667,7 @@
       <w:r>
         <w:instrText xml:space="preserve"> TC "</w:instrText>
       </w:r>
-      <w:bookmarkStart w:id="106" w:name="_Toc243733565"/>
+      <w:bookmarkStart w:id="106" w:name="_Toc243735295"/>
       <w:r>
         <w:instrText>5.16. Clasificación de los grupos experimentales con Random Forest</w:instrText>
       </w:r>
@@ -21654,7 +21696,7 @@
         <w:pStyle w:val="Ttulo1"/>
       </w:pPr>
       <w:bookmarkStart w:id="107" w:name="discusión"/>
-      <w:bookmarkStart w:id="108" w:name="_Toc243733529"/>
+      <w:bookmarkStart w:id="108" w:name="_Toc243735259"/>
       <w:bookmarkEnd w:id="70"/>
       <w:bookmarkEnd w:id="103"/>
       <w:r>
@@ -21668,7 +21710,7 @@
         <w:pStyle w:val="Ttulo2"/>
       </w:pPr>
       <w:bookmarkStart w:id="109" w:name="síntesis-de-los-hallazgos"/>
-      <w:bookmarkStart w:id="110" w:name="_Toc243733530"/>
+      <w:bookmarkStart w:id="110" w:name="_Toc243735260"/>
       <w:r>
         <w:t>6.1 Síntesis de los hallazgos</w:t>
       </w:r>
@@ -21679,7 +21721,7 @@
         <w:pStyle w:val="FirstParagraph"/>
       </w:pPr>
       <w:r>
-        <w:t xml:space="preserve">En este trabajo se evaluaron los efectos a largo plazo del consumo de un extracto de stevia durante la etapa juvenil o durante la adultez y se los comparó con los de la sacarosa al 10 %, cuyos efectos persistentes sobre la conducta y la memoria ya fueron descriptos por el laboratorio [30, 41]. Los animales expuestos a stevia exploraron más las zonas centrales del </w:t>
+        <w:t xml:space="preserve">En este trabajo se evaluaron los efectos a largo plazo del consumo de un extracto de stevia durante la etapa juvenil o durante la adultez y se los comparó con los de la sacarosa al 10 %, cuyos efectos persistentes sobre la conducta y la memoria ya fueron descriptos por el laboratorio [31, 43]. Los animales expuestos a stevia exploraron más las zonas centrales del </w:t>
       </w:r>
       <w:r>
         <w:rPr>
@@ -21728,7 +21770,7 @@
         <w:pStyle w:val="Ttulo2"/>
       </w:pPr>
       <w:bookmarkStart w:id="111" w:name="consumo-de-líquidos-1"/>
-      <w:bookmarkStart w:id="112" w:name="_Toc243733531"/>
+      <w:bookmarkStart w:id="112" w:name="_Toc243735261"/>
       <w:bookmarkEnd w:id="109"/>
       <w:r>
         <w:t>6.2 Consumo de líquidos</w:t>
@@ -21752,10 +21794,10 @@
         <w:t>endulzantes</w:t>
       </w:r>
       <w:r>
-        <w:t xml:space="preserve"> superó los valores diarios de referencia correspondientes, y este exceso fue más pronunciado durante la etapa juvenil. La OMS recomienda que los azúcares libres aporten menos del 10 % de la ingesta energética total [76], lo que para una ingesta de 2000 kcal equivale a unos 50 g por día, es decir, alrededor de 0,7 g/kg de peso corporal para un adulto de 70 kg. Con un consumo medio de 0,54 y 0,23 mL/g de peso corporal por día de la solución al 10 %, los animales expuestos a sacarosa ingirieron alrededor de 5</w:t>
-      </w:r>
-      <w:r>
-        <w:t>4 g/kg/día (juveniles) y 23 g/kg/día (adultos), unas 75 y 32 veces ese valor, respectivamente. De manera similar, la ingesta de stevia superó la ingesta diaria admisible de glucósidos de esteviol, de 4 mg/kg de peso corporal por día expresada como equivalentes de esteviol [77]. Según la composición del extracto (Tabla 4.1, con los factores de conversión a esteviol de 0,40 para el esteviósido y de 0,33 para los rebaudiósidos A y C [77]), la bebida al 4 % contenía alrededor de 0,08 mg/mL de equivalentes de es</w:t>
+        <w:t xml:space="preserve"> superó los valores diarios de referencia correspondientes, y este exceso fue más pronunciado durante la etapa juvenil. La OMS recomienda que los azúcares libres aporten menos del 10 % de la ingesta energética total [78], lo que para una ingesta de 2000 kcal equivale a unos 50 g por día, es decir, alrededor de 0,7 g/kg de peso corporal para un adulto de 70 kg. Con un consumo medio de 0,54 y 0,23 mL/g de peso corporal por día de la solución al 10 %, los animales expuestos a sacarosa ingirieron alrededor de 5</w:t>
+      </w:r>
+      <w:r>
+        <w:t>4 g/kg/día (juveniles) y 23 g/kg/día (adultos), unas 75 y 32 veces ese valor, respectivamente. De manera similar, la ingesta de stevia superó la ingesta diaria admisible de glucósidos de esteviol, de 4 mg/kg de peso corporal por día expresada como equivalentes de esteviol [79]. Según la composición del extracto (Tabla 4.1, con los factores de conversión a esteviol de 0,40 para el esteviósido y de 0,33 para los rebaudiósidos A y C [79]), la bebida al 4 % contenía alrededor de 0,08 mg/mL de equivalentes de es</w:t>
       </w:r>
       <w:r>
         <w:t>teviol; con un consumo medio de 0,24 y 0,09 mL/g de peso corporal por día, los animales juveniles ingirieron alrededor de 20 mg/kg/día (unas cinco veces la ingesta diaria admisible) y los adultos, alrededor de 7 mg/kg/día (1,8 veces).</w:t>
@@ -21779,7 +21821,7 @@
       </w:r>
       <w:r>
         <w:lastRenderedPageBreak/>
-        <w:t>con frustración, como fue descripto previamente por el laboratorio [41]. Por el contrario, los juveniles expuestos a stevia bebieron menos agua que su control de edad durante</w:t>
+        <w:t>con frustración, como fue descripto previamente por el laboratorio [43]. Por el contrario, los juveniles expuestos a stevia bebieron menos agua que su control de edad durante</w:t>
       </w:r>
       <w:r>
         <w:t xml:space="preserve"> los primeros nueve días, y más entre los días 11 y 25</w:t>
@@ -21799,7 +21841,7 @@
         <w:pStyle w:val="Ttulo2"/>
       </w:pPr>
       <w:bookmarkStart w:id="113" w:name="Xbe6db9f52668e63da41a503be782c14d7927980"/>
-      <w:bookmarkStart w:id="114" w:name="_Toc243733532"/>
+      <w:bookmarkStart w:id="114" w:name="_Toc243735262"/>
       <w:bookmarkEnd w:id="111"/>
       <w:r>
         <w:t xml:space="preserve">6.3 Conducta tipo ansiosa y exploración en el </w:t>
@@ -21847,7 +21889,7 @@
         <w:t>;</w:t>
       </w:r>
       <w:r>
-        <w:t xml:space="preserve"> mientras que los expuestos a sacarosa durante la adultez no difirieron de su control (§5.2), lo que indica que el consumo temprano de una bebida azucarada promueve un perfil ansioso a largo plazo, como fue descripto anteriormente [41].</w:t>
+        <w:t xml:space="preserve"> mientras que los expuestos a sacarosa durante la adultez no difirieron de su control (§5.2), lo que indica que el consumo temprano de una bebida azucarada promueve un perfil ansioso a largo plazo, como fue descripto anteriormente [43].</w:t>
       </w:r>
     </w:p>
     <w:p>
@@ -21904,7 +21946,7 @@
         <w:t>mientras dura el consumo</w:t>
       </w:r>
       <w:r>
-        <w:t xml:space="preserve"> [39, 40]. </w:t>
+        <w:t xml:space="preserve"> [41, 42]. </w:t>
       </w:r>
       <w:r>
         <w:rPr>
@@ -21913,7 +21955,13 @@
         <w:t>Esto sugiere que el consumo de stevia imprimiría alteraciones neurobiológicas responsables de los cambios de la conducta de tipo ansioso observables a largo plazo. De manera similar, estudios del laboratorio sugieren que el consumo de sacarosa posee efectos ansiolíticos a corto plazo</w:t>
       </w:r>
       <w:r>
-        <w:t xml:space="preserve"> [45, 69]</w:t>
+        <w:t xml:space="preserve"> </w:t>
+      </w:r>
+      <w:r>
+        <w:rPr>
+          <w:highlight w:val="cyan"/>
+        </w:rPr>
+        <w:t>[71]</w:t>
       </w:r>
       <w:r>
         <w:rPr>
@@ -21922,7 +21970,7 @@
         <w:t>, que difieren de los ansiogénicos encontrados a largo plazo, posiblemente como resultado de la abstinencia</w:t>
       </w:r>
       <w:r>
-        <w:t xml:space="preserve"> [41]. </w:t>
+        <w:t xml:space="preserve"> [43]. </w:t>
       </w:r>
       <w:r>
         <w:rPr>
@@ -21941,7 +21989,7 @@
         <w:t>open field</w:t>
       </w:r>
       <w:r>
-        <w:t xml:space="preserve"> [78], mientras que, a largo plazo, no modificó la distancia total recorrida y aumentó la exploración de las zonas centrales.</w:t>
+        <w:t xml:space="preserve"> [80], mientras que, a largo plazo, no modificó la distancia total recorrida y aumentó la exploración de las zonas centrales.</w:t>
       </w:r>
     </w:p>
     <w:p>
@@ -21973,7 +22021,7 @@
         <w:t>hembras</w:t>
       </w:r>
       <w:r>
-        <w:t xml:space="preserve"> juveniles disminuye las conductas de tipo ansioso en el laberinto en cruz elevado [27]. Estos hallazgos sugieren la existencia de diferencias sexuales en la respuesta </w:t>
+        <w:t xml:space="preserve"> juveniles disminuye las conductas de tipo ansioso en el laberinto en cruz elevado [28]. Estos hallazgos sugieren la existencia de diferencias sexuales en la respuesta </w:t>
       </w:r>
       <w:r>
         <w:rPr>
@@ -21990,7 +22038,7 @@
         <w:pStyle w:val="Textoindependiente"/>
       </w:pPr>
       <w:r>
-        <w:t xml:space="preserve">Estos resultados están en línea con los que demuestran efectos ansiolíticos de la stevia en ratas diabéticas [37]. Los animales expuestos a stevia realizaron, además, menos </w:t>
+        <w:t xml:space="preserve">Estos resultados están en línea con los que demuestran efectos ansiolíticos de la stevia en ratas diabéticas [39]. Los animales expuestos a stevia realizaron, además, menos </w:t>
       </w:r>
       <w:r>
         <w:rPr>
@@ -22000,7 +22048,7 @@
         <w:t>rearing</w:t>
       </w:r>
       <w:r>
-        <w:t xml:space="preserve"> (los juveniles respecto del control y los adultos en el tiempo dedicado), una conducta exploratoria vertical asociada a la novedad y al hipocampo [71]; sin embargo, este cambio no se acompañó de una menor exploración de la arena, sino de una mayor exploración del centro</w:t>
+        <w:t xml:space="preserve"> (los juveniles respecto del control y los adultos en el tiempo dedicado), una conducta exploratoria vertical asociada a la novedad y al hipocampo [73]; sin embargo, este cambio no se acompañó de una menor exploración de la arena, sino de una mayor exploración del centro</w:t>
       </w:r>
       <w:r>
         <w:rPr>
@@ -22017,7 +22065,7 @@
         <w:pStyle w:val="Ttulo2"/>
       </w:pPr>
       <w:bookmarkStart w:id="115" w:name="memoria-de-reconocimiento-de-objetos"/>
-      <w:bookmarkStart w:id="116" w:name="_Toc243733533"/>
+      <w:bookmarkStart w:id="116" w:name="_Toc243735263"/>
       <w:bookmarkEnd w:id="113"/>
       <w:r>
         <w:lastRenderedPageBreak/>
@@ -22033,7 +22081,7 @@
         <w:t>En el NOR, los animales expuestos a sacarosa durante la etapa juvenil presentaron una menor exploración del objeto novedoso que sus controles de edad en todos los intervalos de retención evaluados: a las 2 h (memoria a corto plazo), a las 24 h (memoria a largo plazo) y a los 7 días (memoria consolidada). En contraste, los animales expuestos a sacarosa durante la adultez conservaron la capacidad de discriminar entre el objeto familiar y el novedoso en los tres intervalos de retención (§5.3), como fue descrip</w:t>
       </w:r>
       <w:r>
-        <w:t>to previamente [30].</w:t>
+        <w:t>to previamente [31].</w:t>
       </w:r>
     </w:p>
     <w:p>
@@ -22068,10 +22116,19 @@
         <w:t>reconocimiento de una localización novedosa</w:t>
       </w:r>
       <w:r>
-        <w:t xml:space="preserve"> (prueba NOL) [39, 40]. Además, en este estudio los animales presentaron modificaciones en la expresión de calretinina (CR), un marcador de determinadas poblaciones de interneuronas GABAérgicas, en la corteza prefrontal medial [40]. Las interneuronas que expresan parvalbúmina (PV) y CR son importantes reguladoras de la actividad de los circuitos neuronales y desempeñan funciones relevantes en procesos cognitivos como la memoria y la sincronización de las redes neuronales [79, 80]. En este sentido, estudios </w:t>
-      </w:r>
-      <w:r>
-        <w:t>previos demostraron que la disminución de la expresión de PV en el hipocampo y en la corteza prefrontal tras el consumo de sacarosa se asocia con alteraciones de la memoria y de las conductas de tipo ansioso [41–43, 81]. Considerando estos antecedentes, sería de interés investigar si las modificaciones en la expresión de CR tras el consumo juvenil de stevia persisten hasta la edad adulta y si se relacionan con las alteraciones de la memoria de reconocimiento observadas a largo plazo.</w:t>
+        <w:t xml:space="preserve"> (prueba NOL) [41, 42]. Además, en este estudio los animales presentaron modificaciones en la expresión de calretinina (CR), un marcador de determinadas poblaciones de interneuronas GABAérgicas, en la corteza prefrontal medial [42]. Las interneuronas que expresan parvalbúmina (PV) y CR son importantes reguladoras de la actividad de los circuitos neuronales y desempeñan funciones relevantes en procesos cognitivos como la memoria y la sincronización de las redes neuronales [81, 82]. En este sentido, estudios </w:t>
+      </w:r>
+      <w:r>
+        <w:t xml:space="preserve">previos demostraron que la disminución de la expresión de PV en el hipocampo y en la corteza prefrontal tras el consumo de sacarosa </w:t>
+      </w:r>
+      <w:r>
+        <w:rPr>
+          <w:highlight w:val="cyan"/>
+        </w:rPr>
+        <w:t>[44, 45, 83] y el aumento de CR en la corteza prefrontal medial [43] se asocian</w:t>
+      </w:r>
+      <w:r>
+        <w:t xml:space="preserve"> con alteraciones de la memoria y de las conductas de tipo ansioso. Considerando estos antecedentes, sería de interés investigar si las modificaciones en la expresión de CR tras el consumo juvenil de stevia persisten hasta la edad adulta y si se relacionan con las alteraciones de la memoria de reconocimiento observadas a largo plazo.</w:t>
       </w:r>
     </w:p>
     <w:p>
@@ -22079,10 +22136,10 @@
         <w:pStyle w:val="Textoindependiente"/>
       </w:pPr>
       <w:r>
-        <w:t>Son escasos los trabajos que evaluaron los efectos de la stevia sobre la memoria a largo plazo, es decir, después de finalizado el consumo. La mayoría la evaluó mientras los animales aún consumían el edulcorante, con resultados dispares. Morales-Ríos et al. encontraron que el consumo de stevia durante 18 semanas alteró la memoria a largo plazo en el NOR de ratas macho adultas [82]. En cambio, Tsan et al., que administraron edulcorantes de bajas calorías (acesulfamo de potasio, sacarina o stevia) desde la et</w:t>
-      </w:r>
-      <w:r>
-        <w:t>apa juvenil y evaluaron la memoria dependiente del hipocampo durante el período de consumo, describieron un deterioro al analizar los tres edulcorantes en conjunto, pero no al analizar la stevia por separado [34]. A largo plazo, solo se describió que el consumo materno de stevia durante la gestación y la lactancia se asocia con un peor desempeño de memoria en la descendencia macho adulta [83]. Este trabajo aporta, por lo tanto, evidencia de que el consumo de stevia en la etapa juvenil o en la adultez produc</w:t>
+        <w:t>Son escasos los trabajos que evaluaron los efectos de la stevia sobre la memoria a largo plazo, es decir, después de finalizado el consumo. La mayoría la evaluó mientras los animales aún consumían el edulcorante, con resultados dispares. Morales-Ríos et al. encontraron que el consumo de stevia durante 18 semanas alteró la memoria a largo plazo en el NOR de ratas macho adultas [84]. En cambio, Tsan et al., que administraron edulcorantes de bajas calorías (acesulfamo de potasio, sacarina o stevia) desde la et</w:t>
+      </w:r>
+      <w:r>
+        <w:t>apa juvenil y evaluaron la memoria dependiente del hipocampo durante el período de consumo, describieron un deterioro al analizar los tres edulcorantes en conjunto, pero no al analizar la stevia por separado [36]. A largo plazo, solo se describió que el consumo materno de stevia durante la gestación y la lactancia se asocia con un peor desempeño de memoria en la descendencia macho adulta [85]. Este trabajo aporta, por lo tanto, evidencia de que el consumo de stevia en la etapa juvenil o en la adultez produc</w:t>
       </w:r>
       <w:r>
         <w:t>e alteraciones de la memoria de reconocimiento que persisten después de finalizado el consumo, aunque más limitadas que las de la sacarosa.</w:t>
@@ -22093,14 +22150,23 @@
         <w:pStyle w:val="Textoindependiente"/>
       </w:pPr>
       <w:r>
-        <w:t>A diferencia de esos estudios, que administraron la stevia en dosis cercanas a la ingesta diaria admisible, aquí se administró un extracto acuoso de hojas que contiene, además de glucósidos de esteviol, compuestos fenólicos y flavonoides con actividad antioxidante (Tabla 4.1). La stevia redujo los marcadores de estrés oxidativo cerebral en ratas alimentadas con una dieta alta en grasas y sacarosa [31], y los glucósidos de esteviol presentan actividad antioxidante [32], revirtieron el deterioro de la memoria</w:t>
-      </w:r>
-      <w:r>
-        <w:t xml:space="preserve"> inducido por escopolamina [35] y modularon la </w:t>
+        <w:t>A diferencia de esos estudios, que administraron la stevia en dosis cercanas a la ingesta diaria admisible, aquí se administró un extracto acuoso de hojas que contiene, además de glucósidos de esteviol, compuestos fenólicos y flavonoides con actividad antioxidante (Tabla 4.1). La stevia redujo los marcadores de estrés oxidativo cerebral en ratas alimentadas con una dieta alta en grasas y sacarosa [33], y los glucósidos de esteviol presentan actividad antioxidante [34], revirtieron el deterioro de la memoria</w:t>
+      </w:r>
+      <w:r>
+        <w:t xml:space="preserve"> inducido por escopolamina [37] </w:t>
+      </w:r>
+      <w:r>
+        <w:rPr>
+          <w:highlight w:val="cyan"/>
+        </w:rPr>
+        <w:t>, y las hojas de stevia</w:t>
+      </w:r>
+      <w:r>
+        <w:t xml:space="preserve"> </w:t>
       </w:r>
       <w:r>
         <w:lastRenderedPageBreak/>
-        <w:t xml:space="preserve">plasticidad sináptica hipocampal en un modelo de desorden metabólico [36]. </w:t>
+        <w:t xml:space="preserve">modularon la plasticidad sináptica hipocampal en un modelo de desorden metabólico [38]. </w:t>
       </w:r>
       <w:r>
         <w:rPr>
@@ -22118,7 +22184,7 @@
         <w:rPr>
           <w:highlight w:val="yellow"/>
         </w:rPr>
-        <w:t xml:space="preserve"> [40]. En conjunto, estos antecedentes sugieren que los compuestos presentes en la stevia podrían ejercer efectos neuroprotectores en determinadas condiciones patológicas, posiblemente asociados con sus propiedades antioxidantes y su capacidad para modular la plasticidad sináptica.</w:t>
+        <w:t xml:space="preserve"> [42]. En conjunto, estos antecedentes sugieren que los compuestos presentes en la stevia podrían ejercer efectos neuroprotectores en determinadas condiciones patológicas, posiblemente asociados con sus propiedades antioxidantes y su capacidad para modular la plasticidad sináptica.</w:t>
       </w:r>
     </w:p>
     <w:p>
@@ -22126,7 +22192,7 @@
         <w:pStyle w:val="Ttulo2"/>
       </w:pPr>
       <w:bookmarkStart w:id="117" w:name="Xa69d358d6a5b9d31515259c5445516064b70d4b"/>
-      <w:bookmarkStart w:id="118" w:name="_Toc243733534"/>
+      <w:bookmarkStart w:id="118" w:name="_Toc243735264"/>
       <w:bookmarkEnd w:id="115"/>
       <w:r>
         <w:t>6.5 Separación de patrones espaciales y neurogénesis</w:t>
@@ -22138,10 +22204,10 @@
         <w:pStyle w:val="FirstParagraph"/>
       </w:pPr>
       <w:r>
-        <w:t>En la SLR, los animales expuestos a sacarosa durante la etapa juvenil discriminaron peor la posición novedosa en ambas configuraciones, mientras que los expuestos durante la adultez lo hicieron solo en la s-SLR, la configuración de mayor demanda de separación de patrones (§5.4). Este patrón concuerda con el de Reichelt et al., quienes encontraron que las ratas con acceso diario a sacarosa discriminaron la nueva ubicación de un objeto cuando la separación espacial era grande, pero no cuando era pequeña [29].</w:t>
-      </w:r>
-      <w:r>
-        <w:t xml:space="preserve"> También concuerda con la alteración selectiva de la memoria de lugar descripta tras una exposición breve a azúcar [84, 85] y con el deterioro de la separación de patrones asociado a una menor neurogénesis tras una alteración nutricional temprana [72]. Que en los adultos el déficit apareciera solo en la configuración más exigente sugiere que la exposición adulta a sacarosa compromete específicamente la separación de patrones, mientras que la exposición juvenil produce una alteración más amplia de la memoria</w:t>
+        <w:t>En la SLR, los animales expuestos a sacarosa durante la etapa juvenil discriminaron peor la posición novedosa en ambas configuraciones, mientras que los expuestos durante la adultez lo hicieron solo en la s-SLR, la configuración de mayor demanda de separación de patrones (§5.4). Este patrón concuerda con el de Reichelt et al., quienes encontraron que las ratas con acceso diario a sacarosa discriminaron la nueva ubicación de un objeto cuando la separación espacial era grande, pero no cuando era pequeña [30].</w:t>
+      </w:r>
+      <w:r>
+        <w:t xml:space="preserve"> También concuerda con la alteración selectiva de la memoria de lugar descripta tras una exposición breve a azúcar [86, 87] y con el deterioro de la separación de patrones asociado a una menor neurogénesis tras una alteración nutricional temprana [74]. Que en los adultos el déficit apareciera solo en la configuración más exigente sugiere que la exposición adulta a sacarosa compromete específicamente la separación de patrones, mientras que la exposición juvenil produce una alteración más amplia de la memoria</w:t>
       </w:r>
       <w:r>
         <w:t xml:space="preserve"> espacial</w:t>
@@ -22223,7 +22289,7 @@
         <w:t>+</w:t>
       </w:r>
       <w:r>
-        <w:t xml:space="preserve"> (§5.5). Estos resultados indican que la sacarosa afecta la etapa proliferativa del linaje neuronal [55] y que esa alteración persiste 25 días después de finalizado el consumo. Reichelt et al. también encontraron menos células PCNA</w:t>
+        <w:t xml:space="preserve"> (§5.5). Estos resultados indican que la sacarosa afecta la etapa proliferativa del linaje neuronal [57] y que esa alteración persiste 25 días después de finalizado el consumo. Reichelt et al. también encontraron menos células PCNA</w:t>
       </w:r>
       <w:r>
         <w:rPr>
@@ -22250,7 +22316,7 @@
         <w:t>+</w:t>
       </w:r>
       <w:r>
-        <w:t xml:space="preserve"> [29]. En este trabajo, en cambio, el número total de células DCX</w:t>
+        <w:t xml:space="preserve"> [30]. En este trabajo, en cambio, el número total de células DCX</w:t>
       </w:r>
       <w:r>
         <w:rPr>
@@ -22268,7 +22334,7 @@
         <w:t>GD</w:t>
       </w:r>
       <w:r>
-        <w:t xml:space="preserve"> [42]; esto podría indicar que, a largo plazo, la alteración se restringe a la etapa proliferativa.</w:t>
+        <w:t xml:space="preserve"> [44]; esto podría indicar que, a largo plazo, la alteración se restringe a la etapa proliferativa.</w:t>
       </w:r>
     </w:p>
     <w:p>
@@ -22300,7 +22366,7 @@
           <w:highlight w:val="yellow"/>
         </w:rPr>
         <w:lastRenderedPageBreak/>
-        <w:t xml:space="preserve">representaciones neuronales diferenciadas durante la formación de la memoria [29]. En particular, se ha propuesto que la neurogénesis adulta en el </w:t>
+        <w:t xml:space="preserve">representaciones neuronales diferenciadas durante la formación de la memoria [30]. En particular, se ha propuesto que la neurogénesis adulta en el </w:t>
       </w:r>
       <w:r>
         <w:rPr>
@@ -22312,7 +22378,19 @@
         <w:rPr>
           <w:highlight w:val="yellow"/>
         </w:rPr>
-        <w:t xml:space="preserve"> contribuye a este proceso, especialmente cuando las tareas presentan una elevada demanda cognitiva [62]. En este contexto, la reducción de la proliferación celular inducida por el consumo de sacarosa podría constituir uno de los mecanismos neurobiológicos que subyacen a los déficits de separación de patrones observados en ambas edades.</w:t>
+        <w:t xml:space="preserve"> contribuye a este proceso, especialmente cuando las tareas presentan una elevada demanda cognitiva </w:t>
+      </w:r>
+      <w:r>
+        <w:rPr>
+          <w:highlight w:val="cyan"/>
+        </w:rPr>
+        <w:t>[30, 64]</w:t>
+      </w:r>
+      <w:r>
+        <w:rPr>
+          <w:highlight w:val="yellow"/>
+        </w:rPr>
+        <w:t>. En este contexto, la reducción de la proliferación celular inducida por el consumo de sacarosa podría constituir uno de los mecanismos neurobiológicos que subyacen a los déficits de separación de patrones observados en ambas edades.</w:t>
       </w:r>
     </w:p>
     <w:p>
@@ -22336,7 +22414,7 @@
         <w:rPr>
           <w:highlight w:val="yellow"/>
         </w:rPr>
-        <w:t>) en el GD, inducida por un tratamiento combinado con cafeína y sacarosa, no afecta el desempeño en tareas de memoria espacial ni de memoria de reconocimiento de objetos de largo plazo [42].</w:t>
+        <w:t>) en el GD, inducida por un tratamiento combinado con cafeína y sacarosa, no afecta el desempeño en tareas de memoria espacial ni de memoria de reconocimiento de objetos de largo plazo [44].</w:t>
       </w:r>
     </w:p>
     <w:p>
@@ -22355,7 +22433,7 @@
         <w:pStyle w:val="Ttulo2"/>
       </w:pPr>
       <w:bookmarkStart w:id="119" w:name="análisis-multivariado"/>
-      <w:bookmarkStart w:id="120" w:name="_Toc243733535"/>
+      <w:bookmarkStart w:id="120" w:name="_Toc243735265"/>
       <w:bookmarkEnd w:id="117"/>
       <w:r>
         <w:t>6.6 Análisis multivariado</w:t>
@@ -22383,7 +22461,25 @@
         <w:t>open field</w:t>
       </w:r>
       <w:r>
-        <w:t xml:space="preserve"> (§6.3). Ni el clustering ni el clasificador encontraron grupos conductuales separados, y la exactitud del clasificador, superior al azar pero modesta, es la esperable para una intervención nutricional: en los trabajos que aplicaron Random Forest al fenotipado conductual, los grupos diferían por manipulaciones farmacológicas o genéticas de gran efecto [46, 47].</w:t>
+        <w:t xml:space="preserve"> (§6.3). Ni el clustering ni el clasificador encontraron grupos conductuales separados, y la exactitud del clasificador, superior al azar pero modesta, es la esperable para una intervención nutricional: en los trabajos que aplicaron </w:t>
+      </w:r>
+      <w:r>
+        <w:rPr>
+          <w:highlight w:val="cyan"/>
+        </w:rPr>
+        <w:t>aprendizaje automático</w:t>
+      </w:r>
+      <w:r>
+        <w:t xml:space="preserve"> al fenotipado conductual, los grupos </w:t>
+      </w:r>
+      <w:r>
+        <w:rPr>
+          <w:highlight w:val="cyan"/>
+        </w:rPr>
+        <w:t>diferían genéticamente (líneas knockout o cepas distintas), con efectos de gran magnitud</w:t>
+      </w:r>
+      <w:r>
+        <w:t xml:space="preserve"> [48, 49].</w:t>
       </w:r>
     </w:p>
     <w:p>
@@ -22391,7 +22487,7 @@
         <w:pStyle w:val="Ttulo2"/>
       </w:pPr>
       <w:bookmarkStart w:id="121" w:name="ventana-etaria"/>
-      <w:bookmarkStart w:id="122" w:name="_Toc243733536"/>
+      <w:bookmarkStart w:id="122" w:name="_Toc243735266"/>
       <w:bookmarkEnd w:id="119"/>
       <w:r>
         <w:t>6.7 Ventana etaria</w:t>
@@ -22436,7 +22532,7 @@
         <w:pStyle w:val="Ttulo2"/>
       </w:pPr>
       <w:bookmarkStart w:id="123" w:name="en-resumen"/>
-      <w:bookmarkStart w:id="124" w:name="_Toc243733537"/>
+      <w:bookmarkStart w:id="124" w:name="_Toc243735267"/>
       <w:bookmarkEnd w:id="121"/>
       <w:r>
         <w:t>6.8 En resumen</w:t>
@@ -22468,7 +22564,7 @@
         <w:t>En conclusión, los resultados obtenidos, junto con la evidencia aportada por estudios previos, sugieren que el consumo crónico de bebidas azucaradas durante etapas tempranas de la vida puede afectar negativamente el desarrollo y la maduración del sistema nervioso central, con consecuencias que podrían persistir hasta la edad adulta. Por su parte, el consumo de stevia se asoció con un perfil de efectos diferente, caracterizado por conductas de tipo ansiolítico y alteraciones más moderadas de la memoria de re</w:t>
       </w:r>
       <w:r>
-        <w:t>conocimiento, observadas tanto en animales juveniles como adultos. Si bien estos efectos fueron de menor magnitud que los asociados al consumo de sacarosa, su presencia en ambas etapas de la vida, sumada a los efectos sobre la fertilidad descriptos en ratas hembra [27], pone de manifiesto que la stevia no está exenta de efectos. En este sentido, resulta fundamental continuar investigando sus posibles consecuencias neurobiológicas y cognitivas a largo plazo, así como profundizar en la evaluación de la seguri</w:t>
+        <w:t>conocimiento, observadas tanto en animales juveniles como adultos. Si bien estos efectos fueron de menor magnitud que los asociados al consumo de sacarosa, su presencia en ambas etapas de la vida, sumada a los efectos sobre la fertilidad descriptos en ratas hembra [28], pone de manifiesto que la stevia no está exenta de efectos. En este sentido, resulta fundamental continuar investigando sus posibles consecuencias neurobiológicas y cognitivas a largo plazo, así como profundizar en la evaluación de la seguri</w:t>
       </w:r>
       <w:r>
         <w:t>dad de su consumo en las distintas etapas de la vida.</w:t>
@@ -22479,7 +22575,7 @@
         <w:pStyle w:val="Ttulo1"/>
       </w:pPr>
       <w:bookmarkStart w:id="125" w:name="perspectivas-futuras"/>
-      <w:bookmarkStart w:id="126" w:name="_Toc243733538"/>
+      <w:bookmarkStart w:id="126" w:name="_Toc243735268"/>
       <w:bookmarkEnd w:id="107"/>
       <w:bookmarkEnd w:id="123"/>
       <w:r>
@@ -22650,7 +22746,7 @@
         <w:pStyle w:val="Ttulo1"/>
       </w:pPr>
       <w:bookmarkStart w:id="127" w:name="conclusiones"/>
-      <w:bookmarkStart w:id="128" w:name="_Toc243733539"/>
+      <w:bookmarkStart w:id="128" w:name="_Toc243735269"/>
       <w:bookmarkEnd w:id="125"/>
       <w:r>
         <w:lastRenderedPageBreak/>
@@ -22795,7 +22891,7 @@
         <w:pStyle w:val="Ttulo2"/>
       </w:pPr>
       <w:bookmarkStart w:id="129" w:name="cumplimiento-de-los-objetivos"/>
-      <w:bookmarkStart w:id="130" w:name="_Toc243733540"/>
+      <w:bookmarkStart w:id="130" w:name="_Toc243735270"/>
       <w:r>
         <w:t>Cumplimiento de los objetivos</w:t>
       </w:r>
@@ -22823,7 +22919,7 @@
         <w:pStyle w:val="Ttulo2"/>
       </w:pPr>
       <w:bookmarkStart w:id="131" w:name="hipótesis-1"/>
-      <w:bookmarkStart w:id="132" w:name="_Toc243733541"/>
+      <w:bookmarkStart w:id="132" w:name="_Toc243735271"/>
       <w:bookmarkEnd w:id="129"/>
       <w:r>
         <w:t>Hipótesis</w:t>
@@ -22855,7 +22951,7 @@
         <w:pStyle w:val="Ttulo1"/>
       </w:pPr>
       <w:bookmarkStart w:id="133" w:name="referencias-bibliográficas"/>
-      <w:bookmarkStart w:id="134" w:name="_Toc243733542"/>
+      <w:bookmarkStart w:id="134" w:name="_Toc243735272"/>
       <w:bookmarkEnd w:id="127"/>
       <w:bookmarkEnd w:id="131"/>
       <w:r>
@@ -23203,7 +23299,7 @@
         <w:rPr>
           <w:sz w:val="19"/>
         </w:rPr>
-        <w:t>[23] L. Lara-Castor et al., “Burdens of type 2 diabetes and cardiovascular disease attributable to sugar-sweetened beverages in 184 countries,” Nat. Med., 2025. doi: 10.1038/s41591-024-03345-4</w:t>
+        <w:t>[23] A. Alcaraz et al., “Health and economic burden of disease of sugar-sweetened beverage consumption in four Latin American and Caribbean countries: a modelling study,” BMJ Open, vol. 13, no. 2, 2023, Art. no. e062809. doi: 10.1136/bmjopen-2022-062809</w:t>
       </w:r>
     </w:p>
     <w:p>
@@ -23216,13 +23312,13 @@
         <w:rPr>
           <w:sz w:val="19"/>
         </w:rPr>
-        <w:t xml:space="preserve">[24] Mordor Intelligence. “Stevia Market – Size, Share &amp; Trends Analysis Report 2024–2029,” </w:t>
-      </w:r>
-      <w:r>
-        <w:rPr>
-          <w:sz w:val="19"/>
-        </w:rPr>
-        <w:t>Accessed: May 18, 2026. [Online]. Available: https://www.mordorintelligence.com/es/industry-reports/stevia-market</w:t>
+        <w:t>[24] L. Lara-Castor et al., “</w:t>
+      </w:r>
+      <w:r>
+        <w:rPr>
+          <w:sz w:val="19"/>
+        </w:rPr>
+        <w:t>Burdens of type 2 diabetes and cardiovascular disease attributable to sugar-sweetened beverages in 184 countries,” Nat. Med., 2025. doi: 10.1038/s41591-024-03345-4</w:t>
       </w:r>
     </w:p>
     <w:p>
@@ -23235,7 +23331,7 @@
         <w:rPr>
           <w:sz w:val="19"/>
         </w:rPr>
-        <w:t>[25] Informes de Expertos. “Mercado Latinoamericano de Stevia 2025–2034,” Accessed: May 18, 2026. [Online]. Available: https://www.informesdeexpertos.com/informes/mercadolatinoamericano-de-stevia</w:t>
+        <w:t>[25] Mordor Intelligence. “Tamaño y participación del mercado de stevia: análisis de crecimiento, tendencias y pronóstico (2026–2031),” Accessed: Oct. 24, 2026. [Online]. Available: https://www.mordorintelligence.com/es/industry-reports/stevia-market</w:t>
       </w:r>
     </w:p>
     <w:p>
@@ -23248,13 +23344,13 @@
         <w:rPr>
           <w:sz w:val="19"/>
         </w:rPr>
-        <w:t xml:space="preserve">[26] Informes de Expertos. “Mercado de Edulcorantes Alimentarios en Argentina 2025–2034,” </w:t>
-      </w:r>
-      <w:r>
-        <w:rPr>
-          <w:sz w:val="19"/>
-        </w:rPr>
-        <w:t>Accessed: May 18, 2026. [Online]. Available: https://www.informesdeexpertos.com/informes/mercado-de-edulcorantesalimentarios-en-argentina</w:t>
+        <w:t xml:space="preserve">[26] Informes de Expertos. “Mercado Latinoamericano de Stevia 2025–2034,” </w:t>
+      </w:r>
+      <w:r>
+        <w:rPr>
+          <w:sz w:val="19"/>
+        </w:rPr>
+        <w:t>Accessed: May 18, 2026. [Online]. Available: https://www.informesdeexpertos.com/informes/mercadolatinoamericano-de-stevia</w:t>
       </w:r>
     </w:p>
     <w:p>
@@ -23267,7 +23363,7 @@
         <w:rPr>
           <w:sz w:val="19"/>
         </w:rPr>
-        <w:t>[27] M. S. Kruse, H. Coirini, and M. Rey, “Early Consumption of Stevia rebaudiana Bertoni on Rat Females: Actions on Their Fertility, Progeny, and Behavior,” J. Nutr., vol. 155, no. 6, pp. 1839–1850, Jun. 2025. doi: 10.1016/j.tjnut.2025.04.023 [Online]. Available: https://www.sciencedirect.com/science/article/abs/pii/S0022316625002688</w:t>
+        <w:t>[27] Informes de Expertos. “Mercado de Edulcorantes Alimentarios en Argentina 2025–2034,” Accessed: May 18, 2026. [Online]. Available: https://www.informesdeexpertos.com/informes/mercado-de-edulcorantesalimentarios-en-argentina</w:t>
       </w:r>
     </w:p>
     <w:p>
@@ -23280,13 +23376,13 @@
         <w:rPr>
           <w:sz w:val="19"/>
         </w:rPr>
-        <w:t>[28] L. P. Spear, “</w:t>
-      </w:r>
-      <w:r>
-        <w:rPr>
-          <w:sz w:val="19"/>
-        </w:rPr>
-        <w:t>The adolescent brain and age-related behavioral manifestations,” Neurosci. Biobehav. Rev., vol. 24, no. 4, pp. 417–463, 2000. doi: 10.1016/S0149-7634(00)00014-2</w:t>
+        <w:t xml:space="preserve">[28] M. S. Kruse, H. Coirini, and M. Rey, “Early Consumption of Stevia rebaudiana Bertoni on Rat Females: Actions on Their Fertility, Progeny, and Behavior,” </w:t>
+      </w:r>
+      <w:r>
+        <w:rPr>
+          <w:sz w:val="19"/>
+        </w:rPr>
+        <w:t>J. Nutr., vol. 155, no. 6, pp. 1839–1850, Jun. 2025. doi: 10.1016/j.tjnut.2025.04.023 [Online]. Available: https://www.sciencedirect.com/science/article/abs/pii/S0022316625002688</w:t>
       </w:r>
     </w:p>
     <w:p>
@@ -23299,7 +23395,7 @@
         <w:rPr>
           <w:sz w:val="19"/>
         </w:rPr>
-        <w:t>[29] A. C. Reichelt, M. J. Morris, and R. F. Westbrook, “Daily access to sucrose impairs aspects of spatial memory tasks reliant on pattern separation and neural proliferation in rats,” Learn. Mem., vol. 23, no. 7, pp. 386–390, Jul. 2016. doi: 10.1101/lm.042416.116 [Online]. Available: http://www.ncbi.nlm.nih.gov/pubmed/27317199</w:t>
+        <w:t>[29] L. P. Spear, “The adolescent brain and age-related behavioral manifestations,” Neurosci. Biobehav. Rev., vol. 24, no. 4, pp. 417–463, 2000. doi: 10.1016/S0149-7634(00)00014-2</w:t>
       </w:r>
     </w:p>
     <w:p>
@@ -23312,7 +23408,13 @@
         <w:rPr>
           <w:sz w:val="19"/>
         </w:rPr>
-        <w:t>[30] H. Coirini et al., “Long-Term Memory Function Impairments following Sucrose Exposure in Juvenile versus Adult Rats,” Biomedicines, vol. 10, no. 11, Nov. 2022, Art. no. 2723. doi: 10.3390/biomedicines10112723 [Online]. Available: https://www.mdpi.com/2227-9059/10/11/2723</w:t>
+        <w:t>[30] A. C. Reichelt, M. J. Morris, and R. F. Westbrook, “</w:t>
+      </w:r>
+      <w:r>
+        <w:rPr>
+          <w:sz w:val="19"/>
+        </w:rPr>
+        <w:t>Daily access to sucrose impairs aspects of spatial memory tasks reliant on pattern separation and neural proliferation in rats,” Learn. Mem., vol. 23, no. 7, pp. 386–390, Jul. 2016. doi: 10.1101/lm.042416.116 [Online]. Available: http://www.ncbi.nlm.nih.gov/pubmed/27317199</w:t>
       </w:r>
     </w:p>
     <w:p>
@@ -23325,13 +23427,13 @@
         <w:rPr>
           <w:sz w:val="19"/>
         </w:rPr>
-        <w:t xml:space="preserve">[31] Y. Pozdnyakova and A. Murzatayeva, “Neuroprotective potential of Stevia rebaudiana and Stachys sieboldii: Effects on oxidative stress and locomotor activity in male rats fed a high-fat, high-sucrose diet,” </w:t>
-      </w:r>
-      <w:r>
-        <w:rPr>
-          <w:sz w:val="19"/>
-        </w:rPr>
-        <w:t>Biology (Basel), vol. 14, no. 4, Mar. 2025, Art. no. 359. doi: 10.3390/biology14040359 [Online]. Available: https://www.mdpi.com/2079-7737/14/4/359</w:t>
+        <w:t xml:space="preserve">[31] H. Coirini et al., “Long-Term Memory Function Impairments following Sucrose Exposure in Juvenile versus Adult Rats,” </w:t>
+      </w:r>
+      <w:r>
+        <w:rPr>
+          <w:sz w:val="19"/>
+        </w:rPr>
+        <w:t>Biomedicines, vol. 10, no. 11, Nov. 2022, Art. no. 2723. doi: 10.3390/biomedicines10112723 [Online]. Available: https://www.mdpi.com/2227-9059/10/11/2723</w:t>
       </w:r>
     </w:p>
     <w:p>
@@ -23345,7 +23447,7 @@
           <w:sz w:val="19"/>
         </w:rPr>
         <w:lastRenderedPageBreak/>
-        <w:t>[32] C. Prata et al., “Glycosides from Stevia rebaudiana Bertoni possess insulin-mimetic and antioxidant activities in rat cardiac fibroblasts,” Oxid. Med. Cell. Longev., vol. 2017, Aug. 2017, Art. no. 3724545. doi: 10.1155/2017/3724545 [Online]. Available: https://www.ncbi.nlm.nih.gov/pmc/articles/PMC5602648/</w:t>
+        <w:t>[32] V. Chatsudthipong and C. Muanprasat, “Stevioside and related compounds: therapeutic benefits beyond sweetness,” Pharmacol. Ther., vol. 121, no. 1, pp. 41–54, 2009. doi: 10.1016/j.pharmthera.2008.09.007</w:t>
       </w:r>
     </w:p>
     <w:p>
@@ -23358,13 +23460,13 @@
         <w:rPr>
           <w:sz w:val="19"/>
         </w:rPr>
-        <w:t>[33] A. G. Yunker, R. Patel, and K. A. Page, “</w:t>
-      </w:r>
-      <w:r>
-        <w:rPr>
-          <w:sz w:val="19"/>
-        </w:rPr>
-        <w:t>Effects of non-nutritive sweeteners on sweet taste processing and neuroendocrine regulation of eating behavior,” Curr. Nutr. Rep., vol. 9, no. 3, pp. 278–289, Sep. 2020. doi: 10.1007/s13668-020-00323-3 [Online]. Available: https://pubmed.ncbi.nlm.nih.gov/32588329/</w:t>
+        <w:t>[33] Y. Pozdnyakova and A. Murzatayeva, “</w:t>
+      </w:r>
+      <w:r>
+        <w:rPr>
+          <w:sz w:val="19"/>
+        </w:rPr>
+        <w:t>Neuroprotective potential of Stevia rebaudiana and Stachys sieboldii: Effects on oxidative stress and locomotor activity in male rats fed a high-fat, high-sucrose diet,” Biology (Basel), vol. 14, no. 4, Mar. 2025, Art. no. 359. doi: 10.3390/biology14040359 [Online]. Available: https://www.mdpi.com/2079-7737/14/4/359</w:t>
       </w:r>
     </w:p>
     <w:p>
@@ -23377,13 +23479,13 @@
         <w:rPr>
           <w:sz w:val="19"/>
         </w:rPr>
-        <w:t xml:space="preserve">[34] L. Tsan et al., “Early-life low-calorie sweetener consumption disrupts glucose regulation, sugar-motivated behavior, and memory function in rats,” </w:t>
-      </w:r>
-      <w:r>
-        <w:rPr>
-          <w:sz w:val="19"/>
-        </w:rPr>
-        <w:t>JCI Insight, vol. 7, no. 20, Oct. 2022, Art. no. e157714. doi: 10.1172/jci.insight.157714 [Online]. Available: https://www.ncbi.nlm.nih.gov/pmc/articles/PMC9714783/</w:t>
+        <w:t xml:space="preserve">[34] C. Prata et al., “Glycosides from Stevia rebaudiana Bertoni possess insulin-mimetic and antioxidant activities in rat cardiac fibroblasts,” </w:t>
+      </w:r>
+      <w:r>
+        <w:rPr>
+          <w:sz w:val="19"/>
+        </w:rPr>
+        <w:t>Oxid. Med. Cell. Longev., vol. 2017, Aug. 2017, Art. no. 3724545. doi: 10.1155/2017/3724545 [Online]. Available: https://www.ncbi.nlm.nih.gov/pmc/articles/PMC5602648/</w:t>
       </w:r>
     </w:p>
     <w:p>
@@ -23396,7 +23498,7 @@
         <w:rPr>
           <w:sz w:val="19"/>
         </w:rPr>
-        <w:t>[35] D. Sharma, M. Puri, A. K. Tiwary, N. Singh, and A. S. Jaggi, “Antiamnesic effect of stevioside in scopolamine-treated rats,” Indian J. Pharmacol., vol. 42, no. 3, pp. 164–167, 2010. doi: 10.4103/0253-7613.66840</w:t>
+        <w:t>[35] A. G. Yunker, R. Patel, and K. A. Page, “Effects of non-nutritive sweeteners on sweet taste processing and neuroendocrine regulation of eating behavior,” Curr. Nutr. Rep., vol. 9, no. 3, pp. 278–289, Sep. 2020. doi: 10.1007/s13668-020-00323-3 [Online]. Available: https://pubmed.ncbi.nlm.nih.gov/32588329/</w:t>
       </w:r>
     </w:p>
     <w:p>
@@ -23409,13 +23511,13 @@
         <w:rPr>
           <w:sz w:val="19"/>
         </w:rPr>
-        <w:t>[36] V. A. Chavushyan et al., “</w:t>
-      </w:r>
-      <w:r>
-        <w:rPr>
-          <w:sz w:val="19"/>
-        </w:rPr>
-        <w:t>Effects of stevia on synaptic plasticity and NADPH oxidase level of CNS in conditions of metabolic disorders caused by fructose,” BMC Complement. Altern. Med., vol. 17, Dec. 2017, Art. no. 540. doi: 10.1186/s12906-017-2049-9</w:t>
+        <w:t>[36] L. Tsan et al., “</w:t>
+      </w:r>
+      <w:r>
+        <w:rPr>
+          <w:sz w:val="19"/>
+        </w:rPr>
+        <w:t>Early-life low-calorie sweetener consumption disrupts glucose regulation, sugar-motivated behavior, and memory function in rats,” JCI Insight, vol. 7, no. 20, Oct. 2022, Art. no. e157714. doi: 10.1172/jci.insight.157714 [Online]. Available: https://www.ncbi.nlm.nih.gov/pmc/articles/PMC9714783/</w:t>
       </w:r>
     </w:p>
     <w:p>
@@ -23428,13 +23530,7 @@
         <w:rPr>
           <w:sz w:val="19"/>
         </w:rPr>
-        <w:t xml:space="preserve">[37] F. Khakpai, M. Naseroleslami, M. Moheb-Alian, E. Ghanimati, F. Abdollah-pour, and N. Mousavi-Niri, “Intra-gastrically administration of Stevia and particularly Nano-Stevia reversed the hyperglycemia, anxiety, and memory impairment in streptozotocin-induced diabetic rats,” </w:t>
-      </w:r>
-      <w:r>
-        <w:rPr>
-          <w:sz w:val="19"/>
-        </w:rPr>
-        <w:t>Physiol. Behav., vol. 263, 2023, Art. no. 114100. doi: 10.1016/j.physbeh.2023.114100</w:t>
+        <w:t>[37] D. Sharma, M. Puri, A. K. Tiwary, N. Singh, and A. S. Jaggi, “Antiamnesic effect of stevioside in scopolamine-treated rats,” Indian J. Pharmacol., vol. 42, no. 3, pp. 164–167, 2010. doi: 10.4103/0253-7613.66840</w:t>
       </w:r>
     </w:p>
     <w:p>
@@ -23447,7 +23543,7 @@
         <w:rPr>
           <w:sz w:val="19"/>
         </w:rPr>
-        <w:t>[38] I. D. Salinas-Velarde et al., “Lower ΔFosB expression in the dopaminergic system after stevia consumption in rats housed under environmental enrichment conditions,” Brain Res. Bull., vol. 177, pp. 172–180, 2021. doi: 10.1016/j.brainresbull.2021.10.001</w:t>
+        <w:t>[38] V. A. Chavushyan et al., “Effects of stevia on synaptic plasticity and NADPH oxidase level of CNS in conditions of metabolic disorders caused by fructose,” BMC Complement. Altern. Med., vol. 17, Dec. 2017, Art. no. 540. doi: 10.1186/s12906-017-2049-9</w:t>
       </w:r>
     </w:p>
     <w:p>
@@ -23460,13 +23556,13 @@
         <w:rPr>
           <w:sz w:val="19"/>
         </w:rPr>
-        <w:t xml:space="preserve">[39] H. Coirini, M. Rey, A. Marchena, P. Lence, and M. S. Kruse, “Stevia vs. sucrose consumption: influence on the behavior of juvenile rats,” </w:t>
-      </w:r>
-      <w:r>
-        <w:rPr>
-          <w:sz w:val="19"/>
-        </w:rPr>
-        <w:t>Medicina (B. Aires), vol. 83, no. Supl. V, p. 148, 2023, Resumen 182, Reunión Conjunta SAIC SAB AAFE AACYTAL 2023, Mar del Plata, Argentina.</w:t>
+        <w:t>[39] F. Khakpai, M. Naseroleslami, M. Moheb-Alian, E. Ghanimati, F. Abdollah-pour, and N. Mousavi-Niri, “</w:t>
+      </w:r>
+      <w:r>
+        <w:rPr>
+          <w:sz w:val="19"/>
+        </w:rPr>
+        <w:t>Intra-gastrically administration of Stevia and particularly Nano-Stevia reversed the hyperglycemia, anxiety, and memory impairment in streptozotocin-induced diabetic rats,” Physiol. Behav., vol. 263, 2023, Art. no. 114100. doi: 10.1016/j.physbeh.2023.114100</w:t>
       </w:r>
     </w:p>
     <w:p>
@@ -23479,7 +23575,13 @@
         <w:rPr>
           <w:sz w:val="19"/>
         </w:rPr>
-        <w:t>[40] A. Marchena, M. Rey, M. C. González Deniselle, H. Coirini, and M. S. Kruse, “Stevia vs. sucrose consumption: influence on the behavior of juvenile rats,” En revisión en J. Nutr. (JN-2025-2424_R2), 2025.</w:t>
+        <w:t xml:space="preserve">[40] I. D. Salinas-Velarde et al., “Lower ΔFosB expression in the dopaminergic system after stevia consumption in rats housed under environmental enrichment conditions,” </w:t>
+      </w:r>
+      <w:r>
+        <w:rPr>
+          <w:sz w:val="19"/>
+        </w:rPr>
+        <w:t>Brain Res. Bull., vol. 177, pp. 172–180, 2021. doi: 10.1016/j.brainresbull.2021.10.001</w:t>
       </w:r>
     </w:p>
     <w:p>
@@ -23492,13 +23594,7 @@
         <w:rPr>
           <w:sz w:val="19"/>
         </w:rPr>
-        <w:t xml:space="preserve">[41] M. S. Kruse et al., “Sucrose exposure in juvenile rats produces long-term changes in fear memory and anxiety-like behavior,” </w:t>
-      </w:r>
-      <w:r>
-        <w:rPr>
-          <w:sz w:val="19"/>
-        </w:rPr>
-        <w:t>Psychoneuroendocrinology, vol. 104, pp. 300–307, Jun. 2019. doi: 10.1016/j.psyneuen.2019.03.005</w:t>
+        <w:t>[41] H. Coirini, M. Rey, A. Marchena, P. Lence, and M. S. Kruse, “Stevia vs. sucrose consumption: influence on the behavior of juvenile rats,” Medicina (B. Aires), vol. 83, no. Supl. V, p. 148, 2023, Resumen 182, Reunión Conjunta SAIC SAB AAFE AACYTAL 2023, Mar del Plata, Argentina.</w:t>
       </w:r>
     </w:p>
     <w:p>
@@ -23511,7 +23607,13 @@
         <w:rPr>
           <w:sz w:val="19"/>
         </w:rPr>
-        <w:t>[42] T. J. Xu and A. C. Reichelt, “Sucrose or sucrose and caffeine differentially impact memory and anxiety-like behaviours, and alter hippocampal parvalbumin and doublecortin,” Neuropharmacology, vol. 137, pp. 24–32, 2018. doi: 10.1016/j.neuropharm.2018.04.012</w:t>
+        <w:t>[42] A. Marchena, M. Rey, M. C. González Deniselle, H. Coirini, and M. S. Kruse, “</w:t>
+      </w:r>
+      <w:r>
+        <w:rPr>
+          <w:sz w:val="19"/>
+        </w:rPr>
+        <w:t>Stevia vs. sucrose consumption: influence on the behavior of juvenile rats,” En revisión en J. Nutr. (JN-2025-2424_R2), 2025.</w:t>
       </w:r>
     </w:p>
     <w:p>
@@ -23524,13 +23626,7 @@
         <w:rPr>
           <w:sz w:val="19"/>
         </w:rPr>
-        <w:t>[43] A. C. Reichelt, S. Killcross, L. D. Hambly, M. J. Morris, and R. F. Westbrook, “</w:t>
-      </w:r>
-      <w:r>
-        <w:rPr>
-          <w:sz w:val="19"/>
-        </w:rPr>
-        <w:t>Impact of adolescent sucrose access on cognitive control, recognition memory, and parvalbumin immunoreactivity,” Learn. Mem., vol. 22, no. 4, pp. 215–224, 2015. doi: 10.1101/lm.038000.114</w:t>
+        <w:t>[43] M. S. Kruse et al., “Sucrose exposure in juvenile rats produces long-term changes in fear memory and anxiety-like behavior,” Psychoneuroendocrinology, vol. 104, pp. 300–307, Jun. 2019. doi: 10.1016/j.psyneuen.2019.03.016</w:t>
       </w:r>
     </w:p>
     <w:p>
@@ -23543,13 +23639,13 @@
         <w:rPr>
           <w:sz w:val="19"/>
         </w:rPr>
-        <w:t xml:space="preserve">[44] J. Maniam, C. P. Antoniadis, N. A. Youngson, J. K. Sinha, and M. J. Morris, “Sugar consumption produces effects similar to early life stress exposure on hippocampal markers of neurogenesis and stress response,” </w:t>
-      </w:r>
-      <w:r>
-        <w:rPr>
-          <w:sz w:val="19"/>
-        </w:rPr>
-        <w:t>Front. Mol. Neurosci., vol. 8, Jan. 2016, Art. no. 86. doi: 10.3389/fnmol.2015.00086 [Online]. Available: https://www.ncbi.nlm.nih.gov/pmc/articles/PMC4717325/</w:t>
+        <w:t>[44] T. J. Xu and A. C. Reichelt, “</w:t>
+      </w:r>
+      <w:r>
+        <w:rPr>
+          <w:sz w:val="19"/>
+        </w:rPr>
+        <w:t>Sucrose or sucrose and caffeine differentially impact memory and anxiety-like behaviours, and alter hippocampal parvalbumin and doublecortin,” Neuropharmacology, vol. 137, pp. 24–32, 2018. doi: 10.1016/j.neuropharm.2018.04.012</w:t>
       </w:r>
     </w:p>
     <w:p>
@@ -23562,7 +23658,7 @@
         <w:rPr>
           <w:sz w:val="19"/>
         </w:rPr>
-        <w:t>[45] K. Sánchez-Huerta et al., “Sucrose consumption during late adolescence impairs adult neurogenesis of the ventral dentate gyrus without inducing an anxiety-like behavior,” Int. J. Mol. Sci., vol. 23, no. 22, Nov. 2022, Art. no. 14176. doi: 10.3390/ijms232214176 [Online].Available: https://www.ncbi.nlm.nih.gov/pmc/articles/PMC9695980/</w:t>
+        <w:t>[45] A. C. Reichelt, S. Killcross, L. D. Hambly, M. J. Morris, and R. F. Westbrook, “Impact of adolescent sucrose access on cognitive control, recognition memory, and parvalbumin immunoreactivity,” Learn. Mem., vol. 22, no. 4, pp. 215–224, 2015. doi: 10.1101/lm.038000.114</w:t>
       </w:r>
     </w:p>
     <w:p>
@@ -23575,8 +23671,14 @@
         <w:rPr>
           <w:sz w:val="19"/>
         </w:rPr>
+        <w:t xml:space="preserve">[46] J. Maniam, C. P. Antoniadis, N. A. Youngson, J. K. Sinha, and M. J. Morris, “Sugar consumption produces effects similar to early life stress exposure on hippocampal markers of neurogenesis and stress response,” </w:t>
+      </w:r>
+      <w:r>
+        <w:rPr>
+          <w:sz w:val="19"/>
+        </w:rPr>
         <w:lastRenderedPageBreak/>
-        <w:t>[46] A. Gerós, A. Magalhães, and P. Aguiar, “Improved 3D tracking and automated classification of rodents’ behavioral activity using depth-sensing cameras,” Behav. Res. Methods, vol. 52, no. 5, pp. 2156–2167, Oct. 2020. doi: 10.3758/s13428-020-01381-9 [Online]. Available: https://link.springer.com/article/10.3758/s13428-020-01381-9</w:t>
+        <w:t>Front. Mol. Neurosci., vol. 8, Jan. 2016, Art. no. 86. doi: 10.3389/fnmol.2015.00086 [Online]. Available: https://www.ncbi.nlm.nih.gov/pmc/articles/PMC4717325/</w:t>
       </w:r>
     </w:p>
     <w:p>
@@ -23589,13 +23691,13 @@
         <w:rPr>
           <w:sz w:val="19"/>
         </w:rPr>
-        <w:t xml:space="preserve">[47] D. A. Lukovikov et al., “Automated phenotyping of rodent behavior in the Cylinder Exploration Test using machine learning,” </w:t>
-      </w:r>
-      <w:r>
-        <w:rPr>
-          <w:sz w:val="19"/>
-        </w:rPr>
-        <w:t>Neuroscience, vol. 601, pp. 169–178, May 2026. doi: 10.1016/j.neuroscience.2026.02.048 [Online]. Available: https://pubmed.ncbi.nlm.nih.gov/41780714/</w:t>
+        <w:t>[47] K. Sánchez-Huerta et al., “</w:t>
+      </w:r>
+      <w:r>
+        <w:rPr>
+          <w:sz w:val="19"/>
+        </w:rPr>
+        <w:t>Sucrose consumption during late adolescence impairs adult neurogenesis of the ventral dentate gyrus without inducing an anxiety-like behavior,” Int. J. Mol. Sci., vol. 23, no. 22, Nov. 2022, Art. no. 14176. doi: 10.3390/ijms232214176 [Online].Available: https://www.ncbi.nlm.nih.gov/pmc/articles/PMC9695980/</w:t>
       </w:r>
     </w:p>
     <w:p>
@@ -23608,7 +23710,13 @@
         <w:rPr>
           <w:sz w:val="19"/>
         </w:rPr>
-        <w:t>[48] J. F. Guthrie and J. F. Morton, “Food sources of added sweeteners in the diets of Americans,” J. Am. Diet. Assoc., vol. 100, no. 1, pp. 43–51, 2000. doi: 10.1016/S0002-8223(00)00018-3</w:t>
+        <w:t xml:space="preserve">[48] A. Gerós, A. Magalhães, and P. Aguiar, “Improved 3D tracking and automated classification of rodents’ behavioral activity using depth-sensing cameras,” </w:t>
+      </w:r>
+      <w:r>
+        <w:rPr>
+          <w:sz w:val="19"/>
+        </w:rPr>
+        <w:t>Behav. Res. Methods, vol. 52, no. 5, pp. 2156–2167, Oct. 2020. doi: 10.3758/s13428-020-01381-9 [Online]. Available: https://link.springer.com/article/10.3758/s13428-020-01381-9</w:t>
       </w:r>
     </w:p>
     <w:p>
@@ -23621,13 +23729,7 @@
         <w:rPr>
           <w:sz w:val="19"/>
         </w:rPr>
-        <w:t>[49] C. D. Frary, R. K. Johnson, and M. Q. Wang, “</w:t>
-      </w:r>
-      <w:r>
-        <w:rPr>
-          <w:sz w:val="19"/>
-        </w:rPr>
-        <w:t>Children and adolescents’ choices of foods and beverages high in added sugars are associated with intakes of key nutrients and food groups,” J. Adolesc. Health, vol. 34, no. 1, pp. 56–63, 2004. doi: 10.1016/S1054-139X(03)00248-9</w:t>
+        <w:t>[49] D. A. Lukovikov et al., “Automated phenotyping of rodent behavior in the Cylinder Exploration Test using machine learning,” Neuroscience, vol. 601, pp. 169–178, May 2026. doi: 10.1016/j.neuroscience.2026.02.048 [Online]. Available: https://pubmed.ncbi.nlm.nih.gov/41780714/</w:t>
       </w:r>
     </w:p>
     <w:p>
@@ -23640,7 +23742,13 @@
         <w:rPr>
           <w:sz w:val="19"/>
         </w:rPr>
-        <w:t>[50] I. Guelinckx et al., “Intake of water and beverages of children and adolescents in 13 countries,” Eur. J. Nutr., vol. 54, no. Suppl. 2, pp. 69–79, 2015. doi: 10.1007/s00394-015-0955-5</w:t>
+        <w:t>[50] J. F. Guthrie and J. F. Morton, “</w:t>
+      </w:r>
+      <w:r>
+        <w:rPr>
+          <w:sz w:val="19"/>
+        </w:rPr>
+        <w:t>Food sources of added sweeteners in the diets of Americans,” J. Am. Diet. Assoc., vol. 100, no. 1, pp. 43–51, 2000. doi: 10.1016/S0002-8223(00)00018-3</w:t>
       </w:r>
     </w:p>
     <w:p>
@@ -23653,13 +23761,7 @@
         <w:rPr>
           <w:sz w:val="19"/>
         </w:rPr>
-        <w:t xml:space="preserve">[51] C. L. Sisk and D. L. Foster, “The neural basis of puberty and adolescence,” </w:t>
-      </w:r>
-      <w:r>
-        <w:rPr>
-          <w:sz w:val="19"/>
-        </w:rPr>
-        <w:t>Nat. Neurosci., vol. 7, no. 10, pp. 1040–1047, 2004. doi: 10.1038/nn1326</w:t>
+        <w:t>[51] C. D. Frary, R. K. Johnson, and M. Q. Wang, “Children and adolescents’ choices of foods and beverages high in added sugars are associated with intakes of key nutrients and food groups,” J. Adolesc. Health, vol. 34, no. 1, pp. 56–63, 2004. doi: 10.1016/S1054-139X(03)00248-9</w:t>
       </w:r>
     </w:p>
     <w:p>
@@ -23672,7 +23774,13 @@
         <w:rPr>
           <w:sz w:val="19"/>
         </w:rPr>
-        <w:t>[52] S. D. Anton et al., “Effects of stevia, aspartame, and sucrose on food intake, satiety, and postprandial glucose and insulin levels,” Appetite, vol. 55, no. 1, pp. 37–43, 2010. doi: 10.1016/j.appet.2010.03.009</w:t>
+        <w:t>[52] I. Guelinckx et al., “</w:t>
+      </w:r>
+      <w:r>
+        <w:rPr>
+          <w:sz w:val="19"/>
+        </w:rPr>
+        <w:t>Intake of water and beverages of children and adolescents in 13 countries,” Eur. J. Nutr., vol. 54, no. Suppl. 2, pp. 69–79, 2015. doi: 10.1007/s00394-015-0955-5</w:t>
       </w:r>
     </w:p>
     <w:p>
@@ -23685,7 +23793,7 @@
         <w:rPr>
           <w:sz w:val="19"/>
         </w:rPr>
-        <w:t>[53] V. Chatsudthipong and C. Muanprasat, “Stevioside and related compounds: therapeutic benefits beyond sweetness,” Pharmacol. Ther., vol. 121, no. 1, pp. 41–54, 2009. doi: 10.1016/j.pharmthera.2008.09.007</w:t>
+        <w:t>[53] Y. C. Wang, S. N. Bleich, and S. L. Gortmaker, “Increasing caloric contribution from sugar-sweetened beverages and 100% fruit juices among US children and adolescents, 1988–2004,” Pediatrics, vol. 121, no. 6, e1604–e1614, 2008. doi: 10.1542/peds.2007-2834</w:t>
       </w:r>
     </w:p>
     <w:p>
@@ -23698,7 +23806,13 @@
         <w:rPr>
           <w:sz w:val="19"/>
         </w:rPr>
-        <w:t>[54] S. Gregersen, P. B. Jeppesen, J. J. Holst, and K. Hermansen, “Antihyperglycemic effects of stevioside in type 2 diabetic subjects,” Metabolism, vol. 53, no. 1, pp. 73–76, 2004. doi: 10.1016/j.metabol.2003.07.013</w:t>
+        <w:t xml:space="preserve">[54] C. L. Sisk and D. L. Foster, “The neural basis of puberty and adolescence,” </w:t>
+      </w:r>
+      <w:r>
+        <w:rPr>
+          <w:sz w:val="19"/>
+        </w:rPr>
+        <w:t>Nat. Neurosci., vol. 7, no. 10, pp. 1040–1047, 2004. doi: 10.1038/nn1326</w:t>
       </w:r>
     </w:p>
     <w:p>
@@ -23711,7 +23825,7 @@
         <w:rPr>
           <w:sz w:val="19"/>
         </w:rPr>
-        <w:t>[55] G. Kempermann, H. Song, and F. H. Gage, “Neurogenesis in the adult hippocampus,” Cold Spring Harb. Perspect. Biol., vol. 7, no. 9, a018812, 2015. doi: 10.1101/cshperspect.a018812</w:t>
+        <w:t>[55] S. D. Anton et al., “Effects of stevia, aspartame, and sucrose on food intake, satiety, and postprandial glucose and insulin levels,” Appetite, vol. 55, no. 1, pp. 37–43, 2010. doi: 10.1016/j.appet.2010.03.009</w:t>
       </w:r>
     </w:p>
     <w:p>
@@ -23724,13 +23838,7 @@
         <w:rPr>
           <w:sz w:val="19"/>
         </w:rPr>
-        <w:t>[56] A. J. Eisch and C. D. Mandyam, “Adult neurogenesis: can analysis of cell cycle proteins move us “</w:t>
-      </w:r>
-      <w:r>
-        <w:rPr>
-          <w:sz w:val="19"/>
-        </w:rPr>
-        <w:t>Beyond BrdU”?,” Curr. Pharm. Biotechnol., vol. 8, no. 3, pp. 147–165, 2007. doi: 10.2174/138920107780906540</w:t>
+        <w:t>[56] S. Gregersen, P. B. Jeppesen, J. J. Holst, and K. Hermansen, “Antihyperglycemic effects of stevioside in type 2 diabetic subjects,” Metabolism, vol. 53, no. 1, pp. 73–76, 2004. doi: 10.1016/j.metabol.2003.07.013</w:t>
       </w:r>
     </w:p>
     <w:p>
@@ -23743,7 +23851,7 @@
         <w:rPr>
           <w:sz w:val="19"/>
         </w:rPr>
-        <w:t>[57] C. D. Mandyam, G. C. Harburg, and A. J. Eisch, “Determination of key aspects of precursor cell proliferation, cell cycle length and kinetics in the adult mouse subgranular zone,” Neuroscience, vol. 146, no. 1, pp. 108–122, 2007. doi: 10.1016/j.neuroscience.2006.12.064</w:t>
+        <w:t>[57] G. Kempermann, H. Song, and F. H. Gage, “Neurogenesis in the adult hippocampus,” Cold Spring Harb. Perspect. Biol., vol. 7, no. 9, a018812, 2015. doi: 10.1101/cshperspect.a018812</w:t>
       </w:r>
     </w:p>
     <w:p>
@@ -23756,13 +23864,7 @@
         <w:rPr>
           <w:sz w:val="19"/>
         </w:rPr>
-        <w:t>[58] J. G. Gleeson, P. T. Lin, L. A. Flanagan, and C. A. Walsh, “</w:t>
-      </w:r>
-      <w:r>
-        <w:rPr>
-          <w:sz w:val="19"/>
-        </w:rPr>
-        <w:t>Doublecortin is a microtubule-associated protein and is expressed widely by migrating neurons,” Neuron, vol. 23, no. 2, pp. 257–271, 1999. doi: 10.1016/S0896-6273(00)80778-3</w:t>
+        <w:t>[58] A. J. Eisch and C. D. Mandyam, “Adult neurogenesis: can analysis of cell cycle proteins move us “Beyond BrdU”?,” Curr. Pharm. Biotechnol., vol. 8, no. 3, pp. 147–165, 2007. doi: 10.2174/138920107780906540</w:t>
       </w:r>
     </w:p>
     <w:p>
@@ -23775,7 +23877,13 @@
         <w:rPr>
           <w:sz w:val="19"/>
         </w:rPr>
-        <w:t>[59] F. Francis et al., “Doublecortin is a developmentally regulated, microtubule-associated protein expressed in migrating and differentiating neurons,” Neuron, vol. 23, no. 2, pp. 247–256, 1999. doi: 10.1016/S0896-6273(00)80777-1</w:t>
+        <w:t>[59] C. D. Mandyam, G. C. Harburg, and A. J. Eisch, “</w:t>
+      </w:r>
+      <w:r>
+        <w:rPr>
+          <w:sz w:val="19"/>
+        </w:rPr>
+        <w:t>Determination of key aspects of precursor cell proliferation, cell cycle length and kinetics in the adult mouse subgranular zone,” Neuroscience, vol. 146, no. 1, pp. 108–122, 2007. doi: 10.1016/j.neuroscience.2006.12.064</w:t>
       </w:r>
     </w:p>
     <w:p>
@@ -23788,13 +23896,7 @@
         <w:rPr>
           <w:sz w:val="19"/>
         </w:rPr>
-        <w:t>[60] J. P. Brown, S. Couillard-Després, C. M. Cooper-Kuhn, J. Winkler, L. Aigner, and H. G. Kuhn, “</w:t>
-      </w:r>
-      <w:r>
-        <w:rPr>
-          <w:sz w:val="19"/>
-        </w:rPr>
-        <w:t>Transient expression of doublecortin during adult neurogenesis,” J. Comp. Neurol., vol. 467, no. 1, pp. 1–10, 2003. doi: 10.1002/cne.10874</w:t>
+        <w:t>[60] J. G. Gleeson, P. T. Lin, L. A. Flanagan, and C. A. Walsh, “Doublecortin is a microtubule-associated protein and is expressed widely by migrating neurons,” Neuron, vol. 23, no. 2, pp. 257–271, 1999. doi: 10.1016/S0896-6273(00)80778-3</w:t>
       </w:r>
     </w:p>
     <w:p>
@@ -23807,7 +23909,13 @@
         <w:rPr>
           <w:sz w:val="19"/>
         </w:rPr>
-        <w:t>[61] S. Couillard-Despres et al., “Doublecortin expression levels in adult brain reflect neurogenesis,” Eur. J. Neurosci., vol. 21, no. 1, pp. 1–14, 2005. doi: 10.1111/j.1460-9568.2004.03813.x</w:t>
+        <w:t>[61] F. Francis et al., “</w:t>
+      </w:r>
+      <w:r>
+        <w:rPr>
+          <w:sz w:val="19"/>
+        </w:rPr>
+        <w:t>Doublecortin is a developmentally regulated, microtubule-associated protein expressed in migrating and differentiating neurons,” Neuron, vol. 23, no. 2, pp. 247–256, 1999. doi: 10.1016/S0896-6273(00)80777-1</w:t>
       </w:r>
     </w:p>
     <w:p>
@@ -23820,13 +23928,8 @@
         <w:rPr>
           <w:sz w:val="19"/>
         </w:rPr>
-        <w:t xml:space="preserve">[62] A. C. Reichelt et al., “The spontaneous location recognition task for assessing spatial pattern separation and memory across a delay in rats and mice,” </w:t>
-      </w:r>
-      <w:r>
-        <w:rPr>
-          <w:sz w:val="19"/>
-        </w:rPr>
-        <w:t>Nat. Protoc., vol. 16, no. 12, pp. 5616–5633, Dec. 2021. doi: 10.1038/s41596-021-00627-w [Online]. Available: https://www.nature.com/articles/s41596-021-00627-w</w:t>
+        <w:lastRenderedPageBreak/>
+        <w:t>[62] J. P. Brown, S. Couillard-Després, C. M. Cooper-Kuhn, J. Winkler, L. Aigner, and H. G. Kuhn, “Transient expression of doublecortin during adult neurogenesis,” J. Comp. Neurol., vol. 467, no. 1, pp. 1–10, 2003. doi: 10.1002/cne.10874</w:t>
       </w:r>
     </w:p>
     <w:p>
@@ -23839,8 +23942,13 @@
         <w:rPr>
           <w:sz w:val="19"/>
         </w:rPr>
-        <w:lastRenderedPageBreak/>
-        <w:t>[63] I. T. Jolliffe and J. Cadima, “Principal component analysis: a review and recent developments,” Philos. Trans. R. Soc. A, vol. 374, no. 2065, Apr. 2016, Art. no. 20150202. doi: 10.1098/rsta.2015.0202 [Online]. Available: https://royalsocietypublishing.org/doi/10.1098/rsta.2015.0202</w:t>
+        <w:t>[63] S. Couillard-Despres et al., “</w:t>
+      </w:r>
+      <w:r>
+        <w:rPr>
+          <w:sz w:val="19"/>
+        </w:rPr>
+        <w:t>Doublecortin expression levels in adult brain reflect neurogenesis,” Eur. J. Neurosci., vol. 21, no. 1, pp. 1–14, 2005. doi: 10.1111/j.1460-9568.2004.03813.x</w:t>
       </w:r>
     </w:p>
     <w:p>
@@ -23853,13 +23961,7 @@
         <w:rPr>
           <w:sz w:val="19"/>
         </w:rPr>
-        <w:t>[64] J. H. Ward Jr., “</w:t>
-      </w:r>
-      <w:r>
-        <w:rPr>
-          <w:sz w:val="19"/>
-        </w:rPr>
-        <w:t>Hierarchical grouping to optimize an objective function,” J. Amer. Statist. Assoc., vol. 58, no. 301, pp. 236–244, Mar. 1963. doi: 10.1080/01621459.1963.10500845 [Online]. Available: https://www.tandfonline.com/doi/abs/10.1080/01621459.1963.10500845</w:t>
+        <w:t>[64] A. C. Reichelt et al., “The spontaneous location recognition task for assessing spatial pattern separation and memory across a delay in rats and mice,” Nat. Protoc., vol. 16, no. 12, pp. 5616–5633, Dec. 2021. doi: 10.1038/s41596-021-00627-w [Online]. Available: https://www.nature.com/articles/s41596-021-00627-w</w:t>
       </w:r>
     </w:p>
     <w:p>
@@ -23872,7 +23974,13 @@
         <w:rPr>
           <w:sz w:val="19"/>
         </w:rPr>
-        <w:t>[65] L. Breiman, “Random forests,” Mach. Learn., vol. 45, no. 1, pp. 5–32, Oct. 2001. doi: 10.1023/A:1010933404324 [Online]. Available: https://link.springer.com/article/10.1023/A:1010933404324</w:t>
+        <w:t>[65] I. T. Jolliffe and J. Cadima, “</w:t>
+      </w:r>
+      <w:r>
+        <w:rPr>
+          <w:sz w:val="19"/>
+        </w:rPr>
+        <w:t>Principal component analysis: a review and recent developments,” Philos. Trans. R. Soc. A, vol. 374, no. 2065, Apr. 2016, Art. no. 20150202. doi: 10.1098/rsta.2015.0202 [Online]. Available: https://royalsocietypublishing.org/doi/10.1098/rsta.2015.0202</w:t>
       </w:r>
     </w:p>
     <w:p>
@@ -23885,13 +23993,13 @@
         <w:rPr>
           <w:sz w:val="19"/>
         </w:rPr>
-        <w:t>[66] J. Charan and N. D. Kantharia, “</w:t>
-      </w:r>
-      <w:r>
-        <w:rPr>
-          <w:sz w:val="19"/>
-        </w:rPr>
-        <w:t>How to calculate sample size in animal studies?,” J. Pharmacol. Pharmacother., vol. 4, no. 4, pp. 303–306, Oct. 2013. doi: 10.4103/0976-500X.119726 [Online]. Available: http://www.ncbi.nlm.nih.gov/pubmed/24250214</w:t>
+        <w:t xml:space="preserve">[66] J. H. Ward Jr., “Hierarchical grouping to optimize an objective function,” </w:t>
+      </w:r>
+      <w:r>
+        <w:rPr>
+          <w:sz w:val="19"/>
+        </w:rPr>
+        <w:t>J. Amer. Statist. Assoc., vol. 58, no. 301, pp. 236–244, Mar. 1963. doi: 10.1080/01621459.1963.10500845 [Online]. Available: https://www.tandfonline.com/doi/abs/10.1080/01621459.1963.10500845</w:t>
       </w:r>
     </w:p>
     <w:p>
@@ -23904,7 +24012,7 @@
         <w:rPr>
           <w:sz w:val="19"/>
         </w:rPr>
-        <w:t>[67] M. R. Sharma, R. Mogra, and B. Upadhyay, “Effect of Stevia Extract Intervention on Lipid Profile,” Stud. Ethno-Med., vol. 3, no. 2, pp. 137–140, 2009. doi: 10.1080/09735070.2009.11886351</w:t>
+        <w:t>[67] L. Breiman, “Random forests,” Mach. Learn., vol. 45, no. 1, pp. 5–32, Oct. 2001. doi: 10.1023/A:1010933404324 [Online]. Available: https://link.springer.com/article/10.1023/A:1010933404324</w:t>
       </w:r>
     </w:p>
     <w:p>
@@ -23917,13 +24025,13 @@
         <w:rPr>
           <w:sz w:val="19"/>
         </w:rPr>
-        <w:t>[68] L. Celaya, P. Martina, and N. Kolb-Koslobsky, “</w:t>
-      </w:r>
-      <w:r>
-        <w:rPr>
-          <w:sz w:val="19"/>
-        </w:rPr>
-        <w:t>Infusions prepared with Stevia rebaudiana: application of a simplex centroid mixture design for the study of natural sweeteners and phenolic compounds,” J. Food Sci. Technol., vol. 59, no. 1, pp. 55–64, 2022. doi: 10.1007/s13197-021-04979-9</w:t>
+        <w:t xml:space="preserve">[68] J. Charan and N. D. Kantharia, “How to calculate sample size in animal studies?,” </w:t>
+      </w:r>
+      <w:r>
+        <w:rPr>
+          <w:sz w:val="19"/>
+        </w:rPr>
+        <w:t>J. Pharmacol. Pharmacother., vol. 4, no. 4, pp. 303–306, Oct. 2013. doi: 10.4103/0976-500X.119726 [Online]. Available: http://www.ncbi.nlm.nih.gov/pubmed/24250214</w:t>
       </w:r>
     </w:p>
     <w:p>
@@ -23936,13 +24044,7 @@
         <w:rPr>
           <w:sz w:val="19"/>
         </w:rPr>
-        <w:t xml:space="preserve">[69] M. Rey et al., “Effects of metformin on behavioral alterations produced by chronic sucrose consumption in male rats,” </w:t>
-      </w:r>
-      <w:r>
-        <w:rPr>
-          <w:sz w:val="19"/>
-        </w:rPr>
-        <w:t>J. Neuroendocrinol., vol. 36, no. 2, Feb. 2024, Art. no. e13362. doi: 10.1111/jne.13362 [Online]. Available: http://www.ncbi.nlm.nih.gov/pubmed/38148478</w:t>
+        <w:t>[69] M. R. Sharma, R. Mogra, and B. Upadhyay, “Effect of Stevia Extract Intervention on Lipid Profile,” Stud. Ethno-Med., vol. 3, no. 2, pp. 137–140, 2009. doi: 10.1080/09735070.2009.11886351</w:t>
       </w:r>
     </w:p>
     <w:p>
@@ -23955,7 +24057,13 @@
         <w:rPr>
           <w:sz w:val="19"/>
         </w:rPr>
-        <w:t>[70] E. Yildiz-Ozturk, A. Nalbantsoy, O. Tag, and O. Yesil-Celiktas, “A comparative study on extraction processes of Stevia rebaudiana leaves with emphasis on antioxidant, cytotoxic and nitric oxide inhibition activities,” Ind. Crops Prod., vol. 77, pp. 961–971, 2015. doi: 10.1016/j.indcrop.2015.10.010</w:t>
+        <w:t>[70] L. Celaya, P. Martina, and N. Kolb-Koslobsky, “</w:t>
+      </w:r>
+      <w:r>
+        <w:rPr>
+          <w:sz w:val="19"/>
+        </w:rPr>
+        <w:t>Infusions prepared with Stevia rebaudiana: application of a simplex centroid mixture design for the study of natural sweeteners and phenolic compounds,” J. Food Sci. Technol., vol. 59, no. 1, pp. 55–64, 2022. doi: 10.1007/s13197-021-04979-9</w:t>
       </w:r>
     </w:p>
     <w:p>
@@ -23968,13 +24076,13 @@
         <w:rPr>
           <w:sz w:val="19"/>
         </w:rPr>
-        <w:t>[71] C. Lever, S. Burton, and J. O’Keefe, “</w:t>
-      </w:r>
-      <w:r>
-        <w:rPr>
-          <w:sz w:val="19"/>
-        </w:rPr>
-        <w:t>Rearing on hind legs, environmental novelty, and the hippocampal formation,” Rev. Neurosci., vol. 17, no. 1–2, 2006. doi: 10.1515/revneuro.2006.17.1-2.111</w:t>
+        <w:t xml:space="preserve">[71] M. Rey et al., “Effects of metformin on behavioral alterations produced by chronic sucrose consumption in male rats,” </w:t>
+      </w:r>
+      <w:r>
+        <w:rPr>
+          <w:sz w:val="19"/>
+        </w:rPr>
+        <w:t>J. Neuroendocrinol., vol. 36, no. 2, Feb. 2024, Art. no. e13362. doi: 10.1111/jne.13362 [Online]. Available: http://www.ncbi.nlm.nih.gov/pubmed/38148478</w:t>
       </w:r>
     </w:p>
     <w:p>
@@ -23987,13 +24095,7 @@
         <w:rPr>
           <w:sz w:val="19"/>
         </w:rPr>
-        <w:t xml:space="preserve">[72] G. Pérez-García, O. Guzmán-Quevedo, R. Da Silva Aragão, and F. Bolaños-Jiménez, “Early malnutrition results in long-lasting impairments in pattern-separation for overlapping novel object and novel location memories and reduced hippocampal neurogenesis,” </w:t>
-      </w:r>
-      <w:r>
-        <w:rPr>
-          <w:sz w:val="19"/>
-        </w:rPr>
-        <w:t>Sci. Rep., vol. 6, Feb. 2016, Art. no. 21275. doi: 10.1038/srep21275 [Online]. Available: https://pubmed.ncbi.nlm.nih.gov/26882991/</w:t>
+        <w:t>[72] E. Yildiz-Ozturk, A. Nalbantsoy, O. Tag, and O. Yesil-Celiktas, “A comparative study on extraction processes of Stevia rebaudiana leaves with emphasis on antioxidant, cytotoxic and nitric oxide inhibition activities,” Ind. Crops Prod., vol. 77, pp. 961–971, 2015. doi: 10.1016/j.indcrop.2015.10.010</w:t>
       </w:r>
     </w:p>
     <w:p>
@@ -24006,7 +24108,13 @@
         <w:rPr>
           <w:sz w:val="19"/>
         </w:rPr>
-        <w:t>[73] M. Leger et al., “Object recognition test in mice,” Nat. Protoc., vol. 8, no. 12, pp. 2531–2537, Dec. 2013. doi: 10.1038/nprot.2013.155 [Online]. Available: http://www.ncbi.nlm.nih.gov/pubmed/24263092</w:t>
+        <w:t>[73] C. Lever, S. Burton, and J. O’Keefe, “</w:t>
+      </w:r>
+      <w:r>
+        <w:rPr>
+          <w:sz w:val="19"/>
+        </w:rPr>
+        <w:t>Rearing on hind legs, environmental novelty, and the hippocampal formation,” Rev. Neurosci., vol. 17, no. 1–2, 2006. doi: 10.1515/revneuro.2006.17.1-2.111</w:t>
       </w:r>
     </w:p>
     <w:p>
@@ -24019,37 +24127,13 @@
         <w:rPr>
           <w:sz w:val="19"/>
         </w:rPr>
-        <w:t>[74] M. S. Kruse, M. Rey, M. C. Vega, and H. Coirini, “Alterations of LXR</w:t>
-      </w:r>
-      <w:r>
-        <w:rPr>
-          <w:sz w:val="19"/>
-        </w:rPr>
-        <w:t>𝛼</w:t>
-      </w:r>
-      <w:r>
-        <w:rPr>
-          <w:sz w:val="19"/>
-        </w:rPr>
-        <w:t>and LXR</w:t>
-      </w:r>
-      <w:r>
-        <w:rPr>
-          <w:sz w:val="19"/>
-        </w:rPr>
-        <w:t>𝛽</w:t>
-      </w:r>
-      <w:r>
-        <w:rPr>
-          <w:sz w:val="19"/>
-        </w:rPr>
-        <w:t xml:space="preserve">expression in the hypothalamus of glucose-intolerant rats,” </w:t>
-      </w:r>
-      <w:r>
-        <w:rPr>
-          <w:sz w:val="19"/>
-        </w:rPr>
-        <w:t>J. Endocrinol., vol. 215, no. 1, pp. 51–58, Oct. 2012. doi: 10.1530/JOE-12-0088 [Online]. Available: https://pubmed.ncbi.nlm.nih.gov/22836489/</w:t>
+        <w:t xml:space="preserve">[74] G. Pérez-García, O. Guzmán-Quevedo, R. Da Silva Aragão, and F. Bolaños-Jiménez, “Early malnutrition results in long-lasting impairments in pattern-separation for overlapping novel object and novel location memories and reduced hippocampal neurogenesis,” </w:t>
+      </w:r>
+      <w:r>
+        <w:rPr>
+          <w:sz w:val="19"/>
+        </w:rPr>
+        <w:t>Sci. Rep., vol. 6, Feb. 2016, Art. no. 21275. doi: 10.1038/srep21275 [Online]. Available: https://pubmed.ncbi.nlm.nih.gov/26882991/</w:t>
       </w:r>
     </w:p>
     <w:p>
@@ -24062,7 +24146,7 @@
         <w:rPr>
           <w:sz w:val="19"/>
         </w:rPr>
-        <w:t>[75] G. Paxinos and C. Watson, The Rat Brain in Stereotaxic Coordinates, 2nd. Sydney, Australia: Academic Press, 1986.</w:t>
+        <w:t>[75] M. Leger et al., “Object recognition test in mice,” Nat. Protoc., vol. 8, no. 12, pp. 2531–2537, Dec. 2013. doi: 10.1038/nprot.2013.155 [Online]. Available: http://www.ncbi.nlm.nih.gov/pubmed/24263092</w:t>
       </w:r>
     </w:p>
     <w:p>
@@ -24075,7 +24159,37 @@
         <w:rPr>
           <w:sz w:val="19"/>
         </w:rPr>
-        <w:t>[76] World Health Organization, Guideline: Sugars intake for adults and children. Geneva, Switzerland: World Health Organization, 2015, isbn: 978-92-4-154902-8. [Online]. Available: https://www.who.int/publications/i/item/9789241549028</w:t>
+        <w:t>[76] M. S. Kruse, M. Rey, M. C. Vega, and H. Coirini, “Alterations of LXR</w:t>
+      </w:r>
+      <w:r>
+        <w:rPr>
+          <w:sz w:val="19"/>
+        </w:rPr>
+        <w:t>𝛼</w:t>
+      </w:r>
+      <w:r>
+        <w:rPr>
+          <w:sz w:val="19"/>
+        </w:rPr>
+        <w:t>and LXR</w:t>
+      </w:r>
+      <w:r>
+        <w:rPr>
+          <w:sz w:val="19"/>
+        </w:rPr>
+        <w:t>𝛽</w:t>
+      </w:r>
+      <w:r>
+        <w:rPr>
+          <w:sz w:val="19"/>
+        </w:rPr>
+        <w:t xml:space="preserve">expression in the hypothalamus of glucose-intolerant rats,” </w:t>
+      </w:r>
+      <w:r>
+        <w:rPr>
+          <w:sz w:val="19"/>
+        </w:rPr>
+        <w:t>J. Endocrinol., vol. 215, no. 1, pp. 51–58, Oct. 2012. doi: 10.1530/JOE-12-0088 [Online]. Available: https://pubmed.ncbi.nlm.nih.gov/22836489/</w:t>
       </w:r>
     </w:p>
     <w:p>
@@ -24088,7 +24202,7 @@
         <w:rPr>
           <w:sz w:val="19"/>
         </w:rPr>
-        <w:t>[77] EFSA Panel on Food Additives and Nutrient Sources added to Food (ANS), “Scientific opinion on the safety of steviol glycosides for the proposed uses as a food additive,” EFSA J., vol. 8, no. 4, 2010, Art. no. 1537. doi: 10.2903/j.efsa.2010.1537</w:t>
+        <w:t>[77] G. Paxinos and C. Watson, The Rat Brain in Stereotaxic Coordinates, 2nd. Sydney, Australia: Academic Press, 1986.</w:t>
       </w:r>
     </w:p>
     <w:p>
@@ -24101,13 +24215,8 @@
         <w:rPr>
           <w:sz w:val="19"/>
         </w:rPr>
-        <w:t xml:space="preserve">[78] J. L. Rico, L. Aya-Ramos, and Z. Dueñas, “Effects of early-life stress followed by access to stevia or sucralose during adolescence on weight gain, glycemia, and anxiety-related behaviors in male and female rats,” </w:t>
-      </w:r>
-      <w:r>
-        <w:rPr>
-          <w:sz w:val="19"/>
-        </w:rPr>
-        <w:t>Physiol. Behav., vol. 280, 2024, Art. no. 114529. doi: 10.1016/j.physbeh.2024.114529</w:t>
+        <w:lastRenderedPageBreak/>
+        <w:t>[78] World Health Organization, Guideline: Sugars intake for adults and children. Geneva, Switzerland: World Health Organization, 2015, isbn: 978-92-4-154902-8. [Online]. Available: https://www.who.int/publications/i/item/9789241549028</w:t>
       </w:r>
     </w:p>
     <w:p>
@@ -24120,8 +24229,7 @@
         <w:rPr>
           <w:sz w:val="19"/>
         </w:rPr>
-        <w:lastRenderedPageBreak/>
-        <w:t>[79] D. Bosch and I. Ehrlich, “Postnatal maturation of GABAergic modulation of sensory inputs onto lateral amygdala principal neurons,” J. Physiol., vol. 593, no. 19, pp. 4387–4409, 2015. doi: 10.1113/JP270645</w:t>
+        <w:t>[79] EFSA Panel on Food Additives and Nutrient Sources added to Food (ANS), “Scientific opinion on the safety of steviol glycosides for the proposed uses as a food additive,” EFSA J., vol. 8, no. 4, 2010, Art. no. 1537. doi: 10.2903/j.efsa.2010.1537</w:t>
       </w:r>
     </w:p>
     <w:p>
@@ -24134,7 +24242,13 @@
         <w:rPr>
           <w:sz w:val="19"/>
         </w:rPr>
-        <w:t>[80] N. Ognjanovski et al., “Parvalbumin-expressing interneurons coordinate hippocampal network dynamics required for memory consolidation,” Nat. Commun., vol. 8, 2017, Art. no. 15039. doi: 10.1038/ncomms15039</w:t>
+        <w:t xml:space="preserve">[80] J. L. Rico, L. Aya-Ramos, and Z. Dueñas, “Effects of early-life stress followed by access to stevia or sucralose during adolescence on weight gain, glycemia, and anxiety-related behaviors in male and female rats,” </w:t>
+      </w:r>
+      <w:r>
+        <w:rPr>
+          <w:sz w:val="19"/>
+        </w:rPr>
+        <w:t>Physiol. Behav., vol. 280, 2024, Art. no. 114529. doi: 10.1016/j.physbeh.2024.114529</w:t>
       </w:r>
     </w:p>
     <w:p>
@@ -24147,7 +24261,7 @@
         <w:rPr>
           <w:sz w:val="19"/>
         </w:rPr>
-        <w:t>[81] A. C. Reichelt, G. D. Gibson, K. N. Abbott, and D. J. Hare, “A high-fat high-sugar diet in adolescent rats impairs social memory and alters chemical markers characteristic of atypical neuroplasticity and parvalbumin interneuron depletion in the medial prefrontal cortex,” Food Funct., vol. 10, no. 4, pp. 1985–1998, 2019. doi: 10.1039/c8fo02118j</w:t>
+        <w:t>[81] D. Bosch and I. Ehrlich, “Postnatal maturation of GABAergic modulation of sensory inputs onto lateral amygdala principal neurons,” J. Physiol., vol. 593, no. 19, pp. 4387–4409, 2015. doi: 10.1113/JP270645</w:t>
       </w:r>
     </w:p>
     <w:p>
@@ -24160,13 +24274,7 @@
         <w:rPr>
           <w:sz w:val="19"/>
         </w:rPr>
-        <w:t>[82] E. I. Morales-Ríos, J. García-Machorro, A. Briones-Aranda, R. Gómez-Pliego, and J. Espinosa-Raya, “</w:t>
-      </w:r>
-      <w:r>
-        <w:rPr>
-          <w:sz w:val="19"/>
-        </w:rPr>
-        <w:t>Effect of long-term intake of nutritive and non-nutritive sweeteners on metabolic health and cognition in adult male rats,” J. Med. Food, vol. 25, no. 11, pp. 1059–1065, 2022. doi: 10.1089/jmf.2022.0016</w:t>
+        <w:t>[82] N. Ognjanovski et al., “Parvalbumin-expressing interneurons coordinate hippocampal network dynamics required for memory consolidation,” Nat. Commun., vol. 8, 2017, Art. no. 15039. doi: 10.1038/ncomms15039</w:t>
       </w:r>
     </w:p>
     <w:p>
@@ -24179,7 +24287,7 @@
         <w:rPr>
           <w:sz w:val="19"/>
         </w:rPr>
-        <w:t>[83] A. L. de la Garza et al., “Maternal sweeteners intake modulates gut microbiota and exacerbates learning and memory processes in adult male offspring,” Front. Pediatr., vol. 9, Jan. 2022, Art. no. 746437. doi: 10.3389/fped.2021.746437</w:t>
+        <w:t>[83] A. C. Reichelt, G. D. Gibson, K. N. Abbott, and D. J. Hare, “A high-fat high-sugar diet in adolescent rats impairs social memory and alters chemical markers characteristic of atypical neuroplasticity and parvalbumin interneuron depletion in the medial prefrontal cortex,” Food Funct., vol. 10, no. 4, pp. 1985–1998, 2019. doi: 10.1039/c8fo02118j</w:t>
       </w:r>
     </w:p>
     <w:p>
@@ -24192,13 +24300,13 @@
         <w:rPr>
           <w:sz w:val="19"/>
         </w:rPr>
-        <w:t>[84] J. E. Beilharz, J. Maniam, and M. J. Morris, “</w:t>
-      </w:r>
-      <w:r>
-        <w:rPr>
-          <w:sz w:val="19"/>
-        </w:rPr>
-        <w:t>Short exposure to a diet rich in both fat and sugar or sugar alone impairs place, but not object recognition memory in rats,” Brain Behav. Immun., vol. 37, pp. 134–141, 2014. doi: 10.1016/j.bbi.2013.11.016</w:t>
+        <w:t>[84] E. I. Morales-Ríos, J. García-Machorro, A. Briones-Aranda, R. Gómez-Pliego, and J. Espinosa-Raya, “</w:t>
+      </w:r>
+      <w:r>
+        <w:rPr>
+          <w:sz w:val="19"/>
+        </w:rPr>
+        <w:t>Effect of long-term intake of nutritive and non-nutritive sweeteners on metabolic health and cognition in adult male rats,” J. Med. Food, vol. 25, no. 11, pp. 1059–1065, 2022. doi: 10.1089/jmf.2022.0016</w:t>
       </w:r>
     </w:p>
     <w:p>
@@ -24211,7 +24319,39 @@
         <w:rPr>
           <w:sz w:val="19"/>
         </w:rPr>
-        <w:t>[85] J. E. Beilharz, J. Maniam, and M. J. Morris, “Short-term exposure to a diet high in fat and sugar, or liquid sugar, selectively impairs hippocampal-dependent memory, with differential impacts on inflammation,” Behav. Brain Res., vol. 306, pp. 1–7, 2016. doi: 10.1016/j.bbr.2016.03.018</w:t>
+        <w:t>[85] A. L. de la Garza et al., “Maternal sweeteners intake modulates gut microbiota and exacerbates learning and memory processes in adult male offspring,” Front. Pediatr., vol. 9, Jan. 2022, Art. no. 746437. doi: 10.3389/fped.2021.746437</w:t>
+      </w:r>
+    </w:p>
+    <w:p>
+      <w:pPr>
+        <w:pStyle w:val="Textoindependiente"/>
+        <w:spacing w:after="80"/>
+        <w:jc w:val="left"/>
+      </w:pPr>
+      <w:r>
+        <w:rPr>
+          <w:sz w:val="19"/>
+        </w:rPr>
+        <w:t>[86] J. E. Beilharz, J. Maniam, and M. J. Morris, “</w:t>
+      </w:r>
+      <w:r>
+        <w:rPr>
+          <w:sz w:val="19"/>
+        </w:rPr>
+        <w:t>Short exposure to a diet rich in both fat and sugar or sugar alone impairs place, but not object recognition memory in rats,” Brain Behav. Immun., vol. 37, pp. 134–141, 2014. doi: 10.1016/j.bbi.2013.11.016</w:t>
+      </w:r>
+    </w:p>
+    <w:p>
+      <w:pPr>
+        <w:pStyle w:val="Textoindependiente"/>
+        <w:spacing w:after="80"/>
+        <w:jc w:val="left"/>
+      </w:pPr>
+      <w:r>
+        <w:rPr>
+          <w:sz w:val="19"/>
+        </w:rPr>
+        <w:t>[87] J. E. Beilharz, J. Maniam, and M. J. Morris, “Short-term exposure to a diet high in fat and sugar, or liquid sugar, selectively impairs hippocampal-dependent memory, with differential impacts on inflammation,” Behav. Brain Res., vol. 306, pp. 1–7, 2016. doi: 10.1016/j.bbr.2016.03.018</w:t>
       </w:r>
       <w:bookmarkEnd w:id="133"/>
     </w:p>
@@ -24299,7 +24439,7 @@
   <w:abstractNum w:abstractNumId="0" w15:restartNumberingAfterBreak="0">
     <w:nsid w:val="EA454B4C"/>
     <w:multiLevelType w:val="multilevel"/>
-    <w:tmpl w:val="86500E5C"/>
+    <w:tmpl w:val="6A90B01A"/>
     <w:lvl w:ilvl="0">
       <w:start w:val="1"/>
       <w:numFmt w:val="decimal"/>
@@ -24385,7 +24525,7 @@
   <w:abstractNum w:abstractNumId="1" w15:restartNumberingAfterBreak="0">
     <w:nsid w:val="2C1AE401"/>
     <w:multiLevelType w:val="multilevel"/>
-    <w:tmpl w:val="1ABE4D8E"/>
+    <w:tmpl w:val="0F58F780"/>
     <w:lvl w:ilvl="0">
       <w:numFmt w:val="bullet"/>
       <w:lvlText w:val=" "/>
@@ -24462,7 +24602,7 @@
   <w:abstractNum w:abstractNumId="2" w15:restartNumberingAfterBreak="0">
     <w:nsid w:val="71315DCA"/>
     <w:multiLevelType w:val="multilevel"/>
-    <w:tmpl w:val="4C721F9E"/>
+    <w:tmpl w:val="D6C001A8"/>
     <w:lvl w:ilvl="0">
       <w:numFmt w:val="bullet"/>
       <w:lvlText w:val="•"/>
@@ -24536,10 +24676,10 @@
       </w:pPr>
     </w:lvl>
   </w:abstractNum>
-  <w:num w:numId="1" w16cid:durableId="1542396818">
+  <w:num w:numId="1" w16cid:durableId="1302536590">
     <w:abstractNumId w:val="1"/>
   </w:num>
-  <w:num w:numId="2" w16cid:durableId="1770849910">
+  <w:num w:numId="2" w16cid:durableId="1581253594">
     <w:abstractNumId w:val="0"/>
     <w:lvlOverride w:ilvl="0">
       <w:startOverride w:val="1"/>
@@ -24569,7 +24709,7 @@
       <w:startOverride w:val="1"/>
     </w:lvlOverride>
   </w:num>
-  <w:num w:numId="3" w16cid:durableId="1726102517">
+  <w:num w:numId="3" w16cid:durableId="185946167">
     <w:abstractNumId w:val="0"/>
     <w:lvlOverride w:ilvl="0">
       <w:startOverride w:val="1"/>
@@ -24599,7 +24739,7 @@
       <w:startOverride w:val="1"/>
     </w:lvlOverride>
   </w:num>
-  <w:num w:numId="4" w16cid:durableId="1830751855">
+  <w:num w:numId="4" w16cid:durableId="1661344249">
     <w:abstractNumId w:val="2"/>
   </w:num>
 </w:numbering>
@@ -25663,7 +25803,7 @@
     <w:next w:val="Normal"/>
     <w:autoRedefine/>
     <w:uiPriority w:val="39"/>
-    <w:rsid w:val="00883B92"/>
+    <w:rsid w:val="00EB70EB"/>
     <w:pPr>
       <w:spacing w:after="100"/>
     </w:pPr>
@@ -25674,7 +25814,7 @@
     <w:next w:val="Normal"/>
     <w:autoRedefine/>
     <w:uiPriority w:val="39"/>
-    <w:rsid w:val="00883B92"/>
+    <w:rsid w:val="00EB70EB"/>
     <w:pPr>
       <w:spacing w:after="100"/>
       <w:ind w:left="240"/>
@@ -25686,7 +25826,7 @@
     <w:next w:val="Normal"/>
     <w:autoRedefine/>
     <w:uiPriority w:val="39"/>
-    <w:rsid w:val="00883B92"/>
+    <w:rsid w:val="00EB70EB"/>
     <w:pPr>
       <w:spacing w:after="100"/>
       <w:ind w:left="480"/>

</xml_diff>